<commit_message>
NetSurf: a back buffer (no half-drawn redraws); the NetSurf handoff
- user/nsfb/onyx_surface.c: NetSurf draws off screen; update copies the
  rectangle redrawn into the window's canvas (the compositor showed
  half-drawn redraws: the page flickered at each :hover restyle).
- docs/HANDOFF.md, NetSurf: what is done, building and trying it on this
  PC and on the Pi (OUT outside WSL's /tmp, libnsfb's NSFB=, kmsg / run
  netsurf), an open bug (kotonviolins' sticky header line turned opaque
  after this build), the next steps (restyle only what :hover changes,
  opacity, cookies, the fetch gaps...), pitfalls met.
- tools/tests/netsurf/pages/alpha-hover.html: the bug's bench page (does
  not reproduce it yet).

Co-Authored-By: Claude Opus 5.5 <noreply@anthropic.com>
</commit_message>
<xml_diff>
--- a/docs/exports/03-DEVELOPER-GUIDE.docx
+++ b/docs/exports/03-DEVELOPER-GUIDE.docx
@@ -17749,7 +17749,7 @@
         <w:t xml:space="preserve"> </w:t>
       </w:r>
       <w:r>
-        <w:t xml:space="preserve">commercial documents, CODA read and made a statement, a SEPA file — 194 checks, ASan + UBSan —; the</w:t>
+        <w:t xml:space="preserve">commercial documents, CODA read and made a statement, a SEPA file — 200 checks, ASan + UBSan —; the</w:t>
       </w:r>
       <w:r>
         <w:t xml:space="preserve"> </w:t>
@@ -37634,7 +37634,7 @@
     </w:p>
     <w:bookmarkEnd w:id="61"/>
     <w:bookmarkEnd w:id="62"/>
-    <w:bookmarkStart w:id="70" w:name="X636230dba256ccd30a2e68f8101290712b3f4c4"/>
+    <w:bookmarkStart w:id="73" w:name="X636230dba256ccd30a2e68f8101290712b3f4c4"/>
     <w:p>
       <w:pPr>
         <w:pStyle w:val="Heading2"/>
@@ -39129,7 +39129,7 @@
         <w:t xml:space="preserve">40</w:t>
       </w:r>
     </w:p>
-    <w:bookmarkStart w:id="68" w:name="screenshots-and-documentation"/>
+    <w:bookmarkStart w:id="71" w:name="screenshots-and-documentation"/>
     <w:p>
       <w:pPr>
         <w:pStyle w:val="Heading3"/>
@@ -39825,10 +39825,118 @@
           <w:b/>
           <w:bCs/>
         </w:rPr>
-        <w:t xml:space="preserve">Word/PDF exports</w:t>
-      </w:r>
-      <w:r>
-        <w:t xml:space="preserve">:</w:t>
+        <w:t xml:space="preserve">Manuals</w:t>
+      </w:r>
+      <w:r>
+        <w:t xml:space="preserve"> </w:t>
+      </w:r>
+      <w:r>
+        <w:t xml:space="preserve">(a big app's user manual, for its users):</w:t>
+      </w:r>
+      <w:r>
+        <w:t xml:space="preserve"> </w:t>
+      </w:r>
+      <w:r>
+        <w:rPr>
+          <w:rStyle w:val="VerbatimChar"/>
+        </w:rPr>
+        <w:t xml:space="preserve">sdcard/manuals/&lt;app&gt;/&lt;Name&gt;.md</w:t>
+      </w:r>
+      <w:r>
+        <w:t xml:space="preserve">, its pictures</w:t>
+      </w:r>
+      <w:r>
+        <w:t xml:space="preserve"> </w:t>
+      </w:r>
+      <w:r>
+        <w:t xml:space="preserve">in</w:t>
+      </w:r>
+      <w:r>
+        <w:t xml:space="preserve"> </w:t>
+      </w:r>
+      <w:r>
+        <w:rPr>
+          <w:rStyle w:val="VerbatimChar"/>
+        </w:rPr>
+        <w:t xml:space="preserve">images/</w:t>
+      </w:r>
+      <w:r>
+        <w:t xml:space="preserve"> </w:t>
+      </w:r>
+      <w:r>
+        <w:t xml:space="preserve">and its PDF</w:t>
+      </w:r>
+      <w:r>
+        <w:t xml:space="preserve"> </w:t>
+      </w:r>
+      <w:r>
+        <w:rPr>
+          <w:rStyle w:val="VerbatimChar"/>
+        </w:rPr>
+        <w:t xml:space="preserve">&lt;Name&gt;.pdf</w:t>
+      </w:r>
+      <w:r>
+        <w:t xml:space="preserve"> </w:t>
+      </w:r>
+      <w:r>
+        <w:t xml:space="preserve">next to it (the folder is</w:t>
+      </w:r>
+      <w:r>
+        <w:t xml:space="preserve"> </w:t>
+      </w:r>
+      <w:r>
+        <w:rPr>
+          <w:rStyle w:val="VerbatimChar"/>
+        </w:rPr>
+        <w:t xml:space="preserve">manuals</w:t>
+      </w:r>
+      <w:r>
+        <w:t xml:space="preserve">, not</w:t>
+      </w:r>
+      <w:r>
+        <w:t xml:space="preserve"> </w:t>
+      </w:r>
+      <w:r>
+        <w:rPr>
+          <w:rStyle w:val="VerbatimChar"/>
+        </w:rPr>
+        <w:t xml:space="preserve">Docs</w:t>
+      </w:r>
+      <w:r>
+        <w:t xml:space="preserve">: it would be the</w:t>
+      </w:r>
+      <w:r>
+        <w:t xml:space="preserve"> </w:t>
+      </w:r>
+      <w:r>
+        <w:t xml:space="preserve">same folder as</w:t>
+      </w:r>
+      <w:r>
+        <w:t xml:space="preserve"> </w:t>
+      </w:r>
+      <w:r>
+        <w:rPr>
+          <w:rStyle w:val="VerbatimChar"/>
+        </w:rPr>
+        <w:t xml:space="preserve">docs/</w:t>
+      </w:r>
+      <w:r>
+        <w:t xml:space="preserve"> </w:t>
+      </w:r>
+      <w:r>
+        <w:t xml:space="preserve">on Windows' and FAT's case-insensitive disks). Written in English, in a small</w:t>
+      </w:r>
+      <w:r>
+        <w:t xml:space="preserve"> </w:t>
+      </w:r>
+      <w:r>
+        <w:t xml:space="preserve">Markdown subset (headings, paragraphs, bold / italic / code, links, lists, quotes, tables, figures — a</w:t>
+      </w:r>
+      <w:r>
+        <w:t xml:space="preserve"> </w:t>
+      </w:r>
+      <w:r>
+        <w:t xml:space="preserve">picture alone in its paragraph, an italic line after it its caption), the one</w:t>
       </w:r>
       <w:r>
         <w:t xml:space="preserve"> </w:t>
@@ -39838,152 +39946,135 @@
           <w:rPr>
             <w:rStyle w:val="VerbatimChar"/>
           </w:rPr>
-          <w:t xml:space="preserve">docs/build_docs.py</w:t>
+          <w:t xml:space="preserve">tools/manuals/build_manuals.py</w:t>
         </w:r>
       </w:hyperlink>
       <w:r>
         <w:t xml:space="preserve"> </w:t>
       </w:r>
       <w:r>
-        <w:t xml:space="preserve">converts each</w:t>
-      </w:r>
-      <w:r>
-        <w:t xml:space="preserve"> </w:t>
-      </w:r>
-      <w:r>
-        <w:rPr>
-          <w:rStyle w:val="VerbatimChar"/>
-        </w:rPr>
-        <w:t xml:space="preserve">.md</w:t>
-      </w:r>
-      <w:r>
-        <w:t xml:space="preserve"> </w:t>
-      </w:r>
-      <w:r>
-        <w:t xml:space="preserve">in</w:t>
-      </w:r>
-      <w:r>
-        <w:t xml:space="preserve"> </w:t>
-      </w:r>
-      <w:r>
-        <w:rPr>
-          <w:rStyle w:val="VerbatimChar"/>
-        </w:rPr>
-        <w:t xml:space="preserve">docs/</w:t>
-      </w:r>
-      <w:r>
-        <w:t xml:space="preserve"> </w:t>
-      </w:r>
-      <w:r>
-        <w:t xml:space="preserve">into</w:t>
-      </w:r>
-      <w:r>
-        <w:t xml:space="preserve"> </w:t>
-      </w:r>
-      <w:r>
-        <w:rPr>
-          <w:rStyle w:val="VerbatimChar"/>
-        </w:rPr>
-        <w:t xml:space="preserve">.docx</w:t>
-      </w:r>
-      <w:r>
-        <w:t xml:space="preserve"> </w:t>
-      </w:r>
-      <w:r>
-        <w:t xml:space="preserve">(via</w:t>
-      </w:r>
-      <w:r>
-        <w:t xml:space="preserve"> </w:t>
-      </w:r>
-      <w:r>
-        <w:rPr>
-          <w:rStyle w:val="VerbatimChar"/>
-        </w:rPr>
-        <w:t xml:space="preserve">pandoc</w:t>
-      </w:r>
-      <w:r>
-        <w:t xml:space="preserve">) then into</w:t>
-      </w:r>
-      <w:r>
-        <w:t xml:space="preserve"> </w:t>
-      </w:r>
-      <w:r>
-        <w:rPr>
-          <w:rStyle w:val="VerbatimChar"/>
-        </w:rPr>
-        <w:t xml:space="preserve">.pdf</w:t>
-      </w:r>
-      <w:r>
-        <w:t xml:space="preserve"> </w:t>
-      </w:r>
-      <w:r>
-        <w:t xml:space="preserve">(via Word/</w:t>
-      </w:r>
-      <w:r>
-        <w:rPr>
-          <w:rStyle w:val="VerbatimChar"/>
-        </w:rPr>
-        <w:t xml:space="preserve">docx2pdf</w:t>
-      </w:r>
-      <w:r>
-        <w:t xml:space="preserve">), in</w:t>
-      </w:r>
-      <w:r>
-        <w:t xml:space="preserve"> </w:t>
-      </w:r>
-      <w:r>
-        <w:rPr>
-          <w:rStyle w:val="VerbatimChar"/>
-        </w:rPr>
-        <w:t xml:space="preserve">docs/exports/</w:t>
-      </w:r>
-      <w:r>
-        <w:t xml:space="preserve">. Run</w:t>
-      </w:r>
-      <w:r>
-        <w:t xml:space="preserve"> </w:t>
-      </w:r>
-      <w:r>
-        <w:rPr>
-          <w:rStyle w:val="VerbatimChar"/>
-        </w:rPr>
-        <w:t xml:space="preserve">python docs/build_docs.py</w:t>
-      </w:r>
-      <w:r>
-        <w:t xml:space="preserve"> </w:t>
-      </w:r>
-      <w:r>
-        <w:t xml:space="preserve">after any modification to the</w:t>
-      </w:r>
-      <w:r>
-        <w:t xml:space="preserve"> </w:t>
-      </w:r>
-      <w:r>
-        <w:rPr>
-          <w:rStyle w:val="VerbatimChar"/>
-        </w:rPr>
-        <w:t xml:space="preserve">.md</w:t>
-      </w:r>
-      <w:r>
-        <w:t xml:space="preserve"> </w:t>
-      </w:r>
-      <w:r>
-        <w:t xml:space="preserve">files.</w:t>
-      </w:r>
-      <w:r>
-        <w:t xml:space="preserve"> </w:t>
-      </w:r>
-      <w:r>
-        <w:t xml:space="preserve">Prerequisites (once):</w:t>
-      </w:r>
-      <w:r>
-        <w:t xml:space="preserve"> </w:t>
-      </w:r>
-      <w:r>
-        <w:rPr>
-          <w:rStyle w:val="VerbatimChar"/>
-        </w:rPr>
-        <w:t xml:space="preserve">pip install python-docx docx2pdf pypandoc_binary</w:t>
+        <w:t xml:space="preserve">documents at its top. Its</w:t>
+      </w:r>
+      <w:r>
+        <w:t xml:space="preserve"> </w:t>
+      </w:r>
+      <w:r>
+        <w:t xml:space="preserve">pictures: a script per manual,</w:t>
+      </w:r>
+      <w:r>
+        <w:t xml:space="preserve"> </w:t>
+      </w:r>
+      <w:hyperlink r:id="rId68">
+        <w:r>
+          <w:rPr>
+            <w:rStyle w:val="VerbatimChar"/>
+          </w:rPr>
+          <w:t xml:space="preserve">tools/manuals/ledger_shots.sh</w:t>
+        </w:r>
+      </w:hyperlink>
+      <w:r>
+        <w:t xml:space="preserve"> </w:t>
+      </w:r>
+      <w:r>
+        <w:t xml:space="preserve">(as</w:t>
+      </w:r>
+      <w:r>
+        <w:t xml:space="preserve"> </w:t>
+      </w:r>
+      <w:r>
+        <w:rPr>
+          <w:rStyle w:val="VerbatimChar"/>
+        </w:rPr>
+        <w:t xml:space="preserve">shots.sh</w:t>
+      </w:r>
+      <w:r>
+        <w:t xml:space="preserve">, the demo's data, the stand-in kernel's fixed day: the same pictures every time; Writer</w:t>
+      </w:r>
+      <w:r>
+        <w:t xml:space="preserve"> </w:t>
+      </w:r>
+      <w:r>
+        <w:t xml:space="preserve">run on what Ledger printed),</w:t>
+      </w:r>
+      <w:r>
+        <w:t xml:space="preserve"> </w:t>
+      </w:r>
+      <w:hyperlink r:id="rId69">
+        <w:r>
+          <w:rPr>
+            <w:rStyle w:val="VerbatimChar"/>
+          </w:rPr>
+          <w:t xml:space="preserve">annotate.py</w:t>
+        </w:r>
+      </w:hyperlink>
+      <w:r>
+        <w:t xml:space="preserve"> </w:t>
+      </w:r>
+      <w:r>
+        <w:t xml:space="preserve">adding numbered callouts in</w:t>
+      </w:r>
+      <w:r>
+        <w:t xml:space="preserve"> </w:t>
+      </w:r>
+      <w:r>
+        <w:t xml:space="preserve">margins. The PDF:</w:t>
+      </w:r>
+      <w:r>
+        <w:t xml:space="preserve"> </w:t>
+      </w:r>
+      <w:r>
+        <w:rPr>
+          <w:rStyle w:val="VerbatimChar"/>
+        </w:rPr>
+        <w:t xml:space="preserve">python tools/manuals/build_manuals.py [its .md]</w:t>
+      </w:r>
+      <w:r>
+        <w:t xml:space="preserve"> </w:t>
+      </w:r>
+      <w:r>
+        <w:t xml:space="preserve">— Python only; a headless Chrome,</w:t>
+      </w:r>
+      <w:r>
+        <w:t xml:space="preserve"> </w:t>
+      </w:r>
+      <w:r>
+        <w:t xml:space="preserve">Chromium or Edge prints it (</w:t>
+      </w:r>
+      <w:r>
+        <w:rPr>
+          <w:rStyle w:val="VerbatimChar"/>
+        </w:rPr>
+        <w:t xml:space="preserve">$CHROME</w:t>
+      </w:r>
+      <w:r>
+        <w:t xml:space="preserve"> </w:t>
+      </w:r>
+      <w:r>
+        <w:t xml:space="preserve">to choose one), A4, the docs' colours, Selawik</w:t>
+      </w:r>
+      <w:r>
+        <w:t xml:space="preserve"> </w:t>
+      </w:r>
+      <w:r>
+        <w:t xml:space="preserve">(</w:t>
+      </w:r>
+      <w:r>
+        <w:rPr>
+          <w:rStyle w:val="VerbatimChar"/>
+        </w:rPr>
+        <w:t xml:space="preserve">sdcard/res/fonts</w:t>
+      </w:r>
+      <w:r>
+        <w:t xml:space="preserve">), bookmarks from the headings. Ledger's:</w:t>
+      </w:r>
+      <w:r>
+        <w:t xml:space="preserve"> </w:t>
+      </w:r>
+      <w:r>
+        <w:rPr>
+          <w:rStyle w:val="VerbatimChar"/>
+        </w:rPr>
+        <w:t xml:space="preserve">sdcard/manuals/ledger/Ledger.md</w:t>
       </w:r>
       <w:r>
         <w:t xml:space="preserve">.</w:t>
@@ -40002,49 +40093,226 @@
           <w:b/>
           <w:bCs/>
         </w:rPr>
-        <w:t xml:space="preserve">Reminder of the project rule</w:t>
-      </w:r>
-      <w:r>
-        <w:t xml:space="preserve"> </w:t>
-      </w:r>
-      <w:r>
-        <w:t xml:space="preserve">(see</w:t>
-      </w:r>
-      <w:r>
-        <w:t xml:space="preserve"> </w:t>
-      </w:r>
-      <w:r>
-        <w:rPr>
-          <w:rStyle w:val="VerbatimChar"/>
-        </w:rPr>
-        <w:t xml:space="preserve">CLAUDE.md</w:t>
-      </w:r>
-      <w:r>
-        <w:t xml:space="preserve">): any modification of a</w:t>
-      </w:r>
-      <w:r>
-        <w:t xml:space="preserve"> </w:t>
-      </w:r>
-      <w:r>
-        <w:rPr>
-          <w:rStyle w:val="VerbatimChar"/>
-        </w:rPr>
-        <w:t xml:space="preserve">kapi</w:t>
-      </w:r>
-      <w:r>
-        <w:t xml:space="preserve"> </w:t>
-      </w:r>
-      <w:r>
-        <w:t xml:space="preserve">function or of an app</w:t>
-      </w:r>
-      <w:r>
-        <w:t xml:space="preserve"> </w:t>
-      </w:r>
+        <w:t xml:space="preserve">Word/PDF exports</w:t>
+      </w:r>
+      <w:r>
+        <w:t xml:space="preserve">:</w:t>
+      </w:r>
+      <w:r>
+        <w:t xml:space="preserve"> </w:t>
+      </w:r>
+      <w:hyperlink r:id="rId70">
+        <w:r>
+          <w:rPr>
+            <w:rStyle w:val="VerbatimChar"/>
+          </w:rPr>
+          <w:t xml:space="preserve">docs/build_docs.py</w:t>
+        </w:r>
+      </w:hyperlink>
+      <w:r>
+        <w:t xml:space="preserve"> </w:t>
+      </w:r>
+      <w:r>
+        <w:t xml:space="preserve">converts each</w:t>
+      </w:r>
+      <w:r>
+        <w:t xml:space="preserve"> </w:t>
+      </w:r>
+      <w:r>
+        <w:rPr>
+          <w:rStyle w:val="VerbatimChar"/>
+        </w:rPr>
+        <w:t xml:space="preserve">.md</w:t>
+      </w:r>
+      <w:r>
+        <w:t xml:space="preserve"> </w:t>
+      </w:r>
+      <w:r>
+        <w:t xml:space="preserve">in</w:t>
+      </w:r>
+      <w:r>
+        <w:t xml:space="preserve"> </w:t>
+      </w:r>
+      <w:r>
+        <w:rPr>
+          <w:rStyle w:val="VerbatimChar"/>
+        </w:rPr>
+        <w:t xml:space="preserve">docs/</w:t>
+      </w:r>
+      <w:r>
+        <w:t xml:space="preserve"> </w:t>
+      </w:r>
+      <w:r>
+        <w:t xml:space="preserve">into</w:t>
+      </w:r>
+      <w:r>
+        <w:t xml:space="preserve"> </w:t>
+      </w:r>
+      <w:r>
+        <w:rPr>
+          <w:rStyle w:val="VerbatimChar"/>
+        </w:rPr>
+        <w:t xml:space="preserve">.docx</w:t>
+      </w:r>
+      <w:r>
+        <w:t xml:space="preserve"> </w:t>
+      </w:r>
+      <w:r>
+        <w:t xml:space="preserve">(via</w:t>
+      </w:r>
+      <w:r>
+        <w:t xml:space="preserve"> </w:t>
+      </w:r>
+      <w:r>
+        <w:rPr>
+          <w:rStyle w:val="VerbatimChar"/>
+        </w:rPr>
+        <w:t xml:space="preserve">pandoc</w:t>
+      </w:r>
+      <w:r>
+        <w:t xml:space="preserve">) then into</w:t>
+      </w:r>
+      <w:r>
+        <w:t xml:space="preserve"> </w:t>
+      </w:r>
+      <w:r>
+        <w:rPr>
+          <w:rStyle w:val="VerbatimChar"/>
+        </w:rPr>
+        <w:t xml:space="preserve">.pdf</w:t>
+      </w:r>
+      <w:r>
+        <w:t xml:space="preserve"> </w:t>
+      </w:r>
+      <w:r>
+        <w:t xml:space="preserve">(via Word/</w:t>
+      </w:r>
+      <w:r>
+        <w:rPr>
+          <w:rStyle w:val="VerbatimChar"/>
+        </w:rPr>
+        <w:t xml:space="preserve">docx2pdf</w:t>
+      </w:r>
+      <w:r>
+        <w:t xml:space="preserve">), in</w:t>
+      </w:r>
+      <w:r>
+        <w:t xml:space="preserve"> </w:t>
+      </w:r>
+      <w:r>
+        <w:rPr>
+          <w:rStyle w:val="VerbatimChar"/>
+        </w:rPr>
+        <w:t xml:space="preserve">docs/exports/</w:t>
+      </w:r>
+      <w:r>
+        <w:t xml:space="preserve">. Run</w:t>
+      </w:r>
+      <w:r>
+        <w:t xml:space="preserve"> </w:t>
+      </w:r>
+      <w:r>
+        <w:rPr>
+          <w:rStyle w:val="VerbatimChar"/>
+        </w:rPr>
+        <w:t xml:space="preserve">python docs/build_docs.py</w:t>
+      </w:r>
+      <w:r>
+        <w:t xml:space="preserve"> </w:t>
+      </w:r>
+      <w:r>
+        <w:t xml:space="preserve">after any modification to the</w:t>
+      </w:r>
+      <w:r>
+        <w:t xml:space="preserve"> </w:t>
+      </w:r>
+      <w:r>
+        <w:rPr>
+          <w:rStyle w:val="VerbatimChar"/>
+        </w:rPr>
+        <w:t xml:space="preserve">.md</w:t>
+      </w:r>
+      <w:r>
+        <w:t xml:space="preserve"> </w:t>
+      </w:r>
+      <w:r>
+        <w:t xml:space="preserve">files.</w:t>
+      </w:r>
+      <w:r>
+        <w:t xml:space="preserve"> </w:t>
+      </w:r>
+      <w:r>
+        <w:t xml:space="preserve">Prerequisites (once):</w:t>
+      </w:r>
+      <w:r>
+        <w:t xml:space="preserve"> </w:t>
+      </w:r>
+      <w:r>
+        <w:rPr>
+          <w:rStyle w:val="VerbatimChar"/>
+        </w:rPr>
+        <w:t xml:space="preserve">pip install python-docx docx2pdf pypandoc_binary</w:t>
+      </w:r>
+      <w:r>
+        <w:t xml:space="preserve">.</w:t>
+      </w:r>
+    </w:p>
+    <w:p>
+      <w:pPr>
+        <w:pStyle w:val="Compact"/>
+        <w:numPr>
+          <w:ilvl w:val="0"/>
+          <w:numId w:val="1016"/>
+        </w:numPr>
+      </w:pPr>
       <w:r>
         <w:rPr>
           <w:b/>
           <w:bCs/>
         </w:rPr>
+        <w:t xml:space="preserve">Reminder of the project rule</w:t>
+      </w:r>
+      <w:r>
+        <w:t xml:space="preserve"> </w:t>
+      </w:r>
+      <w:r>
+        <w:t xml:space="preserve">(see</w:t>
+      </w:r>
+      <w:r>
+        <w:t xml:space="preserve"> </w:t>
+      </w:r>
+      <w:r>
+        <w:rPr>
+          <w:rStyle w:val="VerbatimChar"/>
+        </w:rPr>
+        <w:t xml:space="preserve">CLAUDE.md</w:t>
+      </w:r>
+      <w:r>
+        <w:t xml:space="preserve">): any modification of a</w:t>
+      </w:r>
+      <w:r>
+        <w:t xml:space="preserve"> </w:t>
+      </w:r>
+      <w:r>
+        <w:rPr>
+          <w:rStyle w:val="VerbatimChar"/>
+        </w:rPr>
+        <w:t xml:space="preserve">kapi</w:t>
+      </w:r>
+      <w:r>
+        <w:t xml:space="preserve"> </w:t>
+      </w:r>
+      <w:r>
+        <w:t xml:space="preserve">function or of an app</w:t>
+      </w:r>
+      <w:r>
+        <w:t xml:space="preserve"> </w:t>
+      </w:r>
+      <w:r>
+        <w:rPr>
+          <w:b/>
+          <w:bCs/>
+        </w:rPr>
         <w:t xml:space="preserve">updates the docs in the same go</w:t>
       </w:r>
       <w:r>
@@ -40057,8 +40325,8 @@
         <w:t xml:space="preserve">screenshot if the visual changes, then regenerates the exports.</w:t>
       </w:r>
     </w:p>
-    <w:bookmarkEnd w:id="68"/>
-    <w:bookmarkStart w:id="69" w:name="onyx-basic-the-interpreter"/>
+    <w:bookmarkEnd w:id="71"/>
+    <w:bookmarkStart w:id="72" w:name="onyx-basic-the-interpreter"/>
     <w:p>
       <w:pPr>
         <w:pStyle w:val="Heading3"/>
@@ -44226,9 +44494,9 @@
         <w:t xml:space="preserve">rewrites them).</w:t>
       </w:r>
     </w:p>
-    <w:bookmarkEnd w:id="69"/>
-    <w:bookmarkEnd w:id="70"/>
-    <w:bookmarkStart w:id="71" w:name="Xc2ec260aede7afe7fa831ade27ff6c6be860f38"/>
+    <w:bookmarkEnd w:id="72"/>
+    <w:bookmarkEnd w:id="73"/>
+    <w:bookmarkStart w:id="74" w:name="Xc2ec260aede7afe7fa831ade27ff6c6be860f38"/>
     <w:p>
       <w:pPr>
         <w:pStyle w:val="Heading2"/>
@@ -44955,8 +45223,8 @@
         <w:t xml:space="preserve">"must match").</w:t>
       </w:r>
     </w:p>
-    <w:bookmarkEnd w:id="71"/>
-    <w:bookmarkStart w:id="72" w:name="X57cc4a25254639a1e87307c03f7beba3c173828"/>
+    <w:bookmarkEnd w:id="74"/>
+    <w:bookmarkStart w:id="75" w:name="X57cc4a25254639a1e87307c03f7beba3c173828"/>
     <w:p>
       <w:pPr>
         <w:pStyle w:val="Heading2"/>
@@ -45332,8 +45600,8 @@
         <w:t xml:space="preserve">committed in this repo.)</w:t>
       </w:r>
     </w:p>
-    <w:bookmarkEnd w:id="72"/>
-    <w:bookmarkStart w:id="74" w:name="Xe2e8f17f312baf0f280f8a3dfcc5fa34b4105bf"/>
+    <w:bookmarkEnd w:id="75"/>
+    <w:bookmarkStart w:id="77" w:name="Xe2e8f17f312baf0f280f8a3dfcc5fa34b4105bf"/>
     <w:p>
       <w:pPr>
         <w:pStyle w:val="Heading2"/>
@@ -46148,7 +46416,7 @@
       <w:r>
         <w:t xml:space="preserve"> </w:t>
       </w:r>
-      <w:hyperlink r:id="rId73">
+      <w:hyperlink r:id="rId76">
         <w:r>
           <w:rPr>
             <w:rStyle w:val="Hyperlink"/>
@@ -46160,8 +46428,8 @@
         <w:t xml:space="preserve">).</w:t>
       </w:r>
     </w:p>
-    <w:bookmarkEnd w:id="74"/>
-    <w:bookmarkStart w:id="76" w:name="Xe9c7e4e932ad1908138a3909ff179a810da6d71"/>
+    <w:bookmarkEnd w:id="77"/>
+    <w:bookmarkStart w:id="79" w:name="Xe9c7e4e932ad1908138a3909ff179a810da6d71"/>
     <w:p>
       <w:pPr>
         <w:pStyle w:val="Heading2"/>
@@ -46861,7 +47129,7 @@
       <w:r>
         <w:t xml:space="preserve"> </w:t>
       </w:r>
-      <w:hyperlink r:id="rId75">
+      <w:hyperlink r:id="rId78">
         <w:r>
           <w:rPr>
             <w:rStyle w:val="Hyperlink"/>
@@ -47256,7 +47524,7 @@
         <w:t xml:space="preserve">, not another clone.</w:t>
       </w:r>
     </w:p>
-    <w:bookmarkEnd w:id="76"/>
+    <w:bookmarkEnd w:id="79"/>
     <w:sectPr>
       <w:footerReference r:id="rId9" w:type="default"/>
       <w:footnotePr>

</xml_diff>

<commit_message>
Koton user manual (English, French) with pictures; docs point to it
sdcard/manuals/koton/Koton.md, Koton.fr.md and their PDFs; 25 pictures
made by tools/manuals/koton_shots.sh (the app in the simulator on the
demo song). docs/03 Manuals, docs/04 Koton and HANDOFF mention it.

Co-Authored-By: Claude Opus 5.5 <noreply@anthropic.com>
Claude-Session: https://claude.ai/code/session_01GQR2HPR9tf5GJjUSCW3Lgo
</commit_message>
<xml_diff>
--- a/docs/exports/03-DEVELOPER-GUIDE.docx
+++ b/docs/exports/03-DEVELOPER-GUIDE.docx
@@ -51281,7 +51281,7 @@
     </w:p>
     <w:bookmarkEnd w:id="69"/>
     <w:bookmarkEnd w:id="70"/>
-    <w:bookmarkStart w:id="81" w:name="X636230dba256ccd30a2e68f8101290712b3f4c4"/>
+    <w:bookmarkStart w:id="82" w:name="X636230dba256ccd30a2e68f8101290712b3f4c4"/>
     <w:p>
       <w:pPr>
         <w:pStyle w:val="Heading2"/>
@@ -52776,7 +52776,7 @@
         <w:t xml:space="preserve">40</w:t>
       </w:r>
     </w:p>
-    <w:bookmarkStart w:id="79" w:name="screenshots-and-documentation"/>
+    <w:bookmarkStart w:id="80" w:name="screenshots-and-documentation"/>
     <w:p>
       <w:pPr>
         <w:pStyle w:val="Heading3"/>
@@ -53823,7 +53823,75 @@
         <w:t xml:space="preserve">.nl.md</w:t>
       </w:r>
       <w:r>
-        <w:t xml:space="preserve">.</w:t>
+        <w:t xml:space="preserve">. Koton's:</w:t>
+      </w:r>
+      <w:r>
+        <w:t xml:space="preserve"> </w:t>
+      </w:r>
+      <w:r>
+        <w:rPr>
+          <w:rStyle w:val="VerbatimChar"/>
+        </w:rPr>
+        <w:t xml:space="preserve">sdcard/manuals/koton/Koton.md</w:t>
+      </w:r>
+      <w:r>
+        <w:t xml:space="preserve">,</w:t>
+      </w:r>
+      <w:r>
+        <w:t xml:space="preserve"> </w:t>
+      </w:r>
+      <w:r>
+        <w:rPr>
+          <w:rStyle w:val="VerbatimChar"/>
+        </w:rPr>
+        <w:t xml:space="preserve">.fr.md</w:t>
+      </w:r>
+      <w:r>
+        <w:t xml:space="preserve">, its pictures by</w:t>
+      </w:r>
+      <w:r>
+        <w:t xml:space="preserve"> </w:t>
+      </w:r>
+      <w:hyperlink r:id="rId78">
+        <w:r>
+          <w:rPr>
+            <w:rStyle w:val="VerbatimChar"/>
+          </w:rPr>
+          <w:t xml:space="preserve">tools/manuals/koton_shots.sh</w:t>
+        </w:r>
+      </w:hyperlink>
+      <w:r>
+        <w:t xml:space="preserve"> </w:t>
+      </w:r>
+      <w:r>
+        <w:t xml:space="preserve">(the app</w:t>
+      </w:r>
+      <w:r>
+        <w:t xml:space="preserve"> </w:t>
+      </w:r>
+      <w:r>
+        <w:t xml:space="preserve">in the simulator on its demo song, 1920x1080, clicks at fixed places; the plugin editors are the</w:t>
+      </w:r>
+      <w:r>
+        <w:t xml:space="preserve"> </w:t>
+      </w:r>
+      <w:r>
+        <w:t xml:space="preserve">pictures</w:t>
+      </w:r>
+      <w:r>
+        <w:t xml:space="preserve"> </w:t>
+      </w:r>
+      <w:r>
+        <w:rPr>
+          <w:rStyle w:val="VerbatimChar"/>
+        </w:rPr>
+        <w:t xml:space="preserve">tools/tests/koton/plug_host_run.sh</w:t>
+      </w:r>
+      <w:r>
+        <w:t xml:space="preserve"> </w:t>
+      </w:r>
+      <w:r>
+        <w:t xml:space="preserve">made, the simulator running no plugin).</w:t>
       </w:r>
     </w:p>
     <w:p>
@@ -53847,7 +53915,7 @@
       <w:r>
         <w:t xml:space="preserve"> </w:t>
       </w:r>
-      <w:hyperlink r:id="rId78">
+      <w:hyperlink r:id="rId79">
         <w:r>
           <w:rPr>
             <w:rStyle w:val="VerbatimChar"/>
@@ -54071,8 +54139,8 @@
         <w:t xml:space="preserve">screenshot if the visual changes, then regenerates the exports.</w:t>
       </w:r>
     </w:p>
-    <w:bookmarkEnd w:id="79"/>
-    <w:bookmarkStart w:id="80" w:name="onyx-basic-the-interpreter"/>
+    <w:bookmarkEnd w:id="80"/>
+    <w:bookmarkStart w:id="81" w:name="onyx-basic-the-interpreter"/>
     <w:p>
       <w:pPr>
         <w:pStyle w:val="Heading3"/>
@@ -58240,9 +58308,9 @@
         <w:t xml:space="preserve">rewrites them).</w:t>
       </w:r>
     </w:p>
-    <w:bookmarkEnd w:id="80"/>
     <w:bookmarkEnd w:id="81"/>
-    <w:bookmarkStart w:id="82" w:name="Xc2ec260aede7afe7fa831ade27ff6c6be860f38"/>
+    <w:bookmarkEnd w:id="82"/>
+    <w:bookmarkStart w:id="83" w:name="Xc2ec260aede7afe7fa831ade27ff6c6be860f38"/>
     <w:p>
       <w:pPr>
         <w:pStyle w:val="Heading2"/>
@@ -58969,8 +59037,8 @@
         <w:t xml:space="preserve">"must match").</w:t>
       </w:r>
     </w:p>
-    <w:bookmarkEnd w:id="82"/>
-    <w:bookmarkStart w:id="83" w:name="X57cc4a25254639a1e87307c03f7beba3c173828"/>
+    <w:bookmarkEnd w:id="83"/>
+    <w:bookmarkStart w:id="84" w:name="X57cc4a25254639a1e87307c03f7beba3c173828"/>
     <w:p>
       <w:pPr>
         <w:pStyle w:val="Heading2"/>
@@ -59346,8 +59414,8 @@
         <w:t xml:space="preserve">committed in this repo.)</w:t>
       </w:r>
     </w:p>
-    <w:bookmarkEnd w:id="83"/>
-    <w:bookmarkStart w:id="85" w:name="Xe2e8f17f312baf0f280f8a3dfcc5fa34b4105bf"/>
+    <w:bookmarkEnd w:id="84"/>
+    <w:bookmarkStart w:id="86" w:name="Xe2e8f17f312baf0f280f8a3dfcc5fa34b4105bf"/>
     <w:p>
       <w:pPr>
         <w:pStyle w:val="Heading2"/>
@@ -60162,7 +60230,7 @@
       <w:r>
         <w:t xml:space="preserve"> </w:t>
       </w:r>
-      <w:hyperlink r:id="rId84">
+      <w:hyperlink r:id="rId85">
         <w:r>
           <w:rPr>
             <w:rStyle w:val="Hyperlink"/>
@@ -60174,8 +60242,8 @@
         <w:t xml:space="preserve">).</w:t>
       </w:r>
     </w:p>
-    <w:bookmarkEnd w:id="85"/>
-    <w:bookmarkStart w:id="87" w:name="Xe9c7e4e932ad1908138a3909ff179a810da6d71"/>
+    <w:bookmarkEnd w:id="86"/>
+    <w:bookmarkStart w:id="88" w:name="Xe9c7e4e932ad1908138a3909ff179a810da6d71"/>
     <w:p>
       <w:pPr>
         <w:pStyle w:val="Heading2"/>
@@ -60875,7 +60943,7 @@
       <w:r>
         <w:t xml:space="preserve"> </w:t>
       </w:r>
-      <w:hyperlink r:id="rId86">
+      <w:hyperlink r:id="rId87">
         <w:r>
           <w:rPr>
             <w:rStyle w:val="Hyperlink"/>
@@ -61270,7 +61338,7 @@
         <w:t xml:space="preserve">, not another clone.</w:t>
       </w:r>
     </w:p>
-    <w:bookmarkEnd w:id="87"/>
+    <w:bookmarkEnd w:id="88"/>
     <w:sectPr>
       <w:footerReference r:id="rId9" w:type="default"/>
       <w:footnotePr>

</xml_diff>

<commit_message>
Koton: Compose with AI remembers the last request
The dialog opens again with the last style, intention, bars and options
(and, from the transport bar or the AI menu, the last kind), kept in
SD:/koton/settings.json (aiLast). Docs and the manual (en, fr) say so.

Co-Authored-By: Claude Opus 5.5 <noreply@anthropic.com>
Claude-Session: https://claude.ai/code/session_01GQR2HPR9tf5GJjUSCW3Lgo
</commit_message>
<xml_diff>
--- a/docs/exports/03-DEVELOPER-GUIDE.docx
+++ b/docs/exports/03-DEVELOPER-GUIDE.docx
@@ -47513,7 +47513,22 @@
         </w:numPr>
       </w:pPr>
       <w:r>
-        <w:t xml:space="preserve">The app keeps the provider, the model and the API key in</w:t>
+        <w:t xml:space="preserve">The app keeps the provider, the model, the API key and the dialog's last request (</w:t>
+      </w:r>
+      <w:r>
+        <w:rPr>
+          <w:rStyle w:val="VerbatimChar"/>
+        </w:rPr>
+        <w:t xml:space="preserve">aiLast</w:t>
+      </w:r>
+      <w:r>
+        <w:t xml:space="preserve">: kind,</w:t>
+      </w:r>
+      <w:r>
+        <w:t xml:space="preserve"> </w:t>
+      </w:r>
+      <w:r>
+        <w:t xml:space="preserve">style, intention, bars, the options) in</w:t>
       </w:r>
       <w:r>
         <w:t xml:space="preserve"> </w:t>

</xml_diff>

<commit_message>
wtk: Backspace, Tab, Enter reach the focused text box (^H/^I/^M menu shortcuts need Ctrl held)
Menu::shortcut ran first for every key, and ^H is 8 = Backspace: in Courier, Backspace in a text
box opened the History ("^H") instead of deleting. The shared codes (8, 9, 13) now match a menu
item only while Ctrl is down. The card's app binaries relinked with the new libwtk.

Co-Authored-By: Claude Opus 5.5 <noreply@anthropic.com>
</commit_message>
<xml_diff>
--- a/docs/exports/03-DEVELOPER-GUIDE.docx
+++ b/docs/exports/03-DEVELOPER-GUIDE.docx
@@ -34680,7 +34680,7 @@
         <w:t xml:space="preserve"> </w:t>
       </w:r>
       <w:r>
-        <w:t xml:space="preserve">open. Avoid</w:t>
+        <w:t xml:space="preserve">open.</w:t>
       </w:r>
       <w:r>
         <w:t xml:space="preserve"> </w:t>
@@ -34692,10 +34692,7 @@
         <w:t xml:space="preserve">^I</w:t>
       </w:r>
       <w:r>
-        <w:t xml:space="preserve"> </w:t>
-      </w:r>
-      <w:r>
-        <w:t xml:space="preserve">(= Tab),</w:t>
+        <w:t xml:space="preserve">,</w:t>
       </w:r>
       <w:r>
         <w:t xml:space="preserve"> </w:t>
@@ -34707,10 +34704,7 @@
         <w:t xml:space="preserve">^H</w:t>
       </w:r>
       <w:r>
-        <w:t xml:space="preserve"> </w:t>
-      </w:r>
-      <w:r>
-        <w:t xml:space="preserve">(= Backspace),</w:t>
+        <w:t xml:space="preserve">,</w:t>
       </w:r>
       <w:r>
         <w:t xml:space="preserve"> </w:t>
@@ -34725,7 +34719,44 @@
         <w:t xml:space="preserve"> </w:t>
       </w:r>
       <w:r>
-        <w:t xml:space="preserve">(= Enter) as shortcuts.</w:t>
+        <w:t xml:space="preserve">share their key codes with Tab, Backspace and Enter:</w:t>
+      </w:r>
+      <w:r>
+        <w:t xml:space="preserve"> </w:t>
+      </w:r>
+      <w:r>
+        <w:rPr>
+          <w:rStyle w:val="VerbatimChar"/>
+        </w:rPr>
+        <w:t xml:space="preserve">Menu::shortcut</w:t>
+      </w:r>
+      <w:r>
+        <w:t xml:space="preserve"> </w:t>
+      </w:r>
+      <w:r>
+        <w:t xml:space="preserve">only takes them while</w:t>
+      </w:r>
+      <w:r>
+        <w:t xml:space="preserve"> </w:t>
+      </w:r>
+      <w:r>
+        <w:rPr>
+          <w:b/>
+          <w:bCs/>
+        </w:rPr>
+        <w:t xml:space="preserve">Ctrl</w:t>
+      </w:r>
+      <w:r>
+        <w:t xml:space="preserve"> </w:t>
+      </w:r>
+      <w:r>
+        <w:t xml:space="preserve">is actually held, so the plain key still reaches the focused</w:t>
+      </w:r>
+      <w:r>
+        <w:t xml:space="preserve"> </w:t>
+      </w:r>
+      <w:r>
+        <w:t xml:space="preserve">text box (still, prefer other letters).</w:t>
       </w:r>
     </w:p>
     <w:p>

</xml_diff>

<commit_message>
docs: NetSurf's network as in Chrome (06 section 22: certificates, brotli / zstd, HTTP/2, the sockets at exit, TLS sessions kept, the timings, the disk cache, preconnect, CORS, the libparserutils and gettimeofday fixes, cold / warm measurements); 07's network gaps closed and left; 03: the zstd and nghttp2 libraries; the TLS README: verification available
Co-Authored-By: Claude Opus 5.5 <noreply@anthropic.com>
Claude-Session: https://claude.ai/code/session_01UcY36na7Mp1DEYttKiw1pa
</commit_message>
<xml_diff>
--- a/docs/exports/03-DEVELOPER-GUIDE.docx
+++ b/docs/exports/03-DEVELOPER-GUIDE.docx
@@ -51247,7 +51247,106 @@
         <w:t xml:space="preserve"> </w:t>
       </w:r>
       <w:r>
-        <w:t xml:space="preserve">changes. A change is checked on the PC first:</w:t>
+        <w:t xml:space="preserve">changes. The network (docs/06 §22) links two more vendored libraries, built by</w:t>
+      </w:r>
+      <w:r>
+        <w:t xml:space="preserve"> </w:t>
+      </w:r>
+      <w:r>
+        <w:rPr>
+          <w:rStyle w:val="VerbatimChar"/>
+        </w:rPr>
+        <w:t xml:space="preserve">make -C user/netsurf</w:t>
+      </w:r>
+      <w:r>
+        <w:t xml:space="preserve"> </w:t>
+      </w:r>
+      <w:r>
+        <w:t xml:space="preserve">like the others:</w:t>
+      </w:r>
+      <w:r>
+        <w:t xml:space="preserve"> </w:t>
+      </w:r>
+      <w:r>
+        <w:rPr>
+          <w:rStyle w:val="VerbatimChar"/>
+        </w:rPr>
+        <w:t xml:space="preserve">third_party/zstd-1.5.7</w:t>
+      </w:r>
+      <w:r>
+        <w:t xml:space="preserve"> </w:t>
+      </w:r>
+      <w:r>
+        <w:t xml:space="preserve">(the decompressor only,</w:t>
+      </w:r>
+      <w:r>
+        <w:t xml:space="preserve"> </w:t>
+      </w:r>
+      <w:r>
+        <w:rPr>
+          <w:rStyle w:val="VerbatimChar"/>
+        </w:rPr>
+        <w:t xml:space="preserve">libzstddec.a</w:t>
+      </w:r>
+      <w:r>
+        <w:t xml:space="preserve">) and</w:t>
+      </w:r>
+      <w:r>
+        <w:t xml:space="preserve"> </w:t>
+      </w:r>
+      <w:r>
+        <w:rPr>
+          <w:rStyle w:val="VerbatimChar"/>
+        </w:rPr>
+        <w:t xml:space="preserve">third_party/nghttp2-1.70.0</w:t>
+      </w:r>
+      <w:r>
+        <w:t xml:space="preserve"> </w:t>
+      </w:r>
+      <w:r>
+        <w:t xml:space="preserve">(</w:t>
+      </w:r>
+      <w:r>
+        <w:rPr>
+          <w:rStyle w:val="VerbatimChar"/>
+        </w:rPr>
+        <w:t xml:space="preserve">libnghttp2.a</w:t>
+      </w:r>
+      <w:r>
+        <w:t xml:space="preserve">, its</w:t>
+      </w:r>
+      <w:r>
+        <w:t xml:space="preserve"> </w:t>
+      </w:r>
+      <w:r>
+        <w:rPr>
+          <w:rStyle w:val="VerbatimChar"/>
+        </w:rPr>
+        <w:t xml:space="preserve">config.h</w:t>
+      </w:r>
+      <w:r>
+        <w:t xml:space="preserve"> </w:t>
+      </w:r>
+      <w:r>
+        <w:t xml:space="preserve">written by</w:t>
+      </w:r>
+      <w:r>
+        <w:t xml:space="preserve"> </w:t>
+      </w:r>
+      <w:r>
+        <w:t xml:space="preserve">hand for newlib); the disk cache is</w:t>
+      </w:r>
+      <w:r>
+        <w:t xml:space="preserve"> </w:t>
+      </w:r>
+      <w:r>
+        <w:rPr>
+          <w:rStyle w:val="VerbatimChar"/>
+        </w:rPr>
+        <w:t xml:space="preserve">user/netsurf/onyx_cache.c</w:t>
+      </w:r>
+      <w:r>
+        <w:t xml:space="preserve">. A change is checked on the PC first:</w:t>
       </w:r>
       <w:r>
         <w:t xml:space="preserve"> </w:t>

</xml_diff>

<commit_message>
docs: JavaScript speed (docs/06 §30): the interpreter's wins, the code cache, the window during long scripts, the JIT
docs/06 §30: what github.com, m.facebook.com and google.com spend their time on
(PC bench profiles), the interpreter's measured wins, the DOM glue in C, the
code cache, the window kept responsive, the AArch64 JIT (its design, its
measures in exact AArch64 instruction counts, test262 under qemu: 35394 tests,
the same outcome as the interpreter), WAMR's fast JIT being x86-64 only. docs/07
§2's JIT and WebAssembly rows, docs/04 (js_jit, the jscache folder), docs/03 (the
JS bench). README.onyx points at §30. Exports regenerated.

Co-Authored-By: Claude Opus 5.5 <noreply@anthropic.com>
Claude-Session: https://claude.ai/code/session_01UcY36na7Mp1DEYttKiw1pa
</commit_message>
<xml_diff>
--- a/docs/exports/03-DEVELOPER-GUIDE.docx
+++ b/docs/exports/03-DEVELOPER-GUIDE.docx
@@ -53420,7 +53420,322 @@
         <w:t xml:space="preserve"> </w:t>
       </w:r>
       <w:r>
-        <w:t xml:space="preserve">the same page in Chromium.</w:t>
+        <w:t xml:space="preserve">the same page in Chromium. The</w:t>
+      </w:r>
+      <w:r>
+        <w:t xml:space="preserve"> </w:t>
+      </w:r>
+      <w:r>
+        <w:t xml:space="preserve">scripts' engine is QuickJS (</w:t>
+      </w:r>
+      <w:r>
+        <w:rPr>
+          <w:rStyle w:val="VerbatimChar"/>
+        </w:rPr>
+        <w:t xml:space="preserve">third_party/quickjs-ng-0.17.0</w:t>
+      </w:r>
+      <w:r>
+        <w:t xml:space="preserve">,</w:t>
+      </w:r>
+      <w:r>
+        <w:t xml:space="preserve"> </w:t>
+      </w:r>
+      <w:r>
+        <w:rPr>
+          <w:rStyle w:val="VerbatimChar"/>
+        </w:rPr>
+        <w:t xml:space="preserve">libquickjs.a</w:t>
+      </w:r>
+      <w:r>
+        <w:t xml:space="preserve">), with</w:t>
+      </w:r>
+      <w:r>
+        <w:t xml:space="preserve"> </w:t>
+      </w:r>
+      <w:r>
+        <w:t xml:space="preserve">WebAssembly on wasm3 (</w:t>
+      </w:r>
+      <w:r>
+        <w:rPr>
+          <w:rStyle w:val="VerbatimChar"/>
+        </w:rPr>
+        <w:t xml:space="preserve">third_party/wasm3-0.9.2</w:t>
+      </w:r>
+      <w:r>
+        <w:t xml:space="preserve">,</w:t>
+      </w:r>
+      <w:r>
+        <w:t xml:space="preserve"> </w:t>
+      </w:r>
+      <w:r>
+        <w:rPr>
+          <w:rStyle w:val="VerbatimChar"/>
+        </w:rPr>
+        <w:t xml:space="preserve">libm3.a</w:t>
+      </w:r>
+      <w:r>
+        <w:t xml:space="preserve">: both made by</w:t>
+      </w:r>
+      <w:r>
+        <w:t xml:space="preserve"> </w:t>
+      </w:r>
+      <w:r>
+        <w:rPr>
+          <w:rStyle w:val="VerbatimChar"/>
+        </w:rPr>
+        <w:t xml:space="preserve">make -C user/netsurf</w:t>
+      </w:r>
+      <w:r>
+        <w:t xml:space="preserve">, committed) and Web Crypto on the mbedTLS the app links for TLS (docs/06 §27);</w:t>
+      </w:r>
+      <w:r>
+        <w:t xml:space="preserve"> </w:t>
+      </w:r>
+      <w:r>
+        <w:rPr>
+          <w:rStyle w:val="VerbatimChar"/>
+        </w:rPr>
+        <w:t xml:space="preserve">sh tools/tests/netsurf/jstest.sh</w:t>
+      </w:r>
+      <w:r>
+        <w:t xml:space="preserve"> </w:t>
+      </w:r>
+      <w:r>
+        <w:t xml:space="preserve">runs their regression pages on the PC. The engine's speed</w:t>
+      </w:r>
+      <w:r>
+        <w:t xml:space="preserve"> </w:t>
+      </w:r>
+      <w:r>
+        <w:t xml:space="preserve">(docs/06 §30) is measured without the browser:</w:t>
+      </w:r>
+      <w:r>
+        <w:t xml:space="preserve"> </w:t>
+      </w:r>
+      <w:r>
+        <w:rPr>
+          <w:rStyle w:val="VerbatimChar"/>
+        </w:rPr>
+        <w:t xml:space="preserve">tools/tests/netsurf/jit/</w:t>
+      </w:r>
+      <w:r>
+        <w:t xml:space="preserve"> </w:t>
+      </w:r>
+      <w:r>
+        <w:t xml:space="preserve">builds QuickJS alone</w:t>
+      </w:r>
+      <w:r>
+        <w:t xml:space="preserve"> </w:t>
+      </w:r>
+      <w:r>
+        <w:t xml:space="preserve">(</w:t>
+      </w:r>
+      <w:r>
+        <w:rPr>
+          <w:rStyle w:val="VerbatimChar"/>
+        </w:rPr>
+        <w:t xml:space="preserve">build.sh</w:t>
+      </w:r>
+      <w:r>
+        <w:t xml:space="preserve">:</w:t>
+      </w:r>
+      <w:r>
+        <w:t xml:space="preserve"> </w:t>
+      </w:r>
+      <w:r>
+        <w:rPr>
+          <w:rStyle w:val="VerbatimChar"/>
+        </w:rPr>
+        <w:t xml:space="preserve">qjsrun</w:t>
+      </w:r>
+      <w:r>
+        <w:t xml:space="preserve"> </w:t>
+      </w:r>
+      <w:r>
+        <w:t xml:space="preserve">for the PC and AArch64 under</w:t>
+      </w:r>
+      <w:r>
+        <w:t xml:space="preserve"> </w:t>
+      </w:r>
+      <w:r>
+        <w:rPr>
+          <w:rStyle w:val="VerbatimChar"/>
+        </w:rPr>
+        <w:t xml:space="preserve">qemu-aarch64</w:t>
+      </w:r>
+      <w:r>
+        <w:t xml:space="preserve">), runs Octane and React</w:t>
+      </w:r>
+      <w:r>
+        <w:t xml:space="preserve"> </w:t>
+      </w:r>
+      <w:r>
+        <w:t xml:space="preserve">(</w:t>
+      </w:r>
+      <w:r>
+        <w:rPr>
+          <w:rStyle w:val="VerbatimChar"/>
+        </w:rPr>
+        <w:t xml:space="preserve">bench.sh</w:t>
+      </w:r>
+      <w:r>
+        <w:t xml:space="preserve">,</w:t>
+      </w:r>
+      <w:r>
+        <w:t xml:space="preserve"> </w:t>
+      </w:r>
+      <w:r>
+        <w:rPr>
+          <w:rStyle w:val="VerbatimChar"/>
+        </w:rPr>
+        <w:t xml:space="preserve">COUNT=1</w:t>
+      </w:r>
+      <w:r>
+        <w:t xml:space="preserve">: callgrind's instruction counts), test262 against another build</w:t>
+      </w:r>
+      <w:r>
+        <w:t xml:space="preserve"> </w:t>
+      </w:r>
+      <w:r>
+        <w:t xml:space="preserve">(</w:t>
+      </w:r>
+      <w:r>
+        <w:rPr>
+          <w:rStyle w:val="VerbatimChar"/>
+        </w:rPr>
+        <w:t xml:space="preserve">test262.py --bin2</w:t>
+      </w:r>
+      <w:r>
+        <w:t xml:space="preserve">), and counts AArch64 instructions exactly (</w:t>
+      </w:r>
+      <w:r>
+        <w:rPr>
+          <w:rStyle w:val="VerbatimChar"/>
+        </w:rPr>
+        <w:t xml:space="preserve">icount.sh</w:t>
+      </w:r>
+      <w:r>
+        <w:t xml:space="preserve">: the JIT, which is</w:t>
+      </w:r>
+      <w:r>
+        <w:t xml:space="preserve"> </w:t>
+      </w:r>
+      <w:r>
+        <w:t xml:space="preserve">AArch64 only --</w:t>
+      </w:r>
+      <w:r>
+        <w:t xml:space="preserve"> </w:t>
+      </w:r>
+      <w:r>
+        <w:rPr>
+          <w:rStyle w:val="VerbatimChar"/>
+        </w:rPr>
+        <w:t xml:space="preserve">QJS_JIT=n</w:t>
+      </w:r>
+      <w:r>
+        <w:t xml:space="preserve"> </w:t>
+      </w:r>
+      <w:r>
+        <w:t xml:space="preserve">turns it on in</w:t>
+      </w:r>
+      <w:r>
+        <w:t xml:space="preserve"> </w:t>
+      </w:r>
+      <w:r>
+        <w:rPr>
+          <w:rStyle w:val="VerbatimChar"/>
+        </w:rPr>
+        <w:t xml:space="preserve">qjsrun</w:t>
+      </w:r>
+      <w:r>
+        <w:t xml:space="preserve">). A change to</w:t>
+      </w:r>
+      <w:r>
+        <w:t xml:space="preserve"> </w:t>
+      </w:r>
+      <w:r>
+        <w:rPr>
+          <w:rStyle w:val="VerbatimChar"/>
+        </w:rPr>
+        <w:t xml:space="preserve">quickjs.c</w:t>
+      </w:r>
+      <w:r>
+        <w:t xml:space="preserve"> </w:t>
+      </w:r>
+      <w:r>
+        <w:t xml:space="preserve">(or</w:t>
+      </w:r>
+      <w:r>
+        <w:t xml:space="preserve"> </w:t>
+      </w:r>
+      <w:r>
+        <w:rPr>
+          <w:rStyle w:val="VerbatimChar"/>
+        </w:rPr>
+        <w:t xml:space="preserve">quickjs-jit.c</w:t>
+      </w:r>
+      <w:r>
+        <w:t xml:space="preserve">) means</w:t>
+      </w:r>
+      <w:r>
+        <w:t xml:space="preserve"> </w:t>
+      </w:r>
+      <w:r>
+        <w:rPr>
+          <w:rStyle w:val="VerbatimChar"/>
+        </w:rPr>
+        <w:t xml:space="preserve">libquickjs.a</w:t>
+      </w:r>
+      <w:r>
+        <w:t xml:space="preserve"> </w:t>
+      </w:r>
+      <w:r>
+        <w:t xml:space="preserve">made again: delete</w:t>
+      </w:r>
+      <w:r>
+        <w:t xml:space="preserve"> </w:t>
+      </w:r>
+      <w:r>
+        <w:rPr>
+          <w:rStyle w:val="VerbatimChar"/>
+        </w:rPr>
+        <w:t xml:space="preserve">third_party/quickjs-ng-0.17.0/*.o</w:t>
+      </w:r>
+      <w:r>
+        <w:t xml:space="preserve"> </w:t>
+      </w:r>
+      <w:r>
+        <w:t xml:space="preserve">first. The scripts' compiled code is cached on the card (</w:t>
+      </w:r>
+      <w:r>
+        <w:rPr>
+          <w:rStyle w:val="VerbatimChar"/>
+        </w:rPr>
+        <w:t xml:space="preserve">SD:/apps/netsurf.app/jscache/</w:t>
+      </w:r>
+      <w:r>
+        <w:t xml:space="preserve">,</w:t>
+      </w:r>
+      <w:r>
+        <w:t xml:space="preserve"> </w:t>
+      </w:r>
+      <w:r>
+        <w:t xml:space="preserve">keyed by the engine's build: a new</w:t>
+      </w:r>
+      <w:r>
+        <w:t xml:space="preserve"> </w:t>
+      </w:r>
+      <w:r>
+        <w:rPr>
+          <w:rStyle w:val="VerbatimChar"/>
+        </w:rPr>
+        <w:t xml:space="preserve">libquickjs.a</w:t>
+      </w:r>
+      <w:r>
+        <w:t xml:space="preserve"> </w:t>
+      </w:r>
+      <w:r>
+        <w:t xml:space="preserve">starts it afresh).</w:t>
       </w:r>
     </w:p>
     <w:p>

</xml_diff>

<commit_message>
Docs: Onyx Remote over Wi-Fi -- rounds in flight, probes, coalesced pointer, reconnection, the status and kmsg lines
04 (user guide): what the status shows, how lost packets are handled, the automatic
reconnection, the new kmsg fields; 03 (developer guide): the credits / CAPS / PING / PONG
design and the host tests. The .docx exports regenerated (the PDFs need LibreOffice Writer,
absent here).

Co-Authored-By: Claude Opus 5.5 <noreply@anthropic.com>
Claude-Session: https://claude.ai/code/session_01UcY36na7Mp1DEYttKiw1pa
</commit_message>
<xml_diff>
--- a/docs/exports/03-DEVELOPER-GUIDE.docx
+++ b/docs/exports/03-DEVELOPER-GUIDE.docx
@@ -64576,13 +64576,153 @@
         <w:t xml:space="preserve">user/bin/rdpd.c</w:t>
       </w:r>
       <w:r>
-        <w:t xml:space="preserve">. Host test (mock kapi, a Python</w:t>
-      </w:r>
-      <w:r>
-        <w:t xml:space="preserve"> </w:t>
-      </w:r>
-      <w:r>
-        <w:t xml:space="preserve">client):</w:t>
+        <w:t xml:space="preserve">.</w:t>
+      </w:r>
+      <w:r>
+        <w:t xml:space="preserve"> </w:t>
+      </w:r>
+      <w:r>
+        <w:rPr>
+          <w:b/>
+          <w:bCs/>
+        </w:rPr>
+        <w:t xml:space="preserve">Loss tolerance</w:t>
+      </w:r>
+      <w:r>
+        <w:t xml:space="preserve"> </w:t>
+      </w:r>
+      <w:r>
+        <w:t xml:space="preserve">(Wi-Fi): a</w:t>
+      </w:r>
+      <w:r>
+        <w:t xml:space="preserve"> </w:t>
+      </w:r>
+      <w:r>
+        <w:t xml:space="preserve">round is sent only when something changed, and only while the server has</w:t>
+      </w:r>
+      <w:r>
+        <w:t xml:space="preserve"> </w:t>
+      </w:r>
+      <w:r>
+        <w:rPr>
+          <w:b/>
+          <w:bCs/>
+        </w:rPr>
+        <w:t xml:space="preserve">credit</w:t>
+      </w:r>
+      <w:r>
+        <w:t xml:space="preserve"> </w:t>
+      </w:r>
+      <w:r>
+        <w:t xml:space="preserve">(each</w:t>
+      </w:r>
+      <w:r>
+        <w:t xml:space="preserve"> </w:t>
+      </w:r>
+      <w:r>
+        <w:t xml:space="preserve">READY gives one); a client setting hello option bit 2 gets</w:t>
+      </w:r>
+      <w:r>
+        <w:t xml:space="preserve"> </w:t>
+      </w:r>
+      <w:r>
+        <w:rPr>
+          <w:rStyle w:val="VerbatimChar"/>
+        </w:rPr>
+        <w:t xml:space="preserve">CAPS</w:t>
+      </w:r>
+      <w:r>
+        <w:t xml:space="preserve"> </w:t>
+      </w:r>
+      <w:r>
+        <w:t xml:space="preserve">(9) and 3 rounds in flight</w:t>
+      </w:r>
+      <w:r>
+        <w:t xml:space="preserve"> </w:t>
+      </w:r>
+      <w:r>
+        <w:t xml:space="preserve">(an older client: lock-step, its READYs alone); a round unanswered for 250 ms makes rdpd send</w:t>
+      </w:r>
+      <w:r>
+        <w:t xml:space="preserve"> </w:t>
+      </w:r>
+      <w:r>
+        <w:t xml:space="preserve">small</w:t>
+      </w:r>
+      <w:r>
+        <w:t xml:space="preserve"> </w:t>
+      </w:r>
+      <w:r>
+        <w:rPr>
+          <w:rStyle w:val="VerbatimChar"/>
+        </w:rPr>
+        <w:t xml:space="preserve">PING</w:t>
+      </w:r>
+      <w:r>
+        <w:t xml:space="preserve">s (10) -- the PC's dup ACKs make Circle resend its lost tail segment at once</w:t>
+      </w:r>
+      <w:r>
+        <w:t xml:space="preserve"> </w:t>
+      </w:r>
+      <w:r>
+        <w:t xml:space="preserve">instead of after its 1 s minimum RTO, and the client's</w:t>
+      </w:r>
+      <w:r>
+        <w:t xml:space="preserve"> </w:t>
+      </w:r>
+      <w:r>
+        <w:rPr>
+          <w:rStyle w:val="VerbatimChar"/>
+        </w:rPr>
+        <w:t xml:space="preserve">PONG</w:t>
+      </w:r>
+      <w:r>
+        <w:t xml:space="preserve">s (client 8) do the same for a</w:t>
+      </w:r>
+      <w:r>
+        <w:t xml:space="preserve"> </w:t>
+      </w:r>
+      <w:r>
+        <w:t xml:space="preserve">READY the PC lost; a pipelined client also gets a PING every 2 s when idle and is dropped</w:t>
+      </w:r>
+      <w:r>
+        <w:t xml:space="preserve"> </w:t>
+      </w:r>
+      <w:r>
+        <w:t xml:space="preserve">after 12 s of silence. Onyx Remote (</w:t>
+      </w:r>
+      <w:r>
+        <w:rPr>
+          <w:rStyle w:val="VerbatimChar"/>
+        </w:rPr>
+        <w:t xml:space="preserve">Connection.cs</w:t>
+      </w:r>
+      <w:r>
+        <w:t xml:space="preserve">) sends from its own thread, coalesces the</w:t>
+      </w:r>
+      <w:r>
+        <w:t xml:space="preserve"> </w:t>
+      </w:r>
+      <w:r>
+        <w:t xml:space="preserve">pointer's moves (one per 16 ms, the latest; buttons, wheel and keys at once, in order),</w:t>
+      </w:r>
+      <w:r>
+        <w:t xml:space="preserve"> </w:t>
+      </w:r>
+      <w:r>
+        <w:t xml:space="preserve">applies a round to its model only at its END, validates every message (a damaged one is</w:t>
+      </w:r>
+      <w:r>
+        <w:t xml:space="preserve"> </w:t>
+      </w:r>
+      <w:r>
+        <w:t xml:space="preserve">skipped, a damaged stream reconnects) and reconnects by itself (0.5 .. 8 s back-off, the</w:t>
+      </w:r>
+      <w:r>
+        <w:t xml:space="preserve"> </w:t>
+      </w:r>
+      <w:r>
+        <w:t xml:space="preserve">windows kept). Host tests:</w:t>
       </w:r>
       <w:r>
         <w:t xml:space="preserve"> </w:t>
@@ -64594,7 +64734,103 @@
         <w:t xml:space="preserve">sh tools/tests/run_rdpd_test.sh</w:t>
       </w:r>
       <w:r>
-        <w:t xml:space="preserve">.</w:t>
+        <w:t xml:space="preserve"> </w:t>
+      </w:r>
+      <w:r>
+        <w:t xml:space="preserve">(a mock kapi, a Python client),</w:t>
+      </w:r>
+      <w:r>
+        <w:t xml:space="preserve"> </w:t>
+      </w:r>
+      <w:r>
+        <w:rPr>
+          <w:rStyle w:val="VerbatimChar"/>
+        </w:rPr>
+        <w:t xml:space="preserve">sh tools/tests/run_rdpd_pipeline_test.sh</w:t>
+      </w:r>
+      <w:r>
+        <w:t xml:space="preserve"> </w:t>
+      </w:r>
+      <w:r>
+        <w:t xml:space="preserve">(rdpd against the real</w:t>
+      </w:r>
+      <w:r>
+        <w:t xml:space="preserve"> </w:t>
+      </w:r>
+      <w:r>
+        <w:rPr>
+          <w:rStyle w:val="VerbatimChar"/>
+        </w:rPr>
+        <w:t xml:space="preserve">kapi.h</w:t>
+      </w:r>
+      <w:r>
+        <w:t xml:space="preserve"> </w:t>
+      </w:r>
+      <w:r>
+        <w:t xml:space="preserve">with fake windows</w:t>
+      </w:r>
+      <w:r>
+        <w:t xml:space="preserve"> </w:t>
+      </w:r>
+      <w:r>
+        <w:t xml:space="preserve">--</w:t>
+      </w:r>
+      <w:r>
+        <w:t xml:space="preserve"> </w:t>
+      </w:r>
+      <w:r>
+        <w:rPr>
+          <w:rStyle w:val="VerbatimChar"/>
+        </w:rPr>
+        <w:t xml:space="preserve">tools/tests/rdpd/rdpdhost.c</w:t>
+      </w:r>
+      <w:r>
+        <w:t xml:space="preserve"> </w:t>
+      </w:r>
+      <w:r>
+        <w:t xml:space="preserve">--, the current and an older rdpd, a Python client both</w:t>
+      </w:r>
+      <w:r>
+        <w:t xml:space="preserve"> </w:t>
+      </w:r>
+      <w:r>
+        <w:t xml:space="preserve">ways, and Onyx Remote's own</w:t>
+      </w:r>
+      <w:r>
+        <w:t xml:space="preserve"> </w:t>
+      </w:r>
+      <w:r>
+        <w:rPr>
+          <w:rStyle w:val="VerbatimChar"/>
+        </w:rPr>
+        <w:t xml:space="preserve">Connection.cs</w:t>
+      </w:r>
+      <w:r>
+        <w:t xml:space="preserve"> </w:t>
+      </w:r>
+      <w:r>
+        <w:t xml:space="preserve">when the .NET SDK is there), and</w:t>
+      </w:r>
+      <w:r>
+        <w:t xml:space="preserve"> </w:t>
+      </w:r>
+      <w:r>
+        <w:rPr>
+          <w:rStyle w:val="VerbatimChar"/>
+        </w:rPr>
+        <w:t xml:space="preserve">unshare -rn python3 tools/tests/rdpd/loss_bench.py</w:t>
+      </w:r>
+      <w:r>
+        <w:t xml:space="preserve"> </w:t>
+      </w:r>
+      <w:r>
+        <w:t xml:space="preserve">(rounds a second over a loopback that</w:t>
+      </w:r>
+      <w:r>
+        <w:t xml:space="preserve"> </w:t>
+      </w:r>
+      <w:r>
+        <w:t xml:space="preserve">drops 20 % of the packets).</w:t>
       </w:r>
     </w:p>
     <w:p>

</xml_diff>

<commit_message>
Jet: quadtest.sh's noise floor (awk quoting), §36's layout note; docs exports regenerated
Co-Authored-By: Claude Opus 5.5 <noreply@anthropic.com>
Claude-Session: https://claude.ai/code/session_01UcY36na7Mp1DEYttKiw1pa
</commit_message>
<xml_diff>
--- a/docs/exports/03-DEVELOPER-GUIDE.docx
+++ b/docs/exports/03-DEVELOPER-GUIDE.docx
@@ -54435,7 +54435,28 @@
         <w:t xml:space="preserve"> </w:t>
       </w:r>
       <w:r>
-        <w:t xml:space="preserve">runs their regression pages on the PC. The engine's speed</w:t>
+        <w:t xml:space="preserve">runs their regression pages on the PC,</w:t>
+      </w:r>
+      <w:r>
+        <w:t xml:space="preserve"> </w:t>
+      </w:r>
+      <w:r>
+        <w:rPr>
+          <w:rStyle w:val="VerbatimChar"/>
+        </w:rPr>
+        <w:t xml:space="preserve">quadtest.sh</w:t>
+      </w:r>
+      <w:r>
+        <w:t xml:space="preserve"> </w:t>
+      </w:r>
+      <w:r>
+        <w:t xml:space="preserve">the</w:t>
+      </w:r>
+      <w:r>
+        <w:t xml:space="preserve"> </w:t>
+      </w:r>
+      <w:r>
+        <w:t xml:space="preserve">micro-benchmarks of what must stay linear in a page's size (docs/06 §36). The engine's speed</w:t>
       </w:r>
       <w:r>
         <w:t xml:space="preserve"> </w:t>

</xml_diff>

<commit_message>
Archiver, version 1: ZIP opened, browsed, extracted (folders kept / from the current folder / flat), changed (add, delete, rename, new folder); files dropped from the File Viewer go into the folder under the pointer, rows dragged out are extracted to RAM:, a file opened and saved is put back; jobs on a thread. Built for the Pi (zlib/libz.a), staged in sdcard/apps/archiver.app, .zip associated; screenshots, docs 03 / 04, HANDOFF; the simulator's script gets dragover / drop
Co-Authored-By: Claude Opus 5.5 <noreply@anthropic.com>
Claude-Session: https://claude.ai/code/session_012k6pqyonBBqCtDQrtttmUW
</commit_message>
<xml_diff>
--- a/docs/exports/03-DEVELOPER-GUIDE.docx
+++ b/docs/exports/03-DEVELOPER-GUIDE.docx
@@ -8348,7 +8348,7 @@
     </w:p>
     <w:bookmarkEnd w:id="40"/>
     <w:bookmarkEnd w:id="41"/>
-    <w:bookmarkStart w:id="48" w:name="Xb2b57b3b718f4be25317d23f525cf8bb9daa0d0"/>
+    <w:bookmarkStart w:id="49" w:name="Xb2b57b3b718f4be25317d23f525cf8bb9daa0d0"/>
     <w:p>
       <w:pPr>
         <w:pStyle w:val="Heading2"/>
@@ -39355,7 +39355,1032 @@
         <w:t xml:space="preserve">for complete examples.</w:t>
       </w:r>
     </w:p>
-    <w:bookmarkStart w:id="42" w:name="X292acd1b77966009c7799e5ef4fd99b22efd18c"/>
+    <w:bookmarkStart w:id="42" w:name="the-archiver-userappsarchiver"/>
+    <w:p>
+      <w:pPr>
+        <w:pStyle w:val="Heading3"/>
+      </w:pPr>
+      <w:r>
+        <w:t xml:space="preserve">The Archiver (</w:t>
+      </w:r>
+      <w:r>
+        <w:rPr>
+          <w:rStyle w:val="VerbatimChar"/>
+        </w:rPr>
+        <w:t xml:space="preserve">user/Apps/archiver</w:t>
+      </w:r>
+      <w:r>
+        <w:t xml:space="preserve">)</w:t>
+      </w:r>
+    </w:p>
+    <w:p>
+      <w:pPr>
+        <w:pStyle w:val="FirstParagraph"/>
+      </w:pPr>
+      <w:r>
+        <w:t xml:space="preserve">The archive manager (the plan and the user's decisions:</w:t>
+      </w:r>
+      <w:r>
+        <w:t xml:space="preserve"> </w:t>
+      </w:r>
+      <w:r>
+        <w:rPr>
+          <w:rStyle w:val="VerbatimChar"/>
+        </w:rPr>
+        <w:t xml:space="preserve">docs/archiver/README.md</w:t>
+      </w:r>
+      <w:r>
+        <w:t xml:space="preserve">; its use:</w:t>
+      </w:r>
+      <w:r>
+        <w:t xml:space="preserve"> </w:t>
+      </w:r>
+      <w:r>
+        <w:t xml:space="preserve">docs/04 §9) is a</w:t>
+      </w:r>
+      <w:r>
+        <w:t xml:space="preserve"> </w:t>
+      </w:r>
+      <w:r>
+        <w:rPr>
+          <w:b/>
+          <w:bCs/>
+        </w:rPr>
+        <w:t xml:space="preserve">newlib</w:t>
+      </w:r>
+      <w:r>
+        <w:t xml:space="preserve"> </w:t>
+      </w:r>
+      <w:r>
+        <w:t xml:space="preserve">wtk app with FreeType text (</w:t>
+      </w:r>
+      <w:r>
+        <w:rPr>
+          <w:rStyle w:val="VerbatimChar"/>
+        </w:rPr>
+        <w:t xml:space="preserve">archiver.elf</w:t>
+      </w:r>
+      <w:r>
+        <w:t xml:space="preserve"> </w:t>
+      </w:r>
+      <w:r>
+        <w:t xml:space="preserve">in</w:t>
+      </w:r>
+      <w:r>
+        <w:t xml:space="preserve"> </w:t>
+      </w:r>
+      <w:r>
+        <w:rPr>
+          <w:rStyle w:val="VerbatimChar"/>
+        </w:rPr>
+        <w:t xml:space="preserve">user/Makefile</w:t>
+      </w:r>
+      <w:r>
+        <w:t xml:space="preserve">, with</w:t>
+      </w:r>
+      <w:r>
+        <w:t xml:space="preserve"> </w:t>
+      </w:r>
+      <w:r>
+        <w:rPr>
+          <w:b/>
+          <w:bCs/>
+        </w:rPr>
+        <w:t xml:space="preserve">zlib</w:t>
+      </w:r>
+      <w:r>
+        <w:t xml:space="preserve"> </w:t>
+      </w:r>
+      <w:r>
+        <w:t xml:space="preserve">built from</w:t>
+      </w:r>
+      <w:r>
+        <w:t xml:space="preserve"> </w:t>
+      </w:r>
+      <w:r>
+        <w:rPr>
+          <w:rStyle w:val="VerbatimChar"/>
+        </w:rPr>
+        <w:t xml:space="preserve">third_party/zlib-1.3.1</w:t>
+      </w:r>
+      <w:r>
+        <w:t xml:space="preserve"> </w:t>
+      </w:r>
+      <w:r>
+        <w:t xml:space="preserve">into</w:t>
+      </w:r>
+      <w:r>
+        <w:t xml:space="preserve"> </w:t>
+      </w:r>
+      <w:r>
+        <w:rPr>
+          <w:rStyle w:val="VerbatimChar"/>
+        </w:rPr>
+        <w:t xml:space="preserve">user/zlib/libz.a</w:t>
+      </w:r>
+      <w:r>
+        <w:t xml:space="preserve">), one translation unit:</w:t>
+      </w:r>
+    </w:p>
+    <w:tbl>
+      <w:tblPr>
+        <w:tblStyle w:val="Table"/>
+        <w:tblW w:type="auto" w:w="0"/>
+        <w:tblLook w:firstRow="1" w:lastRow="0" w:firstColumn="0" w:lastColumn="0" w:noHBand="0" w:noVBand="0" w:val="0020"/>
+      </w:tblPr>
+      <w:tblGrid>
+        <w:gridCol w:w="3960"/>
+        <w:gridCol w:w="3960"/>
+      </w:tblGrid>
+      <w:tr>
+        <w:trPr>
+          <w:tblHeader w:val="on"/>
+        </w:trPr>
+        <w:tc>
+          <w:tcPr/>
+          <w:p>
+            <w:pPr>
+              <w:pStyle w:val="Compact"/>
+            </w:pPr>
+            <w:r>
+              <w:t xml:space="preserve">File</w:t>
+            </w:r>
+          </w:p>
+        </w:tc>
+        <w:tc>
+          <w:tcPr/>
+          <w:p>
+            <w:pPr>
+              <w:pStyle w:val="Compact"/>
+            </w:pPr>
+            <w:r>
+              <w:t xml:space="preserve">What</w:t>
+            </w:r>
+          </w:p>
+        </w:tc>
+      </w:tr>
+      <w:tr>
+        <w:tc>
+          <w:tcPr/>
+          <w:p>
+            <w:pPr>
+              <w:pStyle w:val="Compact"/>
+            </w:pPr>
+            <w:r>
+              <w:rPr>
+                <w:rStyle w:val="VerbatimChar"/>
+              </w:rPr>
+              <w:t xml:space="preserve">arc.h</w:t>
+            </w:r>
+            <w:r>
+              <w:t xml:space="preserve"> </w:t>
+            </w:r>
+            <w:r>
+              <w:t xml:space="preserve">(namespace</w:t>
+            </w:r>
+            <w:r>
+              <w:t xml:space="preserve"> </w:t>
+            </w:r>
+            <w:r>
+              <w:rPr>
+                <w:rStyle w:val="VerbatimChar"/>
+              </w:rPr>
+              <w:t xml:space="preserve">arc</w:t>
+            </w:r>
+            <w:r>
+              <w:t xml:space="preserve">)</w:t>
+            </w:r>
+          </w:p>
+        </w:tc>
+        <w:tc>
+          <w:tcPr/>
+          <w:p>
+            <w:pPr>
+              <w:pStyle w:val="Compact"/>
+            </w:pPr>
+            <w:r>
+              <w:t xml:space="preserve">The engine's base, no wtk:</w:t>
+            </w:r>
+            <w:r>
+              <w:t xml:space="preserve"> </w:t>
+            </w:r>
+            <w:r>
+              <w:rPr>
+                <w:rStyle w:val="VerbatimChar"/>
+              </w:rPr>
+              <w:t xml:space="preserve">Entry</w:t>
+            </w:r>
+            <w:r>
+              <w:t xml:space="preserve"> </w:t>
+            </w:r>
+            <w:r>
+              <w:t xml:space="preserve">(a path in UTF-8, sizes, CRC, DOS time, the format's fields),</w:t>
+            </w:r>
+            <w:r>
+              <w:t xml:space="preserve"> </w:t>
+            </w:r>
+            <w:r>
+              <w:rPr>
+                <w:rStyle w:val="VerbatimChar"/>
+              </w:rPr>
+              <w:t xml:space="preserve">Archive</w:t>
+            </w:r>
+            <w:r>
+              <w:t xml:space="preserve"> </w:t>
+            </w:r>
+            <w:r>
+              <w:t xml:space="preserve">(the interface a format implements:</w:t>
+            </w:r>
+            <w:r>
+              <w:t xml:space="preserve"> </w:t>
+            </w:r>
+            <w:r>
+              <w:rPr>
+                <w:rStyle w:val="VerbatimChar"/>
+              </w:rPr>
+              <w:t xml:space="preserve">open</w:t>
+            </w:r>
+            <w:r>
+              <w:t xml:space="preserve">,</w:t>
+            </w:r>
+            <w:r>
+              <w:t xml:space="preserve"> </w:t>
+            </w:r>
+            <w:r>
+              <w:rPr>
+                <w:rStyle w:val="VerbatimChar"/>
+              </w:rPr>
+              <w:t xml:space="preserve">extract (i, Sink &amp;, Progress *)</w:t>
+            </w:r>
+            <w:r>
+              <w:t xml:space="preserve">,</w:t>
+            </w:r>
+            <w:r>
+              <w:t xml:space="preserve"> </w:t>
+            </w:r>
+            <w:r>
+              <w:rPr>
+                <w:rStyle w:val="VerbatimChar"/>
+              </w:rPr>
+              <w:t xml:space="preserve">rewrite (Plan, dest, Progress *)</w:t>
+            </w:r>
+            <w:r>
+              <w:t xml:space="preserve">,</w:t>
+            </w:r>
+            <w:r>
+              <w:t xml:space="preserve"> </w:t>
+            </w:r>
+            <w:r>
+              <w:rPr>
+                <w:rStyle w:val="VerbatimChar"/>
+              </w:rPr>
+              <w:t xml:space="preserve">writable</w:t>
+            </w:r>
+            <w:r>
+              <w:t xml:space="preserve">,</w:t>
+            </w:r>
+            <w:r>
+              <w:t xml:space="preserve"> </w:t>
+            </w:r>
+            <w:r>
+              <w:rPr>
+                <w:rStyle w:val="VerbatimChar"/>
+              </w:rPr>
+              <w:t xml:space="preserve">methodName</w:t>
+            </w:r>
+            <w:r>
+              <w:t xml:space="preserve">),</w:t>
+            </w:r>
+            <w:r>
+              <w:t xml:space="preserve"> </w:t>
+            </w:r>
+            <w:r>
+              <w:rPr>
+                <w:rStyle w:val="VerbatimChar"/>
+              </w:rPr>
+              <w:t xml:space="preserve">Plan</w:t>
+            </w:r>
+            <w:r>
+              <w:t xml:space="preserve"> </w:t>
+            </w:r>
+            <w:r>
+              <w:t xml:space="preserve">(a rewrite: the entries kept — renamed or not — and the new ones, a file of the disk or a folder),</w:t>
+            </w:r>
+            <w:r>
+              <w:t xml:space="preserve"> </w:t>
+            </w:r>
+            <w:r>
+              <w:rPr>
+                <w:rStyle w:val="VerbatimChar"/>
+              </w:rPr>
+              <w:t xml:space="preserve">Reader</w:t>
+            </w:r>
+            <w:r>
+              <w:t xml:space="preserve"> </w:t>
+            </w:r>
+            <w:r>
+              <w:t xml:space="preserve">(random access:</w:t>
+            </w:r>
+            <w:r>
+              <w:t xml:space="preserve"> </w:t>
+            </w:r>
+            <w:r>
+              <w:rPr>
+                <w:rStyle w:val="VerbatimChar"/>
+              </w:rPr>
+              <w:t xml:space="preserve">kapi_open</w:t>
+            </w:r>
+            <w:r>
+              <w:t xml:space="preserve"> </w:t>
+            </w:r>
+            <w:r>
+              <w:t xml:space="preserve">+</w:t>
+            </w:r>
+            <w:r>
+              <w:t xml:space="preserve"> </w:t>
+            </w:r>
+            <w:r>
+              <w:rPr>
+                <w:rStyle w:val="VerbatimChar"/>
+              </w:rPr>
+              <w:t xml:space="preserve">kapi_seek</w:t>
+            </w:r>
+            <w:r>
+              <w:t xml:space="preserve">, files of any size, not slurped like newlib's),</w:t>
+            </w:r>
+            <w:r>
+              <w:t xml:space="preserve"> </w:t>
+            </w:r>
+            <w:r>
+              <w:rPr>
+                <w:rStyle w:val="VerbatimChar"/>
+              </w:rPr>
+              <w:t xml:space="preserve">FileSink</w:t>
+            </w:r>
+            <w:r>
+              <w:t xml:space="preserve"> </w:t>
+            </w:r>
+            <w:r>
+              <w:t xml:space="preserve">(a</w:t>
+            </w:r>
+            <w:r>
+              <w:t xml:space="preserve"> </w:t>
+            </w:r>
+            <w:r>
+              <w:rPr>
+                <w:rStyle w:val="VerbatimChar"/>
+              </w:rPr>
+              <w:t xml:space="preserve">kapi_file_out</w:t>
+            </w:r>
+            <w:r>
+              <w:t xml:space="preserve"> </w:t>
+            </w:r>
+            <w:r>
+              <w:t xml:space="preserve">stream), CP437 → UTF-8, DOS dates, human sizes.</w:t>
+            </w:r>
+          </w:p>
+        </w:tc>
+      </w:tr>
+      <w:tr>
+        <w:tc>
+          <w:tcPr/>
+          <w:p>
+            <w:pPr>
+              <w:pStyle w:val="Compact"/>
+            </w:pPr>
+            <w:r>
+              <w:rPr>
+                <w:rStyle w:val="VerbatimChar"/>
+              </w:rPr>
+              <w:t xml:space="preserve">zip.h</w:t>
+            </w:r>
+          </w:p>
+        </w:tc>
+        <w:tc>
+          <w:tcPr/>
+          <w:p>
+            <w:pPr>
+              <w:pStyle w:val="Compact"/>
+            </w:pPr>
+            <w:r>
+              <w:t xml:space="preserve">ZIP: the central directory (zip64, Info-ZIP's Unicode path, a self-extractor's offset, a UTF-8 name without its flag), extract (Store, Deflate through zlib, ZipCrypto), rewrite (the kept entries copied packed under a new local header; the new ones stored, deflated in memory when small — stored if that is not smaller —, streamed with a data descriptor when big; zip64 records when needed).</w:t>
+            </w:r>
+          </w:p>
+        </w:tc>
+      </w:tr>
+      <w:tr>
+        <w:tc>
+          <w:tcPr/>
+          <w:p>
+            <w:pPr>
+              <w:pStyle w:val="Compact"/>
+            </w:pPr>
+            <w:r>
+              <w:rPr>
+                <w:rStyle w:val="VerbatimChar"/>
+              </w:rPr>
+              <w:t xml:space="preserve">ops.h</w:t>
+            </w:r>
+          </w:p>
+        </w:tc>
+        <w:tc>
+          <w:tcPr/>
+          <w:p>
+            <w:pPr>
+              <w:pStyle w:val="Compact"/>
+            </w:pPr>
+            <w:r>
+              <w:t xml:space="preserve">The operations whatever the format:</w:t>
+            </w:r>
+            <w:r>
+              <w:t xml:space="preserve"> </w:t>
+            </w:r>
+            <w:r>
+              <w:rPr>
+                <w:rStyle w:val="VerbatimChar"/>
+              </w:rPr>
+              <w:t xml:space="preserve">archive_open</w:t>
+            </w:r>
+            <w:r>
+              <w:t xml:space="preserve"> </w:t>
+            </w:r>
+            <w:r>
+              <w:t xml:space="preserve">(the format from the first bytes),</w:t>
+            </w:r>
+            <w:r>
+              <w:t xml:space="preserve"> </w:t>
+            </w:r>
+            <w:r>
+              <w:rPr>
+                <w:rStyle w:val="VerbatimChar"/>
+              </w:rPr>
+              <w:t xml:space="preserve">run_extract</w:t>
+            </w:r>
+            <w:r>
+              <w:t xml:space="preserve"> </w:t>
+            </w:r>
+            <w:r>
+              <w:t xml:space="preserve">(the layouts</w:t>
+            </w:r>
+            <w:r>
+              <w:t xml:space="preserve"> </w:t>
+            </w:r>
+            <w:r>
+              <w:rPr>
+                <w:rStyle w:val="VerbatimChar"/>
+              </w:rPr>
+              <w:t xml:space="preserve">LAY_FULL / LAY_FROM_CURRENT / LAY_FLAT</w:t>
+            </w:r>
+            <w:r>
+              <w:t xml:space="preserve">, the overwrite policy and its question, names made safe for FAT, no half file left),</w:t>
+            </w:r>
+            <w:r>
+              <w:t xml:space="preserve"> </w:t>
+            </w:r>
+            <w:r>
+              <w:rPr>
+                <w:rStyle w:val="VerbatimChar"/>
+              </w:rPr>
+              <w:t xml:space="preserve">apply_plan</w:t>
+            </w:r>
+            <w:r>
+              <w:t xml:space="preserve"> </w:t>
+            </w:r>
+            <w:r>
+              <w:t xml:space="preserve">(a new copy</w:t>
+            </w:r>
+            <w:r>
+              <w:t xml:space="preserve"> </w:t>
+            </w:r>
+            <w:r>
+              <w:rPr>
+                <w:rStyle w:val="VerbatimChar"/>
+              </w:rPr>
+              <w:t xml:space="preserve">*.part</w:t>
+            </w:r>
+            <w:r>
+              <w:t xml:space="preserve">, then swapped in),</w:t>
+            </w:r>
+            <w:r>
+              <w:t xml:space="preserve"> </w:t>
+            </w:r>
+            <w:r>
+              <w:rPr>
+                <w:rStyle w:val="VerbatimChar"/>
+              </w:rPr>
+              <w:t xml:space="preserve">op_add</w:t>
+            </w:r>
+            <w:r>
+              <w:t xml:space="preserve"> </w:t>
+            </w:r>
+            <w:r>
+              <w:t xml:space="preserve">/</w:t>
+            </w:r>
+            <w:r>
+              <w:t xml:space="preserve"> </w:t>
+            </w:r>
+            <w:r>
+              <w:rPr>
+                <w:rStyle w:val="VerbatimChar"/>
+              </w:rPr>
+              <w:t xml:space="preserve">op_delete</w:t>
+            </w:r>
+            <w:r>
+              <w:t xml:space="preserve"> </w:t>
+            </w:r>
+            <w:r>
+              <w:t xml:space="preserve">/</w:t>
+            </w:r>
+            <w:r>
+              <w:t xml:space="preserve"> </w:t>
+            </w:r>
+            <w:r>
+              <w:rPr>
+                <w:rStyle w:val="VerbatimChar"/>
+              </w:rPr>
+              <w:t xml:space="preserve">op_rename</w:t>
+            </w:r>
+            <w:r>
+              <w:t xml:space="preserve"> </w:t>
+            </w:r>
+            <w:r>
+              <w:t xml:space="preserve">/</w:t>
+            </w:r>
+            <w:r>
+              <w:t xml:space="preserve"> </w:t>
+            </w:r>
+            <w:r>
+              <w:rPr>
+                <w:rStyle w:val="VerbatimChar"/>
+              </w:rPr>
+              <w:t xml:space="preserve">op_new_folder</w:t>
+            </w:r>
+            <w:r>
+              <w:t xml:space="preserve">,</w:t>
+            </w:r>
+            <w:r>
+              <w:t xml:space="preserve"> </w:t>
+            </w:r>
+            <w:r>
+              <w:rPr>
+                <w:rStyle w:val="VerbatimChar"/>
+              </w:rPr>
+              <w:t xml:space="preserve">plan_add</w:t>
+            </w:r>
+            <w:r>
+              <w:t xml:space="preserve"> </w:t>
+            </w:r>
+            <w:r>
+              <w:t xml:space="preserve">(a folder walked, the names that exist replaced or kept).</w:t>
+            </w:r>
+          </w:p>
+        </w:tc>
+      </w:tr>
+      <w:tr>
+        <w:tc>
+          <w:tcPr/>
+          <w:p>
+            <w:pPr>
+              <w:pStyle w:val="Compact"/>
+            </w:pPr>
+            <w:r>
+              <w:rPr>
+                <w:rStyle w:val="VerbatimChar"/>
+              </w:rPr>
+              <w:t xml:space="preserve">model.h</w:t>
+            </w:r>
+            <w:r>
+              <w:t xml:space="preserve"> </w:t>
+            </w:r>
+            <w:r>
+              <w:t xml:space="preserve">(namespace</w:t>
+            </w:r>
+            <w:r>
+              <w:t xml:space="preserve"> </w:t>
+            </w:r>
+            <w:r>
+              <w:rPr>
+                <w:rStyle w:val="VerbatimChar"/>
+              </w:rPr>
+              <w:t xml:space="preserve">ui</w:t>
+            </w:r>
+            <w:r>
+              <w:t xml:space="preserve">)</w:t>
+            </w:r>
+          </w:p>
+        </w:tc>
+        <w:tc>
+          <w:tcPr/>
+          <w:p>
+            <w:pPr>
+              <w:pStyle w:val="Compact"/>
+            </w:pPr>
+            <w:r>
+              <w:t xml:space="preserve">The archive as a tree for the view: a node per path part (implicit folders too), totals, children sorted (folders first, by the list's column), the search.</w:t>
+            </w:r>
+          </w:p>
+        </w:tc>
+      </w:tr>
+      <w:tr>
+        <w:tc>
+          <w:tcPr/>
+          <w:p>
+            <w:pPr>
+              <w:pStyle w:val="Compact"/>
+            </w:pPr>
+            <w:r>
+              <w:rPr>
+                <w:rStyle w:val="VerbatimChar"/>
+              </w:rPr>
+              <w:t xml:space="preserve">icons.h</w:t>
+            </w:r>
+            <w:r>
+              <w:t xml:space="preserve">,</w:t>
+            </w:r>
+            <w:r>
+              <w:t xml:space="preserve"> </w:t>
+            </w:r>
+            <w:r>
+              <w:rPr>
+                <w:rStyle w:val="VerbatimChar"/>
+              </w:rPr>
+              <w:t xml:space="preserve">widgets.h</w:t>
+            </w:r>
+            <w:r>
+              <w:t xml:space="preserve">,</w:t>
+            </w:r>
+            <w:r>
+              <w:t xml:space="preserve"> </w:t>
+            </w:r>
+            <w:r>
+              <w:rPr>
+                <w:rStyle w:val="VerbatimChar"/>
+              </w:rPr>
+              <w:t xml:space="preserve">dialogs.h</w:t>
+            </w:r>
+          </w:p>
+        </w:tc>
+        <w:tc>
+          <w:tcPr/>
+          <w:p>
+            <w:pPr>
+              <w:pStyle w:val="Compact"/>
+            </w:pPr>
+            <w:r>
+              <w:t xml:space="preserve">The vector icons; the widgets (</w:t>
+            </w:r>
+            <w:r>
+              <w:rPr>
+                <w:rStyle w:val="VerbatimChar"/>
+              </w:rPr>
+              <w:t xml:space="preserve">ToolStrip</w:t>
+            </w:r>
+            <w:r>
+              <w:t xml:space="preserve"> </w:t>
+            </w:r>
+            <w:r>
+              <w:t xml:space="preserve">of large buttons,</w:t>
+            </w:r>
+            <w:r>
+              <w:t xml:space="preserve"> </w:t>
+            </w:r>
+            <w:r>
+              <w:rPr>
+                <w:rStyle w:val="VerbatimChar"/>
+              </w:rPr>
+              <w:t xml:space="preserve">PathBar</w:t>
+            </w:r>
+            <w:r>
+              <w:t xml:space="preserve"> </w:t>
+            </w:r>
+            <w:r>
+              <w:t xml:space="preserve">with its</w:t>
+            </w:r>
+            <w:r>
+              <w:t xml:space="preserve"> </w:t>
+            </w:r>
+            <w:r>
+              <w:rPr>
+                <w:rStyle w:val="VerbatimChar"/>
+              </w:rPr>
+              <w:t xml:space="preserve">SearchBox</w:t>
+            </w:r>
+            <w:r>
+              <w:t xml:space="preserve">,</w:t>
+            </w:r>
+            <w:r>
+              <w:t xml:space="preserve"> </w:t>
+            </w:r>
+            <w:r>
+              <w:rPr>
+                <w:rStyle w:val="VerbatimChar"/>
+              </w:rPr>
+              <w:t xml:space="preserve">FolderTree</w:t>
+            </w:r>
+            <w:r>
+              <w:t xml:space="preserve">,</w:t>
+            </w:r>
+            <w:r>
+              <w:t xml:space="preserve"> </w:t>
+            </w:r>
+            <w:r>
+              <w:rPr>
+                <w:rStyle w:val="VerbatimChar"/>
+              </w:rPr>
+              <w:t xml:space="preserve">EntryList</w:t>
+            </w:r>
+            <w:r>
+              <w:t xml:space="preserve"> </w:t>
+            </w:r>
+            <w:r>
+              <w:t xml:space="preserve">— multiple selection, sort, drag out, the drop's banner —,</w:t>
+            </w:r>
+            <w:r>
+              <w:t xml:space="preserve"> </w:t>
+            </w:r>
+            <w:r>
+              <w:rPr>
+                <w:rStyle w:val="VerbatimChar"/>
+              </w:rPr>
+              <w:t xml:space="preserve">InfoCard</w:t>
+            </w:r>
+            <w:r>
+              <w:t xml:space="preserve">,</w:t>
+            </w:r>
+            <w:r>
+              <w:t xml:space="preserve"> </w:t>
+            </w:r>
+            <w:r>
+              <w:rPr>
+                <w:rStyle w:val="VerbatimChar"/>
+              </w:rPr>
+              <w:t xml:space="preserve">StatusBar</w:t>
+            </w:r>
+            <w:r>
+              <w:t xml:space="preserve">,</w:t>
+            </w:r>
+            <w:r>
+              <w:t xml:space="preserve"> </w:t>
+            </w:r>
+            <w:r>
+              <w:rPr>
+                <w:rStyle w:val="VerbatimChar"/>
+              </w:rPr>
+              <w:t xml:space="preserve">Welcome</w:t>
+            </w:r>
+            <w:r>
+              <w:t xml:space="preserve">); the dialogs (Extract, Add, progress, exists, text, properties).</w:t>
+            </w:r>
+          </w:p>
+        </w:tc>
+      </w:tr>
+      <w:tr>
+        <w:tc>
+          <w:tcPr/>
+          <w:p>
+            <w:pPr>
+              <w:pStyle w:val="Compact"/>
+            </w:pPr>
+            <w:r>
+              <w:rPr>
+                <w:rStyle w:val="VerbatimChar"/>
+              </w:rPr>
+              <w:t xml:space="preserve">main.cpp</w:t>
+            </w:r>
+          </w:p>
+        </w:tc>
+        <w:tc>
+          <w:tcPr/>
+          <w:p>
+            <w:pPr>
+              <w:pStyle w:val="Compact"/>
+            </w:pPr>
+            <w:r>
+              <w:t xml:space="preserve">The app: the jobs (a thread per job,</w:t>
+            </w:r>
+            <w:r>
+              <w:t xml:space="preserve"> </w:t>
+            </w:r>
+            <w:r>
+              <w:rPr>
+                <w:rStyle w:val="VerbatimChar"/>
+              </w:rPr>
+              <w:t xml:space="preserve">kapi_post</w:t>
+            </w:r>
+            <w:r>
+              <w:t xml:space="preserve"> </w:t>
+            </w:r>
+            <w:r>
+              <w:t xml:space="preserve">for the progress and the end, a question to the main thread answered through an event), drag &amp; drop both ways, files opened into</w:t>
+            </w:r>
+            <w:r>
+              <w:t xml:space="preserve"> </w:t>
+            </w:r>
+            <w:r>
+              <w:rPr>
+                <w:rStyle w:val="VerbatimChar"/>
+              </w:rPr>
+              <w:t xml:space="preserve">RAM:</w:t>
+            </w:r>
+            <w:r>
+              <w:t xml:space="preserve"> </w:t>
+            </w:r>
+            <w:r>
+              <w:t xml:space="preserve">and watched to be put back, the menus.</w:t>
+            </w:r>
+          </w:p>
+        </w:tc>
+      </w:tr>
+    </w:tbl>
+    <w:p>
+      <w:pPr>
+        <w:pStyle w:val="BodyText"/>
+      </w:pPr>
+      <w:r>
+        <w:t xml:space="preserve">A job works on</w:t>
+      </w:r>
+      <w:r>
+        <w:t xml:space="preserve"> </w:t>
+      </w:r>
+      <w:r>
+        <w:rPr>
+          <w:b/>
+          <w:bCs/>
+        </w:rPr>
+        <w:t xml:space="preserve">its own instance</w:t>
+      </w:r>
+      <w:r>
+        <w:t xml:space="preserve"> </w:t>
+      </w:r>
+      <w:r>
+        <w:t xml:space="preserve">of the archive (opened again): the view keeps reading the old one</w:t>
+      </w:r>
+      <w:r>
+        <w:t xml:space="preserve"> </w:t>
+      </w:r>
+      <w:r>
+        <w:t xml:space="preserve">until the job ends and the archive is read again from the disk.</w:t>
+      </w:r>
+      <w:r>
+        <w:t xml:space="preserve"> </w:t>
+      </w:r>
+      <w:r>
+        <w:rPr>
+          <w:b/>
+          <w:bCs/>
+        </w:rPr>
+        <w:t xml:space="preserve">Host test</w:t>
+      </w:r>
+      <w:r>
+        <w:t xml:space="preserve">:</w:t>
+      </w:r>
+      <w:r>
+        <w:t xml:space="preserve"> </w:t>
+      </w:r>
+      <w:r>
+        <w:rPr>
+          <w:rStyle w:val="VerbatimChar"/>
+        </w:rPr>
+        <w:t xml:space="preserve">sh tools/tests/run_archiver_test.sh</w:t>
+      </w:r>
+      <w:r>
+        <w:t xml:space="preserve"> </w:t>
+      </w:r>
+      <w:r>
+        <w:t xml:space="preserve">—</w:t>
+      </w:r>
+      <w:r>
+        <w:t xml:space="preserve"> </w:t>
+      </w:r>
+      <w:r>
+        <w:rPr>
+          <w:rStyle w:val="VerbatimChar"/>
+        </w:rPr>
+        <w:t xml:space="preserve">tools/tests/archiver/arctool.cpp</w:t>
+      </w:r>
+      <w:r>
+        <w:t xml:space="preserve"> </w:t>
+      </w:r>
+      <w:r>
+        <w:t xml:space="preserve">(the engine on the</w:t>
+      </w:r>
+      <w:r>
+        <w:t xml:space="preserve"> </w:t>
+      </w:r>
+      <w:r>
+        <w:t xml:space="preserve">simulator's kapi) driven by</w:t>
+      </w:r>
+      <w:r>
+        <w:t xml:space="preserve"> </w:t>
+      </w:r>
+      <w:r>
+        <w:rPr>
+          <w:rStyle w:val="VerbatimChar"/>
+        </w:rPr>
+        <w:t xml:space="preserve">test.py</w:t>
+      </w:r>
+      <w:r>
+        <w:t xml:space="preserve">: archives made by Python's</w:t>
+      </w:r>
+      <w:r>
+        <w:t xml:space="preserve"> </w:t>
+      </w:r>
+      <w:r>
+        <w:rPr>
+          <w:rStyle w:val="VerbatimChar"/>
+        </w:rPr>
+        <w:t xml:space="preserve">zipfile</w:t>
+      </w:r>
+      <w:r>
+        <w:t xml:space="preserve"> </w:t>
+      </w:r>
+      <w:r>
+        <w:t xml:space="preserve">and the</w:t>
+      </w:r>
+      <w:r>
+        <w:t xml:space="preserve"> </w:t>
+      </w:r>
+      <w:r>
+        <w:rPr>
+          <w:rStyle w:val="VerbatimChar"/>
+        </w:rPr>
+        <w:t xml:space="preserve">zip</w:t>
+      </w:r>
+      <w:r>
+        <w:t xml:space="preserve"> </w:t>
+      </w:r>
+      <w:r>
+        <w:t xml:space="preserve">tool (stored,</w:t>
+      </w:r>
+      <w:r>
+        <w:t xml:space="preserve"> </w:t>
+      </w:r>
+      <w:r>
+        <w:t xml:space="preserve">deflated, a self-extractor, ZipCrypto, UTF-8 names), every result checked by</w:t>
+      </w:r>
+      <w:r>
+        <w:t xml:space="preserve"> </w:t>
+      </w:r>
+      <w:r>
+        <w:rPr>
+          <w:rStyle w:val="VerbatimChar"/>
+        </w:rPr>
+        <w:t xml:space="preserve">zipfile</w:t>
+      </w:r>
+      <w:r>
+        <w:t xml:space="preserve"> </w:t>
+      </w:r>
+      <w:r>
+        <w:t xml:space="preserve">and</w:t>
+      </w:r>
+      <w:r>
+        <w:t xml:space="preserve"> </w:t>
+      </w:r>
+      <w:r>
+        <w:rPr>
+          <w:rStyle w:val="VerbatimChar"/>
+        </w:rPr>
+        <w:t xml:space="preserve">unzip -t</w:t>
+      </w:r>
+      <w:r>
+        <w:t xml:space="preserve">.</w:t>
+      </w:r>
+      <w:r>
+        <w:t xml:space="preserve"> </w:t>
+      </w:r>
+      <w:r>
+        <w:t xml:space="preserve">The screenshots:</w:t>
+      </w:r>
+      <w:r>
+        <w:t xml:space="preserve"> </w:t>
+      </w:r>
+      <w:r>
+        <w:rPr>
+          <w:rStyle w:val="VerbatimChar"/>
+        </w:rPr>
+        <w:t xml:space="preserve">sh tools/tests/desktop_sim/shots.sh archiver</w:t>
+      </w:r>
+      <w:r>
+        <w:t xml:space="preserve"> </w:t>
+      </w:r>
+      <w:r>
+        <w:t xml:space="preserve">(a sample archive made by</w:t>
+      </w:r>
+      <w:r>
+        <w:t xml:space="preserve"> </w:t>
+      </w:r>
+      <w:r>
+        <w:rPr>
+          <w:rStyle w:val="VerbatimChar"/>
+        </w:rPr>
+        <w:t xml:space="preserve">arc_sample.py</w:t>
+      </w:r>
+      <w:r>
+        <w:t xml:space="preserve">).</w:t>
+      </w:r>
+    </w:p>
+    <w:bookmarkEnd w:id="42"/>
+    <w:bookmarkStart w:id="43" w:name="X292acd1b77966009c7799e5ef4fd99b22efd18c"/>
     <w:p>
       <w:pPr>
         <w:pStyle w:val="Heading3"/>
@@ -40450,8 +41475,8 @@
         <w:t xml:space="preserve">is a reference to storage constructed there).</w:t>
       </w:r>
     </w:p>
-    <w:bookmarkEnd w:id="42"/>
-    <w:bookmarkStart w:id="47" w:name="Xaed6078f9236dd71c6901d3b4b7c078cf403560"/>
+    <w:bookmarkEnd w:id="43"/>
+    <w:bookmarkStart w:id="48" w:name="Xaed6078f9236dd71c6901d3b4b7c078cf403560"/>
     <w:p>
       <w:pPr>
         <w:pStyle w:val="Heading3"/>
@@ -40564,7 +41589,7 @@
             <w:pPr>
               <w:pStyle w:val="Compact"/>
             </w:pPr>
-            <w:hyperlink r:id="rId43">
+            <w:hyperlink r:id="rId44">
               <w:r>
                 <w:rPr>
                   <w:rStyle w:val="VerbatimChar"/>
@@ -40633,7 +41658,7 @@
             <w:pPr>
               <w:pStyle w:val="Compact"/>
             </w:pPr>
-            <w:hyperlink r:id="rId44">
+            <w:hyperlink r:id="rId45">
               <w:r>
                 <w:rPr>
                   <w:rStyle w:val="VerbatimChar"/>
@@ -40839,7 +41864,7 @@
             <w:pPr>
               <w:pStyle w:val="Compact"/>
             </w:pPr>
-            <w:hyperlink r:id="rId45">
+            <w:hyperlink r:id="rId46">
               <w:r>
                 <w:rPr>
                   <w:rStyle w:val="VerbatimChar"/>
@@ -41973,7 +42998,7 @@
       <w:r>
         <w:t xml:space="preserve">(</w:t>
       </w:r>
-      <w:hyperlink r:id="rId46">
+      <w:hyperlink r:id="rId47">
         <w:r>
           <w:rPr>
             <w:rStyle w:val="VerbatimChar"/>
@@ -47455,9 +48480,9 @@
         <w:t xml:space="preserve">writes the editors' pictures).</w:t>
       </w:r>
     </w:p>
-    <w:bookmarkEnd w:id="47"/>
     <w:bookmarkEnd w:id="48"/>
-    <w:bookmarkStart w:id="51" w:name="Xeac8a7f07d054ec4a738e7316cecd6b2667878f"/>
+    <w:bookmarkEnd w:id="49"/>
+    <w:bookmarkStart w:id="52" w:name="Xeac8a7f07d054ec4a738e7316cecd6b2667878f"/>
     <w:p>
       <w:pPr>
         <w:pStyle w:val="Heading2"/>
@@ -48731,7 +49756,7 @@
         <w:t xml:space="preserve">).</w:t>
       </w:r>
     </w:p>
-    <w:bookmarkStart w:id="49" w:name="memset--memcpy-in-freestanding-apps"/>
+    <w:bookmarkStart w:id="50" w:name="memset--memcpy-in-freestanding-apps"/>
     <w:p>
       <w:pPr>
         <w:pStyle w:val="Heading3"/>
@@ -48973,8 +49998,8 @@
         <w:t xml:space="preserve">; newlib programs must not (they keep newlib's versions).</w:t>
       </w:r>
     </w:p>
-    <w:bookmarkEnd w:id="49"/>
-    <w:bookmarkStart w:id="50" w:name="Xcf0dbbf20be0cc782816b5e8ce7c8fb7d3dde7b"/>
+    <w:bookmarkEnd w:id="50"/>
+    <w:bookmarkStart w:id="51" w:name="Xcf0dbbf20be0cc782816b5e8ce7c8fb7d3dde7b"/>
     <w:p>
       <w:pPr>
         <w:pStyle w:val="Heading3"/>
@@ -51220,9 +52245,9 @@
         <w:t xml:space="preserve">.</w:t>
       </w:r>
     </w:p>
-    <w:bookmarkEnd w:id="50"/>
     <w:bookmarkEnd w:id="51"/>
-    <w:bookmarkStart w:id="72" w:name="Xf0254b5b66af42bca7d25138d14efff7271fb9a"/>
+    <w:bookmarkEnd w:id="52"/>
+    <w:bookmarkStart w:id="73" w:name="Xf0254b5b66af42bca7d25138d14efff7271fb9a"/>
     <w:p>
       <w:pPr>
         <w:pStyle w:val="Heading2"/>
@@ -51250,7 +52275,7 @@
       <w:pPr>
         <w:pStyle w:val="FirstParagraph"/>
       </w:pPr>
-      <w:hyperlink r:id="rId52">
+      <w:hyperlink r:id="rId53">
         <w:r>
           <w:rPr>
             <w:rStyle w:val="VerbatimChar"/>
@@ -51730,7 +52755,7 @@
       <w:r>
         <w:t xml:space="preserve"> </w:t>
       </w:r>
-      <w:hyperlink r:id="rId53">
+      <w:hyperlink r:id="rId54">
         <w:r>
           <w:rPr>
             <w:rStyle w:val="VerbatimChar"/>
@@ -51869,7 +52894,7 @@
       <w:r>
         <w:t xml:space="preserve"> </w:t>
       </w:r>
-      <w:hyperlink r:id="rId54">
+      <w:hyperlink r:id="rId55">
         <w:r>
           <w:rPr>
             <w:rStyle w:val="VerbatimChar"/>
@@ -52153,7 +53178,7 @@
       <w:r>
         <w:t xml:space="preserve"> </w:t>
       </w:r>
-      <w:hyperlink r:id="rId55">
+      <w:hyperlink r:id="rId56">
         <w:r>
           <w:rPr>
             <w:rStyle w:val="VerbatimChar"/>
@@ -52366,7 +53391,7 @@
       <w:r>
         <w:t xml:space="preserve"> </w:t>
       </w:r>
-      <w:hyperlink r:id="rId56">
+      <w:hyperlink r:id="rId57">
         <w:r>
           <w:rPr>
             <w:rStyle w:val="VerbatimChar"/>
@@ -52483,7 +53508,7 @@
       <w:r>
         <w:t xml:space="preserve">(</w:t>
       </w:r>
-      <w:hyperlink r:id="rId57">
+      <w:hyperlink r:id="rId58">
         <w:r>
           <w:rPr>
             <w:rStyle w:val="VerbatimChar"/>
@@ -52952,7 +53977,7 @@
       <w:r>
         <w:t xml:space="preserve"> </w:t>
       </w:r>
-      <w:hyperlink r:id="rId58">
+      <w:hyperlink r:id="rId59">
         <w:r>
           <w:rPr>
             <w:rStyle w:val="VerbatimChar"/>
@@ -53059,7 +54084,7 @@
       <w:r>
         <w:t xml:space="preserve"> </w:t>
       </w:r>
-      <w:hyperlink r:id="rId59">
+      <w:hyperlink r:id="rId60">
         <w:r>
           <w:rPr>
             <w:rStyle w:val="VerbatimChar"/>
@@ -53170,7 +54195,7 @@
       <w:r>
         <w:t xml:space="preserve"> </w:t>
       </w:r>
-      <w:hyperlink r:id="rId60">
+      <w:hyperlink r:id="rId61">
         <w:r>
           <w:rPr>
             <w:rStyle w:val="VerbatimChar"/>
@@ -53242,7 +54267,7 @@
       <w:r>
         <w:t xml:space="preserve"> </w:t>
       </w:r>
-      <w:hyperlink r:id="rId61">
+      <w:hyperlink r:id="rId62">
         <w:r>
           <w:rPr>
             <w:rStyle w:val="VerbatimChar"/>
@@ -53544,7 +54569,7 @@
       <w:r>
         <w:t xml:space="preserve"> </w:t>
       </w:r>
-      <w:hyperlink r:id="rId62">
+      <w:hyperlink r:id="rId63">
         <w:r>
           <w:rPr>
             <w:rStyle w:val="VerbatimChar"/>
@@ -53696,7 +54721,7 @@
       <w:r>
         <w:t xml:space="preserve"> </w:t>
       </w:r>
-      <w:hyperlink r:id="rId63">
+      <w:hyperlink r:id="rId64">
         <w:r>
           <w:rPr>
             <w:rStyle w:val="VerbatimChar"/>
@@ -53900,7 +54925,7 @@
       <w:r>
         <w:t xml:space="preserve">(</w:t>
       </w:r>
-      <w:hyperlink r:id="rId64">
+      <w:hyperlink r:id="rId65">
         <w:r>
           <w:rPr>
             <w:rStyle w:val="VerbatimChar"/>
@@ -53927,7 +54952,7 @@
       <w:r>
         <w:t xml:space="preserve">(</w:t>
       </w:r>
-      <w:hyperlink r:id="rId65">
+      <w:hyperlink r:id="rId66">
         <w:r>
           <w:rPr>
             <w:rStyle w:val="VerbatimChar"/>
@@ -54175,7 +55200,7 @@
       <w:r>
         <w:t xml:space="preserve"> </w:t>
       </w:r>
-      <w:hyperlink r:id="rId63">
+      <w:hyperlink r:id="rId64">
         <w:r>
           <w:rPr>
             <w:rStyle w:val="VerbatimChar"/>
@@ -54207,7 +55232,7 @@
       <w:r>
         <w:t xml:space="preserve"> </w:t>
       </w:r>
-      <w:hyperlink r:id="rId66">
+      <w:hyperlink r:id="rId67">
         <w:r>
           <w:rPr>
             <w:rStyle w:val="VerbatimChar"/>
@@ -54703,7 +55728,7 @@
       <w:r>
         <w:t xml:space="preserve"> </w:t>
       </w:r>
-      <w:hyperlink r:id="rId67">
+      <w:hyperlink r:id="rId68">
         <w:r>
           <w:rPr>
             <w:rStyle w:val="VerbatimChar"/>
@@ -55107,7 +56132,7 @@
         <w:t xml:space="preserve">…, §earlier) still work and coexist; apps choose one model per window.</w:t>
       </w:r>
     </w:p>
-    <w:bookmarkStart w:id="71" w:name="dynamic-memory--c-apps"/>
+    <w:bookmarkStart w:id="72" w:name="dynamic-memory--c-apps"/>
     <w:p>
       <w:pPr>
         <w:pStyle w:val="Heading3"/>
@@ -55177,7 +56202,7 @@
       <w:r>
         <w:t xml:space="preserve"> </w:t>
       </w:r>
-      <w:hyperlink r:id="rId68">
+      <w:hyperlink r:id="rId69">
         <w:r>
           <w:rPr>
             <w:rStyle w:val="VerbatimChar"/>
@@ -55473,7 +56498,7 @@
       <w:r>
         <w:t xml:space="preserve"> </w:t>
       </w:r>
-      <w:hyperlink r:id="rId69">
+      <w:hyperlink r:id="rId70">
         <w:r>
           <w:rPr>
             <w:rStyle w:val="VerbatimChar"/>
@@ -55707,7 +56732,7 @@
       <w:r>
         <w:t xml:space="preserve"> </w:t>
       </w:r>
-      <w:hyperlink r:id="rId70">
+      <w:hyperlink r:id="rId71">
         <w:r>
           <w:rPr>
             <w:rStyle w:val="VerbatimChar"/>
@@ -55722,9 +56747,9 @@
         <w:t xml:space="preserve">for a working example.</w:t>
       </w:r>
     </w:p>
-    <w:bookmarkEnd w:id="71"/>
     <w:bookmarkEnd w:id="72"/>
-    <w:bookmarkStart w:id="86" w:name="X636230dba256ccd30a2e68f8101290712b3f4c4"/>
+    <w:bookmarkEnd w:id="73"/>
+    <w:bookmarkStart w:id="87" w:name="X636230dba256ccd30a2e68f8101290712b3f4c4"/>
     <w:p>
       <w:pPr>
         <w:pStyle w:val="Heading2"/>
@@ -56874,7 +57899,7 @@
       <w:r>
         <w:t xml:space="preserve"> </w:t>
       </w:r>
-      <w:hyperlink r:id="rId73">
+      <w:hyperlink r:id="rId74">
         <w:r>
           <w:rPr>
             <w:rStyle w:val="VerbatimChar"/>
@@ -56955,7 +57980,7 @@
       <w:r>
         <w:t xml:space="preserve"> </w:t>
       </w:r>
-      <w:hyperlink r:id="rId74">
+      <w:hyperlink r:id="rId75">
         <w:r>
           <w:rPr>
             <w:rStyle w:val="VerbatimChar"/>
@@ -57219,7 +58244,7 @@
         <w:t xml:space="preserve">40</w:t>
       </w:r>
     </w:p>
-    <w:bookmarkStart w:id="82" w:name="screenshots-and-documentation"/>
+    <w:bookmarkStart w:id="83" w:name="screenshots-and-documentation"/>
     <w:p>
       <w:pPr>
         <w:pStyle w:val="Heading3"/>
@@ -57249,7 +58274,7 @@
       <w:r>
         <w:t xml:space="preserve"> </w:t>
       </w:r>
-      <w:hyperlink r:id="rId75">
+      <w:hyperlink r:id="rId76">
         <w:r>
           <w:rPr>
             <w:rStyle w:val="VerbatimChar"/>
@@ -57716,7 +58741,220 @@
         <w:t xml:space="preserve"> </w:t>
       </w:r>
       <w:r>
-        <w:t xml:space="preserve">stops the process on the spot). Like the kernel, the simulator makes no</w:t>
+        <w:t xml:space="preserve">stops the process on the spot), and drag &amp; drop from another app:</w:t>
+      </w:r>
+      <w:r>
+        <w:t xml:space="preserve"> </w:t>
+      </w:r>
+      <w:r>
+        <w:rPr>
+          <w:rStyle w:val="VerbatimChar"/>
+        </w:rPr>
+        <w:t xml:space="preserve">dragover X Y [FLAGS]</w:t>
+      </w:r>
+      <w:r>
+        <w:t xml:space="preserve"> </w:t>
+      </w:r>
+      <w:r>
+        <w:t xml:space="preserve">(</w:t>
+      </w:r>
+      <w:r>
+        <w:rPr>
+          <w:rStyle w:val="VerbatimChar"/>
+        </w:rPr>
+        <w:t xml:space="preserve">GUI_EVENT_DRAG_OVER</w:t>
+      </w:r>
+      <w:r>
+        <w:t xml:space="preserve">; FLAGS 1 Ctrl, 4 the drag left) and</w:t>
+      </w:r>
+      <w:r>
+        <w:t xml:space="preserve"> </w:t>
+      </w:r>
+      <w:r>
+        <w:rPr>
+          <w:rStyle w:val="VerbatimChar"/>
+        </w:rPr>
+        <w:t xml:space="preserve">drop X Y PATH|PATH... [FLAGS]</w:t>
+      </w:r>
+      <w:r>
+        <w:t xml:space="preserve"> </w:t>
+      </w:r>
+      <w:r>
+        <w:t xml:space="preserve">(</w:t>
+      </w:r>
+      <w:r>
+        <w:rPr>
+          <w:rStyle w:val="VerbatimChar"/>
+        </w:rPr>
+        <w:t xml:space="preserve">GUI_EVENT_DROP</w:t>
+      </w:r>
+      <w:r>
+        <w:t xml:space="preserve">, the paths a</w:t>
+      </w:r>
+      <w:r>
+        <w:t xml:space="preserve"> </w:t>
+      </w:r>
+      <w:r>
+        <w:rPr>
+          <w:rStyle w:val="VerbatimChar"/>
+        </w:rPr>
+        <w:t xml:space="preserve">DND_FILES</w:t>
+      </w:r>
+      <w:r>
+        <w:t xml:space="preserve"> </w:t>
+      </w:r>
+      <w:r>
+        <w:t xml:space="preserve">payload that</w:t>
+      </w:r>
+      <w:r>
+        <w:t xml:space="preserve"> </w:t>
+      </w:r>
+      <w:r>
+        <w:rPr>
+          <w:rStyle w:val="VerbatimChar"/>
+        </w:rPr>
+        <w:t xml:space="preserve">kapi_drag_data</w:t>
+      </w:r>
+      <w:r>
+        <w:t xml:space="preserve"> </w:t>
+      </w:r>
+      <w:r>
+        <w:t xml:space="preserve">returns). Files: what an app writes goes to</w:t>
+      </w:r>
+      <w:r>
+        <w:t xml:space="preserve"> </w:t>
+      </w:r>
+      <w:r>
+        <w:rPr>
+          <w:rStyle w:val="VerbatimChar"/>
+        </w:rPr>
+        <w:t xml:space="preserve">SIM_WRITES</w:t>
+      </w:r>
+      <w:r>
+        <w:t xml:space="preserve"> </w:t>
+      </w:r>
+      <w:r>
+        <w:t xml:space="preserve">(never the card) —</w:t>
+      </w:r>
+      <w:r>
+        <w:t xml:space="preserve"> </w:t>
+      </w:r>
+      <w:r>
+        <w:rPr>
+          <w:rStyle w:val="VerbatimChar"/>
+        </w:rPr>
+        <w:t xml:space="preserve">kapi_save_file</w:t>
+      </w:r>
+      <w:r>
+        <w:t xml:space="preserve">,</w:t>
+      </w:r>
+      <w:r>
+        <w:t xml:space="preserve"> </w:t>
+      </w:r>
+      <w:r>
+        <w:rPr>
+          <w:rStyle w:val="VerbatimChar"/>
+        </w:rPr>
+        <w:t xml:space="preserve">kapi_mkdir</w:t>
+      </w:r>
+      <w:r>
+        <w:t xml:space="preserve">, the streams</w:t>
+      </w:r>
+      <w:r>
+        <w:t xml:space="preserve"> </w:t>
+      </w:r>
+      <w:r>
+        <w:rPr>
+          <w:rStyle w:val="VerbatimChar"/>
+        </w:rPr>
+        <w:t xml:space="preserve">kapi_file_out</w:t>
+      </w:r>
+      <w:r>
+        <w:t xml:space="preserve"> </w:t>
+      </w:r>
+      <w:r>
+        <w:t xml:space="preserve">/</w:t>
+      </w:r>
+      <w:r>
+        <w:t xml:space="preserve"> </w:t>
+      </w:r>
+      <w:r>
+        <w:rPr>
+          <w:rStyle w:val="VerbatimChar"/>
+        </w:rPr>
+        <w:t xml:space="preserve">kapi_file_in</w:t>
+      </w:r>
+      <w:r>
+        <w:t xml:space="preserve"> </w:t>
+      </w:r>
+      <w:r>
+        <w:t xml:space="preserve">(a</w:t>
+      </w:r>
+      <w:r>
+        <w:t xml:space="preserve"> </w:t>
+      </w:r>
+      <w:r>
+        <w:rPr>
+          <w:rStyle w:val="VerbatimChar"/>
+        </w:rPr>
+        <w:t xml:space="preserve">FILE *</w:t>
+      </w:r>
+      <w:r>
+        <w:t xml:space="preserve"> </w:t>
+      </w:r>
+      <w:r>
+        <w:t xml:space="preserve">behind</w:t>
+      </w:r>
+      <w:r>
+        <w:t xml:space="preserve"> </w:t>
+      </w:r>
+      <w:r>
+        <w:t xml:space="preserve">the handle) —, and</w:t>
+      </w:r>
+      <w:r>
+        <w:t xml:space="preserve"> </w:t>
+      </w:r>
+      <w:r>
+        <w:rPr>
+          <w:rStyle w:val="VerbatimChar"/>
+        </w:rPr>
+        <w:t xml:space="preserve">kapi_remove</w:t>
+      </w:r>
+      <w:r>
+        <w:t xml:space="preserve"> </w:t>
+      </w:r>
+      <w:r>
+        <w:t xml:space="preserve">/</w:t>
+      </w:r>
+      <w:r>
+        <w:t xml:space="preserve"> </w:t>
+      </w:r>
+      <w:r>
+        <w:rPr>
+          <w:rStyle w:val="VerbatimChar"/>
+        </w:rPr>
+        <w:t xml:space="preserve">kapi_rename</w:t>
+      </w:r>
+      <w:r>
+        <w:t xml:space="preserve"> </w:t>
+      </w:r>
+      <w:r>
+        <w:t xml:space="preserve">work on</w:t>
+      </w:r>
+      <w:r>
+        <w:t xml:space="preserve"> </w:t>
+      </w:r>
+      <w:r>
+        <w:rPr>
+          <w:rStyle w:val="VerbatimChar"/>
+        </w:rPr>
+        <w:t xml:space="preserve">RAM:</w:t>
+      </w:r>
+      <w:r>
+        <w:t xml:space="preserve"> </w:t>
+      </w:r>
+      <w:r>
+        <w:t xml:space="preserve">and on those written files. Like the kernel, the simulator makes no</w:t>
       </w:r>
       <w:r>
         <w:t xml:space="preserve"> </w:t>
@@ -58031,7 +59269,7 @@
       <w:r>
         <w:t xml:space="preserve"> </w:t>
       </w:r>
-      <w:hyperlink r:id="rId76">
+      <w:hyperlink r:id="rId77">
         <w:r>
           <w:rPr>
             <w:rStyle w:val="VerbatimChar"/>
@@ -58172,7 +59410,7 @@
       <w:r>
         <w:t xml:space="preserve"> </w:t>
       </w:r>
-      <w:hyperlink r:id="rId77">
+      <w:hyperlink r:id="rId78">
         <w:r>
           <w:rPr>
             <w:rStyle w:val="VerbatimChar"/>
@@ -58195,7 +59433,7 @@
       <w:r>
         <w:t xml:space="preserve"> </w:t>
       </w:r>
-      <w:hyperlink r:id="rId78">
+      <w:hyperlink r:id="rId79">
         <w:r>
           <w:rPr>
             <w:rStyle w:val="VerbatimChar"/>
@@ -58230,7 +59468,7 @@
       <w:r>
         <w:t xml:space="preserve"> </w:t>
       </w:r>
-      <w:hyperlink r:id="rId79">
+      <w:hyperlink r:id="rId80">
         <w:r>
           <w:rPr>
             <w:rStyle w:val="VerbatimChar"/>
@@ -58436,7 +59674,7 @@
       <w:r>
         <w:t xml:space="preserve"> </w:t>
       </w:r>
-      <w:hyperlink r:id="rId80">
+      <w:hyperlink r:id="rId81">
         <w:r>
           <w:rPr>
             <w:rStyle w:val="VerbatimChar"/>
@@ -58499,7 +59737,7 @@
       <w:r>
         <w:t xml:space="preserve"> </w:t>
       </w:r>
-      <w:hyperlink r:id="rId81">
+      <w:hyperlink r:id="rId82">
         <w:r>
           <w:rPr>
             <w:rStyle w:val="VerbatimChar"/>
@@ -58723,8 +59961,8 @@
         <w:t xml:space="preserve">screenshot if the visual changes, then regenerates the exports.</w:t>
       </w:r>
     </w:p>
-    <w:bookmarkEnd w:id="82"/>
-    <w:bookmarkStart w:id="85" w:name="onyx-basic-the-interpreter"/>
+    <w:bookmarkEnd w:id="83"/>
+    <w:bookmarkStart w:id="86" w:name="onyx-basic-the-interpreter"/>
     <w:p>
       <w:pPr>
         <w:pStyle w:val="Heading3"/>
@@ -61752,7 +62990,7 @@
       <w:r>
         <w:t xml:space="preserve"> </w:t>
       </w:r>
-      <w:hyperlink r:id="rId83">
+      <w:hyperlink r:id="rId84">
         <w:r>
           <w:rPr>
             <w:rStyle w:val="VerbatimChar"/>
@@ -62562,7 +63800,7 @@
       <w:r>
         <w:t xml:space="preserve"> </w:t>
       </w:r>
-      <w:hyperlink r:id="rId84">
+      <w:hyperlink r:id="rId85">
         <w:r>
           <w:rPr>
             <w:rStyle w:val="VerbatimChar"/>
@@ -64102,9 +65340,9 @@
         <w:t xml:space="preserve">rewrites them).</w:t>
       </w:r>
     </w:p>
-    <w:bookmarkEnd w:id="85"/>
     <w:bookmarkEnd w:id="86"/>
-    <w:bookmarkStart w:id="87" w:name="Xc2ec260aede7afe7fa831ade27ff6c6be860f38"/>
+    <w:bookmarkEnd w:id="87"/>
+    <w:bookmarkStart w:id="88" w:name="Xc2ec260aede7afe7fa831ade27ff6c6be860f38"/>
     <w:p>
       <w:pPr>
         <w:pStyle w:val="Heading2"/>
@@ -64831,8 +66069,8 @@
         <w:t xml:space="preserve">"must match").</w:t>
       </w:r>
     </w:p>
-    <w:bookmarkEnd w:id="87"/>
-    <w:bookmarkStart w:id="88" w:name="X57cc4a25254639a1e87307c03f7beba3c173828"/>
+    <w:bookmarkEnd w:id="88"/>
+    <w:bookmarkStart w:id="89" w:name="X57cc4a25254639a1e87307c03f7beba3c173828"/>
     <w:p>
       <w:pPr>
         <w:pStyle w:val="Heading2"/>
@@ -65208,8 +66446,8 @@
         <w:t xml:space="preserve">committed in this repo.)</w:t>
       </w:r>
     </w:p>
-    <w:bookmarkEnd w:id="88"/>
-    <w:bookmarkStart w:id="90" w:name="Xe2e8f17f312baf0f280f8a3dfcc5fa34b4105bf"/>
+    <w:bookmarkEnd w:id="89"/>
+    <w:bookmarkStart w:id="91" w:name="Xe2e8f17f312baf0f280f8a3dfcc5fa34b4105bf"/>
     <w:p>
       <w:pPr>
         <w:pStyle w:val="Heading2"/>
@@ -66260,7 +67498,7 @@
       <w:r>
         <w:t xml:space="preserve"> </w:t>
       </w:r>
-      <w:hyperlink r:id="rId89">
+      <w:hyperlink r:id="rId90">
         <w:r>
           <w:rPr>
             <w:rStyle w:val="Hyperlink"/>
@@ -66272,8 +67510,8 @@
         <w:t xml:space="preserve">).</w:t>
       </w:r>
     </w:p>
-    <w:bookmarkEnd w:id="90"/>
-    <w:bookmarkStart w:id="92" w:name="Xe9c7e4e932ad1908138a3909ff179a810da6d71"/>
+    <w:bookmarkEnd w:id="91"/>
+    <w:bookmarkStart w:id="93" w:name="Xe9c7e4e932ad1908138a3909ff179a810da6d71"/>
     <w:p>
       <w:pPr>
         <w:pStyle w:val="Heading2"/>
@@ -67360,7 +68598,7 @@
       <w:r>
         <w:t xml:space="preserve"> </w:t>
       </w:r>
-      <w:hyperlink r:id="rId91">
+      <w:hyperlink r:id="rId92">
         <w:r>
           <w:rPr>
             <w:rStyle w:val="Hyperlink"/>
@@ -67755,7 +68993,7 @@
         <w:t xml:space="preserve">, not another clone.</w:t>
       </w:r>
     </w:p>
-    <w:bookmarkEnd w:id="92"/>
+    <w:bookmarkEnd w:id="93"/>
     <w:sectPr>
       <w:footerReference r:id="rId9" w:type="default"/>
       <w:footnotePr>

</xml_diff>

<commit_message>
zip / unzip on the command line (the Archiver's engine: Info-ZIP's options -- -r -0..-9 -j -k -p -d / -l -v -t -p -o -n -j -d -x -P --, exit codes for scripts and packages), tested on the PC (cli_test.py); the Archiver's icon drawn by its own vector crate (tools/icons/archiver_icon.sh)
Co-Authored-By: Claude Opus 5.5 <noreply@anthropic.com>
Claude-Session: https://claude.ai/code/session_012k6pqyonBBqCtDQrtttmUW
</commit_message>
<xml_diff>
--- a/docs/exports/03-DEVELOPER-GUIDE.docx
+++ b/docs/exports/03-DEVELOPER-GUIDE.docx
@@ -40197,6 +40197,176 @@
         <w:pStyle w:val="BodyText"/>
       </w:pPr>
       <w:r>
+        <w:rPr>
+          <w:rStyle w:val="VerbatimChar"/>
+        </w:rPr>
+        <w:t xml:space="preserve">/bin/zip</w:t>
+      </w:r>
+      <w:r>
+        <w:t xml:space="preserve"> </w:t>
+      </w:r>
+      <w:r>
+        <w:t xml:space="preserve">and</w:t>
+      </w:r>
+      <w:r>
+        <w:t xml:space="preserve"> </w:t>
+      </w:r>
+      <w:r>
+        <w:rPr>
+          <w:rStyle w:val="VerbatimChar"/>
+        </w:rPr>
+        <w:t xml:space="preserve">/bin/unzip</w:t>
+      </w:r>
+      <w:r>
+        <w:t xml:space="preserve"> </w:t>
+      </w:r>
+      <w:r>
+        <w:t xml:space="preserve">(</w:t>
+      </w:r>
+      <w:r>
+        <w:rPr>
+          <w:rStyle w:val="VerbatimChar"/>
+        </w:rPr>
+        <w:t xml:space="preserve">user/bin/zip.cpp</w:t>
+      </w:r>
+      <w:r>
+        <w:t xml:space="preserve">,</w:t>
+      </w:r>
+      <w:r>
+        <w:t xml:space="preserve"> </w:t>
+      </w:r>
+      <w:r>
+        <w:rPr>
+          <w:rStyle w:val="VerbatimChar"/>
+        </w:rPr>
+        <w:t xml:space="preserve">unzip.cpp</w:t>
+      </w:r>
+      <w:r>
+        <w:t xml:space="preserve">,</w:t>
+      </w:r>
+      <w:r>
+        <w:t xml:space="preserve"> </w:t>
+      </w:r>
+      <w:r>
+        <w:rPr>
+          <w:rStyle w:val="VerbatimChar"/>
+        </w:rPr>
+        <w:t xml:space="preserve">arccli.h</w:t>
+      </w:r>
+      <w:r>
+        <w:t xml:space="preserve">: the command line split,</w:t>
+      </w:r>
+      <w:r>
+        <w:t xml:space="preserve"> </w:t>
+      </w:r>
+      <w:r>
+        <w:t xml:space="preserve">patterns) are C++ newlib tools on the same engine (</w:t>
+      </w:r>
+      <w:r>
+        <w:rPr>
+          <w:rStyle w:val="VerbatimChar"/>
+        </w:rPr>
+        <w:t xml:space="preserve">ops.h</w:t>
+      </w:r>
+      <w:r>
+        <w:t xml:space="preserve">:</w:t>
+      </w:r>
+      <w:r>
+        <w:t xml:space="preserve"> </w:t>
+      </w:r>
+      <w:r>
+        <w:rPr>
+          <w:rStyle w:val="VerbatimChar"/>
+        </w:rPr>
+        <w:t xml:space="preserve">plan_begin</w:t>
+      </w:r>
+      <w:r>
+        <w:t xml:space="preserve"> </w:t>
+      </w:r>
+      <w:r>
+        <w:t xml:space="preserve">/</w:t>
+      </w:r>
+      <w:r>
+        <w:t xml:space="preserve"> </w:t>
+      </w:r>
+      <w:r>
+        <w:rPr>
+          <w:rStyle w:val="VerbatimChar"/>
+        </w:rPr>
+        <w:t xml:space="preserve">plan_add_path</w:t>
+      </w:r>
+      <w:r>
+        <w:t xml:space="preserve"> </w:t>
+      </w:r>
+      <w:r>
+        <w:t xml:space="preserve">/</w:t>
+      </w:r>
+      <w:r>
+        <w:t xml:space="preserve"> </w:t>
+      </w:r>
+      <w:r>
+        <w:rPr>
+          <w:rStyle w:val="VerbatimChar"/>
+        </w:rPr>
+        <w:t xml:space="preserve">plan_finish</w:t>
+      </w:r>
+      <w:r>
+        <w:t xml:space="preserve"> </w:t>
+      </w:r>
+      <w:r>
+        <w:t xml:space="preserve">give each path its own folder in the archive, one rewrite for all), linked with the</w:t>
+      </w:r>
+      <w:r>
+        <w:t xml:space="preserve"> </w:t>
+      </w:r>
+      <w:r>
+        <w:t xml:space="preserve">vendored</w:t>
+      </w:r>
+      <w:r>
+        <w:t xml:space="preserve"> </w:t>
+      </w:r>
+      <w:r>
+        <w:rPr>
+          <w:rStyle w:val="VerbatimChar"/>
+        </w:rPr>
+        <w:t xml:space="preserve">third_party/zlib-1.3.1/libz.a</w:t>
+      </w:r>
+      <w:r>
+        <w:t xml:space="preserve"> </w:t>
+      </w:r>
+      <w:r>
+        <w:t xml:space="preserve">(</w:t>
+      </w:r>
+      <w:r>
+        <w:rPr>
+          <w:rStyle w:val="VerbatimChar"/>
+        </w:rPr>
+        <w:t xml:space="preserve">ARC_PROGS</w:t>
+      </w:r>
+      <w:r>
+        <w:t xml:space="preserve"> </w:t>
+      </w:r>
+      <w:r>
+        <w:t xml:space="preserve">in</w:t>
+      </w:r>
+      <w:r>
+        <w:t xml:space="preserve"> </w:t>
+      </w:r>
+      <w:r>
+        <w:rPr>
+          <w:rStyle w:val="VerbatimChar"/>
+        </w:rPr>
+        <w:t xml:space="preserve">user/bin/Makefile</w:t>
+      </w:r>
+      <w:r>
+        <w:t xml:space="preserve">).</w:t>
+      </w:r>
+    </w:p>
+    <w:p>
+      <w:pPr>
+        <w:pStyle w:val="BodyText"/>
+      </w:pPr>
+      <w:r>
         <w:t xml:space="preserve">A job works on</w:t>
       </w:r>
       <w:r>
@@ -40341,6 +40511,54 @@
           <w:rStyle w:val="VerbatimChar"/>
         </w:rPr>
         <w:t xml:space="preserve">unzip -t</w:t>
+      </w:r>
+      <w:r>
+        <w:t xml:space="preserve">;</w:t>
+      </w:r>
+      <w:r>
+        <w:t xml:space="preserve"> </w:t>
+      </w:r>
+      <w:r>
+        <w:t xml:space="preserve">then</w:t>
+      </w:r>
+      <w:r>
+        <w:t xml:space="preserve"> </w:t>
+      </w:r>
+      <w:r>
+        <w:rPr>
+          <w:rStyle w:val="VerbatimChar"/>
+        </w:rPr>
+        <w:t xml:space="preserve">/bin/zip</w:t>
+      </w:r>
+      <w:r>
+        <w:t xml:space="preserve"> </w:t>
+      </w:r>
+      <w:r>
+        <w:t xml:space="preserve">and</w:t>
+      </w:r>
+      <w:r>
+        <w:t xml:space="preserve"> </w:t>
+      </w:r>
+      <w:r>
+        <w:rPr>
+          <w:rStyle w:val="VerbatimChar"/>
+        </w:rPr>
+        <w:t xml:space="preserve">/bin/unzip</w:t>
+      </w:r>
+      <w:r>
+        <w:t xml:space="preserve"> </w:t>
+      </w:r>
+      <w:r>
+        <w:t xml:space="preserve">built for the PC, driven by</w:t>
+      </w:r>
+      <w:r>
+        <w:t xml:space="preserve"> </w:t>
+      </w:r>
+      <w:r>
+        <w:rPr>
+          <w:rStyle w:val="VerbatimChar"/>
+        </w:rPr>
+        <w:t xml:space="preserve">cli_test.py</w:t>
       </w:r>
       <w:r>
         <w:t xml:space="preserve">.</w:t>

</xml_diff>

<commit_message>
Jet dead code: docs -- 06 §39 (what went, why, the measures), JET-DEAD-CODE.md (§4/§1/§2 done; §3 and find in page left), 03 and user/netsurf/README.md; exports regenerated (docx; the PDF export failed here)
Co-Authored-By: Claude Opus 5.5 <noreply@anthropic.com>
Claude-Session: https://claude.ai/code/session_01UcY36na7Mp1DEYttKiw1pa
</commit_message>
<xml_diff>
--- a/docs/exports/03-DEVELOPER-GUIDE.docx
+++ b/docs/exports/03-DEVELOPER-GUIDE.docx
@@ -51222,7 +51222,7 @@
     </w:p>
     <w:bookmarkEnd w:id="50"/>
     <w:bookmarkEnd w:id="51"/>
-    <w:bookmarkStart w:id="72" w:name="Xf0254b5b66af42bca7d25138d14efff7271fb9a"/>
+    <w:bookmarkStart w:id="73" w:name="Xf0254b5b66af42bca7d25138d14efff7271fb9a"/>
     <w:p>
       <w:pPr>
         <w:pStyle w:val="Heading2"/>
@@ -54190,6 +54190,59 @@
         <w:t xml:space="preserve"> </w:t>
       </w:r>
       <w:r>
+        <w:t xml:space="preserve">The NetSurf code Jet does not use was removed from the tree and the builds in 2026-10</w:t>
+      </w:r>
+      <w:r>
+        <w:t xml:space="preserve"> </w:t>
+      </w:r>
+      <w:r>
+        <w:t xml:space="preserve">(docs/06 §39,</w:t>
+      </w:r>
+      <w:r>
+        <w:t xml:space="preserve"> </w:t>
+      </w:r>
+      <w:hyperlink r:id="rId66">
+        <w:r>
+          <w:rPr>
+            <w:rStyle w:val="VerbatimChar"/>
+          </w:rPr>
+          <w:t xml:space="preserve">JET-DEAD-CODE.md</w:t>
+        </w:r>
+      </w:hyperlink>
+      <w:r>
+        <w:t xml:space="preserve">): only the framebuffer frontend is left, the</w:t>
+      </w:r>
+      <w:r>
+        <w:t xml:space="preserve"> </w:t>
+      </w:r>
+      <w:r>
+        <w:t xml:space="preserve">three makefiles no longer generate the internal bitmap font, and a NetSurf file dropped from the</w:t>
+      </w:r>
+      <w:r>
+        <w:t xml:space="preserve"> </w:t>
+      </w:r>
+      <w:r>
+        <w:t xml:space="preserve">tree drops out of the builds'</w:t>
+      </w:r>
+      <w:r>
+        <w:t xml:space="preserve"> </w:t>
+      </w:r>
+      <w:r>
+        <w:rPr>
+          <w:rStyle w:val="VerbatimChar"/>
+        </w:rPr>
+        <w:t xml:space="preserve">$(wildcard ...)</w:t>
+      </w:r>
+      <w:r>
+        <w:t xml:space="preserve"> </w:t>
+      </w:r>
+      <w:r>
+        <w:t xml:space="preserve">lists by itself.</w:t>
+      </w:r>
+      <w:r>
+        <w:t xml:space="preserve"> </w:t>
+      </w:r>
+      <w:r>
         <w:t xml:space="preserve">NetSurf has since been changed a great deal for Onyx — its fonts (FreeType, web fonts,</w:t>
       </w:r>
       <w:r>
@@ -54207,7 +54260,7 @@
       <w:r>
         <w:t xml:space="preserve"> </w:t>
       </w:r>
-      <w:hyperlink r:id="rId66">
+      <w:hyperlink r:id="rId67">
         <w:r>
           <w:rPr>
             <w:rStyle w:val="VerbatimChar"/>
@@ -54703,7 +54756,7 @@
       <w:r>
         <w:t xml:space="preserve"> </w:t>
       </w:r>
-      <w:hyperlink r:id="rId67">
+      <w:hyperlink r:id="rId68">
         <w:r>
           <w:rPr>
             <w:rStyle w:val="VerbatimChar"/>
@@ -55107,7 +55160,7 @@
         <w:t xml:space="preserve">…, §earlier) still work and coexist; apps choose one model per window.</w:t>
       </w:r>
     </w:p>
-    <w:bookmarkStart w:id="71" w:name="dynamic-memory--c-apps"/>
+    <w:bookmarkStart w:id="72" w:name="dynamic-memory--c-apps"/>
     <w:p>
       <w:pPr>
         <w:pStyle w:val="Heading3"/>
@@ -55177,7 +55230,7 @@
       <w:r>
         <w:t xml:space="preserve"> </w:t>
       </w:r>
-      <w:hyperlink r:id="rId68">
+      <w:hyperlink r:id="rId69">
         <w:r>
           <w:rPr>
             <w:rStyle w:val="VerbatimChar"/>
@@ -55473,7 +55526,7 @@
       <w:r>
         <w:t xml:space="preserve"> </w:t>
       </w:r>
-      <w:hyperlink r:id="rId69">
+      <w:hyperlink r:id="rId70">
         <w:r>
           <w:rPr>
             <w:rStyle w:val="VerbatimChar"/>
@@ -55707,7 +55760,7 @@
       <w:r>
         <w:t xml:space="preserve"> </w:t>
       </w:r>
-      <w:hyperlink r:id="rId70">
+      <w:hyperlink r:id="rId71">
         <w:r>
           <w:rPr>
             <w:rStyle w:val="VerbatimChar"/>
@@ -55722,9 +55775,9 @@
         <w:t xml:space="preserve">for a working example.</w:t>
       </w:r>
     </w:p>
-    <w:bookmarkEnd w:id="71"/>
     <w:bookmarkEnd w:id="72"/>
-    <w:bookmarkStart w:id="86" w:name="X636230dba256ccd30a2e68f8101290712b3f4c4"/>
+    <w:bookmarkEnd w:id="73"/>
+    <w:bookmarkStart w:id="87" w:name="X636230dba256ccd30a2e68f8101290712b3f4c4"/>
     <w:p>
       <w:pPr>
         <w:pStyle w:val="Heading2"/>
@@ -56874,7 +56927,7 @@
       <w:r>
         <w:t xml:space="preserve"> </w:t>
       </w:r>
-      <w:hyperlink r:id="rId73">
+      <w:hyperlink r:id="rId74">
         <w:r>
           <w:rPr>
             <w:rStyle w:val="VerbatimChar"/>
@@ -56955,7 +57008,7 @@
       <w:r>
         <w:t xml:space="preserve"> </w:t>
       </w:r>
-      <w:hyperlink r:id="rId74">
+      <w:hyperlink r:id="rId75">
         <w:r>
           <w:rPr>
             <w:rStyle w:val="VerbatimChar"/>
@@ -57219,7 +57272,7 @@
         <w:t xml:space="preserve">40</w:t>
       </w:r>
     </w:p>
-    <w:bookmarkStart w:id="82" w:name="screenshots-and-documentation"/>
+    <w:bookmarkStart w:id="83" w:name="screenshots-and-documentation"/>
     <w:p>
       <w:pPr>
         <w:pStyle w:val="Heading3"/>
@@ -57249,7 +57302,7 @@
       <w:r>
         <w:t xml:space="preserve"> </w:t>
       </w:r>
-      <w:hyperlink r:id="rId75">
+      <w:hyperlink r:id="rId76">
         <w:r>
           <w:rPr>
             <w:rStyle w:val="VerbatimChar"/>
@@ -58031,7 +58084,7 @@
       <w:r>
         <w:t xml:space="preserve"> </w:t>
       </w:r>
-      <w:hyperlink r:id="rId76">
+      <w:hyperlink r:id="rId77">
         <w:r>
           <w:rPr>
             <w:rStyle w:val="VerbatimChar"/>
@@ -58172,7 +58225,7 @@
       <w:r>
         <w:t xml:space="preserve"> </w:t>
       </w:r>
-      <w:hyperlink r:id="rId77">
+      <w:hyperlink r:id="rId78">
         <w:r>
           <w:rPr>
             <w:rStyle w:val="VerbatimChar"/>
@@ -58195,7 +58248,7 @@
       <w:r>
         <w:t xml:space="preserve"> </w:t>
       </w:r>
-      <w:hyperlink r:id="rId78">
+      <w:hyperlink r:id="rId79">
         <w:r>
           <w:rPr>
             <w:rStyle w:val="VerbatimChar"/>
@@ -58230,7 +58283,7 @@
       <w:r>
         <w:t xml:space="preserve"> </w:t>
       </w:r>
-      <w:hyperlink r:id="rId79">
+      <w:hyperlink r:id="rId80">
         <w:r>
           <w:rPr>
             <w:rStyle w:val="VerbatimChar"/>
@@ -58436,7 +58489,7 @@
       <w:r>
         <w:t xml:space="preserve"> </w:t>
       </w:r>
-      <w:hyperlink r:id="rId80">
+      <w:hyperlink r:id="rId81">
         <w:r>
           <w:rPr>
             <w:rStyle w:val="VerbatimChar"/>
@@ -58499,7 +58552,7 @@
       <w:r>
         <w:t xml:space="preserve"> </w:t>
       </w:r>
-      <w:hyperlink r:id="rId81">
+      <w:hyperlink r:id="rId82">
         <w:r>
           <w:rPr>
             <w:rStyle w:val="VerbatimChar"/>
@@ -58723,8 +58776,8 @@
         <w:t xml:space="preserve">screenshot if the visual changes, then regenerates the exports.</w:t>
       </w:r>
     </w:p>
-    <w:bookmarkEnd w:id="82"/>
-    <w:bookmarkStart w:id="85" w:name="onyx-basic-the-interpreter"/>
+    <w:bookmarkEnd w:id="83"/>
+    <w:bookmarkStart w:id="86" w:name="onyx-basic-the-interpreter"/>
     <w:p>
       <w:pPr>
         <w:pStyle w:val="Heading3"/>
@@ -61752,7 +61805,7 @@
       <w:r>
         <w:t xml:space="preserve"> </w:t>
       </w:r>
-      <w:hyperlink r:id="rId83">
+      <w:hyperlink r:id="rId84">
         <w:r>
           <w:rPr>
             <w:rStyle w:val="VerbatimChar"/>
@@ -62562,7 +62615,7 @@
       <w:r>
         <w:t xml:space="preserve"> </w:t>
       </w:r>
-      <w:hyperlink r:id="rId84">
+      <w:hyperlink r:id="rId85">
         <w:r>
           <w:rPr>
             <w:rStyle w:val="VerbatimChar"/>
@@ -64102,9 +64155,9 @@
         <w:t xml:space="preserve">rewrites them).</w:t>
       </w:r>
     </w:p>
-    <w:bookmarkEnd w:id="85"/>
     <w:bookmarkEnd w:id="86"/>
-    <w:bookmarkStart w:id="87" w:name="Xc2ec260aede7afe7fa831ade27ff6c6be860f38"/>
+    <w:bookmarkEnd w:id="87"/>
+    <w:bookmarkStart w:id="88" w:name="Xc2ec260aede7afe7fa831ade27ff6c6be860f38"/>
     <w:p>
       <w:pPr>
         <w:pStyle w:val="Heading2"/>
@@ -64831,8 +64884,8 @@
         <w:t xml:space="preserve">"must match").</w:t>
       </w:r>
     </w:p>
-    <w:bookmarkEnd w:id="87"/>
-    <w:bookmarkStart w:id="88" w:name="X57cc4a25254639a1e87307c03f7beba3c173828"/>
+    <w:bookmarkEnd w:id="88"/>
+    <w:bookmarkStart w:id="89" w:name="X57cc4a25254639a1e87307c03f7beba3c173828"/>
     <w:p>
       <w:pPr>
         <w:pStyle w:val="Heading2"/>
@@ -65208,8 +65261,8 @@
         <w:t xml:space="preserve">committed in this repo.)</w:t>
       </w:r>
     </w:p>
-    <w:bookmarkEnd w:id="88"/>
-    <w:bookmarkStart w:id="90" w:name="Xe2e8f17f312baf0f280f8a3dfcc5fa34b4105bf"/>
+    <w:bookmarkEnd w:id="89"/>
+    <w:bookmarkStart w:id="91" w:name="Xe2e8f17f312baf0f280f8a3dfcc5fa34b4105bf"/>
     <w:p>
       <w:pPr>
         <w:pStyle w:val="Heading2"/>
@@ -66260,7 +66313,7 @@
       <w:r>
         <w:t xml:space="preserve"> </w:t>
       </w:r>
-      <w:hyperlink r:id="rId89">
+      <w:hyperlink r:id="rId90">
         <w:r>
           <w:rPr>
             <w:rStyle w:val="Hyperlink"/>
@@ -66272,8 +66325,8 @@
         <w:t xml:space="preserve">).</w:t>
       </w:r>
     </w:p>
-    <w:bookmarkEnd w:id="90"/>
-    <w:bookmarkStart w:id="92" w:name="Xe9c7e4e932ad1908138a3909ff179a810da6d71"/>
+    <w:bookmarkEnd w:id="91"/>
+    <w:bookmarkStart w:id="93" w:name="Xe9c7e4e932ad1908138a3909ff179a810da6d71"/>
     <w:p>
       <w:pPr>
         <w:pStyle w:val="Heading2"/>
@@ -67360,7 +67413,7 @@
       <w:r>
         <w:t xml:space="preserve"> </w:t>
       </w:r>
-      <w:hyperlink r:id="rId91">
+      <w:hyperlink r:id="rId92">
         <w:r>
           <w:rPr>
             <w:rStyle w:val="Hyperlink"/>
@@ -67755,7 +67808,7 @@
         <w:t xml:space="preserve">, not another clone.</w:t>
       </w:r>
     </w:p>
-    <w:bookmarkEnd w:id="92"/>
+    <w:bookmarkEnd w:id="93"/>
     <w:sectPr>
       <w:footerReference r:id="rId9" w:type="default"/>
       <w:footnotePr>

</xml_diff>

<commit_message>
docs exports: 03 and 06 regenerated after the merge (§38 + §39; docx -- the PDF export does not run here)
Co-Authored-By: Claude Opus 5.5 <noreply@anthropic.com>
Claude-Session: https://claude.ai/code/session_01UcY36na7Mp1DEYttKiw1pa
</commit_message>
<xml_diff>
--- a/docs/exports/03-DEVELOPER-GUIDE.docx
+++ b/docs/exports/03-DEVELOPER-GUIDE.docx
@@ -51222,7 +51222,7 @@
     </w:p>
     <w:bookmarkEnd w:id="50"/>
     <w:bookmarkEnd w:id="51"/>
-    <w:bookmarkStart w:id="72" w:name="Xf0254b5b66af42bca7d25138d14efff7271fb9a"/>
+    <w:bookmarkStart w:id="73" w:name="Xf0254b5b66af42bca7d25138d14efff7271fb9a"/>
     <w:p>
       <w:pPr>
         <w:pStyle w:val="Heading2"/>
@@ -54190,6 +54190,59 @@
         <w:t xml:space="preserve"> </w:t>
       </w:r>
       <w:r>
+        <w:t xml:space="preserve">The NetSurf code Jet does not use was removed from the tree and the builds in 2026-10</w:t>
+      </w:r>
+      <w:r>
+        <w:t xml:space="preserve"> </w:t>
+      </w:r>
+      <w:r>
+        <w:t xml:space="preserve">(docs/06 §39,</w:t>
+      </w:r>
+      <w:r>
+        <w:t xml:space="preserve"> </w:t>
+      </w:r>
+      <w:hyperlink r:id="rId66">
+        <w:r>
+          <w:rPr>
+            <w:rStyle w:val="VerbatimChar"/>
+          </w:rPr>
+          <w:t xml:space="preserve">JET-DEAD-CODE.md</w:t>
+        </w:r>
+      </w:hyperlink>
+      <w:r>
+        <w:t xml:space="preserve">): only the framebuffer frontend is left, the</w:t>
+      </w:r>
+      <w:r>
+        <w:t xml:space="preserve"> </w:t>
+      </w:r>
+      <w:r>
+        <w:t xml:space="preserve">three makefiles no longer generate the internal bitmap font, and a NetSurf file dropped from the</w:t>
+      </w:r>
+      <w:r>
+        <w:t xml:space="preserve"> </w:t>
+      </w:r>
+      <w:r>
+        <w:t xml:space="preserve">tree drops out of the builds'</w:t>
+      </w:r>
+      <w:r>
+        <w:t xml:space="preserve"> </w:t>
+      </w:r>
+      <w:r>
+        <w:rPr>
+          <w:rStyle w:val="VerbatimChar"/>
+        </w:rPr>
+        <w:t xml:space="preserve">$(wildcard ...)</w:t>
+      </w:r>
+      <w:r>
+        <w:t xml:space="preserve"> </w:t>
+      </w:r>
+      <w:r>
+        <w:t xml:space="preserve">lists by itself.</w:t>
+      </w:r>
+      <w:r>
+        <w:t xml:space="preserve"> </w:t>
+      </w:r>
+      <w:r>
         <w:t xml:space="preserve">NetSurf has since been changed a great deal for Onyx — its fonts (FreeType, web fonts,</w:t>
       </w:r>
       <w:r>
@@ -54207,7 +54260,7 @@
       <w:r>
         <w:t xml:space="preserve"> </w:t>
       </w:r>
-      <w:hyperlink r:id="rId66">
+      <w:hyperlink r:id="rId67">
         <w:r>
           <w:rPr>
             <w:rStyle w:val="VerbatimChar"/>
@@ -54865,7 +54918,7 @@
       <w:r>
         <w:t xml:space="preserve"> </w:t>
       </w:r>
-      <w:hyperlink r:id="rId67">
+      <w:hyperlink r:id="rId68">
         <w:r>
           <w:rPr>
             <w:rStyle w:val="VerbatimChar"/>
@@ -55269,7 +55322,7 @@
         <w:t xml:space="preserve">…, §earlier) still work and coexist; apps choose one model per window.</w:t>
       </w:r>
     </w:p>
-    <w:bookmarkStart w:id="71" w:name="dynamic-memory--c-apps"/>
+    <w:bookmarkStart w:id="72" w:name="dynamic-memory--c-apps"/>
     <w:p>
       <w:pPr>
         <w:pStyle w:val="Heading3"/>
@@ -55339,7 +55392,7 @@
       <w:r>
         <w:t xml:space="preserve"> </w:t>
       </w:r>
-      <w:hyperlink r:id="rId68">
+      <w:hyperlink r:id="rId69">
         <w:r>
           <w:rPr>
             <w:rStyle w:val="VerbatimChar"/>
@@ -55635,7 +55688,7 @@
       <w:r>
         <w:t xml:space="preserve"> </w:t>
       </w:r>
-      <w:hyperlink r:id="rId69">
+      <w:hyperlink r:id="rId70">
         <w:r>
           <w:rPr>
             <w:rStyle w:val="VerbatimChar"/>
@@ -55869,7 +55922,7 @@
       <w:r>
         <w:t xml:space="preserve"> </w:t>
       </w:r>
-      <w:hyperlink r:id="rId70">
+      <w:hyperlink r:id="rId71">
         <w:r>
           <w:rPr>
             <w:rStyle w:val="VerbatimChar"/>
@@ -55884,9 +55937,9 @@
         <w:t xml:space="preserve">for a working example.</w:t>
       </w:r>
     </w:p>
-    <w:bookmarkEnd w:id="71"/>
     <w:bookmarkEnd w:id="72"/>
-    <w:bookmarkStart w:id="86" w:name="X636230dba256ccd30a2e68f8101290712b3f4c4"/>
+    <w:bookmarkEnd w:id="73"/>
+    <w:bookmarkStart w:id="87" w:name="X636230dba256ccd30a2e68f8101290712b3f4c4"/>
     <w:p>
       <w:pPr>
         <w:pStyle w:val="Heading2"/>
@@ -57036,7 +57089,7 @@
       <w:r>
         <w:t xml:space="preserve"> </w:t>
       </w:r>
-      <w:hyperlink r:id="rId73">
+      <w:hyperlink r:id="rId74">
         <w:r>
           <w:rPr>
             <w:rStyle w:val="VerbatimChar"/>
@@ -57117,7 +57170,7 @@
       <w:r>
         <w:t xml:space="preserve"> </w:t>
       </w:r>
-      <w:hyperlink r:id="rId74">
+      <w:hyperlink r:id="rId75">
         <w:r>
           <w:rPr>
             <w:rStyle w:val="VerbatimChar"/>
@@ -57381,7 +57434,7 @@
         <w:t xml:space="preserve">40</w:t>
       </w:r>
     </w:p>
-    <w:bookmarkStart w:id="82" w:name="screenshots-and-documentation"/>
+    <w:bookmarkStart w:id="83" w:name="screenshots-and-documentation"/>
     <w:p>
       <w:pPr>
         <w:pStyle w:val="Heading3"/>
@@ -57411,7 +57464,7 @@
       <w:r>
         <w:t xml:space="preserve"> </w:t>
       </w:r>
-      <w:hyperlink r:id="rId75">
+      <w:hyperlink r:id="rId76">
         <w:r>
           <w:rPr>
             <w:rStyle w:val="VerbatimChar"/>
@@ -58193,7 +58246,7 @@
       <w:r>
         <w:t xml:space="preserve"> </w:t>
       </w:r>
-      <w:hyperlink r:id="rId76">
+      <w:hyperlink r:id="rId77">
         <w:r>
           <w:rPr>
             <w:rStyle w:val="VerbatimChar"/>
@@ -58334,7 +58387,7 @@
       <w:r>
         <w:t xml:space="preserve"> </w:t>
       </w:r>
-      <w:hyperlink r:id="rId77">
+      <w:hyperlink r:id="rId78">
         <w:r>
           <w:rPr>
             <w:rStyle w:val="VerbatimChar"/>
@@ -58357,7 +58410,7 @@
       <w:r>
         <w:t xml:space="preserve"> </w:t>
       </w:r>
-      <w:hyperlink r:id="rId78">
+      <w:hyperlink r:id="rId79">
         <w:r>
           <w:rPr>
             <w:rStyle w:val="VerbatimChar"/>
@@ -58392,7 +58445,7 @@
       <w:r>
         <w:t xml:space="preserve"> </w:t>
       </w:r>
-      <w:hyperlink r:id="rId79">
+      <w:hyperlink r:id="rId80">
         <w:r>
           <w:rPr>
             <w:rStyle w:val="VerbatimChar"/>
@@ -58598,7 +58651,7 @@
       <w:r>
         <w:t xml:space="preserve"> </w:t>
       </w:r>
-      <w:hyperlink r:id="rId80">
+      <w:hyperlink r:id="rId81">
         <w:r>
           <w:rPr>
             <w:rStyle w:val="VerbatimChar"/>
@@ -58661,7 +58714,7 @@
       <w:r>
         <w:t xml:space="preserve"> </w:t>
       </w:r>
-      <w:hyperlink r:id="rId81">
+      <w:hyperlink r:id="rId82">
         <w:r>
           <w:rPr>
             <w:rStyle w:val="VerbatimChar"/>
@@ -58885,8 +58938,8 @@
         <w:t xml:space="preserve">screenshot if the visual changes, then regenerates the exports.</w:t>
       </w:r>
     </w:p>
-    <w:bookmarkEnd w:id="82"/>
-    <w:bookmarkStart w:id="85" w:name="onyx-basic-the-interpreter"/>
+    <w:bookmarkEnd w:id="83"/>
+    <w:bookmarkStart w:id="86" w:name="onyx-basic-the-interpreter"/>
     <w:p>
       <w:pPr>
         <w:pStyle w:val="Heading3"/>
@@ -61914,7 +61967,7 @@
       <w:r>
         <w:t xml:space="preserve"> </w:t>
       </w:r>
-      <w:hyperlink r:id="rId83">
+      <w:hyperlink r:id="rId84">
         <w:r>
           <w:rPr>
             <w:rStyle w:val="VerbatimChar"/>
@@ -62724,7 +62777,7 @@
       <w:r>
         <w:t xml:space="preserve"> </w:t>
       </w:r>
-      <w:hyperlink r:id="rId84">
+      <w:hyperlink r:id="rId85">
         <w:r>
           <w:rPr>
             <w:rStyle w:val="VerbatimChar"/>
@@ -64264,9 +64317,9 @@
         <w:t xml:space="preserve">rewrites them).</w:t>
       </w:r>
     </w:p>
-    <w:bookmarkEnd w:id="85"/>
     <w:bookmarkEnd w:id="86"/>
-    <w:bookmarkStart w:id="87" w:name="Xc2ec260aede7afe7fa831ade27ff6c6be860f38"/>
+    <w:bookmarkEnd w:id="87"/>
+    <w:bookmarkStart w:id="88" w:name="Xc2ec260aede7afe7fa831ade27ff6c6be860f38"/>
     <w:p>
       <w:pPr>
         <w:pStyle w:val="Heading2"/>
@@ -64993,8 +65046,8 @@
         <w:t xml:space="preserve">"must match").</w:t>
       </w:r>
     </w:p>
-    <w:bookmarkEnd w:id="87"/>
-    <w:bookmarkStart w:id="88" w:name="X57cc4a25254639a1e87307c03f7beba3c173828"/>
+    <w:bookmarkEnd w:id="88"/>
+    <w:bookmarkStart w:id="89" w:name="X57cc4a25254639a1e87307c03f7beba3c173828"/>
     <w:p>
       <w:pPr>
         <w:pStyle w:val="Heading2"/>
@@ -65370,8 +65423,8 @@
         <w:t xml:space="preserve">committed in this repo.)</w:t>
       </w:r>
     </w:p>
-    <w:bookmarkEnd w:id="88"/>
-    <w:bookmarkStart w:id="90" w:name="Xe2e8f17f312baf0f280f8a3dfcc5fa34b4105bf"/>
+    <w:bookmarkEnd w:id="89"/>
+    <w:bookmarkStart w:id="91" w:name="Xe2e8f17f312baf0f280f8a3dfcc5fa34b4105bf"/>
     <w:p>
       <w:pPr>
         <w:pStyle w:val="Heading2"/>
@@ -66422,7 +66475,7 @@
       <w:r>
         <w:t xml:space="preserve"> </w:t>
       </w:r>
-      <w:hyperlink r:id="rId89">
+      <w:hyperlink r:id="rId90">
         <w:r>
           <w:rPr>
             <w:rStyle w:val="Hyperlink"/>
@@ -66434,8 +66487,8 @@
         <w:t xml:space="preserve">).</w:t>
       </w:r>
     </w:p>
-    <w:bookmarkEnd w:id="90"/>
-    <w:bookmarkStart w:id="92" w:name="Xe9c7e4e932ad1908138a3909ff179a810da6d71"/>
+    <w:bookmarkEnd w:id="91"/>
+    <w:bookmarkStart w:id="93" w:name="Xe9c7e4e932ad1908138a3909ff179a810da6d71"/>
     <w:p>
       <w:pPr>
         <w:pStyle w:val="Heading2"/>
@@ -67522,7 +67575,7 @@
       <w:r>
         <w:t xml:space="preserve"> </w:t>
       </w:r>
-      <w:hyperlink r:id="rId91">
+      <w:hyperlink r:id="rId92">
         <w:r>
           <w:rPr>
             <w:rStyle w:val="Hyperlink"/>
@@ -67917,7 +67970,7 @@
         <w:t xml:space="preserve">, not another clone.</w:t>
       </w:r>
     </w:p>
-    <w:bookmarkEnd w:id="92"/>
+    <w:bookmarkEnd w:id="93"/>
     <w:sectPr>
       <w:footerReference r:id="rId9" w:type="default"/>
       <w:footnotePr>

</xml_diff>

<commit_message>
Jet: screenshots (find bar, context menu) and the docs' exports (docs/06 §40)
Co-Authored-By: Claude Opus 5.5 <noreply@anthropic.com>
Claude-Session: https://claude.ai/code/session_01UcY36na7Mp1DEYttKiw1pa
</commit_message>
<xml_diff>
--- a/docs/exports/03-DEVELOPER-GUIDE.docx
+++ b/docs/exports/03-DEVELOPER-GUIDE.docx
@@ -54853,6 +54853,211 @@
       </w:r>
       <w:r>
         <w:t xml:space="preserve">reads the box.</w:t>
+      </w:r>
+      <w:r>
+        <w:t xml:space="preserve"> </w:t>
+      </w:r>
+      <w:r>
+        <w:t xml:space="preserve">Find in page, copy and paste and the page's context menu (docs/06 §40) are checked by</w:t>
+      </w:r>
+      <w:r>
+        <w:t xml:space="preserve"> </w:t>
+      </w:r>
+      <w:r>
+        <w:rPr>
+          <w:rStyle w:val="VerbatimChar"/>
+        </w:rPr>
+        <w:t xml:space="preserve">sh tools/tests/netsurf/findtest.sh</w:t>
+      </w:r>
+      <w:r>
+        <w:t xml:space="preserve">; the frontend's side is</w:t>
+      </w:r>
+      <w:r>
+        <w:t xml:space="preserve"> </w:t>
+      </w:r>
+      <w:r>
+        <w:rPr>
+          <w:rStyle w:val="VerbatimChar"/>
+        </w:rPr>
+        <w:t xml:space="preserve">frontends/framebuffer/onyx_edit.c</w:t>
+      </w:r>
+      <w:r>
+        <w:t xml:space="preserve"> </w:t>
+      </w:r>
+      <w:r>
+        <w:t xml:space="preserve">(the search, the context menu's commands, Copy Image as a PNG in</w:t>
+      </w:r>
+      <w:r>
+        <w:t xml:space="preserve"> </w:t>
+      </w:r>
+      <w:r>
+        <w:rPr>
+          <w:rStyle w:val="VerbatimChar"/>
+        </w:rPr>
+        <w:t xml:space="preserve">RAM:/jet/clip/</w:t>
+      </w:r>
+      <w:r>
+        <w:t xml:space="preserve"> </w:t>
+      </w:r>
+      <w:r>
+        <w:t xml:space="preserve">+</w:t>
+      </w:r>
+      <w:r>
+        <w:t xml:space="preserve"> </w:t>
+      </w:r>
+      <w:r>
+        <w:rPr>
+          <w:rStyle w:val="VerbatimChar"/>
+        </w:rPr>
+        <w:t xml:space="preserve">CLIP_FILES</w:t>
+      </w:r>
+      <w:r>
+        <w:t xml:space="preserve">)</w:t>
+      </w:r>
+      <w:r>
+        <w:t xml:space="preserve"> </w:t>
+      </w:r>
+      <w:r>
+        <w:t xml:space="preserve">and</w:t>
+      </w:r>
+      <w:r>
+        <w:t xml:space="preserve"> </w:t>
+      </w:r>
+      <w:r>
+        <w:rPr>
+          <w:rStyle w:val="VerbatimChar"/>
+        </w:rPr>
+        <w:t xml:space="preserve">clipboard.c</w:t>
+      </w:r>
+      <w:r>
+        <w:t xml:space="preserve"> </w:t>
+      </w:r>
+      <w:r>
+        <w:t xml:space="preserve">(the kernel's clipboard, UTF-8); the core's search is</w:t>
+      </w:r>
+      <w:r>
+        <w:t xml:space="preserve"> </w:t>
+      </w:r>
+      <w:r>
+        <w:rPr>
+          <w:rStyle w:val="VerbatimChar"/>
+        </w:rPr>
+        <w:t xml:space="preserve">content/textsearch.c</w:t>
+      </w:r>
+      <w:r>
+        <w:t xml:space="preserve"> </w:t>
+      </w:r>
+      <w:r>
+        <w:t xml:space="preserve">(an array of matches, binary-searched when painting). The stand-in</w:t>
+      </w:r>
+      <w:r>
+        <w:t xml:space="preserve"> </w:t>
+      </w:r>
+      <w:r>
+        <w:t xml:space="preserve">kernel's clipboard is a real one:</w:t>
+      </w:r>
+      <w:r>
+        <w:t xml:space="preserve"> </w:t>
+      </w:r>
+      <w:r>
+        <w:rPr>
+          <w:rStyle w:val="VerbatimChar"/>
+          <w:b/>
+          <w:bCs/>
+        </w:rPr>
+        <w:t xml:space="preserve">SIM_CLIP</w:t>
+      </w:r>
+      <w:r>
+        <w:t xml:space="preserve"> </w:t>
+      </w:r>
+      <w:r>
+        <w:t xml:space="preserve">sets it at the start (text, or</w:t>
+      </w:r>
+      <w:r>
+        <w:t xml:space="preserve"> </w:t>
+      </w:r>
+      <w:r>
+        <w:rPr>
+          <w:rStyle w:val="VerbatimChar"/>
+        </w:rPr>
+        <w:t xml:space="preserve">files:PATH</w:t>
+      </w:r>
+      <w:r>
+        <w:t xml:space="preserve"> </w:t>
+      </w:r>
+      <w:r>
+        <w:t xml:space="preserve">for</w:t>
+      </w:r>
+      <w:r>
+        <w:t xml:space="preserve"> </w:t>
+      </w:r>
+      <w:r>
+        <w:rPr>
+          <w:rStyle w:val="VerbatimChar"/>
+        </w:rPr>
+        <w:t xml:space="preserve">CLIP_FILES</w:t>
+      </w:r>
+      <w:r>
+        <w:t xml:space="preserve">),</w:t>
+      </w:r>
+      <w:r>
+        <w:t xml:space="preserve"> </w:t>
+      </w:r>
+      <w:r>
+        <w:rPr>
+          <w:rStyle w:val="VerbatimChar"/>
+          <w:b/>
+          <w:bCs/>
+        </w:rPr>
+        <w:t xml:space="preserve">SIM_CLIPFILE</w:t>
+      </w:r>
+      <w:r>
+        <w:t xml:space="preserve"> </w:t>
+      </w:r>
+      <w:r>
+        <w:t xml:space="preserve">receives each copy's bytes, and every set logs</w:t>
+      </w:r>
+      <w:r>
+        <w:t xml:space="preserve"> </w:t>
+      </w:r>
+      <w:r>
+        <w:rPr>
+          <w:rStyle w:val="VerbatimChar"/>
+        </w:rPr>
+        <w:t xml:space="preserve">SIM-CLIPBOARD type=T len=N</w:t>
+      </w:r>
+      <w:r>
+        <w:t xml:space="preserve">. An app that pastes a copied picture reads it as Paint does</w:t>
+      </w:r>
+      <w:r>
+        <w:t xml:space="preserve"> </w:t>
+      </w:r>
+      <w:r>
+        <w:t xml:space="preserve">(</w:t>
+      </w:r>
+      <w:r>
+        <w:rPr>
+          <w:rStyle w:val="VerbatimChar"/>
+        </w:rPr>
+        <w:t xml:space="preserve">clip_get_file</w:t>
+      </w:r>
+      <w:r>
+        <w:t xml:space="preserve"> </w:t>
+      </w:r>
+      <w:r>
+        <w:t xml:space="preserve">+</w:t>
+      </w:r>
+      <w:r>
+        <w:t xml:space="preserve"> </w:t>
+      </w:r>
+      <w:r>
+        <w:rPr>
+          <w:rStyle w:val="VerbatimChar"/>
+        </w:rPr>
+        <w:t xml:space="preserve">img_load</w:t>
+      </w:r>
+      <w:r>
+        <w:t xml:space="preserve">).</w:t>
       </w:r>
     </w:p>
     <w:p>

</xml_diff>

<commit_message>
docs exports: 03 and 06 regenerated after the Acid merge (§37, §38, §39; docx)
Co-Authored-By: Claude Opus 5.5 <noreply@anthropic.com>
Claude-Session: https://claude.ai/code/session_01UcY36na7Mp1DEYttKiw1pa
</commit_message>
<xml_diff>
--- a/docs/exports/03-DEVELOPER-GUIDE.docx
+++ b/docs/exports/03-DEVELOPER-GUIDE.docx
@@ -51222,7 +51222,7 @@
     </w:p>
     <w:bookmarkEnd w:id="50"/>
     <w:bookmarkEnd w:id="51"/>
-    <w:bookmarkStart w:id="72" w:name="Xf0254b5b66af42bca7d25138d14efff7271fb9a"/>
+    <w:bookmarkStart w:id="73" w:name="Xf0254b5b66af42bca7d25138d14efff7271fb9a"/>
     <w:p>
       <w:pPr>
         <w:pStyle w:val="Heading2"/>
@@ -54190,6 +54190,59 @@
         <w:t xml:space="preserve"> </w:t>
       </w:r>
       <w:r>
+        <w:t xml:space="preserve">The NetSurf code Jet does not use was removed from the tree and the builds in 2026-10</w:t>
+      </w:r>
+      <w:r>
+        <w:t xml:space="preserve"> </w:t>
+      </w:r>
+      <w:r>
+        <w:t xml:space="preserve">(docs/06 §39,</w:t>
+      </w:r>
+      <w:r>
+        <w:t xml:space="preserve"> </w:t>
+      </w:r>
+      <w:hyperlink r:id="rId66">
+        <w:r>
+          <w:rPr>
+            <w:rStyle w:val="VerbatimChar"/>
+          </w:rPr>
+          <w:t xml:space="preserve">JET-DEAD-CODE.md</w:t>
+        </w:r>
+      </w:hyperlink>
+      <w:r>
+        <w:t xml:space="preserve">): only the framebuffer frontend is left, the</w:t>
+      </w:r>
+      <w:r>
+        <w:t xml:space="preserve"> </w:t>
+      </w:r>
+      <w:r>
+        <w:t xml:space="preserve">three makefiles no longer generate the internal bitmap font, and a NetSurf file dropped from the</w:t>
+      </w:r>
+      <w:r>
+        <w:t xml:space="preserve"> </w:t>
+      </w:r>
+      <w:r>
+        <w:t xml:space="preserve">tree drops out of the builds'</w:t>
+      </w:r>
+      <w:r>
+        <w:t xml:space="preserve"> </w:t>
+      </w:r>
+      <w:r>
+        <w:rPr>
+          <w:rStyle w:val="VerbatimChar"/>
+        </w:rPr>
+        <w:t xml:space="preserve">$(wildcard ...)</w:t>
+      </w:r>
+      <w:r>
+        <w:t xml:space="preserve"> </w:t>
+      </w:r>
+      <w:r>
+        <w:t xml:space="preserve">lists by itself.</w:t>
+      </w:r>
+      <w:r>
+        <w:t xml:space="preserve"> </w:t>
+      </w:r>
+      <w:r>
         <w:t xml:space="preserve">NetSurf has since been changed a great deal for Onyx — its fonts (FreeType, web fonts,</w:t>
       </w:r>
       <w:r>
@@ -54207,7 +54260,7 @@
       <w:r>
         <w:t xml:space="preserve"> </w:t>
       </w:r>
-      <w:hyperlink r:id="rId66">
+      <w:hyperlink r:id="rId67">
         <w:r>
           <w:rPr>
             <w:rStyle w:val="VerbatimChar"/>
@@ -54865,7 +54918,7 @@
       <w:r>
         <w:t xml:space="preserve"> </w:t>
       </w:r>
-      <w:hyperlink r:id="rId67">
+      <w:hyperlink r:id="rId68">
         <w:r>
           <w:rPr>
             <w:rStyle w:val="VerbatimChar"/>
@@ -55269,7 +55322,7 @@
         <w:t xml:space="preserve">…, §earlier) still work and coexist; apps choose one model per window.</w:t>
       </w:r>
     </w:p>
-    <w:bookmarkStart w:id="71" w:name="dynamic-memory--c-apps"/>
+    <w:bookmarkStart w:id="72" w:name="dynamic-memory--c-apps"/>
     <w:p>
       <w:pPr>
         <w:pStyle w:val="Heading3"/>
@@ -55339,7 +55392,7 @@
       <w:r>
         <w:t xml:space="preserve"> </w:t>
       </w:r>
-      <w:hyperlink r:id="rId68">
+      <w:hyperlink r:id="rId69">
         <w:r>
           <w:rPr>
             <w:rStyle w:val="VerbatimChar"/>
@@ -55635,7 +55688,7 @@
       <w:r>
         <w:t xml:space="preserve"> </w:t>
       </w:r>
-      <w:hyperlink r:id="rId69">
+      <w:hyperlink r:id="rId70">
         <w:r>
           <w:rPr>
             <w:rStyle w:val="VerbatimChar"/>
@@ -55869,7 +55922,7 @@
       <w:r>
         <w:t xml:space="preserve"> </w:t>
       </w:r>
-      <w:hyperlink r:id="rId70">
+      <w:hyperlink r:id="rId71">
         <w:r>
           <w:rPr>
             <w:rStyle w:val="VerbatimChar"/>
@@ -55884,9 +55937,9 @@
         <w:t xml:space="preserve">for a working example.</w:t>
       </w:r>
     </w:p>
-    <w:bookmarkEnd w:id="71"/>
     <w:bookmarkEnd w:id="72"/>
-    <w:bookmarkStart w:id="86" w:name="X636230dba256ccd30a2e68f8101290712b3f4c4"/>
+    <w:bookmarkEnd w:id="73"/>
+    <w:bookmarkStart w:id="87" w:name="X636230dba256ccd30a2e68f8101290712b3f4c4"/>
     <w:p>
       <w:pPr>
         <w:pStyle w:val="Heading2"/>
@@ -57036,7 +57089,7 @@
       <w:r>
         <w:t xml:space="preserve"> </w:t>
       </w:r>
-      <w:hyperlink r:id="rId73">
+      <w:hyperlink r:id="rId74">
         <w:r>
           <w:rPr>
             <w:rStyle w:val="VerbatimChar"/>
@@ -57117,7 +57170,7 @@
       <w:r>
         <w:t xml:space="preserve"> </w:t>
       </w:r>
-      <w:hyperlink r:id="rId74">
+      <w:hyperlink r:id="rId75">
         <w:r>
           <w:rPr>
             <w:rStyle w:val="VerbatimChar"/>
@@ -57381,7 +57434,7 @@
         <w:t xml:space="preserve">40</w:t>
       </w:r>
     </w:p>
-    <w:bookmarkStart w:id="82" w:name="screenshots-and-documentation"/>
+    <w:bookmarkStart w:id="83" w:name="screenshots-and-documentation"/>
     <w:p>
       <w:pPr>
         <w:pStyle w:val="Heading3"/>
@@ -57411,7 +57464,7 @@
       <w:r>
         <w:t xml:space="preserve"> </w:t>
       </w:r>
-      <w:hyperlink r:id="rId75">
+      <w:hyperlink r:id="rId76">
         <w:r>
           <w:rPr>
             <w:rStyle w:val="VerbatimChar"/>
@@ -58193,7 +58246,7 @@
       <w:r>
         <w:t xml:space="preserve"> </w:t>
       </w:r>
-      <w:hyperlink r:id="rId76">
+      <w:hyperlink r:id="rId77">
         <w:r>
           <w:rPr>
             <w:rStyle w:val="VerbatimChar"/>
@@ -58334,7 +58387,7 @@
       <w:r>
         <w:t xml:space="preserve"> </w:t>
       </w:r>
-      <w:hyperlink r:id="rId77">
+      <w:hyperlink r:id="rId78">
         <w:r>
           <w:rPr>
             <w:rStyle w:val="VerbatimChar"/>
@@ -58357,7 +58410,7 @@
       <w:r>
         <w:t xml:space="preserve"> </w:t>
       </w:r>
-      <w:hyperlink r:id="rId78">
+      <w:hyperlink r:id="rId79">
         <w:r>
           <w:rPr>
             <w:rStyle w:val="VerbatimChar"/>
@@ -58392,7 +58445,7 @@
       <w:r>
         <w:t xml:space="preserve"> </w:t>
       </w:r>
-      <w:hyperlink r:id="rId79">
+      <w:hyperlink r:id="rId80">
         <w:r>
           <w:rPr>
             <w:rStyle w:val="VerbatimChar"/>
@@ -58598,7 +58651,7 @@
       <w:r>
         <w:t xml:space="preserve"> </w:t>
       </w:r>
-      <w:hyperlink r:id="rId80">
+      <w:hyperlink r:id="rId81">
         <w:r>
           <w:rPr>
             <w:rStyle w:val="VerbatimChar"/>
@@ -58661,7 +58714,7 @@
       <w:r>
         <w:t xml:space="preserve"> </w:t>
       </w:r>
-      <w:hyperlink r:id="rId81">
+      <w:hyperlink r:id="rId82">
         <w:r>
           <w:rPr>
             <w:rStyle w:val="VerbatimChar"/>
@@ -58885,8 +58938,8 @@
         <w:t xml:space="preserve">screenshot if the visual changes, then regenerates the exports.</w:t>
       </w:r>
     </w:p>
-    <w:bookmarkEnd w:id="82"/>
-    <w:bookmarkStart w:id="85" w:name="onyx-basic-the-interpreter"/>
+    <w:bookmarkEnd w:id="83"/>
+    <w:bookmarkStart w:id="86" w:name="onyx-basic-the-interpreter"/>
     <w:p>
       <w:pPr>
         <w:pStyle w:val="Heading3"/>
@@ -61914,7 +61967,7 @@
       <w:r>
         <w:t xml:space="preserve"> </w:t>
       </w:r>
-      <w:hyperlink r:id="rId83">
+      <w:hyperlink r:id="rId84">
         <w:r>
           <w:rPr>
             <w:rStyle w:val="VerbatimChar"/>
@@ -62724,7 +62777,7 @@
       <w:r>
         <w:t xml:space="preserve"> </w:t>
       </w:r>
-      <w:hyperlink r:id="rId84">
+      <w:hyperlink r:id="rId85">
         <w:r>
           <w:rPr>
             <w:rStyle w:val="VerbatimChar"/>
@@ -64264,9 +64317,9 @@
         <w:t xml:space="preserve">rewrites them).</w:t>
       </w:r>
     </w:p>
-    <w:bookmarkEnd w:id="85"/>
     <w:bookmarkEnd w:id="86"/>
-    <w:bookmarkStart w:id="87" w:name="Xc2ec260aede7afe7fa831ade27ff6c6be860f38"/>
+    <w:bookmarkEnd w:id="87"/>
+    <w:bookmarkStart w:id="88" w:name="Xc2ec260aede7afe7fa831ade27ff6c6be860f38"/>
     <w:p>
       <w:pPr>
         <w:pStyle w:val="Heading2"/>
@@ -64993,8 +65046,8 @@
         <w:t xml:space="preserve">"must match").</w:t>
       </w:r>
     </w:p>
-    <w:bookmarkEnd w:id="87"/>
-    <w:bookmarkStart w:id="88" w:name="X57cc4a25254639a1e87307c03f7beba3c173828"/>
+    <w:bookmarkEnd w:id="88"/>
+    <w:bookmarkStart w:id="89" w:name="X57cc4a25254639a1e87307c03f7beba3c173828"/>
     <w:p>
       <w:pPr>
         <w:pStyle w:val="Heading2"/>
@@ -65370,8 +65423,8 @@
         <w:t xml:space="preserve">committed in this repo.)</w:t>
       </w:r>
     </w:p>
-    <w:bookmarkEnd w:id="88"/>
-    <w:bookmarkStart w:id="90" w:name="Xe2e8f17f312baf0f280f8a3dfcc5fa34b4105bf"/>
+    <w:bookmarkEnd w:id="89"/>
+    <w:bookmarkStart w:id="91" w:name="Xe2e8f17f312baf0f280f8a3dfcc5fa34b4105bf"/>
     <w:p>
       <w:pPr>
         <w:pStyle w:val="Heading2"/>
@@ -66422,7 +66475,7 @@
       <w:r>
         <w:t xml:space="preserve"> </w:t>
       </w:r>
-      <w:hyperlink r:id="rId89">
+      <w:hyperlink r:id="rId90">
         <w:r>
           <w:rPr>
             <w:rStyle w:val="Hyperlink"/>
@@ -66434,8 +66487,8 @@
         <w:t xml:space="preserve">).</w:t>
       </w:r>
     </w:p>
-    <w:bookmarkEnd w:id="90"/>
-    <w:bookmarkStart w:id="92" w:name="Xe9c7e4e932ad1908138a3909ff179a810da6d71"/>
+    <w:bookmarkEnd w:id="91"/>
+    <w:bookmarkStart w:id="93" w:name="Xe9c7e4e932ad1908138a3909ff179a810da6d71"/>
     <w:p>
       <w:pPr>
         <w:pStyle w:val="Heading2"/>
@@ -67522,7 +67575,7 @@
       <w:r>
         <w:t xml:space="preserve"> </w:t>
       </w:r>
-      <w:hyperlink r:id="rId91">
+      <w:hyperlink r:id="rId92">
         <w:r>
           <w:rPr>
             <w:rStyle w:val="Hyperlink"/>
@@ -67917,7 +67970,7 @@
         <w:t xml:space="preserve">, not another clone.</w:t>
       </w:r>
     </w:p>
-    <w:bookmarkEnd w:id="92"/>
+    <w:bookmarkEnd w:id="93"/>
     <w:sectPr>
       <w:footerReference r:id="rId9" w:type="default"/>
       <w:footnotePr>

</xml_diff>

<commit_message>
menubar: draw its text with FreeType (DejaVu Sans 13, anti-aliased)
The menu bar joins FT_APPS (newlib + ft/libft.a): ft_wtk_install after
wtk::init, titles, items, shortcuts, sub-menus, the clock and the volume
box measured in pixels (wk_tw) and drawn through the face (wk_text_l).
Screenshots (menubar, volume, clock, wifimenu, desktop, clipboard), docs
03/04, HANDOFF and the exports updated.

Co-Authored-By: Claude Opus 5.5 <noreply@anthropic.com>
Claude-Session: https://claude.ai/code/session_012k6pqyonBBqCtDQrtttmUW
</commit_message>
<xml_diff>
--- a/docs/exports/03-DEVELOPER-GUIDE.docx
+++ b/docs/exports/03-DEVELOPER-GUIDE.docx
@@ -32395,13 +32395,13 @@
         <w:t xml:space="preserve"> </w:t>
       </w:r>
       <w:r>
-        <w:t xml:space="preserve">Display, Sound, Keyboard &amp; Mouse, Gamepad, Wi-Fi, App Settings), the Game Library and Setup</w:t>
-      </w:r>
-      <w:r>
-        <w:t xml:space="preserve"> </w:t>
-      </w:r>
-      <w:r>
-        <w:t xml:space="preserve">share (</w:t>
+        <w:t xml:space="preserve">Display, Sound, Keyboard &amp; Mouse, Gamepad, Wi-Fi, App Settings), the Game Library, Setup and</w:t>
+      </w:r>
+      <w:r>
+        <w:t xml:space="preserve"> </w:t>
+      </w:r>
+      <w:r>
+        <w:t xml:space="preserve">the menu bar share (</w:t>
       </w:r>
       <w:r>
         <w:rPr>

</xml_diff>

<commit_message>
docs exports: 03 and 06 regenerated after the last merge (§37-§39; docx)
Co-Authored-By: Claude Opus 5.5 <noreply@anthropic.com>
Claude-Session: https://claude.ai/code/session_01UcY36na7Mp1DEYttKiw1pa
</commit_message>
<xml_diff>
--- a/docs/exports/03-DEVELOPER-GUIDE.docx
+++ b/docs/exports/03-DEVELOPER-GUIDE.docx
@@ -51222,7 +51222,7 @@
     </w:p>
     <w:bookmarkEnd w:id="50"/>
     <w:bookmarkEnd w:id="51"/>
-    <w:bookmarkStart w:id="72" w:name="Xf0254b5b66af42bca7d25138d14efff7271fb9a"/>
+    <w:bookmarkStart w:id="73" w:name="Xf0254b5b66af42bca7d25138d14efff7271fb9a"/>
     <w:p>
       <w:pPr>
         <w:pStyle w:val="Heading2"/>
@@ -54190,6 +54190,59 @@
         <w:t xml:space="preserve"> </w:t>
       </w:r>
       <w:r>
+        <w:t xml:space="preserve">The NetSurf code Jet does not use was removed from the tree and the builds in 2026-10</w:t>
+      </w:r>
+      <w:r>
+        <w:t xml:space="preserve"> </w:t>
+      </w:r>
+      <w:r>
+        <w:t xml:space="preserve">(docs/06 §39,</w:t>
+      </w:r>
+      <w:r>
+        <w:t xml:space="preserve"> </w:t>
+      </w:r>
+      <w:hyperlink r:id="rId66">
+        <w:r>
+          <w:rPr>
+            <w:rStyle w:val="VerbatimChar"/>
+          </w:rPr>
+          <w:t xml:space="preserve">JET-DEAD-CODE.md</w:t>
+        </w:r>
+      </w:hyperlink>
+      <w:r>
+        <w:t xml:space="preserve">): only the framebuffer frontend is left, the</w:t>
+      </w:r>
+      <w:r>
+        <w:t xml:space="preserve"> </w:t>
+      </w:r>
+      <w:r>
+        <w:t xml:space="preserve">three makefiles no longer generate the internal bitmap font, and a NetSurf file dropped from the</w:t>
+      </w:r>
+      <w:r>
+        <w:t xml:space="preserve"> </w:t>
+      </w:r>
+      <w:r>
+        <w:t xml:space="preserve">tree drops out of the builds'</w:t>
+      </w:r>
+      <w:r>
+        <w:t xml:space="preserve"> </w:t>
+      </w:r>
+      <w:r>
+        <w:rPr>
+          <w:rStyle w:val="VerbatimChar"/>
+        </w:rPr>
+        <w:t xml:space="preserve">$(wildcard ...)</w:t>
+      </w:r>
+      <w:r>
+        <w:t xml:space="preserve"> </w:t>
+      </w:r>
+      <w:r>
+        <w:t xml:space="preserve">lists by itself.</w:t>
+      </w:r>
+      <w:r>
+        <w:t xml:space="preserve"> </w:t>
+      </w:r>
+      <w:r>
         <w:t xml:space="preserve">NetSurf has since been changed a great deal for Onyx — its fonts (FreeType, web fonts,</w:t>
       </w:r>
       <w:r>
@@ -54207,7 +54260,7 @@
       <w:r>
         <w:t xml:space="preserve"> </w:t>
       </w:r>
-      <w:hyperlink r:id="rId66">
+      <w:hyperlink r:id="rId67">
         <w:r>
           <w:rPr>
             <w:rStyle w:val="VerbatimChar"/>
@@ -54865,7 +54918,7 @@
       <w:r>
         <w:t xml:space="preserve"> </w:t>
       </w:r>
-      <w:hyperlink r:id="rId67">
+      <w:hyperlink r:id="rId68">
         <w:r>
           <w:rPr>
             <w:rStyle w:val="VerbatimChar"/>
@@ -55269,7 +55322,7 @@
         <w:t xml:space="preserve">…, §earlier) still work and coexist; apps choose one model per window.</w:t>
       </w:r>
     </w:p>
-    <w:bookmarkStart w:id="71" w:name="dynamic-memory--c-apps"/>
+    <w:bookmarkStart w:id="72" w:name="dynamic-memory--c-apps"/>
     <w:p>
       <w:pPr>
         <w:pStyle w:val="Heading3"/>
@@ -55339,7 +55392,7 @@
       <w:r>
         <w:t xml:space="preserve"> </w:t>
       </w:r>
-      <w:hyperlink r:id="rId68">
+      <w:hyperlink r:id="rId69">
         <w:r>
           <w:rPr>
             <w:rStyle w:val="VerbatimChar"/>
@@ -55635,7 +55688,7 @@
       <w:r>
         <w:t xml:space="preserve"> </w:t>
       </w:r>
-      <w:hyperlink r:id="rId69">
+      <w:hyperlink r:id="rId70">
         <w:r>
           <w:rPr>
             <w:rStyle w:val="VerbatimChar"/>
@@ -55869,7 +55922,7 @@
       <w:r>
         <w:t xml:space="preserve"> </w:t>
       </w:r>
-      <w:hyperlink r:id="rId70">
+      <w:hyperlink r:id="rId71">
         <w:r>
           <w:rPr>
             <w:rStyle w:val="VerbatimChar"/>
@@ -55884,9 +55937,9 @@
         <w:t xml:space="preserve">for a working example.</w:t>
       </w:r>
     </w:p>
-    <w:bookmarkEnd w:id="71"/>
     <w:bookmarkEnd w:id="72"/>
-    <w:bookmarkStart w:id="86" w:name="X636230dba256ccd30a2e68f8101290712b3f4c4"/>
+    <w:bookmarkEnd w:id="73"/>
+    <w:bookmarkStart w:id="87" w:name="X636230dba256ccd30a2e68f8101290712b3f4c4"/>
     <w:p>
       <w:pPr>
         <w:pStyle w:val="Heading2"/>
@@ -57036,7 +57089,7 @@
       <w:r>
         <w:t xml:space="preserve"> </w:t>
       </w:r>
-      <w:hyperlink r:id="rId73">
+      <w:hyperlink r:id="rId74">
         <w:r>
           <w:rPr>
             <w:rStyle w:val="VerbatimChar"/>
@@ -57117,7 +57170,7 @@
       <w:r>
         <w:t xml:space="preserve"> </w:t>
       </w:r>
-      <w:hyperlink r:id="rId74">
+      <w:hyperlink r:id="rId75">
         <w:r>
           <w:rPr>
             <w:rStyle w:val="VerbatimChar"/>
@@ -57381,7 +57434,7 @@
         <w:t xml:space="preserve">40</w:t>
       </w:r>
     </w:p>
-    <w:bookmarkStart w:id="82" w:name="screenshots-and-documentation"/>
+    <w:bookmarkStart w:id="83" w:name="screenshots-and-documentation"/>
     <w:p>
       <w:pPr>
         <w:pStyle w:val="Heading3"/>
@@ -57411,7 +57464,7 @@
       <w:r>
         <w:t xml:space="preserve"> </w:t>
       </w:r>
-      <w:hyperlink r:id="rId75">
+      <w:hyperlink r:id="rId76">
         <w:r>
           <w:rPr>
             <w:rStyle w:val="VerbatimChar"/>
@@ -58193,7 +58246,7 @@
       <w:r>
         <w:t xml:space="preserve"> </w:t>
       </w:r>
-      <w:hyperlink r:id="rId76">
+      <w:hyperlink r:id="rId77">
         <w:r>
           <w:rPr>
             <w:rStyle w:val="VerbatimChar"/>
@@ -58334,7 +58387,7 @@
       <w:r>
         <w:t xml:space="preserve"> </w:t>
       </w:r>
-      <w:hyperlink r:id="rId77">
+      <w:hyperlink r:id="rId78">
         <w:r>
           <w:rPr>
             <w:rStyle w:val="VerbatimChar"/>
@@ -58357,7 +58410,7 @@
       <w:r>
         <w:t xml:space="preserve"> </w:t>
       </w:r>
-      <w:hyperlink r:id="rId78">
+      <w:hyperlink r:id="rId79">
         <w:r>
           <w:rPr>
             <w:rStyle w:val="VerbatimChar"/>
@@ -58392,7 +58445,7 @@
       <w:r>
         <w:t xml:space="preserve"> </w:t>
       </w:r>
-      <w:hyperlink r:id="rId79">
+      <w:hyperlink r:id="rId80">
         <w:r>
           <w:rPr>
             <w:rStyle w:val="VerbatimChar"/>
@@ -58598,7 +58651,7 @@
       <w:r>
         <w:t xml:space="preserve"> </w:t>
       </w:r>
-      <w:hyperlink r:id="rId80">
+      <w:hyperlink r:id="rId81">
         <w:r>
           <w:rPr>
             <w:rStyle w:val="VerbatimChar"/>
@@ -58661,7 +58714,7 @@
       <w:r>
         <w:t xml:space="preserve"> </w:t>
       </w:r>
-      <w:hyperlink r:id="rId81">
+      <w:hyperlink r:id="rId82">
         <w:r>
           <w:rPr>
             <w:rStyle w:val="VerbatimChar"/>
@@ -58885,8 +58938,8 @@
         <w:t xml:space="preserve">screenshot if the visual changes, then regenerates the exports.</w:t>
       </w:r>
     </w:p>
-    <w:bookmarkEnd w:id="82"/>
-    <w:bookmarkStart w:id="85" w:name="onyx-basic-the-interpreter"/>
+    <w:bookmarkEnd w:id="83"/>
+    <w:bookmarkStart w:id="86" w:name="onyx-basic-the-interpreter"/>
     <w:p>
       <w:pPr>
         <w:pStyle w:val="Heading3"/>
@@ -61914,7 +61967,7 @@
       <w:r>
         <w:t xml:space="preserve"> </w:t>
       </w:r>
-      <w:hyperlink r:id="rId83">
+      <w:hyperlink r:id="rId84">
         <w:r>
           <w:rPr>
             <w:rStyle w:val="VerbatimChar"/>
@@ -62724,7 +62777,7 @@
       <w:r>
         <w:t xml:space="preserve"> </w:t>
       </w:r>
-      <w:hyperlink r:id="rId84">
+      <w:hyperlink r:id="rId85">
         <w:r>
           <w:rPr>
             <w:rStyle w:val="VerbatimChar"/>
@@ -64264,9 +64317,9 @@
         <w:t xml:space="preserve">rewrites them).</w:t>
       </w:r>
     </w:p>
-    <w:bookmarkEnd w:id="85"/>
     <w:bookmarkEnd w:id="86"/>
-    <w:bookmarkStart w:id="87" w:name="Xc2ec260aede7afe7fa831ade27ff6c6be860f38"/>
+    <w:bookmarkEnd w:id="87"/>
+    <w:bookmarkStart w:id="88" w:name="Xc2ec260aede7afe7fa831ade27ff6c6be860f38"/>
     <w:p>
       <w:pPr>
         <w:pStyle w:val="Heading2"/>
@@ -64993,8 +65046,8 @@
         <w:t xml:space="preserve">"must match").</w:t>
       </w:r>
     </w:p>
-    <w:bookmarkEnd w:id="87"/>
-    <w:bookmarkStart w:id="88" w:name="X57cc4a25254639a1e87307c03f7beba3c173828"/>
+    <w:bookmarkEnd w:id="88"/>
+    <w:bookmarkStart w:id="89" w:name="X57cc4a25254639a1e87307c03f7beba3c173828"/>
     <w:p>
       <w:pPr>
         <w:pStyle w:val="Heading2"/>
@@ -65370,8 +65423,8 @@
         <w:t xml:space="preserve">committed in this repo.)</w:t>
       </w:r>
     </w:p>
-    <w:bookmarkEnd w:id="88"/>
-    <w:bookmarkStart w:id="90" w:name="Xe2e8f17f312baf0f280f8a3dfcc5fa34b4105bf"/>
+    <w:bookmarkEnd w:id="89"/>
+    <w:bookmarkStart w:id="91" w:name="Xe2e8f17f312baf0f280f8a3dfcc5fa34b4105bf"/>
     <w:p>
       <w:pPr>
         <w:pStyle w:val="Heading2"/>
@@ -66422,7 +66475,7 @@
       <w:r>
         <w:t xml:space="preserve"> </w:t>
       </w:r>
-      <w:hyperlink r:id="rId89">
+      <w:hyperlink r:id="rId90">
         <w:r>
           <w:rPr>
             <w:rStyle w:val="Hyperlink"/>
@@ -66434,8 +66487,8 @@
         <w:t xml:space="preserve">).</w:t>
       </w:r>
     </w:p>
-    <w:bookmarkEnd w:id="90"/>
-    <w:bookmarkStart w:id="92" w:name="Xe9c7e4e932ad1908138a3909ff179a810da6d71"/>
+    <w:bookmarkEnd w:id="91"/>
+    <w:bookmarkStart w:id="93" w:name="Xe9c7e4e932ad1908138a3909ff179a810da6d71"/>
     <w:p>
       <w:pPr>
         <w:pStyle w:val="Heading2"/>
@@ -67522,7 +67575,7 @@
       <w:r>
         <w:t xml:space="preserve"> </w:t>
       </w:r>
-      <w:hyperlink r:id="rId91">
+      <w:hyperlink r:id="rId92">
         <w:r>
           <w:rPr>
             <w:rStyle w:val="Hyperlink"/>
@@ -67917,7 +67970,7 @@
         <w:t xml:space="preserve">, not another clone.</w:t>
       </w:r>
     </w:p>
-    <w:bookmarkEnd w:id="92"/>
+    <w:bookmarkEnd w:id="93"/>
     <w:sectPr>
       <w:footerReference r:id="rId9" w:type="default"/>
       <w:footnotePr>

</xml_diff>

<commit_message>
Packages: the samples with their apps, the needs (emulators -> gamelib; writer, sheet, ledger -> cardfile), voronoy / imageview / tinypad in the system
The content hash includes the manifest's needs and settings (a new need is
a new version). The repository published to stephaneweg/onyx-packages
(52 packages); sdcard/var/pkg/db and sdcard_lite regenerated.

Co-Authored-By: Claude Opus 5.5 <noreply@anthropic.com>
Claude-Session: https://claude.ai/code/session_012k6pqyonBBqCtDQrtttmUW
</commit_message>
<xml_diff>
--- a/docs/exports/03-DEVELOPER-GUIDE.docx
+++ b/docs/exports/03-DEVELOPER-GUIDE.docx
@@ -41240,7 +41240,7 @@
               <w:t xml:space="preserve"> </w:t>
             </w:r>
             <w:r>
-              <w:t xml:space="preserve">as settings, the fonts, the Shell and Settings apps, the terminal, the File Viewer, the Task Manager;</w:t>
+              <w:t xml:space="preserve">as settings, the fonts, the Shell and Settings apps, the terminal, the File Viewer, the Task Manager, Tinypad, voronoy and imageview;</w:t>
             </w:r>
             <w:r>
               <w:t xml:space="preserve"> </w:t>
@@ -41288,16 +41288,13 @@
               <w:t xml:space="preserve">[demos]</w:t>
             </w:r>
             <w:r>
-              <w:t xml:space="preserve">,</w:t>
-            </w:r>
-            <w:r>
-              <w:t xml:space="preserve"> </w:t>
+              <w:t xml:space="preserve">, the samples each with its app (</w:t>
             </w:r>
             <w:r>
               <w:rPr>
                 <w:rStyle w:val="VerbatimChar"/>
               </w:rPr>
-              <w:t xml:space="preserve">[basic-examples]</w:t>
+              <w:t xml:space="preserve">[basic-samples]</w:t>
             </w:r>
             <w:r>
               <w:t xml:space="preserve">,</w:t>
@@ -41309,10 +41306,37 @@
               <w:rPr>
                 <w:rStyle w:val="VerbatimChar"/>
               </w:rPr>
-              <w:t xml:space="preserve">[samples]</w:t>
-            </w:r>
-            <w:r>
-              <w:t xml:space="preserve">, then</w:t>
+              <w:t xml:space="preserve">[writer-samples]</w:t>
+            </w:r>
+            <w:r>
+              <w:t xml:space="preserve">...</w:t>
+            </w:r>
+            <w:r>
+              <w:t xml:space="preserve"> </w:t>
+            </w:r>
+            <w:r>
+              <w:rPr>
+                <w:rStyle w:val="VerbatimChar"/>
+              </w:rPr>
+              <w:t xml:space="preserve">needs</w:t>
+            </w:r>
+            <w:r>
+              <w:t xml:space="preserve"> </w:t>
+            </w:r>
+            <w:r>
+              <w:t xml:space="preserve">their app; their files are the user's:</w:t>
+            </w:r>
+            <w:r>
+              <w:t xml:space="preserve"> </w:t>
+            </w:r>
+            <w:r>
+              <w:rPr>
+                <w:rStyle w:val="VerbatimChar"/>
+              </w:rPr>
+              <w:t xml:space="preserve">config</w:t>
+            </w:r>
+            <w:r>
+              <w:t xml:space="preserve">), then</w:t>
             </w:r>
             <w:r>
               <w:t xml:space="preserve"> </w:t>
@@ -41345,7 +41369,37 @@
               <w:t xml:space="preserve">needs</w:t>
             </w:r>
             <w:r>
-              <w:t xml:space="preserve">, its</w:t>
+              <w:t xml:space="preserve"> </w:t>
+            </w:r>
+            <w:r>
+              <w:t xml:space="preserve">— the emulators</w:t>
+            </w:r>
+            <w:r>
+              <w:t xml:space="preserve"> </w:t>
+            </w:r>
+            <w:r>
+              <w:rPr>
+                <w:rStyle w:val="VerbatimChar"/>
+              </w:rPr>
+              <w:t xml:space="preserve">gamelib</w:t>
+            </w:r>
+            <w:r>
+              <w:t xml:space="preserve">, Writer / Sheet / Ledger</w:t>
+            </w:r>
+            <w:r>
+              <w:t xml:space="preserve"> </w:t>
+            </w:r>
+            <w:r>
+              <w:rPr>
+                <w:rStyle w:val="VerbatimChar"/>
+              </w:rPr>
+              <w:t xml:space="preserve">cardfile</w:t>
+            </w:r>
+            <w:r>
+              <w:t xml:space="preserve"> </w:t>
+            </w:r>
+            <w:r>
+              <w:t xml:space="preserve">—, its</w:t>
             </w:r>
             <w:r>
               <w:t xml:space="preserve"> </w:t>

</xml_diff>

<commit_message>
Packages: the Package Manager (pkgman), the update daemon (pkgd), notifications with an action
- user/Apps/pkgman: the Control Panel's Packages applet (Updates /
  Installed / Available, the search, the modes, Remove, the restart
  banner); its jobs in a thread, their progress per row
- user/Apps/pkgd: once a day (the network and the time there) the index
  read again, the 'auto' packages updated, a notification for the others
- notify_action (notify.h / notifyd): a click runs an app ('control pkgman')
- http.hpp: a progress callback; pkglib: the download's progress
- mkrepo: a sample's icon its app's, the old archives dropped; the
  system's icon; onyx 2026.10.1 (pkgman, pkgd, pkg, notifyd, autostart)
- screenshots (shots.sh pkgman: pkg_sample.py's card and repository),
  control.png; docs 03, 04, pkg/README.md, HANDOFF; exports

Co-Authored-By: Claude Opus 5.5 <noreply@anthropic.com>
Claude-Session: https://claude.ai/code/session_012k6pqyonBBqCtDQrtttmUW
</commit_message>
<xml_diff>
--- a/docs/exports/03-DEVELOPER-GUIDE.docx
+++ b/docs/exports/03-DEVELOPER-GUIDE.docx
@@ -8417,7 +8417,46 @@
         <w:t xml:space="preserve"> </w:t>
       </w:r>
       <w:r>
-        <w:t xml:space="preserve">launched on demand).</w:t>
+        <w:t xml:space="preserve">launched on demand);</w:t>
+      </w:r>
+      <w:r>
+        <w:t xml:space="preserve"> </w:t>
+      </w:r>
+      <w:r>
+        <w:rPr>
+          <w:rStyle w:val="VerbatimChar"/>
+        </w:rPr>
+        <w:t xml:space="preserve">notify_action (title, text, "app args")</w:t>
+      </w:r>
+      <w:r>
+        <w:t xml:space="preserve">: a click on it runs that app with those</w:t>
+      </w:r>
+      <w:r>
+        <w:t xml:space="preserve"> </w:t>
+      </w:r>
+      <w:r>
+        <w:t xml:space="preserve">arguments (</w:t>
+      </w:r>
+      <w:r>
+        <w:rPr>
+          <w:rStyle w:val="VerbatimChar"/>
+        </w:rPr>
+        <w:t xml:space="preserve">pkgd</w:t>
+      </w:r>
+      <w:r>
+        <w:t xml:space="preserve">:</w:t>
+      </w:r>
+      <w:r>
+        <w:t xml:space="preserve"> </w:t>
+      </w:r>
+      <w:r>
+        <w:rPr>
+          <w:rStyle w:val="VerbatimChar"/>
+        </w:rPr>
+        <w:t xml:space="preserve">"control pkgman"</w:t>
+      </w:r>
+      <w:r>
+        <w:t xml:space="preserve">), and it stays longer.</w:t>
       </w:r>
       <w:r>
         <w:t xml:space="preserve"> </w:t>
@@ -41950,7 +41989,7 @@
               <w:rPr>
                 <w:rStyle w:val="VerbatimChar"/>
               </w:rPr>
-              <w:t xml:space="preserve">user/bin/init.c</w:t>
+              <w:t xml:space="preserve">user/Apps/pkgman</w:t>
             </w:r>
           </w:p>
         </w:tc>
@@ -41968,6 +42007,317 @@
             </w:r>
             <w:r>
               <w:rPr>
+                <w:b/>
+                <w:bCs/>
+              </w:rPr>
+              <w:t xml:space="preserve">Package Manager</w:t>
+            </w:r>
+            <w:r>
+              <w:t xml:space="preserve">, the Control Panel's applet (</w:t>
+            </w:r>
+            <w:r>
+              <w:rPr>
+                <w:rStyle w:val="VerbatimChar"/>
+              </w:rPr>
+              <w:t xml:space="preserve">70-pkgman.lnk</w:t>
+            </w:r>
+            <w:r>
+              <w:t xml:space="preserve">; FreeType): a snapshot of the index and the database (</w:t>
+            </w:r>
+            <w:r>
+              <w:rPr>
+                <w:rStyle w:val="VerbatimChar"/>
+              </w:rPr>
+              <w:t xml:space="preserve">Row</w:t>
+            </w:r>
+            <w:r>
+              <w:t xml:space="preserve">s, rebuilt after each job) drawn by its own widgets (</w:t>
+            </w:r>
+            <w:r>
+              <w:rPr>
+                <w:rStyle w:val="VerbatimChar"/>
+              </w:rPr>
+              <w:t xml:space="preserve">Tabs</w:t>
+            </w:r>
+            <w:r>
+              <w:t xml:space="preserve">,</w:t>
+            </w:r>
+            <w:r>
+              <w:t xml:space="preserve"> </w:t>
+            </w:r>
+            <w:r>
+              <w:rPr>
+                <w:rStyle w:val="VerbatimChar"/>
+              </w:rPr>
+              <w:t xml:space="preserve">PkgList</w:t>
+            </w:r>
+            <w:r>
+              <w:t xml:space="preserve">: the rows, the boxes, the mode pills, the buttons, the restart banner); a job (check, install, remove, mode) in a thread (</w:t>
+            </w:r>
+            <w:r>
+              <w:rPr>
+                <w:rStyle w:val="VerbatimChar"/>
+              </w:rPr>
+              <w:t xml:space="preserve">kapi_thread_create</w:t>
+            </w:r>
+            <w:r>
+              <w:t xml:space="preserve">), its progress read each frame (</w:t>
+            </w:r>
+            <w:r>
+              <w:rPr>
+                <w:rStyle w:val="VerbatimChar"/>
+              </w:rPr>
+              <w:t xml:space="preserve">onTick</w:t>
+            </w:r>
+            <w:r>
+              <w:t xml:space="preserve">: the package being done, its percentage —</w:t>
+            </w:r>
+            <w:r>
+              <w:t xml:space="preserve"> </w:t>
+            </w:r>
+            <w:r>
+              <w:rPr>
+                <w:rStyle w:val="VerbatimChar"/>
+              </w:rPr>
+              <w:t xml:space="preserve">http.hpp</w:t>
+            </w:r>
+            <w:r>
+              <w:t xml:space="preserve">'s new</w:t>
+            </w:r>
+            <w:r>
+              <w:t xml:space="preserve"> </w:t>
+            </w:r>
+            <w:r>
+              <w:rPr>
+                <w:rStyle w:val="VerbatimChar"/>
+              </w:rPr>
+              <w:t xml:space="preserve">progress ()</w:t>
+            </w:r>
+            <w:r>
+              <w:t xml:space="preserve"> </w:t>
+            </w:r>
+            <w:r>
+              <w:t xml:space="preserve">callback and the extraction —, the packages finished). Built by</w:t>
+            </w:r>
+            <w:r>
+              <w:t xml:space="preserve"> </w:t>
+            </w:r>
+            <w:r>
+              <w:rPr>
+                <w:rStyle w:val="VerbatimChar"/>
+              </w:rPr>
+              <w:t xml:space="preserve">pkgman.elf</w:t>
+            </w:r>
+            <w:r>
+              <w:t xml:space="preserve"> </w:t>
+            </w:r>
+            <w:r>
+              <w:t xml:space="preserve">in</w:t>
+            </w:r>
+            <w:r>
+              <w:t xml:space="preserve"> </w:t>
+            </w:r>
+            <w:r>
+              <w:rPr>
+                <w:rStyle w:val="VerbatimChar"/>
+              </w:rPr>
+              <w:t xml:space="preserve">user/Makefile</w:t>
+            </w:r>
+            <w:r>
+              <w:t xml:space="preserve"> </w:t>
+            </w:r>
+            <w:r>
+              <w:t xml:space="preserve">(newlib + FreeType + mbedTLS + zlib,</w:t>
+            </w:r>
+            <w:r>
+              <w:t xml:space="preserve"> </w:t>
+            </w:r>
+            <w:r>
+              <w:rPr>
+                <w:rStyle w:val="VerbatimChar"/>
+              </w:rPr>
+              <w:t xml:space="preserve">-DPKG_NET -DONYX_HTTP_TLS</w:t>
+            </w:r>
+            <w:r>
+              <w:t xml:space="preserve">).</w:t>
+            </w:r>
+          </w:p>
+        </w:tc>
+      </w:tr>
+      <w:tr>
+        <w:tc>
+          <w:tcPr/>
+          <w:p>
+            <w:pPr>
+              <w:pStyle w:val="Compact"/>
+            </w:pPr>
+            <w:r>
+              <w:rPr>
+                <w:rStyle w:val="VerbatimChar"/>
+              </w:rPr>
+              <w:t xml:space="preserve">user/Apps/pkgd</w:t>
+            </w:r>
+          </w:p>
+        </w:tc>
+        <w:tc>
+          <w:tcPr/>
+          <w:p>
+            <w:pPr>
+              <w:pStyle w:val="Compact"/>
+            </w:pPr>
+            <w:r>
+              <w:t xml:space="preserve">The</w:t>
+            </w:r>
+            <w:r>
+              <w:t xml:space="preserve"> </w:t>
+            </w:r>
+            <w:r>
+              <w:rPr>
+                <w:b/>
+                <w:bCs/>
+              </w:rPr>
+              <w:t xml:space="preserve">update daemon</w:t>
+            </w:r>
+            <w:r>
+              <w:t xml:space="preserve"> </w:t>
+            </w:r>
+            <w:r>
+              <w:t xml:space="preserve">(no window;</w:t>
+            </w:r>
+            <w:r>
+              <w:t xml:space="preserve"> </w:t>
+            </w:r>
+            <w:r>
+              <w:rPr>
+                <w:rStyle w:val="VerbatimChar"/>
+              </w:rPr>
+              <w:t xml:space="preserve">run pkgd</w:t>
+            </w:r>
+            <w:r>
+              <w:t xml:space="preserve"> </w:t>
+            </w:r>
+            <w:r>
+              <w:t xml:space="preserve">in</w:t>
+            </w:r>
+            <w:r>
+              <w:t xml:space="preserve"> </w:t>
+            </w:r>
+            <w:r>
+              <w:rPr>
+                <w:rStyle w:val="VerbatimChar"/>
+              </w:rPr>
+              <w:t xml:space="preserve">etc/autostart</w:t>
+            </w:r>
+            <w:r>
+              <w:t xml:space="preserve">): waits for the network and the time, then once a day (</w:t>
+            </w:r>
+            <w:r>
+              <w:rPr>
+                <w:rStyle w:val="VerbatimChar"/>
+              </w:rPr>
+              <w:t xml:space="preserve">SD:/var/pkg/lastcheck</w:t>
+            </w:r>
+            <w:r>
+              <w:t xml:space="preserve">)</w:t>
+            </w:r>
+            <w:r>
+              <w:t xml:space="preserve"> </w:t>
+            </w:r>
+            <w:r>
+              <w:rPr>
+                <w:rStyle w:val="VerbatimChar"/>
+              </w:rPr>
+              <w:t xml:space="preserve">refresh</w:t>
+            </w:r>
+            <w:r>
+              <w:t xml:space="preserve">, the "auto" packages installed (their new needs first; the system staged),</w:t>
+            </w:r>
+            <w:r>
+              <w:t xml:space="preserve"> </w:t>
+            </w:r>
+            <w:r>
+              <w:rPr>
+                <w:rStyle w:val="VerbatimChar"/>
+              </w:rPr>
+              <w:t xml:space="preserve">notify_action</w:t>
+            </w:r>
+            <w:r>
+              <w:t xml:space="preserve"> </w:t>
+            </w:r>
+            <w:r>
+              <w:t xml:space="preserve">for the others;</w:t>
+            </w:r>
+            <w:r>
+              <w:t xml:space="preserve"> </w:t>
+            </w:r>
+            <w:r>
+              <w:rPr>
+                <w:rStyle w:val="VerbatimChar"/>
+              </w:rPr>
+              <w:t xml:space="preserve">--once</w:t>
+            </w:r>
+            <w:r>
+              <w:t xml:space="preserve">: one round;</w:t>
+            </w:r>
+            <w:r>
+              <w:t xml:space="preserve"> </w:t>
+            </w:r>
+            <w:r>
+              <w:rPr>
+                <w:rStyle w:val="VerbatimChar"/>
+              </w:rPr>
+              <w:t xml:space="preserve">check = never</w:t>
+            </w:r>
+            <w:r>
+              <w:t xml:space="preserve"> </w:t>
+            </w:r>
+            <w:r>
+              <w:t xml:space="preserve">in</w:t>
+            </w:r>
+            <w:r>
+              <w:t xml:space="preserve"> </w:t>
+            </w:r>
+            <w:r>
+              <w:rPr>
+                <w:rStyle w:val="VerbatimChar"/>
+              </w:rPr>
+              <w:t xml:space="preserve">pkg.ini</w:t>
+            </w:r>
+            <w:r>
+              <w:t xml:space="preserve">: it ends.</w:t>
+            </w:r>
+          </w:p>
+        </w:tc>
+      </w:tr>
+      <w:tr>
+        <w:tc>
+          <w:tcPr/>
+          <w:p>
+            <w:pPr>
+              <w:pStyle w:val="Compact"/>
+            </w:pPr>
+            <w:r>
+              <w:rPr>
+                <w:rStyle w:val="VerbatimChar"/>
+              </w:rPr>
+              <w:t xml:space="preserve">user/bin/init.c</w:t>
+            </w:r>
+          </w:p>
+        </w:tc>
+        <w:tc>
+          <w:tcPr/>
+          <w:p>
+            <w:pPr>
+              <w:pStyle w:val="Compact"/>
+            </w:pPr>
+            <w:r>
+              <w:t xml:space="preserve">The</w:t>
+            </w:r>
+            <w:r>
+              <w:t xml:space="preserve"> </w:t>
+            </w:r>
+            <w:r>
+              <w:rPr>
                 <w:rStyle w:val="VerbatimChar"/>
               </w:rPr>
               <w:t xml:space="preserve">wait &lt;command&gt;</w:t>
@@ -42018,6 +42368,135 @@
         </w:tc>
       </w:tr>
     </w:tbl>
+    <w:p>
+      <w:pPr>
+        <w:pStyle w:val="BodyText"/>
+      </w:pPr>
+      <w:r>
+        <w:rPr>
+          <w:b/>
+          <w:bCs/>
+        </w:rPr>
+        <w:t xml:space="preserve">Screenshots</w:t>
+      </w:r>
+      <w:r>
+        <w:t xml:space="preserve">:</w:t>
+      </w:r>
+      <w:r>
+        <w:t xml:space="preserve"> </w:t>
+      </w:r>
+      <w:r>
+        <w:rPr>
+          <w:rStyle w:val="VerbatimChar"/>
+        </w:rPr>
+        <w:t xml:space="preserve">sh tools/tests/desktop_sim/shots.sh pkgman</w:t>
+      </w:r>
+      <w:r>
+        <w:t xml:space="preserve"> </w:t>
+      </w:r>
+      <w:r>
+        <w:t xml:space="preserve">—</w:t>
+      </w:r>
+      <w:r>
+        <w:t xml:space="preserve"> </w:t>
+      </w:r>
+      <w:r>
+        <w:rPr>
+          <w:rStyle w:val="VerbatimChar"/>
+        </w:rPr>
+        <w:t xml:space="preserve">tools/tests/desktop_sim/pkg_sample.py</w:t>
+      </w:r>
+      <w:r>
+        <w:t xml:space="preserve"> </w:t>
+      </w:r>
+      <w:r>
+        <w:t xml:space="preserve">makes a card of its own (the real one through symbolic links, its own</w:t>
+      </w:r>
+      <w:r>
+        <w:t xml:space="preserve"> </w:t>
+      </w:r>
+      <w:r>
+        <w:rPr>
+          <w:rStyle w:val="VerbatimChar"/>
+        </w:rPr>
+        <w:t xml:space="preserve">etc/pkg</w:t>
+      </w:r>
+      <w:r>
+        <w:t xml:space="preserve"> </w:t>
+      </w:r>
+      <w:r>
+        <w:t xml:space="preserve">and</w:t>
+      </w:r>
+      <w:r>
+        <w:t xml:space="preserve"> </w:t>
+      </w:r>
+      <w:r>
+        <w:rPr>
+          <w:rStyle w:val="VerbatimChar"/>
+        </w:rPr>
+        <w:t xml:space="preserve">var/pkg/db</w:t>
+      </w:r>
+      <w:r>
+        <w:t xml:space="preserve">: a</w:t>
+      </w:r>
+      <w:r>
+        <w:t xml:space="preserve"> </w:t>
+      </w:r>
+      <w:r>
+        <w:t xml:space="preserve">few apps not installed) and a repository with four newer versions (a key made for it); the applet's</w:t>
+      </w:r>
+      <w:r>
+        <w:t xml:space="preserve"> </w:t>
+      </w:r>
+      <w:r>
+        <w:t xml:space="preserve">four pictures (</w:t>
+      </w:r>
+      <w:r>
+        <w:rPr>
+          <w:rStyle w:val="VerbatimChar"/>
+        </w:rPr>
+        <w:t xml:space="preserve">pkgman</w:t>
+      </w:r>
+      <w:r>
+        <w:t xml:space="preserve">,</w:t>
+      </w:r>
+      <w:r>
+        <w:t xml:space="preserve"> </w:t>
+      </w:r>
+      <w:r>
+        <w:rPr>
+          <w:rStyle w:val="VerbatimChar"/>
+        </w:rPr>
+        <w:t xml:space="preserve">-installed</w:t>
+      </w:r>
+      <w:r>
+        <w:t xml:space="preserve">,</w:t>
+      </w:r>
+      <w:r>
+        <w:t xml:space="preserve"> </w:t>
+      </w:r>
+      <w:r>
+        <w:rPr>
+          <w:rStyle w:val="VerbatimChar"/>
+        </w:rPr>
+        <w:t xml:space="preserve">-available</w:t>
+      </w:r>
+      <w:r>
+        <w:t xml:space="preserve">,</w:t>
+      </w:r>
+      <w:r>
+        <w:t xml:space="preserve"> </w:t>
+      </w:r>
+      <w:r>
+        <w:rPr>
+          <w:rStyle w:val="VerbatimChar"/>
+        </w:rPr>
+        <w:t xml:space="preserve">-restart</w:t>
+      </w:r>
+      <w:r>
+        <w:t xml:space="preserve">: Install 4 Updates run to its end).</w:t>
+      </w:r>
+    </w:p>
     <w:p>
       <w:pPr>
         <w:pStyle w:val="BodyText"/>

</xml_diff>

<commit_message>
Jet: XML documents' docs (docs/06 section 43, 07, 04, 03, LICENSING: expat); XSLT faster on big documents
The data model wraps no DOM node (N.xmlFlat), a result's nodes are wrapped in one more
walk (N.xmlWrap); "//x[pred]" with a predicate that is no number and asks no position is
one descendant step; NS_PERF times the tree view and the transform. A 2.2 MB XML on the
PC: XSLT 1.4 -> 0.93 s.

Co-Authored-By: Claude Opus 5.5 <noreply@anthropic.com>
Claude-Session: https://claude.ai/code/session_01UcY36na7Mp1DEYttKiw1pa
</commit_message>
<xml_diff>
--- a/docs/exports/03-DEVELOPER-GUIDE.docx
+++ b/docs/exports/03-DEVELOPER-GUIDE.docx
@@ -56072,7 +56072,28 @@
         <w:t xml:space="preserve"> </w:t>
       </w:r>
       <w:r>
-        <w:t xml:space="preserve">hand for newlib); the disk cache is</w:t>
+        <w:t xml:space="preserve">hand for newlib); expat (</w:t>
+      </w:r>
+      <w:r>
+        <w:rPr>
+          <w:rStyle w:val="VerbatimChar"/>
+        </w:rPr>
+        <w:t xml:space="preserve">third_party/expat-2.7.1</w:t>
+      </w:r>
+      <w:r>
+        <w:t xml:space="preserve">,</w:t>
+      </w:r>
+      <w:r>
+        <w:t xml:space="preserve"> </w:t>
+      </w:r>
+      <w:r>
+        <w:rPr>
+          <w:rStyle w:val="VerbatimChar"/>
+        </w:rPr>
+        <w:t xml:space="preserve">libexpat.a</w:t>
+      </w:r>
+      <w:r>
+        <w:t xml:space="preserve">: the XML documents, docs/06 §43); the disk cache is</w:t>
       </w:r>
       <w:r>
         <w:t xml:space="preserve"> </w:t>

</xml_diff>

<commit_message>
Game Library: the systems of the installed emulators (their app.txt), launch.h finds a file's app there
- an emulator's app.txt: games = Game Boy Color: gbc; Game Boy: gb, order =
  (and opens = dol); Doom's opens = wad; their lines gone from runners.ini
- gamelib: load_systems () -- its sections from the apps with games =,
  sorted by order (an emulator of before: its old systems); a game whose
  emulator has no picture maker here shows its emulator's icon
- launch.h: lx_app_for (games / opens), the built-in list only for what
  exists; the apps that include it rebuilt
- shots.sh: pkgman's zlib apart (the archiver's build); packages bumped
  (onyx 2026.10.2, the emulators, gamelib, archiver, doom); docs 03 / 04 /
  pkg/README / HANDOFF, exports

Co-Authored-By: Claude Opus 5.5 <noreply@anthropic.com>
Claude-Session: https://claude.ai/code/session_012k6pqyonBBqCtDQrtttmUW
</commit_message>
<xml_diff>
--- a/docs/exports/03-DEVELOPER-GUIDE.docx
+++ b/docs/exports/03-DEVELOPER-GUIDE.docx
@@ -59566,6 +59566,190 @@
         <w:t xml:space="preserve">bax = SD:/bin/basic</w:t>
       </w:r>
       <w:r>
+        <w:t xml:space="preserve">), then from the</w:t>
+      </w:r>
+      <w:r>
+        <w:t xml:space="preserve"> </w:t>
+      </w:r>
+      <w:r>
+        <w:rPr>
+          <w:b/>
+          <w:bCs/>
+        </w:rPr>
+        <w:t xml:space="preserve">apps' own</w:t>
+      </w:r>
+      <w:r>
+        <w:rPr>
+          <w:b/>
+          <w:bCs/>
+        </w:rPr>
+        <w:t xml:space="preserve"> </w:t>
+      </w:r>
+      <w:r>
+        <w:rPr>
+          <w:rStyle w:val="VerbatimChar"/>
+          <w:b/>
+          <w:bCs/>
+        </w:rPr>
+        <w:t xml:space="preserve">app.txt</w:t>
+      </w:r>
+      <w:r>
+        <w:t xml:space="preserve"> </w:t>
+      </w:r>
+      <w:r>
+        <w:t xml:space="preserve">(</w:t>
+      </w:r>
+      <w:r>
+        <w:rPr>
+          <w:rStyle w:val="VerbatimChar"/>
+        </w:rPr>
+        <w:t xml:space="preserve">lx_app_for</w:t>
+      </w:r>
+      <w:r>
+        <w:t xml:space="preserve">: an emulator's</w:t>
+      </w:r>
+      <w:r>
+        <w:t xml:space="preserve"> </w:t>
+      </w:r>
+      <w:r>
+        <w:rPr>
+          <w:rStyle w:val="VerbatimChar"/>
+        </w:rPr>
+        <w:t xml:space="preserve">games = Game Boy Color: gbc; Game Boy: gb</w:t>
+      </w:r>
+      <w:r>
+        <w:t xml:space="preserve"> </w:t>
+      </w:r>
+      <w:r>
+        <w:t xml:space="preserve">—</w:t>
+      </w:r>
+      <w:r>
+        <w:t xml:space="preserve"> </w:t>
+      </w:r>
+      <w:r>
+        <w:t xml:space="preserve">the extensions after each system's name —, any app's</w:t>
+      </w:r>
+      <w:r>
+        <w:t xml:space="preserve"> </w:t>
+      </w:r>
+      <w:r>
+        <w:rPr>
+          <w:rStyle w:val="VerbatimChar"/>
+        </w:rPr>
+        <w:t xml:space="preserve">opens = wad</w:t>
+      </w:r>
+      <w:r>
+        <w:t xml:space="preserve">; the app's</w:t>
+      </w:r>
+      <w:r>
+        <w:t xml:space="preserve"> </w:t>
+      </w:r>
+      <w:r>
+        <w:rPr>
+          <w:rStyle w:val="VerbatimChar"/>
+        </w:rPr>
+        <w:t xml:space="preserve">main</w:t>
+      </w:r>
+      <w:r>
+        <w:t xml:space="preserve"> </w:t>
+      </w:r>
+      <w:r>
+        <w:t xml:space="preserve">must be there),</w:t>
+      </w:r>
+      <w:r>
+        <w:t xml:space="preserve"> </w:t>
+      </w:r>
+      <w:r>
+        <w:t xml:space="preserve">then a built-in list (those that exist):</w:t>
+      </w:r>
+      <w:r>
+        <w:t xml:space="preserve"> </w:t>
+      </w:r>
+      <w:r>
+        <w:rPr>
+          <w:rStyle w:val="VerbatimChar"/>
+        </w:rPr>
+        <w:t xml:space="preserve">lx_launch (name, args)</w:t>
+      </w:r>
+      <w:r>
+        <w:t xml:space="preserve"> </w:t>
+      </w:r>
+      <w:r>
+        <w:t xml:space="preserve">starts an app (its</w:t>
+      </w:r>
+      <w:r>
+        <w:t xml:space="preserve"> </w:t>
+      </w:r>
+      <w:r>
+        <w:rPr>
+          <w:rStyle w:val="VerbatimChar"/>
+        </w:rPr>
+        <w:t xml:space="preserve">main</w:t>
+      </w:r>
+      <w:r>
+        <w:t xml:space="preserve">, else the first</w:t>
+      </w:r>
+      <w:r>
+        <w:t xml:space="preserve"> </w:t>
+      </w:r>
+      <w:r>
+        <w:rPr>
+          <w:rStyle w:val="VerbatimChar"/>
+        </w:rPr>
+        <w:t xml:space="preserve">main.&lt;ext&gt;</w:t>
+      </w:r>
+      <w:r>
+        <w:t xml:space="preserve"> </w:t>
+      </w:r>
+      <w:r>
+        <w:t xml:space="preserve">with a</w:t>
+      </w:r>
+      <w:r>
+        <w:t xml:space="preserve"> </w:t>
+      </w:r>
+      <w:r>
+        <w:t xml:space="preserve">runner),</w:t>
+      </w:r>
+      <w:r>
+        <w:t xml:space="preserve"> </w:t>
+      </w:r>
+      <w:r>
+        <w:rPr>
+          <w:rStyle w:val="VerbatimChar"/>
+        </w:rPr>
+        <w:t xml:space="preserve">lx_open (path, args)</w:t>
+      </w:r>
+      <w:r>
+        <w:t xml:space="preserve"> </w:t>
+      </w:r>
+      <w:r>
+        <w:t xml:space="preserve">a program file (an ELF, or by its runner), both through</w:t>
+      </w:r>
+      <w:r>
+        <w:t xml:space="preserve"> </w:t>
+      </w:r>
+      <w:r>
+        <w:rPr>
+          <w:rStyle w:val="VerbatimChar"/>
+        </w:rPr>
+        <w:t xml:space="preserve">kapi_exec_as</w:t>
+      </w:r>
+      <w:r>
+        <w:t xml:space="preserve"> </w:t>
+      </w:r>
+      <w:r>
+        <w:t xml:space="preserve">so the process is named after the app. The launchers use it: the menu bar,</w:t>
+      </w:r>
+      <w:r>
+        <w:t xml:space="preserve"> </w:t>
+      </w:r>
+      <w:r>
+        <w:rPr>
+          <w:rStyle w:val="VerbatimChar"/>
+        </w:rPr>
+        <w:t xml:space="preserve">run</w:t>
+      </w:r>
+      <w:r>
         <w:t xml:space="preserve">,</w:t>
       </w:r>
       <w:r>
@@ -59575,7 +59759,22 @@
         <w:rPr>
           <w:rStyle w:val="VerbatimChar"/>
         </w:rPr>
-        <w:t xml:space="preserve">gb</w:t>
+        <w:t xml:space="preserve">fileassoc.h</w:t>
+      </w:r>
+      <w:r>
+        <w:t xml:space="preserve"> </w:t>
+      </w:r>
+      <w:r>
+        <w:t xml:space="preserve">(File Viewer, the dock), the dock, the Game Library. A new format = a</w:t>
+      </w:r>
+      <w:r>
+        <w:t xml:space="preserve"> </w:t>
+      </w:r>
+      <w:r>
+        <w:rPr>
+          <w:rStyle w:val="VerbatimChar"/>
+        </w:rPr>
+        <w:t xml:space="preserve">games =</w:t>
       </w:r>
       <w:r>
         <w:t xml:space="preserve"> </w:t>
@@ -59590,178 +59789,28 @@
         <w:rPr>
           <w:rStyle w:val="VerbatimChar"/>
         </w:rPr>
-        <w:t xml:space="preserve">gbc = SD:/apps/gbemu.app/main</w:t>
-      </w:r>
-      <w:r>
-        <w:t xml:space="preserve">,</w:t>
-      </w:r>
-      <w:r>
-        <w:t xml:space="preserve"> </w:t>
-      </w:r>
-      <w:r>
-        <w:rPr>
-          <w:rStyle w:val="VerbatimChar"/>
-        </w:rPr>
-        <w:t xml:space="preserve">gba = SD:/apps/gbaemu.app/main</w:t>
-      </w:r>
-      <w:r>
-        <w:t xml:space="preserve">,</w:t>
-      </w:r>
-      <w:r>
-        <w:t xml:space="preserve"> </w:t>
-      </w:r>
-      <w:r>
-        <w:rPr>
-          <w:rStyle w:val="VerbatimChar"/>
-        </w:rPr>
-        <w:t xml:space="preserve">nes = SD:/apps/nesemu.app/main</w:t>
-      </w:r>
-      <w:r>
-        <w:t xml:space="preserve">,</w:t>
-      </w:r>
-      <w:r>
-        <w:t xml:space="preserve"> </w:t>
-      </w:r>
-      <w:r>
-        <w:rPr>
-          <w:rStyle w:val="VerbatimChar"/>
-        </w:rPr>
-        <w:t xml:space="preserve">sfc</w:t>
-      </w:r>
-      <w:r>
-        <w:t xml:space="preserve"> </w:t>
-      </w:r>
-      <w:r>
-        <w:t xml:space="preserve">/</w:t>
-      </w:r>
-      <w:r>
-        <w:t xml:space="preserve"> </w:t>
-      </w:r>
-      <w:r>
-        <w:rPr>
-          <w:rStyle w:val="VerbatimChar"/>
-        </w:rPr>
-        <w:t xml:space="preserve">smc = SD:/apps/snesemu.app/main</w:t>
-      </w:r>
-      <w:r>
-        <w:t xml:space="preserve">,</w:t>
-      </w:r>
-      <w:r>
-        <w:t xml:space="preserve"> </w:t>
-      </w:r>
-      <w:r>
-        <w:rPr>
-          <w:rStyle w:val="VerbatimChar"/>
-        </w:rPr>
-        <w:t xml:space="preserve">wad = SD:/apps/doom.app/main</w:t>
-      </w:r>
-      <w:r>
-        <w:t xml:space="preserve">):</w:t>
-      </w:r>
-      <w:r>
-        <w:t xml:space="preserve"> </w:t>
-      </w:r>
-      <w:r>
-        <w:rPr>
-          <w:rStyle w:val="VerbatimChar"/>
-        </w:rPr>
-        <w:t xml:space="preserve">lx_launch (name, args)</w:t>
-      </w:r>
-      <w:r>
-        <w:t xml:space="preserve"> </w:t>
-      </w:r>
-      <w:r>
-        <w:t xml:space="preserve">starts an app (its</w:t>
-      </w:r>
-      <w:r>
-        <w:t xml:space="preserve"> </w:t>
-      </w:r>
-      <w:r>
-        <w:rPr>
-          <w:rStyle w:val="VerbatimChar"/>
-        </w:rPr>
-        <w:t xml:space="preserve">main</w:t>
-      </w:r>
-      <w:r>
-        <w:t xml:space="preserve">, else the first</w:t>
-      </w:r>
-      <w:r>
-        <w:t xml:space="preserve"> </w:t>
-      </w:r>
-      <w:r>
-        <w:rPr>
-          <w:rStyle w:val="VerbatimChar"/>
-        </w:rPr>
-        <w:t xml:space="preserve">main.&lt;ext&gt;</w:t>
-      </w:r>
-      <w:r>
-        <w:t xml:space="preserve"> </w:t>
-      </w:r>
-      <w:r>
-        <w:t xml:space="preserve">with a</w:t>
-      </w:r>
-      <w:r>
-        <w:t xml:space="preserve"> </w:t>
-      </w:r>
-      <w:r>
-        <w:t xml:space="preserve">runner),</w:t>
-      </w:r>
-      <w:r>
-        <w:t xml:space="preserve"> </w:t>
-      </w:r>
-      <w:r>
-        <w:rPr>
-          <w:rStyle w:val="VerbatimChar"/>
-        </w:rPr>
-        <w:t xml:space="preserve">lx_open (path, args)</w:t>
-      </w:r>
-      <w:r>
-        <w:t xml:space="preserve"> </w:t>
-      </w:r>
-      <w:r>
-        <w:t xml:space="preserve">a program file (an ELF, or by its runner), both through</w:t>
-      </w:r>
-      <w:r>
-        <w:t xml:space="preserve"> </w:t>
-      </w:r>
-      <w:r>
-        <w:rPr>
-          <w:rStyle w:val="VerbatimChar"/>
-        </w:rPr>
-        <w:t xml:space="preserve">kapi_exec_as</w:t>
-      </w:r>
-      <w:r>
-        <w:t xml:space="preserve"> </w:t>
-      </w:r>
-      <w:r>
-        <w:t xml:space="preserve">so the process is named after the app. The launchers use it: the menu bar,</w:t>
-      </w:r>
-      <w:r>
-        <w:t xml:space="preserve"> </w:t>
-      </w:r>
-      <w:r>
-        <w:rPr>
-          <w:rStyle w:val="VerbatimChar"/>
-        </w:rPr>
-        <w:t xml:space="preserve">run</w:t>
-      </w:r>
-      <w:r>
-        <w:t xml:space="preserve">,</w:t>
-      </w:r>
-      <w:r>
-        <w:t xml:space="preserve"> </w:t>
-      </w:r>
-      <w:r>
-        <w:rPr>
-          <w:rStyle w:val="VerbatimChar"/>
-        </w:rPr>
-        <w:t xml:space="preserve">fileassoc.h</w:t>
-      </w:r>
-      <w:r>
-        <w:t xml:space="preserve"> </w:t>
-      </w:r>
-      <w:r>
-        <w:t xml:space="preserve">(File Viewer, the dock), the dock, the Game Library. A new format = one line in</w:t>
+        <w:t xml:space="preserve">opens =</w:t>
+      </w:r>
+      <w:r>
+        <w:t xml:space="preserve"> </w:t>
+      </w:r>
+      <w:r>
+        <w:t xml:space="preserve">line in the app's</w:t>
+      </w:r>
+      <w:r>
+        <w:t xml:space="preserve"> </w:t>
+      </w:r>
+      <w:r>
+        <w:rPr>
+          <w:rStyle w:val="VerbatimChar"/>
+        </w:rPr>
+        <w:t xml:space="preserve">app.txt</w:t>
+      </w:r>
+      <w:r>
+        <w:t xml:space="preserve"> </w:t>
+      </w:r>
+      <w:r>
+        <w:t xml:space="preserve">(installed with its package: nothing to change elsewhere), or one line in</w:t>
       </w:r>
       <w:r>
         <w:t xml:space="preserve"> </w:t>
@@ -59773,7 +59822,82 @@
         <w:t xml:space="preserve">runners.ini</w:t>
       </w:r>
       <w:r>
-        <w:t xml:space="preserve">. An app written in BASIC and shipped compiled is listed in</w:t>
+        <w:t xml:space="preserve">.</w:t>
+      </w:r>
+      <w:r>
+        <w:t xml:space="preserve"> </w:t>
+      </w:r>
+      <w:r>
+        <w:rPr>
+          <w:b/>
+          <w:bCs/>
+        </w:rPr>
+        <w:t xml:space="preserve">The Game</w:t>
+      </w:r>
+      <w:r>
+        <w:rPr>
+          <w:b/>
+          <w:bCs/>
+        </w:rPr>
+        <w:t xml:space="preserve"> </w:t>
+      </w:r>
+      <w:r>
+        <w:rPr>
+          <w:b/>
+          <w:bCs/>
+        </w:rPr>
+        <w:t xml:space="preserve">Library's systems</w:t>
+      </w:r>
+      <w:r>
+        <w:t xml:space="preserve"> </w:t>
+      </w:r>
+      <w:r>
+        <w:t xml:space="preserve">come from the same keys (</w:t>
+      </w:r>
+      <w:r>
+        <w:rPr>
+          <w:rStyle w:val="VerbatimChar"/>
+        </w:rPr>
+        <w:t xml:space="preserve">load_systems</w:t>
+      </w:r>
+      <w:r>
+        <w:t xml:space="preserve">: every app with</w:t>
+      </w:r>
+      <w:r>
+        <w:t xml:space="preserve"> </w:t>
+      </w:r>
+      <w:r>
+        <w:rPr>
+          <w:rStyle w:val="VerbatimChar"/>
+        </w:rPr>
+        <w:t xml:space="preserve">games =</w:t>
+      </w:r>
+      <w:r>
+        <w:t xml:space="preserve">, its sections</w:t>
+      </w:r>
+      <w:r>
+        <w:t xml:space="preserve"> </w:t>
+      </w:r>
+      <w:r>
+        <w:t xml:space="preserve">sorted by</w:t>
+      </w:r>
+      <w:r>
+        <w:t xml:space="preserve"> </w:t>
+      </w:r>
+      <w:r>
+        <w:rPr>
+          <w:rStyle w:val="VerbatimChar"/>
+        </w:rPr>
+        <w:t xml:space="preserve">order =</w:t>
+      </w:r>
+      <w:r>
+        <w:t xml:space="preserve">); a system whose emulator is not one of the cores it carries (GB, GBA, NES, SNES;</w:t>
+      </w:r>
+      <w:r>
+        <w:t xml:space="preserve"> </w:t>
+      </w:r>
+      <w:r>
+        <w:t xml:space="preserve">the N64's label, the GameCube's banner) shows its emulator's icon on the cards. An app written in BASIC and shipped compiled is listed in</w:t>
       </w:r>
       <w:r>
         <w:t xml:space="preserve"> </w:t>

</xml_diff>

<commit_message>
Ledger for macOS (Apple silicon): pc/macOS -- Ledger and Writer over the kernel's table on macOS
The Onyx sources unchanged (user/Apps/ledger, user/Apps/writer for the printed
documents, wtk, FreeType) over pc/macOS/hostkapi.cpp (POSIX: the table at
KAPI_TABLE_VA, files, threads, processes, arguments) and cocoa.mm (the window,
CoreGraphics drawing, the Mac's menu bar, Cmd as Ctrl, dead keys, the clipboard,
files dropped or opened from the Finder). SD:/docs is ~/Documents/Onyx Ledger,
the rest of the card ~/Library/Application Support/Onyx Ledger, over the bundle's
read-only card; Writer is Ledger.app/Contents/Helpers/Writer.app.
Built on a Mac by sh pc/macOS/build.sh (Ledger.app + zip, ad hoc signed);
checked on Linux by sh pc/macOS/check.sh (open, print, save, the card's folders).
wtk's file dialog lists SD:, HOME:, MAC: on __APPLE__. Docs 03 / 04 / HANDOFF.

Co-Authored-By: Claude Opus 5.5 <noreply@anthropic.com>
Claude-Session: https://claude.ai/code/session_01HNKeGJ7T59GeUPPjqUg6Bd
</commit_message>
<xml_diff>
--- a/docs/exports/03-DEVELOPER-GUIDE.docx
+++ b/docs/exports/03-DEVELOPER-GUIDE.docx
@@ -58812,7 +58812,7 @@
     </w:p>
     <w:bookmarkEnd w:id="73"/>
     <w:bookmarkEnd w:id="74"/>
-    <w:bookmarkStart w:id="88" w:name="X636230dba256ccd30a2e68f8101290712b3f4c4"/>
+    <w:bookmarkStart w:id="90" w:name="X636230dba256ccd30a2e68f8101290712b3f4c4"/>
     <w:p>
       <w:pPr>
         <w:pStyle w:val="Heading2"/>
@@ -62025,7 +62025,7 @@
       </w:r>
     </w:p>
     <w:bookmarkEnd w:id="84"/>
-    <w:bookmarkStart w:id="87" w:name="onyx-basic-the-interpreter"/>
+    <w:bookmarkStart w:id="89" w:name="onyx-basic-the-interpreter"/>
     <w:p>
       <w:pPr>
         <w:pStyle w:val="Heading3"/>
@@ -66122,22 +66122,7 @@
           <w:b/>
           <w:bCs/>
         </w:rPr>
-        <w:t xml:space="preserve">Volume and Wi-Fi from the menu bar</w:t>
-      </w:r>
-      <w:r>
-        <w:t xml:space="preserve"> </w:t>
-      </w:r>
-      <w:r>
-        <w:t xml:space="preserve">(ABI v60):</w:t>
-      </w:r>
-      <w:r>
-        <w:t xml:space="preserve"> </w:t>
-      </w:r>
-      <w:r>
-        <w:rPr>
-          <w:rStyle w:val="VerbatimChar"/>
-        </w:rPr>
-        <w:t xml:space="preserve">user/volume.h</w:t>
+        <w:t xml:space="preserve">Ledger for macOS</w:t>
       </w:r>
       <w:r>
         <w:t xml:space="preserve"> </w:t>
@@ -66149,22 +66134,570 @@
         <w:rPr>
           <w:rStyle w:val="VerbatimChar"/>
         </w:rPr>
-        <w:t xml:space="preserve">volume_save</w:t>
-      </w:r>
-      <w:r>
-        <w:t xml:space="preserve"> </w:t>
-      </w:r>
-      <w:r>
+        <w:t xml:space="preserve">pc/macOS</w:t>
+      </w:r>
+      <w:r>
+        <w:t xml:space="preserve">, built</w:t>
+      </w:r>
+      <w:r>
+        <w:t xml:space="preserve"> </w:t>
+      </w:r>
+      <w:r>
+        <w:rPr>
+          <w:b/>
+          <w:bCs/>
+        </w:rPr>
+        <w:t xml:space="preserve">on a Mac</w:t>
+      </w:r>
+      <w:r>
+        <w:t xml:space="preserve"> </w:t>
+      </w:r>
+      <w:r>
+        <w:t xml:space="preserve">by</w:t>
+      </w:r>
+      <w:r>
+        <w:t xml:space="preserve"> </w:t>
+      </w:r>
+      <w:r>
+        <w:rPr>
+          <w:rStyle w:val="VerbatimChar"/>
+        </w:rPr>
+        <w:t xml:space="preserve">sh pc/macOS/build.sh</w:t>
+      </w:r>
+      <w:r>
+        <w:t xml:space="preserve"> </w:t>
+      </w:r>
+      <w:r>
+        <w:t xml:space="preserve">into</w:t>
+      </w:r>
+      <w:r>
+        <w:t xml:space="preserve"> </w:t>
+      </w:r>
+      <w:r>
+        <w:rPr>
+          <w:rStyle w:val="VerbatimChar"/>
+        </w:rPr>
+        <w:t xml:space="preserve">pc/dist/macOS/Ledger.app</w:t>
+      </w:r>
+      <w:r>
+        <w:t xml:space="preserve"> </w:t>
+      </w:r>
+      <w:r>
+        <w:t xml:space="preserve">+</w:t>
+      </w:r>
+      <w:r>
+        <w:t xml:space="preserve"> </w:t>
+      </w:r>
+      <w:r>
+        <w:rPr>
+          <w:rStyle w:val="VerbatimChar"/>
+        </w:rPr>
+        <w:t xml:space="preserve">Ledger-macOS-arm64.zip</w:t>
+      </w:r>
+      <w:r>
+        <w:t xml:space="preserve"> </w:t>
+      </w:r>
+      <w:r>
+        <w:t xml:space="preserve">-- the Xcode command-line tools only; not built</w:t>
+      </w:r>
+      <w:r>
+        <w:t xml:space="preserve"> </w:t>
+      </w:r>
+      <w:r>
+        <w:t xml:space="preserve">here, so not committed). As Koton for Windows,</w:t>
+      </w:r>
+      <w:r>
+        <w:t xml:space="preserve"> </w:t>
+      </w:r>
+      <w:r>
+        <w:rPr>
+          <w:b/>
+          <w:bCs/>
+        </w:rPr>
+        <w:t xml:space="preserve">the Onyx sources unchanged</w:t>
+      </w:r>
+      <w:r>
+        <w:t xml:space="preserve"> </w:t>
+      </w:r>
+      <w:r>
+        <w:t xml:space="preserve">--</w:t>
+      </w:r>
+      <w:r>
+        <w:t xml:space="preserve"> </w:t>
+      </w:r>
+      <w:r>
+        <w:rPr>
+          <w:rStyle w:val="VerbatimChar"/>
+        </w:rPr>
+        <w:t xml:space="preserve">user/Apps/ledger</w:t>
+      </w:r>
+      <w:r>
+        <w:t xml:space="preserve">,</w:t>
+      </w:r>
+      <w:r>
+        <w:t xml:space="preserve"> </w:t>
+      </w:r>
+      <w:r>
+        <w:rPr>
+          <w:rStyle w:val="VerbatimChar"/>
+        </w:rPr>
+        <w:t xml:space="preserve">user/Apps/writer</w:t>
+      </w:r>
+      <w:r>
+        <w:t xml:space="preserve"> </w:t>
+      </w:r>
+      <w:r>
+        <w:t xml:space="preserve">(it prints Ledger's documents from their templates),</w:t>
+      </w:r>
+      <w:r>
+        <w:t xml:space="preserve"> </w:t>
+      </w:r>
+      <w:r>
+        <w:rPr>
+          <w:rStyle w:val="VerbatimChar"/>
+        </w:rPr>
+        <w:t xml:space="preserve">user/wtk</w:t>
+      </w:r>
+      <w:r>
+        <w:t xml:space="preserve">, FreeType -- over the</w:t>
+      </w:r>
+      <w:r>
+        <w:t xml:space="preserve"> </w:t>
+      </w:r>
+      <w:r>
+        <w:t xml:space="preserve">kernel's ABI table on macOS, in two halves:</w:t>
+      </w:r>
+      <w:r>
+        <w:t xml:space="preserve"> </w:t>
+      </w:r>
+      <w:hyperlink r:id="rId87">
+        <w:r>
+          <w:rPr>
+            <w:rStyle w:val="VerbatimChar"/>
+          </w:rPr>
+          <w:t xml:space="preserve">pc/macOS/hostkapi.cpp</w:t>
+        </w:r>
+      </w:hyperlink>
+      <w:r>
+        <w:t xml:space="preserve"> </w:t>
+      </w:r>
+      <w:r>
+        <w:t xml:space="preserve">(POSIX:</w:t>
+      </w:r>
+      <w:r>
+        <w:t xml:space="preserve"> </w:t>
+      </w:r>
+      <w:r>
+        <w:t xml:space="preserve">the table at</w:t>
+      </w:r>
+      <w:r>
+        <w:t xml:space="preserve"> </w:t>
+      </w:r>
+      <w:r>
+        <w:rPr>
+          <w:rStyle w:val="VerbatimChar"/>
+        </w:rPr>
+        <w:t xml:space="preserve">KAPI_TABLE_VA</w:t>
+      </w:r>
+      <w:r>
+        <w:t xml:space="preserve"> </w:t>
+      </w:r>
+      <w:r>
+        <w:t xml:space="preserve">by</w:t>
+      </w:r>
+      <w:r>
+        <w:t xml:space="preserve"> </w:t>
+      </w:r>
+      <w:r>
+        <w:rPr>
+          <w:rStyle w:val="VerbatimChar"/>
+        </w:rPr>
+        <w:t xml:space="preserve">mach_vm_allocate (VM_FLAGS_FIXED)</w:t>
+      </w:r>
+      <w:r>
+        <w:t xml:space="preserve"> </w:t>
+      </w:r>
+      <w:r>
+        <w:t xml:space="preserve">-- taken only if free --, files,</w:t>
+      </w:r>
+      <w:r>
+        <w:t xml:space="preserve"> </w:t>
+      </w:r>
+      <w:r>
+        <w:t xml:space="preserve">time, threads,</w:t>
+      </w:r>
+      <w:r>
+        <w:t xml:space="preserve"> </w:t>
+      </w:r>
+      <w:r>
+        <w:rPr>
+          <w:rStyle w:val="VerbatimChar"/>
+        </w:rPr>
+        <w:t xml:space="preserve">wait_word</w:t>
+      </w:r>
+      <w:r>
+        <w:t xml:space="preserve">, processes, arguments) and</w:t>
+      </w:r>
+      <w:r>
+        <w:t xml:space="preserve"> </w:t>
+      </w:r>
+      <w:hyperlink r:id="rId88">
+        <w:r>
+          <w:rPr>
+            <w:rStyle w:val="VerbatimChar"/>
+          </w:rPr>
+          <w:t xml:space="preserve">pc/macOS/cocoa.mm</w:t>
+        </w:r>
+      </w:hyperlink>
+      <w:r>
+        <w:t xml:space="preserve"> </w:t>
+      </w:r>
+      <w:r>
+        <w:t xml:space="preserve">(an</w:t>
+      </w:r>
+      <w:r>
+        <w:t xml:space="preserve"> </w:t>
+      </w:r>
+      <w:r>
+        <w:rPr>
+          <w:rStyle w:val="VerbatimChar"/>
+        </w:rPr>
+        <w:t xml:space="preserve">NSWindow</w:t>
+      </w:r>
+      <w:r>
+        <w:t xml:space="preserve"> </w:t>
+      </w:r>
+      <w:r>
+        <w:t xml:space="preserve">whose view draws the canvas with CoreGraphics, 1 point a pixel; the events queued and handed</w:t>
+      </w:r>
+      <w:r>
+        <w:t xml:space="preserve"> </w:t>
+      </w:r>
+      <w:r>
+        <w:t xml:space="preserve">out by</w:t>
+      </w:r>
+      <w:r>
+        <w:t xml:space="preserve"> </w:t>
+      </w:r>
+      <w:r>
+        <w:rPr>
+          <w:rStyle w:val="VerbatimChar"/>
+        </w:rPr>
+        <w:t xml:space="preserve">pump_events</w:t>
+      </w:r>
+      <w:r>
+        <w:t xml:space="preserve"> </w:t>
+      </w:r>
+      <w:r>
+        <w:t xml:space="preserve">-- the app's thread pumps Cocoa's events itself, no</w:t>
+      </w:r>
+      <w:r>
+        <w:t xml:space="preserve"> </w:t>
+      </w:r>
+      <w:r>
+        <w:rPr>
+          <w:rStyle w:val="VerbatimChar"/>
+        </w:rPr>
+        <w:t xml:space="preserve">[NSApp run]</w:t>
+      </w:r>
+      <w:r>
+        <w:t xml:space="preserve">; the app's menu</w:t>
+      </w:r>
+      <w:r>
+        <w:t xml:space="preserve"> </w:t>
+      </w:r>
+      <w:r>
+        <w:t xml:space="preserve">bar as the Mac's;</w:t>
+      </w:r>
+      <w:r>
+        <w:t xml:space="preserve"> </w:t>
+      </w:r>
+      <w:r>
+        <w:rPr>
+          <w:rStyle w:val="VerbatimChar"/>
+        </w:rPr>
+        <w:t xml:space="preserve">NSPasteboard</w:t>
+      </w:r>
+      <w:r>
+        <w:t xml:space="preserve">; files dropped or opened from the Finder as</w:t>
+      </w:r>
+      <w:r>
+        <w:t xml:space="preserve"> </w:t>
+      </w:r>
+      <w:r>
+        <w:rPr>
+          <w:rStyle w:val="VerbatimChar"/>
+        </w:rPr>
+        <w:t xml:space="preserve">GUI_EVENT_DROP</w:t>
+      </w:r>
+      <w:r>
+        <w:t xml:space="preserve">). Mach-O</w:t>
+      </w:r>
+      <w:r>
+        <w:t xml:space="preserve"> </w:t>
+      </w:r>
+      <w:r>
+        <w:t xml:space="preserve">has no</w:t>
+      </w:r>
+      <w:r>
+        <w:t xml:space="preserve"> </w:t>
+      </w:r>
+      <w:r>
+        <w:rPr>
+          <w:rStyle w:val="VerbatimChar"/>
+        </w:rPr>
+        <w:t xml:space="preserve">init_priority</w:t>
+      </w:r>
+      <w:r>
+        <w:t xml:space="preserve">:</w:t>
+      </w:r>
+      <w:r>
+        <w:t xml:space="preserve"> </w:t>
+      </w:r>
+      <w:r>
+        <w:rPr>
+          <w:rStyle w:val="VerbatimChar"/>
+        </w:rPr>
+        <w:t xml:space="preserve">hostkapi.o</w:t>
+      </w:r>
+      <w:r>
+        <w:t xml:space="preserve"> </w:t>
+      </w:r>
+      <w:r>
+        <w:t xml:space="preserve">is linked first (Mach-O and ELF run the files' initialisers in the</w:t>
+      </w:r>
+      <w:r>
+        <w:t xml:space="preserve"> </w:t>
+      </w:r>
+      <w:r>
+        <w:t xml:space="preserve">link's order) and the screen's half keeps no C++ object at file scope (they would be made after</w:t>
+      </w:r>
+      <w:r>
+        <w:t xml:space="preserve"> </w:t>
+      </w:r>
+      <w:r>
+        <w:rPr>
+          <w:rStyle w:val="VerbatimChar"/>
+        </w:rPr>
+        <w:t xml:space="preserve">gui_setup</w:t>
+      </w:r>
+      <w:r>
+        <w:t xml:space="preserve">).</w:t>
+      </w:r>
+      <w:r>
+        <w:t xml:space="preserve"> </w:t>
+      </w:r>
+      <w:r>
+        <w:rPr>
+          <w:b/>
+          <w:bCs/>
+        </w:rPr>
+        <w:t xml:space="preserve">The card</w:t>
+      </w:r>
+      <w:r>
+        <w:t xml:space="preserve"> </w:t>
+      </w:r>
+      <w:r>
+        <w:t xml:space="preserve">is two folders over the bundle's read-only one</w:t>
+      </w:r>
+      <w:r>
+        <w:t xml:space="preserve"> </w:t>
+      </w:r>
+      <w:r>
+        <w:t xml:space="preserve">(</w:t>
+      </w:r>
+      <w:r>
+        <w:rPr>
+          <w:rStyle w:val="VerbatimChar"/>
+        </w:rPr>
+        <w:t xml:space="preserve">Contents/Resources/sd</w:t>
+      </w:r>
+      <w:r>
+        <w:t xml:space="preserve">, filled by</w:t>
+      </w:r>
+      <w:r>
+        <w:t xml:space="preserve"> </w:t>
+      </w:r>
+      <w:r>
+        <w:rPr>
+          <w:rStyle w:val="VerbatimChar"/>
+        </w:rPr>
+        <w:t xml:space="preserve">pc/macOS/card.sh</w:t>
+      </w:r>
+      <w:r>
+        <w:t xml:space="preserve">):</w:t>
+      </w:r>
+      <w:r>
+        <w:t xml:space="preserve"> </w:t>
+      </w:r>
+      <w:r>
+        <w:rPr>
+          <w:rStyle w:val="VerbatimChar"/>
+        </w:rPr>
+        <w:t xml:space="preserve">SD:/docs</w:t>
+      </w:r>
+      <w:r>
+        <w:t xml:space="preserve"> </w:t>
+      </w:r>
+      <w:r>
+        <w:t xml:space="preserve">is</w:t>
+      </w:r>
+      <w:r>
+        <w:t xml:space="preserve"> </w:t>
+      </w:r>
+      <w:r>
+        <w:rPr>
+          <w:rStyle w:val="VerbatimChar"/>
+        </w:rPr>
+        <w:t xml:space="preserve">~/Documents/Onyx Ledger</w:t>
+      </w:r>
+      <w:r>
+        <w:t xml:space="preserve"> </w:t>
+      </w:r>
+      <w:r>
+        <w:t xml:space="preserve">(</w:t>
+      </w:r>
+      <w:r>
+        <w:rPr>
+          <w:rStyle w:val="VerbatimChar"/>
+        </w:rPr>
+        <w:t xml:space="preserve">ONYX_DOCS</w:t>
+      </w:r>
+      <w:r>
+        <w:t xml:space="preserve">), the rest of</w:t>
+      </w:r>
+      <w:r>
+        <w:t xml:space="preserve"> </w:t>
+      </w:r>
+      <w:r>
+        <w:rPr>
+          <w:rStyle w:val="VerbatimChar"/>
+        </w:rPr>
+        <w:t xml:space="preserve">SD:/</w:t>
+      </w:r>
+      <w:r>
+        <w:t xml:space="preserve"> </w:t>
+      </w:r>
+      <w:r>
+        <w:rPr>
+          <w:rStyle w:val="VerbatimChar"/>
+        </w:rPr>
+        <w:t xml:space="preserve">~/Library/Application Support/Onyx Ledger</w:t>
+      </w:r>
+      <w:r>
+        <w:t xml:space="preserve"> </w:t>
+      </w:r>
+      <w:r>
+        <w:t xml:space="preserve">(</w:t>
+      </w:r>
+      <w:r>
+        <w:rPr>
+          <w:rStyle w:val="VerbatimChar"/>
+        </w:rPr>
+        <w:t xml:space="preserve">ONYX_SD</w:t>
+      </w:r>
+      <w:r>
+        <w:t xml:space="preserve">; the app's</w:t>
+      </w:r>
+      <w:r>
+        <w:t xml:space="preserve"> </w:t>
+      </w:r>
+      <w:r>
+        <w:rPr>
+          <w:rStyle w:val="VerbatimChar"/>
+        </w:rPr>
+        <w:t xml:space="preserve">apps/&lt;app&gt;.app</w:t>
+      </w:r>
+      <w:r>
+        <w:t xml:space="preserve"> </w:t>
+      </w:r>
+      <w:r>
+        <w:t xml:space="preserve">-- Ledger's templates -- copied there at the first start); read from the user's</w:t>
+      </w:r>
+      <w:r>
+        <w:t xml:space="preserve"> </w:t>
+      </w:r>
+      <w:r>
+        <w:t xml:space="preserve">folder else the bundle's, written in the user's (the demo company, saved, lands in Documents);</w:t>
+      </w:r>
+      <w:r>
+        <w:t xml:space="preserve"> </w:t>
+      </w:r>
+      <w:r>
+        <w:rPr>
+          <w:rStyle w:val="VerbatimChar"/>
+        </w:rPr>
+        <w:t xml:space="preserve">HOME:/</w:t>
+      </w:r>
+      <w:r>
+        <w:t xml:space="preserve"> </w:t>
+      </w:r>
+      <w:r>
+        <w:t xml:space="preserve">is</w:t>
+      </w:r>
+      <w:r>
+        <w:t xml:space="preserve"> </w:t>
+      </w:r>
+      <w:r>
+        <w:rPr>
+          <w:rStyle w:val="VerbatimChar"/>
+        </w:rPr>
+        <w:t xml:space="preserve">~</w:t>
+      </w:r>
+      <w:r>
+        <w:t xml:space="preserve">,</w:t>
+      </w:r>
+      <w:r>
+        <w:t xml:space="preserve"> </w:t>
+      </w:r>
+      <w:r>
+        <w:rPr>
+          <w:rStyle w:val="VerbatimChar"/>
+        </w:rPr>
+        <w:t xml:space="preserve">MAC:/</w:t>
+      </w:r>
+      <w:r>
+        <w:t xml:space="preserve"> </w:t>
+      </w:r>
+      <w:r>
+        <w:t xml:space="preserve">the Mac's</w:t>
+      </w:r>
+      <w:r>
+        <w:t xml:space="preserve"> </w:t>
+      </w:r>
+      <w:r>
+        <w:rPr>
+          <w:rStyle w:val="VerbatimChar"/>
+        </w:rPr>
         <w:t xml:space="preserve">/</w:t>
       </w:r>
       <w:r>
         <w:t xml:space="preserve"> </w:t>
       </w:r>
       <w:r>
-        <w:rPr>
-          <w:rStyle w:val="VerbatimChar"/>
-        </w:rPr>
-        <w:t xml:space="preserve">volume_restore</w:t>
+        <w:t xml:space="preserve">(a file the Finder gives:</w:t>
+      </w:r>
+      <w:r>
+        <w:t xml:space="preserve"> </w:t>
+      </w:r>
+      <w:r>
+        <w:rPr>
+          <w:rStyle w:val="VerbatimChar"/>
+        </w:rPr>
+        <w:t xml:space="preserve">MAC:/Users/...</w:t>
+      </w:r>
+      <w:r>
+        <w:t xml:space="preserve">).</w:t>
+      </w:r>
+      <w:r>
+        <w:t xml:space="preserve"> </w:t>
+      </w:r>
+      <w:r>
+        <w:rPr>
+          <w:b/>
+          <w:bCs/>
+        </w:rPr>
+        <w:t xml:space="preserve">Programs</w:t>
       </w:r>
       <w:r>
         <w:t xml:space="preserve">:</w:t>
@@ -66176,19 +66709,22 @@
         <w:rPr>
           <w:rStyle w:val="VerbatimChar"/>
         </w:rPr>
-        <w:t xml:space="preserve">SD:/etc/sound.ini</w:t>
-      </w:r>
-      <w:r>
-        <w:t xml:space="preserve">) for the menu bar's volume box and</w:t>
-      </w:r>
-      <w:r>
-        <w:t xml:space="preserve"> </w:t>
-      </w:r>
-      <w:r>
-        <w:rPr>
-          <w:rStyle w:val="VerbatimChar"/>
-        </w:rPr>
-        <w:t xml:space="preserve">/bin/volume</w:t>
+        <w:t xml:space="preserve">SD:/apps/writer.app/main</w:t>
+      </w:r>
+      <w:r>
+        <w:t xml:space="preserve"> </w:t>
+      </w:r>
+      <w:r>
+        <w:t xml:space="preserve">is</w:t>
+      </w:r>
+      <w:r>
+        <w:t xml:space="preserve"> </w:t>
+      </w:r>
+      <w:r>
+        <w:rPr>
+          <w:rStyle w:val="VerbatimChar"/>
+        </w:rPr>
+        <w:t xml:space="preserve">Ledger.app/Contents/Helpers/Writer.app</w:t>
       </w:r>
       <w:r>
         <w:t xml:space="preserve"> </w:t>
@@ -66200,103 +66736,125 @@
         <w:rPr>
           <w:rStyle w:val="VerbatimChar"/>
         </w:rPr>
-        <w:t xml:space="preserve">kapi_sound_volume (vol, mute)</w:t>
-      </w:r>
-      <w:r>
-        <w:t xml:space="preserve">, −1 keeps). The Wi-Fi menu is its own app,</w:t>
-      </w:r>
-      <w:r>
-        <w:t xml:space="preserve"> </w:t>
-      </w:r>
-      <w:r>
-        <w:rPr>
-          <w:rStyle w:val="VerbatimChar"/>
-        </w:rPr>
-        <w:t xml:space="preserve">Apps/wifimenu</w:t>
-      </w:r>
-      <w:r>
-        <w:t xml:space="preserve"> </w:t>
-      </w:r>
-      <w:r>
-        <w:t xml:space="preserve">(a borderless window: it takes the keyboard for the password, unlike the</w:t>
-      </w:r>
-      <w:r>
-        <w:t xml:space="preserve"> </w:t>
-      </w:r>
-      <w:r>
-        <w:t xml:space="preserve">TOPMOST menu bar):</w:t>
-      </w:r>
-      <w:r>
-        <w:t xml:space="preserve"> </w:t>
-      </w:r>
-      <w:r>
-        <w:rPr>
-          <w:rStyle w:val="VerbatimChar"/>
-        </w:rPr>
-        <w:t xml:space="preserve">kapi_wlan_scan</w:t>
-      </w:r>
-      <w:r>
-        <w:t xml:space="preserve">, the known networks parsed from / written back to</w:t>
-      </w:r>
-      <w:r>
-        <w:t xml:space="preserve"> </w:t>
-      </w:r>
-      <w:r>
-        <w:rPr>
-          <w:rStyle w:val="VerbatimChar"/>
-        </w:rPr>
-        <w:t xml:space="preserve">SD:/etc/wpa_supplicant.conf</w:t>
-      </w:r>
-      <w:r>
-        <w:t xml:space="preserve"> </w:t>
-      </w:r>
-      <w:r>
-        <w:t xml:space="preserve">(several</w:t>
-      </w:r>
-      <w:r>
-        <w:t xml:space="preserve"> </w:t>
-      </w:r>
-      <w:r>
-        <w:rPr>
-          <w:rStyle w:val="VerbatimChar"/>
-        </w:rPr>
-        <w:t xml:space="preserve">network={}</w:t>
-      </w:r>
-      <w:r>
-        <w:t xml:space="preserve"> </w:t>
-      </w:r>
-      <w:r>
-        <w:t xml:space="preserve">blocks,</w:t>
-      </w:r>
-      <w:r>
-        <w:t xml:space="preserve"> </w:t>
-      </w:r>
-      <w:r>
-        <w:rPr>
-          <w:rStyle w:val="VerbatimChar"/>
-        </w:rPr>
-        <w:t xml:space="preserve">priority</w:t>
-      </w:r>
-      <w:r>
-        <w:t xml:space="preserve">), then</w:t>
-      </w:r>
-      <w:r>
-        <w:t xml:space="preserve"> </w:t>
-      </w:r>
-      <w:r>
-        <w:rPr>
-          <w:rStyle w:val="VerbatimChar"/>
-        </w:rPr>
-        <w:t xml:space="preserve">kapi_wlan_reconnect</w:t>
-      </w:r>
-      <w:r>
-        <w:t xml:space="preserve">; it closes when another window has the keys (</w:t>
-      </w:r>
-      <w:r>
-        <w:rPr>
-          <w:rStyle w:val="VerbatimChar"/>
-        </w:rPr>
-        <w:t xml:space="preserve">kapi_win_list</w:t>
+        <w:t xml:space="preserve">ONYX_HELPERS</w:t>
+      </w:r>
+      <w:r>
+        <w:t xml:space="preserve">), the arguments</w:t>
+      </w:r>
+      <w:r>
+        <w:t xml:space="preserve"> </w:t>
+      </w:r>
+      <w:r>
+        <w:t xml:space="preserve">passed whole in</w:t>
+      </w:r>
+      <w:r>
+        <w:t xml:space="preserve"> </w:t>
+      </w:r>
+      <w:r>
+        <w:rPr>
+          <w:rStyle w:val="VerbatimChar"/>
+        </w:rPr>
+        <w:t xml:space="preserve">ONYX_ARGS</w:t>
+      </w:r>
+      <w:r>
+        <w:t xml:space="preserve">; one the Mac lacks (the Spreadsheet, the File Viewer) has its file or</w:t>
+      </w:r>
+      <w:r>
+        <w:t xml:space="preserve"> </w:t>
+      </w:r>
+      <w:r>
+        <w:t xml:space="preserve">folder shown by</w:t>
+      </w:r>
+      <w:r>
+        <w:t xml:space="preserve"> </w:t>
+      </w:r>
+      <w:r>
+        <w:rPr>
+          <w:rStyle w:val="VerbatimChar"/>
+        </w:rPr>
+        <w:t xml:space="preserve">open</w:t>
+      </w:r>
+      <w:r>
+        <w:t xml:space="preserve"> </w:t>
+      </w:r>
+      <w:r>
+        <w:t xml:space="preserve">(Numbers / Excel, the Finder).</w:t>
+      </w:r>
+      <w:r>
+        <w:t xml:space="preserve"> </w:t>
+      </w:r>
+      <w:r>
+        <w:rPr>
+          <w:b/>
+          <w:bCs/>
+        </w:rPr>
+        <w:t xml:space="preserve">Keys</w:t>
+      </w:r>
+      <w:r>
+        <w:t xml:space="preserve">: Cmd+letter is the Onyx Ctrl+letter</w:t>
+      </w:r>
+      <w:r>
+        <w:t xml:space="preserve"> </w:t>
+      </w:r>
+      <w:r>
+        <w:t xml:space="preserve">(the real Ctrl too), Cmd+Left / Right Home / End, Cmd+Up / Down Ctrl+Home / End (each event carries</w:t>
+      </w:r>
+      <w:r>
+        <w:t xml:space="preserve"> </w:t>
+      </w:r>
+      <w:r>
+        <w:t xml:space="preserve">its modifiers:</w:t>
+      </w:r>
+      <w:r>
+        <w:t xml:space="preserve"> </w:t>
+      </w:r>
+      <w:r>
+        <w:rPr>
+          <w:rStyle w:val="VerbatimChar"/>
+        </w:rPr>
+        <w:t xml:space="preserve">get_modifiers</w:t>
+      </w:r>
+      <w:r>
+        <w:t xml:space="preserve"> </w:t>
+      </w:r>
+      <w:r>
+        <w:t xml:space="preserve">answers the event's while it is handled), Option is Alt, the text</w:t>
+      </w:r>
+      <w:r>
+        <w:t xml:space="preserve"> </w:t>
+      </w:r>
+      <w:r>
+        <w:t xml:space="preserve">through</w:t>
+      </w:r>
+      <w:r>
+        <w:t xml:space="preserve"> </w:t>
+      </w:r>
+      <w:r>
+        <w:rPr>
+          <w:rStyle w:val="VerbatimChar"/>
+        </w:rPr>
+        <w:t xml:space="preserve">NSTextInputClient</w:t>
+      </w:r>
+      <w:r>
+        <w:t xml:space="preserve"> </w:t>
+      </w:r>
+      <w:r>
+        <w:t xml:space="preserve">(dead keys). One thing in the shared sources exists for it: wtk's file</w:t>
+      </w:r>
+      <w:r>
+        <w:t xml:space="preserve"> </w:t>
+      </w:r>
+      <w:r>
+        <w:t xml:space="preserve">dialog lists</w:t>
+      </w:r>
+      <w:r>
+        <w:t xml:space="preserve"> </w:t>
+      </w:r>
+      <w:r>
+        <w:rPr>
+          <w:rStyle w:val="VerbatimChar"/>
+        </w:rPr>
+        <w:t xml:space="preserve">SD:</w:t>
       </w:r>
       <w:r>
         <w:t xml:space="preserve">,</w:t>
@@ -66308,10 +66866,192 @@
         <w:rPr>
           <w:rStyle w:val="VerbatimChar"/>
         </w:rPr>
-        <w:t xml:space="preserve">KAPI_WIN_KEYS</w:t>
-      </w:r>
-      <w:r>
-        <w:t xml:space="preserve">).</w:t>
+        <w:t xml:space="preserve">HOME:</w:t>
+      </w:r>
+      <w:r>
+        <w:t xml:space="preserve">,</w:t>
+      </w:r>
+      <w:r>
+        <w:t xml:space="preserve"> </w:t>
+      </w:r>
+      <w:r>
+        <w:rPr>
+          <w:rStyle w:val="VerbatimChar"/>
+        </w:rPr>
+        <w:t xml:space="preserve">MAC:</w:t>
+      </w:r>
+      <w:r>
+        <w:t xml:space="preserve"> </w:t>
+      </w:r>
+      <w:r>
+        <w:t xml:space="preserve">on</w:t>
+      </w:r>
+      <w:r>
+        <w:t xml:space="preserve"> </w:t>
+      </w:r>
+      <w:r>
+        <w:rPr>
+          <w:rStyle w:val="VerbatimChar"/>
+        </w:rPr>
+        <w:t xml:space="preserve">__APPLE__</w:t>
+      </w:r>
+      <w:r>
+        <w:t xml:space="preserve">. Checked on Linux by</w:t>
+      </w:r>
+      <w:r>
+        <w:t xml:space="preserve"> </w:t>
+      </w:r>
+      <w:r>
+        <w:rPr>
+          <w:rStyle w:val="VerbatimChar"/>
+          <w:b/>
+          <w:bCs/>
+        </w:rPr>
+        <w:t xml:space="preserve">sh pc/macOS/check.sh</w:t>
+      </w:r>
+      <w:r>
+        <w:t xml:space="preserve">:</w:t>
+      </w:r>
+      <w:r>
+        <w:t xml:space="preserve"> </w:t>
+      </w:r>
+      <w:r>
+        <w:t xml:space="preserve">the same</w:t>
+      </w:r>
+      <w:r>
+        <w:t xml:space="preserve"> </w:t>
+      </w:r>
+      <w:r>
+        <w:rPr>
+          <w:rStyle w:val="VerbatimChar"/>
+        </w:rPr>
+        <w:t xml:space="preserve">hostkapi.cpp</w:t>
+      </w:r>
+      <w:r>
+        <w:t xml:space="preserve"> </w:t>
+      </w:r>
+      <w:r>
+        <w:t xml:space="preserve">under Ledger and Writer with a screen-less half (</w:t>
+      </w:r>
+      <w:r>
+        <w:rPr>
+          <w:rStyle w:val="VerbatimChar"/>
+        </w:rPr>
+        <w:t xml:space="preserve">pc/macOS/headless.cpp</w:t>
+      </w:r>
+      <w:r>
+        <w:t xml:space="preserve">,</w:t>
+      </w:r>
+      <w:r>
+        <w:t xml:space="preserve"> </w:t>
+      </w:r>
+      <w:r>
+        <w:t xml:space="preserve">a script of events, the window written as a picture) -- the demo company opened from the bundle's</w:t>
+      </w:r>
+      <w:r>
+        <w:t xml:space="preserve"> </w:t>
+      </w:r>
+      <w:r>
+        <w:t xml:space="preserve">card, a quote printed (Writer started from</w:t>
+      </w:r>
+      <w:r>
+        <w:t xml:space="preserve"> </w:t>
+      </w:r>
+      <w:r>
+        <w:rPr>
+          <w:rStyle w:val="VerbatimChar"/>
+        </w:rPr>
+        <w:t xml:space="preserve">Helpers/</w:t>
+      </w:r>
+      <w:r>
+        <w:t xml:space="preserve">, its</w:t>
+      </w:r>
+      <w:r>
+        <w:t xml:space="preserve"> </w:t>
+      </w:r>
+      <w:r>
+        <w:rPr>
+          <w:rStyle w:val="VerbatimChar"/>
+        </w:rPr>
+        <w:t xml:space="preserve">.rtf</w:t>
+      </w:r>
+      <w:r>
+        <w:t xml:space="preserve"> </w:t>
+      </w:r>
+      <w:r>
+        <w:t xml:space="preserve">in the user's</w:t>
+      </w:r>
+      <w:r>
+        <w:t xml:space="preserve"> </w:t>
+      </w:r>
+      <w:r>
+        <w:rPr>
+          <w:rStyle w:val="VerbatimChar"/>
+        </w:rPr>
+        <w:t xml:space="preserve">SD:/docs/Quotes</w:t>
+      </w:r>
+      <w:r>
+        <w:t xml:space="preserve">), a</w:t>
+      </w:r>
+      <w:r>
+        <w:t xml:space="preserve"> </w:t>
+      </w:r>
+      <w:r>
+        <w:t xml:space="preserve">document saved (the books written in the user's folder, the bundle's untouched), the templates copied,</w:t>
+      </w:r>
+      <w:r>
+        <w:t xml:space="preserve"> </w:t>
+      </w:r>
+      <w:r>
+        <w:t xml:space="preserve">a host path opened as</w:t>
+      </w:r>
+      <w:r>
+        <w:t xml:space="preserve"> </w:t>
+      </w:r>
+      <w:r>
+        <w:rPr>
+          <w:rStyle w:val="VerbatimChar"/>
+        </w:rPr>
+        <w:t xml:space="preserve">MAC:/...</w:t>
+      </w:r>
+      <w:r>
+        <w:t xml:space="preserve">;</w:t>
+      </w:r>
+      <w:r>
+        <w:t xml:space="preserve"> </w:t>
+      </w:r>
+      <w:r>
+        <w:rPr>
+          <w:rStyle w:val="VerbatimChar"/>
+        </w:rPr>
+        <w:t xml:space="preserve">cocoa.mm</w:t>
+      </w:r>
+      <w:r>
+        <w:t xml:space="preserve"> </w:t>
+      </w:r>
+      <w:r>
+        <w:t xml:space="preserve">syntax-checked against GNUstep's headers (the Mac-only</w:t>
+      </w:r>
+      <w:r>
+        <w:t xml:space="preserve"> </w:t>
+      </w:r>
+      <w:r>
+        <w:t xml:space="preserve">calls aside).</w:t>
+      </w:r>
+      <w:r>
+        <w:t xml:space="preserve"> </w:t>
+      </w:r>
+      <w:r>
+        <w:rPr>
+          <w:rStyle w:val="VerbatimChar"/>
+        </w:rPr>
+        <w:t xml:space="preserve">pc/macOS/README.txt</w:t>
+      </w:r>
+      <w:r>
+        <w:t xml:space="preserve"> </w:t>
+      </w:r>
+      <w:r>
+        <w:t xml:space="preserve">is the user's page.</w:t>
       </w:r>
     </w:p>
     <w:p>
@@ -66327,7 +67067,22 @@
           <w:b/>
           <w:bCs/>
         </w:rPr>
-        <w:t xml:space="preserve">NintendoEMU</w:t>
+        <w:t xml:space="preserve">Volume and Wi-Fi from the menu bar</w:t>
+      </w:r>
+      <w:r>
+        <w:t xml:space="preserve"> </w:t>
+      </w:r>
+      <w:r>
+        <w:t xml:space="preserve">(ABI v60):</w:t>
+      </w:r>
+      <w:r>
+        <w:t xml:space="preserve"> </w:t>
+      </w:r>
+      <w:r>
+        <w:rPr>
+          <w:rStyle w:val="VerbatimChar"/>
+        </w:rPr>
+        <w:t xml:space="preserve">user/volume.h</w:t>
       </w:r>
       <w:r>
         <w:t xml:space="preserve"> </w:t>
@@ -66339,19 +67094,46 @@
         <w:rPr>
           <w:rStyle w:val="VerbatimChar"/>
         </w:rPr>
-        <w:t xml:space="preserve">pc/NintendoEMU</w:t>
-      </w:r>
-      <w:r>
-        <w:t xml:space="preserve">):</w:t>
-      </w:r>
-      <w:r>
-        <w:t xml:space="preserve"> </w:t>
-      </w:r>
-      <w:r>
-        <w:rPr>
-          <w:rStyle w:val="VerbatimChar"/>
-        </w:rPr>
-        <w:t xml:space="preserve">nemucore.dll</w:t>
+        <w:t xml:space="preserve">volume_save</w:t>
+      </w:r>
+      <w:r>
+        <w:t xml:space="preserve"> </w:t>
+      </w:r>
+      <w:r>
+        <w:t xml:space="preserve">/</w:t>
+      </w:r>
+      <w:r>
+        <w:t xml:space="preserve"> </w:t>
+      </w:r>
+      <w:r>
+        <w:rPr>
+          <w:rStyle w:val="VerbatimChar"/>
+        </w:rPr>
+        <w:t xml:space="preserve">volume_restore</w:t>
+      </w:r>
+      <w:r>
+        <w:t xml:space="preserve">:</w:t>
+      </w:r>
+      <w:r>
+        <w:t xml:space="preserve"> </w:t>
+      </w:r>
+      <w:r>
+        <w:rPr>
+          <w:rStyle w:val="VerbatimChar"/>
+        </w:rPr>
+        <w:t xml:space="preserve">SD:/etc/sound.ini</w:t>
+      </w:r>
+      <w:r>
+        <w:t xml:space="preserve">) for the menu bar's volume box and</w:t>
+      </w:r>
+      <w:r>
+        <w:t xml:space="preserve"> </w:t>
+      </w:r>
+      <w:r>
+        <w:rPr>
+          <w:rStyle w:val="VerbatimChar"/>
+        </w:rPr>
+        <w:t xml:space="preserve">/bin/volume</w:t>
       </w:r>
       <w:r>
         <w:t xml:space="preserve"> </w:t>
@@ -66363,38 +67145,103 @@
         <w:rPr>
           <w:rStyle w:val="VerbatimChar"/>
         </w:rPr>
-        <w:t xml:space="preserve">core/nemucore.cpp</w:t>
-      </w:r>
-      <w:r>
-        <w:t xml:space="preserve">, mingw-w64) builds the</w:t>
-      </w:r>
-      <w:r>
-        <w:t xml:space="preserve"> </w:t>
-      </w:r>
-      <w:r>
-        <w:t xml:space="preserve">emulator cores</w:t>
-      </w:r>
-      <w:r>
-        <w:t xml:space="preserve"> </w:t>
-      </w:r>
-      <w:r>
-        <w:rPr>
-          <w:b/>
-          <w:bCs/>
-        </w:rPr>
-        <w:t xml:space="preserve">unchanged</w:t>
-      </w:r>
-      <w:r>
-        <w:t xml:space="preserve"> </w:t>
-      </w:r>
-      <w:r>
-        <w:t xml:space="preserve">(</w:t>
-      </w:r>
-      <w:r>
-        <w:rPr>
-          <w:rStyle w:val="VerbatimChar"/>
-        </w:rPr>
-        <w:t xml:space="preserve">user/gb</w:t>
+        <w:t xml:space="preserve">kapi_sound_volume (vol, mute)</w:t>
+      </w:r>
+      <w:r>
+        <w:t xml:space="preserve">, −1 keeps). The Wi-Fi menu is its own app,</w:t>
+      </w:r>
+      <w:r>
+        <w:t xml:space="preserve"> </w:t>
+      </w:r>
+      <w:r>
+        <w:rPr>
+          <w:rStyle w:val="VerbatimChar"/>
+        </w:rPr>
+        <w:t xml:space="preserve">Apps/wifimenu</w:t>
+      </w:r>
+      <w:r>
+        <w:t xml:space="preserve"> </w:t>
+      </w:r>
+      <w:r>
+        <w:t xml:space="preserve">(a borderless window: it takes the keyboard for the password, unlike the</w:t>
+      </w:r>
+      <w:r>
+        <w:t xml:space="preserve"> </w:t>
+      </w:r>
+      <w:r>
+        <w:t xml:space="preserve">TOPMOST menu bar):</w:t>
+      </w:r>
+      <w:r>
+        <w:t xml:space="preserve"> </w:t>
+      </w:r>
+      <w:r>
+        <w:rPr>
+          <w:rStyle w:val="VerbatimChar"/>
+        </w:rPr>
+        <w:t xml:space="preserve">kapi_wlan_scan</w:t>
+      </w:r>
+      <w:r>
+        <w:t xml:space="preserve">, the known networks parsed from / written back to</w:t>
+      </w:r>
+      <w:r>
+        <w:t xml:space="preserve"> </w:t>
+      </w:r>
+      <w:r>
+        <w:rPr>
+          <w:rStyle w:val="VerbatimChar"/>
+        </w:rPr>
+        <w:t xml:space="preserve">SD:/etc/wpa_supplicant.conf</w:t>
+      </w:r>
+      <w:r>
+        <w:t xml:space="preserve"> </w:t>
+      </w:r>
+      <w:r>
+        <w:t xml:space="preserve">(several</w:t>
+      </w:r>
+      <w:r>
+        <w:t xml:space="preserve"> </w:t>
+      </w:r>
+      <w:r>
+        <w:rPr>
+          <w:rStyle w:val="VerbatimChar"/>
+        </w:rPr>
+        <w:t xml:space="preserve">network={}</w:t>
+      </w:r>
+      <w:r>
+        <w:t xml:space="preserve"> </w:t>
+      </w:r>
+      <w:r>
+        <w:t xml:space="preserve">blocks,</w:t>
+      </w:r>
+      <w:r>
+        <w:t xml:space="preserve"> </w:t>
+      </w:r>
+      <w:r>
+        <w:rPr>
+          <w:rStyle w:val="VerbatimChar"/>
+        </w:rPr>
+        <w:t xml:space="preserve">priority</w:t>
+      </w:r>
+      <w:r>
+        <w:t xml:space="preserve">), then</w:t>
+      </w:r>
+      <w:r>
+        <w:t xml:space="preserve"> </w:t>
+      </w:r>
+      <w:r>
+        <w:rPr>
+          <w:rStyle w:val="VerbatimChar"/>
+        </w:rPr>
+        <w:t xml:space="preserve">kapi_wlan_reconnect</w:t>
+      </w:r>
+      <w:r>
+        <w:t xml:space="preserve">; it closes when another window has the keys (</w:t>
+      </w:r>
+      <w:r>
+        <w:rPr>
+          <w:rStyle w:val="VerbatimChar"/>
+        </w:rPr>
+        <w:t xml:space="preserve">kapi_win_list</w:t>
       </w:r>
       <w:r>
         <w:t xml:space="preserve">,</w:t>
@@ -66406,904 +67253,10 @@
         <w:rPr>
           <w:rStyle w:val="VerbatimChar"/>
         </w:rPr>
-        <w:t xml:space="preserve">gba</w:t>
-      </w:r>
-      <w:r>
-        <w:t xml:space="preserve">,</w:t>
-      </w:r>
-      <w:r>
-        <w:t xml:space="preserve"> </w:t>
-      </w:r>
-      <w:r>
-        <w:rPr>
-          <w:rStyle w:val="VerbatimChar"/>
-        </w:rPr>
-        <w:t xml:space="preserve">nes</w:t>
-      </w:r>
-      <w:r>
-        <w:t xml:space="preserve">,</w:t>
-      </w:r>
-      <w:r>
-        <w:t xml:space="preserve"> </w:t>
-      </w:r>
-      <w:r>
-        <w:rPr>
-          <w:rStyle w:val="VerbatimChar"/>
-        </w:rPr>
-        <w:t xml:space="preserve">snes</w:t>
-      </w:r>
-      <w:r>
-        <w:t xml:space="preserve">,</w:t>
-      </w:r>
-      <w:r>
-        <w:t xml:space="preserve"> </w:t>
-      </w:r>
-      <w:r>
-        <w:rPr>
-          <w:rStyle w:val="VerbatimChar"/>
-        </w:rPr>
-        <w:t xml:space="preserve">n64</w:t>
-      </w:r>
-      <w:r>
-        <w:t xml:space="preserve">,</w:t>
-      </w:r>
-      <w:r>
-        <w:t xml:space="preserve"> </w:t>
-      </w:r>
-      <w:r>
-        <w:rPr>
-          <w:rStyle w:val="VerbatimChar"/>
-        </w:rPr>
-        <w:t xml:space="preserve">gc</w:t>
-      </w:r>
-      <w:r>
-        <w:t xml:space="preserve">) behind a C API —</w:t>
-      </w:r>
-      <w:r>
-        <w:t xml:space="preserve"> </w:t>
-      </w:r>
-      <w:r>
-        <w:rPr>
-          <w:rStyle w:val="VerbatimChar"/>
-        </w:rPr>
-        <w:t xml:space="preserve">ne_open</w:t>
-      </w:r>
-      <w:r>
-        <w:t xml:space="preserve"> </w:t>
-      </w:r>
-      <w:r>
-        <w:t xml:space="preserve">(the system from the extension; a GameCube disc read on demand through</w:t>
-      </w:r>
-      <w:r>
-        <w:t xml:space="preserve"> </w:t>
-      </w:r>
-      <w:r>
-        <w:rPr>
-          <w:rStyle w:val="VerbatimChar"/>
-        </w:rPr>
-        <w:t xml:space="preserve">discRead</w:t>
-      </w:r>
-      <w:r>
-        <w:t xml:space="preserve">),</w:t>
-      </w:r>
-      <w:r>
-        <w:t xml:space="preserve"> </w:t>
-      </w:r>
-      <w:r>
-        <w:rPr>
-          <w:rStyle w:val="VerbatimChar"/>
-        </w:rPr>
-        <w:t xml:space="preserve">ne_set_keys</w:t>
-      </w:r>
-      <w:r>
-        <w:t xml:space="preserve"> </w:t>
-      </w:r>
-      <w:r>
-        <w:t xml:space="preserve">(the Windows key states) + XInput pad 0, mapped per system exactly as the Onyx</w:t>
-      </w:r>
-      <w:r>
-        <w:t xml:space="preserve"> </w:t>
-      </w:r>
-      <w:r>
-        <w:t xml:space="preserve">apps do,</w:t>
-      </w:r>
-      <w:r>
-        <w:t xml:space="preserve"> </w:t>
-      </w:r>
-      <w:r>
-        <w:rPr>
-          <w:rStyle w:val="VerbatimChar"/>
-        </w:rPr>
-        <w:t xml:space="preserve">ne_run_frame (h, draw)</w:t>
-      </w:r>
-      <w:r>
-        <w:t xml:space="preserve">,</w:t>
-      </w:r>
-      <w:r>
-        <w:t xml:space="preserve"> </w:t>
-      </w:r>
-      <w:r>
-        <w:rPr>
-          <w:rStyle w:val="VerbatimChar"/>
-        </w:rPr>
-        <w:t xml:space="preserve">ne_audio</w:t>
-      </w:r>
-      <w:r>
-        <w:t xml:space="preserve">,</w:t>
-      </w:r>
-      <w:r>
-        <w:t xml:space="preserve"> </w:t>
-      </w:r>
-      <w:r>
-        <w:rPr>
-          <w:rStyle w:val="VerbatimChar"/>
-        </w:rPr>
-        <w:t xml:space="preserve">ne_video</w:t>
-      </w:r>
-      <w:r>
-        <w:t xml:space="preserve"> </w:t>
-      </w:r>
-      <w:r>
-        <w:t xml:space="preserve">(the last picture, double-buffered</w:t>
-      </w:r>
-      <w:r>
-        <w:t xml:space="preserve"> </w:t>
-      </w:r>
-      <w:r>
-        <w:t xml:space="preserve">under a lock: the game runs on its own thread),</w:t>
-      </w:r>
-      <w:r>
-        <w:t xml:space="preserve"> </w:t>
-      </w:r>
-      <w:r>
-        <w:rPr>
-          <w:rStyle w:val="VerbatimChar"/>
-        </w:rPr>
-        <w:t xml:space="preserve">ne_thumb</w:t>
-      </w:r>
-      <w:r>
-        <w:t xml:space="preserve"> </w:t>
-      </w:r>
-      <w:r>
-        <w:t xml:space="preserve">(the library's picture),</w:t>
-      </w:r>
-      <w:r>
-        <w:t xml:space="preserve"> </w:t>
-      </w:r>
-      <w:r>
-        <w:rPr>
-          <w:rStyle w:val="VerbatimChar"/>
-        </w:rPr>
-        <w:t xml:space="preserve">ne_save</w:t>
-      </w:r>
-      <w:r>
-        <w:t xml:space="preserve"> </w:t>
-      </w:r>
-      <w:r>
-        <w:t xml:space="preserve">(</w:t>
-      </w:r>
-      <w:r>
-        <w:rPr>
-          <w:rStyle w:val="VerbatimChar"/>
-        </w:rPr>
-        <w:t xml:space="preserve">&lt;rom&gt;.sav</w:t>
-      </w:r>
-      <w:r>
-        <w:t xml:space="preserve">, as on Onyx; a GameCube's is its</w:t>
-      </w:r>
-      <w:r>
-        <w:t xml:space="preserve"> </w:t>
-      </w:r>
-      <w:r>
-        <w:rPr>
-          <w:b/>
-          <w:bCs/>
-        </w:rPr>
-        <w:t xml:space="preserve">memory card</w:t>
-      </w:r>
-      <w:r>
-        <w:t xml:space="preserve"> </w:t>
-      </w:r>
-      <w:r>
-        <w:t xml:space="preserve">in slot A, a 2 MB raw image —</w:t>
-      </w:r>
-      <w:r>
-        <w:t xml:space="preserve"> </w:t>
-      </w:r>
-      <w:r>
-        <w:t xml:space="preserve">Dolphin's</w:t>
-      </w:r>
-      <w:r>
-        <w:t xml:space="preserve"> </w:t>
-      </w:r>
-      <w:r>
-        <w:rPr>
-          <w:rStyle w:val="VerbatimChar"/>
-        </w:rPr>
-        <w:t xml:space="preserve">.raw</w:t>
-      </w:r>
-      <w:r>
-        <w:t xml:space="preserve"> </w:t>
-      </w:r>
-      <w:r>
-        <w:t xml:space="preserve">sizes accepted — inserted before the boot and written when</w:t>
-      </w:r>
-      <w:r>
-        <w:t xml:space="preserve"> </w:t>
-      </w:r>
-      <w:r>
-        <w:rPr>
-          <w:rStyle w:val="VerbatimChar"/>
-        </w:rPr>
-        <w:t xml:space="preserve">card[0].dirty</w:t>
-      </w:r>
-      <w:r>
-        <w:t xml:space="preserve">),</w:t>
-      </w:r>
-      <w:r>
-        <w:t xml:space="preserve"> </w:t>
-      </w:r>
-      <w:r>
-        <w:t xml:space="preserve">waveOut (</w:t>
-      </w:r>
-      <w:r>
-        <w:rPr>
-          <w:rStyle w:val="VerbatimChar"/>
-        </w:rPr>
-        <w:t xml:space="preserve">ne_audio_*</w:t>
-      </w:r>
-      <w:r>
-        <w:t xml:space="preserve">; the GameCube's sound through</w:t>
-      </w:r>
-      <w:r>
-        <w:t xml:space="preserve"> </w:t>
-      </w:r>
-      <w:r>
-        <w:rPr>
-          <w:rStyle w:val="VerbatimChar"/>
-        </w:rPr>
-        <w:t xml:space="preserve">Machine::audioRead</w:t>
-      </w:r>
-      <w:r>
-        <w:t xml:space="preserve">). The N64</w:t>
-      </w:r>
-      <w:r>
-        <w:t xml:space="preserve"> </w:t>
-      </w:r>
-      <w:r>
-        <w:rPr>
-          <w:rStyle w:val="VerbatimChar"/>
-        </w:rPr>
-        <w:t xml:space="preserve">GFrame</w:t>
-      </w:r>
-      <w:r>
-        <w:t xml:space="preserve">s go to</w:t>
-      </w:r>
-      <w:r>
-        <w:t xml:space="preserve"> </w:t>
-      </w:r>
-      <w:r>
-        <w:rPr>
-          <w:b/>
-          <w:bCs/>
-        </w:rPr>
-        <w:t xml:space="preserve">OpenGL</w:t>
-      </w:r>
-      <w:r>
-        <w:t xml:space="preserve"> </w:t>
-      </w:r>
-      <w:r>
-        <w:t xml:space="preserve">(</w:t>
-      </w:r>
-      <w:r>
-        <w:rPr>
-          <w:rStyle w:val="VerbatimChar"/>
-        </w:rPr>
-        <w:t xml:space="preserve">ne_gl_attach (h, hwnd)</w:t>
-      </w:r>
-      <w:r>
-        <w:t xml:space="preserve"> </w:t>
-      </w:r>
-      <w:r>
-        <w:t xml:space="preserve">from the game's thread: a WGL context on the picture</w:t>
-      </w:r>
-      <w:r>
-        <w:t xml:space="preserve"> </w:t>
-      </w:r>
-      <w:r>
-        <w:t xml:space="preserve">control, GLSL 1.20 — colour = texel × colour + colour2, alpha test, the batch's matrix, blending</w:t>
-      </w:r>
-      <w:r>
-        <w:t xml:space="preserve"> </w:t>
-      </w:r>
-      <w:r>
-        <w:t xml:space="preserve">/ depth / cull / wrap from the flags, as</w:t>
-      </w:r>
-      <w:r>
-        <w:t xml:space="preserve"> </w:t>
-      </w:r>
-      <w:r>
-        <w:rPr>
-          <w:rStyle w:val="VerbatimChar"/>
-        </w:rPr>
-        <w:t xml:space="preserve">kapi_gpu_render</w:t>
-      </w:r>
-      <w:r>
-        <w:t xml:space="preserve">; the machine's dirty textures uploaded;</w:t>
-      </w:r>
-      <w:r>
-        <w:t xml:space="preserve"> </w:t>
-      </w:r>
-      <w:r>
-        <w:t xml:space="preserve">a CPU-drawn framebuffer as a textured quad), else</w:t>
-      </w:r>
-      <w:r>
-        <w:t xml:space="preserve"> </w:t>
-      </w:r>
-      <w:r>
-        <w:rPr>
-          <w:rStyle w:val="VerbatimChar"/>
-        </w:rPr>
-        <w:t xml:space="preserve">bas::swTriangles</w:t>
-      </w:r>
-      <w:r>
-        <w:t xml:space="preserve"> </w:t>
-      </w:r>
-      <w:r>
-        <w:t xml:space="preserve">+</w:t>
-      </w:r>
-      <w:r>
-        <w:t xml:space="preserve"> </w:t>
-      </w:r>
-      <w:r>
-        <w:rPr>
-          <w:rStyle w:val="VerbatimChar"/>
-        </w:rPr>
-        <w:t xml:space="preserve">g3raster</w:t>
-      </w:r>
-      <w:r>
-        <w:t xml:space="preserve"> </w:t>
-      </w:r>
-      <w:r>
-        <w:t xml:space="preserve">in bands of 16</w:t>
-      </w:r>
-      <w:r>
-        <w:t xml:space="preserve"> </w:t>
-      </w:r>
-      <w:r>
-        <w:t xml:space="preserve">rows on every core (</w:t>
-      </w:r>
-      <w:r>
-        <w:rPr>
-          <w:rStyle w:val="VerbatimChar"/>
-        </w:rPr>
-        <w:t xml:space="preserve">user/basic/bas3d.h</w:t>
-      </w:r>
-      <w:r>
-        <w:t xml:space="preserve">) at</w:t>
-      </w:r>
-      <w:r>
-        <w:t xml:space="preserve"> </w:t>
-      </w:r>
-      <w:r>
-        <w:rPr>
-          <w:rStyle w:val="VerbatimChar"/>
-        </w:rPr>
-        <w:t xml:space="preserve">ne_set_scale</w:t>
-      </w:r>
-      <w:r>
-        <w:t xml:space="preserve"> </w:t>
-      </w:r>
-      <w:r>
-        <w:t xml:space="preserve">× their size. A GameCube game with</w:t>
-      </w:r>
-      <w:r>
-        <w:t xml:space="preserve"> </w:t>
-      </w:r>
-      <w:r>
-        <w:t xml:space="preserve">OpenGL 3.3 gets</w:t>
-      </w:r>
-      <w:r>
-        <w:t xml:space="preserve"> </w:t>
-      </w:r>
-      <w:r>
-        <w:rPr>
-          <w:rStyle w:val="VerbatimChar"/>
-          <w:b/>
-          <w:bCs/>
-        </w:rPr>
-        <w:t xml:space="preserve">core/gxgl.cpp</w:t>
-      </w:r>
-      <w:r>
-        <w:t xml:space="preserve"> </w:t>
-      </w:r>
-      <w:r>
-        <w:t xml:space="preserve">as its</w:t>
-      </w:r>
-      <w:r>
-        <w:t xml:space="preserve"> </w:t>
-      </w:r>
-      <w:r>
-        <w:rPr>
-          <w:rStyle w:val="VerbatimChar"/>
-        </w:rPr>
-        <w:t xml:space="preserve">Machine::gpu</w:t>
-      </w:r>
-      <w:r>
-        <w:t xml:space="preserve"> </w:t>
-      </w:r>
-      <w:r>
-        <w:t xml:space="preserve">(the GX's real pipeline on the GPU):</w:t>
-      </w:r>
-      <w:r>
-        <w:t xml:space="preserve"> </w:t>
-      </w:r>
-      <w:r>
-        <w:t xml:space="preserve">the EFB is a framebuffer (RGBA8 + depth 24,</w:t>
-      </w:r>
-      <w:r>
-        <w:t xml:space="preserve"> </w:t>
-      </w:r>
-      <w:r>
-        <w:rPr>
-          <w:rStyle w:val="VerbatimChar"/>
-        </w:rPr>
-        <w:t xml:space="preserve">ne_set_scale</w:t>
-      </w:r>
-      <w:r>
-        <w:t xml:space="preserve"> </w:t>
-      </w:r>
-      <w:r>
-        <w:t xml:space="preserve">× 640 × 528, its rows the EFB's); a</w:t>
-      </w:r>
-      <w:r>
-        <w:t xml:space="preserve"> </w:t>
-      </w:r>
-      <w:r>
-        <w:t xml:space="preserve">draw's vertices, the XF memory and the</w:t>
-      </w:r>
-      <w:r>
-        <w:t xml:space="preserve"> </w:t>
-      </w:r>
-      <w:r>
-        <w:rPr>
-          <w:rStyle w:val="VerbatimChar"/>
-        </w:rPr>
-        <w:t xml:space="preserve">GxState</w:t>
-      </w:r>
-      <w:r>
-        <w:t xml:space="preserve"> </w:t>
-      </w:r>
-      <w:r>
-        <w:t xml:space="preserve">go to three ring buffers (persistently mapped,</w:t>
-      </w:r>
-      <w:r>
-        <w:t xml:space="preserve"> </w:t>
-      </w:r>
-      <w:r>
-        <w:t xml:space="preserve">their quarters fenced; else unsynchronized maps) and two uniform blocks; the vertex shader</w:t>
-      </w:r>
-      <w:r>
-        <w:t xml:space="preserve"> </w:t>
-      </w:r>
-      <w:r>
-        <w:t xml:space="preserve">transforms, lights (the two channels, 8 lights: spot / specular attenuation, diffuse functions)</w:t>
-      </w:r>
-      <w:r>
-        <w:t xml:space="preserve"> </w:t>
-      </w:r>
-      <w:r>
-        <w:t xml:space="preserve">and makes the texture coordinates (texgens, dual texture); the fragment shader is the TEV in</w:t>
-      </w:r>
-      <w:r>
-        <w:t xml:space="preserve"> </w:t>
-      </w:r>
-      <w:r>
-        <w:t xml:space="preserve">integers as the hardware (the lerp with c + c &gt;&gt; 7, the scale inside it, compare modes, swap</w:t>
-      </w:r>
-      <w:r>
-        <w:t xml:space="preserve"> </w:t>
-      </w:r>
-      <w:r>
-        <w:t xml:space="preserve">tables, konst colours, the last stage into PREV, &amp; 255), indirect texturing (matrices, wraps,</w:t>
-      </w:r>
-      <w:r>
-        <w:t xml:space="preserve"> </w:t>
-      </w:r>
-      <w:r>
-        <w:t xml:space="preserve">bump alpha), the alpha test, the z texture, the fog (with its range adjustment), RGBA6 / RGB565</w:t>
-      </w:r>
-      <w:r>
-        <w:t xml:space="preserve"> </w:t>
-      </w:r>
-      <w:r>
-        <w:t xml:space="preserve">EFB formats, the destination alpha (dual-source blending); GX blending / logic ops / depth /</w:t>
-      </w:r>
-      <w:r>
-        <w:t xml:space="preserve"> </w:t>
-      </w:r>
-      <w:r>
-        <w:t xml:space="preserve">culling / scissor are GL state. Each TEV configuration gets a</w:t>
-      </w:r>
-      <w:r>
-        <w:t xml:space="preserve"> </w:t>
-      </w:r>
-      <w:r>
-        <w:rPr>
-          <w:b/>
-          <w:bCs/>
-        </w:rPr>
-        <w:t xml:space="preserve">specialized program</w:t>
-      </w:r>
-      <w:r>
-        <w:t xml:space="preserve"> </w:t>
-      </w:r>
-      <w:r>
-        <w:t xml:space="preserve">(the</w:t>
-      </w:r>
-      <w:r>
-        <w:t xml:space="preserve"> </w:t>
-      </w:r>
-      <w:r>
-        <w:t xml:space="preserve">ubershader's code with the stages unrolled and the state's choices as constants — ~1.6× faster</w:t>
-      </w:r>
-      <w:r>
-        <w:t xml:space="preserve"> </w:t>
-      </w:r>
-      <w:r>
-        <w:t xml:space="preserve">on an integrated GPU), compiled by the driver's threads when it has</w:t>
-      </w:r>
-      <w:r>
-        <w:t xml:space="preserve"> </w:t>
-      </w:r>
-      <w:r>
-        <w:rPr>
-          <w:rStyle w:val="VerbatimChar"/>
-        </w:rPr>
-        <w:t xml:space="preserve">KHR_parallel_shader_compile</w:t>
-      </w:r>
-      <w:r>
-        <w:t xml:space="preserve"> </w:t>
-      </w:r>
-      <w:r>
-        <w:t xml:space="preserve">(the ubershader meanwhile), else at once (the driver caches them on disk: a pause only the first</w:t>
-      </w:r>
-      <w:r>
-        <w:t xml:space="preserve"> </w:t>
-      </w:r>
-      <w:r>
-        <w:t xml:space="preserve">time a configuration is seen). Consecutive draws of one state are one draw call; textures are</w:t>
-      </w:r>
-      <w:r>
-        <w:t xml:space="preserve"> </w:t>
-      </w:r>
-      <w:r>
-        <w:t xml:space="preserve">uploaded with their mipmaps, sampled through cached sampler objects. An EFB copy to a texture</w:t>
-      </w:r>
-      <w:r>
-        <w:t xml:space="preserve"> </w:t>
-      </w:r>
-      <w:r>
-        <w:t xml:space="preserve">renders the rectangle into a texture of ours converted as the texture decoder would read it</w:t>
-      </w:r>
-      <w:r>
-        <w:t xml:space="preserve"> </w:t>
-      </w:r>
-      <w:r>
-        <w:t xml:space="preserve">(intensity Y = 0.257 R + 0.504 G + 0.098 B + 16, RGB565, RGB5A3, the depth's bytes for Z</w:t>
-      </w:r>
-      <w:r>
-        <w:t xml:space="preserve"> </w:t>
-      </w:r>
-      <w:r>
-        <w:t xml:space="preserve">formats), box-filtered when halved; a copy to the XFB is the picture, presented into the window</w:t>
-      </w:r>
-      <w:r>
-        <w:t xml:space="preserve"> </w:t>
-      </w:r>
-      <w:r>
-        <w:t xml:space="preserve">(</w:t>
-      </w:r>
-      <w:r>
-        <w:rPr>
-          <w:rStyle w:val="VerbatimChar"/>
-        </w:rPr>
-        <w:t xml:space="preserve">gxgl_present</w:t>
+        <w:t xml:space="preserve">KAPI_WIN_KEYS</w:t>
       </w:r>
       <w:r>
         <w:t xml:space="preserve">).</w:t>
-      </w:r>
-      <w:r>
-        <w:t xml:space="preserve"> </w:t>
-      </w:r>
-      <w:r>
-        <w:rPr>
-          <w:rStyle w:val="VerbatimChar"/>
-        </w:rPr>
-        <w:t xml:space="preserve">NEMU_GX_UBER=1</w:t>
-      </w:r>
-      <w:r>
-        <w:t xml:space="preserve"> </w:t>
-      </w:r>
-      <w:r>
-        <w:t xml:space="preserve">forces the ubershader,</w:t>
-      </w:r>
-      <w:r>
-        <w:t xml:space="preserve"> </w:t>
-      </w:r>
-      <w:r>
-        <w:rPr>
-          <w:rStyle w:val="VerbatimChar"/>
-        </w:rPr>
-        <w:t xml:space="preserve">NEMU_GX_SYNC=1</w:t>
-      </w:r>
-      <w:r>
-        <w:t xml:space="preserve"> </w:t>
-      </w:r>
-      <w:r>
-        <w:t xml:space="preserve">compiles at once,</w:t>
-      </w:r>
-      <w:r>
-        <w:t xml:space="preserve"> </w:t>
-      </w:r>
-      <w:r>
-        <w:rPr>
-          <w:rStyle w:val="VerbatimChar"/>
-        </w:rPr>
-        <w:t xml:space="preserve">NEMU_GX_DUMP=&lt;prefix&gt;</w:t>
-      </w:r>
-      <w:r>
-        <w:t xml:space="preserve"> </w:t>
-      </w:r>
-      <w:r>
-        <w:t xml:space="preserve">writes the GPU's picture every 250 fields (+ what GL is). Pads: XInput, else</w:t>
-      </w:r>
-      <w:r>
-        <w:t xml:space="preserve"> </w:t>
-      </w:r>
-      <w:r>
-        <w:t xml:space="preserve">the first Windows joystick (winmm</w:t>
-      </w:r>
-      <w:r>
-        <w:t xml:space="preserve"> </w:t>
-      </w:r>
-      <w:r>
-        <w:rPr>
-          <w:rStyle w:val="VerbatimChar"/>
-        </w:rPr>
-        <w:t xml:space="preserve">joyGetPosEx</w:t>
-      </w:r>
-      <w:r>
-        <w:t xml:space="preserve">) through</w:t>
-      </w:r>
-      <w:r>
-        <w:t xml:space="preserve"> </w:t>
-      </w:r>
-      <w:r>
-        <w:rPr>
-          <w:rStyle w:val="VerbatimChar"/>
-        </w:rPr>
-        <w:t xml:space="preserve">ne_pad_map</w:t>
-      </w:r>
-      <w:r>
-        <w:t xml:space="preserve"> </w:t>
-      </w:r>
-      <w:r>
-        <w:t xml:space="preserve">(PAD_* bit → button / axis</w:t>
-      </w:r>
-      <w:r>
-        <w:t xml:space="preserve"> </w:t>
-      </w:r>
-      <w:r>
-        <w:t xml:space="preserve">end / hat direction;</w:t>
-      </w:r>
-      <w:r>
-        <w:t xml:space="preserve"> </w:t>
-      </w:r>
-      <w:r>
-        <w:rPr>
-          <w:rStyle w:val="VerbatimChar"/>
-        </w:rPr>
-        <w:t xml:space="preserve">PadDialog.cs</w:t>
-      </w:r>
-      <w:r>
-        <w:t xml:space="preserve">).</w:t>
-      </w:r>
-      <w:r>
-        <w:t xml:space="preserve"> </w:t>
-      </w:r>
-      <w:r>
-        <w:rPr>
-          <w:rStyle w:val="VerbatimChar"/>
-        </w:rPr>
-        <w:t xml:space="preserve">NintendoEMU.exe</w:t>
-      </w:r>
-      <w:r>
-        <w:t xml:space="preserve"> </w:t>
-      </w:r>
-      <w:r>
-        <w:t xml:space="preserve">(.NET</w:t>
-      </w:r>
-      <w:r>
-        <w:t xml:space="preserve"> </w:t>
-      </w:r>
-      <w:r>
-        <w:t xml:space="preserve">4.8 WinForms):</w:t>
-      </w:r>
-      <w:r>
-        <w:t xml:space="preserve"> </w:t>
-      </w:r>
-      <w:r>
-        <w:rPr>
-          <w:rStyle w:val="VerbatimChar"/>
-        </w:rPr>
-        <w:t xml:space="preserve">MainForm</w:t>
-      </w:r>
-      <w:r>
-        <w:t xml:space="preserve"> </w:t>
-      </w:r>
-      <w:r>
-        <w:t xml:space="preserve">(the library,</w:t>
-      </w:r>
-      <w:r>
-        <w:t xml:space="preserve"> </w:t>
-      </w:r>
-      <w:r>
-        <w:rPr>
-          <w:rStyle w:val="VerbatimChar"/>
-        </w:rPr>
-        <w:t xml:space="preserve">library.txt</w:t>
-      </w:r>
-      <w:r>
-        <w:t xml:space="preserve">, the pictures made by a worker thread),</w:t>
-      </w:r>
-      <w:r>
-        <w:t xml:space="preserve"> </w:t>
-      </w:r>
-      <w:r>
-        <w:rPr>
-          <w:rStyle w:val="VerbatimChar"/>
-        </w:rPr>
-        <w:t xml:space="preserve">GameForm</w:t>
-      </w:r>
-      <w:r>
-        <w:t xml:space="preserve"> </w:t>
-      </w:r>
-      <w:r>
-        <w:t xml:space="preserve">(the game thread: paced by the sound queue — ~70 ms — when the game makes sound,</w:t>
-      </w:r>
-      <w:r>
-        <w:t xml:space="preserve"> </w:t>
-      </w:r>
-      <w:r>
-        <w:t xml:space="preserve">else by the clock, a picture skipped to catch up; the window draws with</w:t>
-      </w:r>
-      <w:r>
-        <w:t xml:space="preserve"> </w:t>
-      </w:r>
-      <w:r>
-        <w:rPr>
-          <w:rStyle w:val="VerbatimChar"/>
-        </w:rPr>
-        <w:t xml:space="preserve">StretchDIBits</w:t>
-      </w:r>
-      <w:r>
-        <w:t xml:space="preserve">).</w:t>
-      </w:r>
-      <w:r>
-        <w:t xml:space="preserve"> </w:t>
-      </w:r>
-      <w:r>
-        <w:t xml:space="preserve">View ▸ 3D Renderer ▸</w:t>
-      </w:r>
-      <w:r>
-        <w:t xml:space="preserve"> </w:t>
-      </w:r>
-      <w:r>
-        <w:rPr>
-          <w:i/>
-          <w:iCs/>
-        </w:rPr>
-        <w:t xml:space="preserve">Use the High-Performance Graphics Card</w:t>
-      </w:r>
-      <w:r>
-        <w:t xml:space="preserve"> </w:t>
-      </w:r>
-      <w:r>
-        <w:t xml:space="preserve">(</w:t>
-      </w:r>
-      <w:r>
-        <w:rPr>
-          <w:rStyle w:val="VerbatimChar"/>
-        </w:rPr>
-        <w:t xml:space="preserve">GpuPreference</w:t>
-      </w:r>
-      <w:r>
-        <w:t xml:space="preserve"> </w:t>
-      </w:r>
-      <w:r>
-        <w:t xml:space="preserve">in</w:t>
-      </w:r>
-      <w:r>
-        <w:t xml:space="preserve"> </w:t>
-      </w:r>
-      <w:r>
-        <w:rPr>
-          <w:rStyle w:val="VerbatimChar"/>
-        </w:rPr>
-        <w:t xml:space="preserve">GameForm.cs</w:t>
-      </w:r>
-      <w:r>
-        <w:t xml:space="preserve">) writes Windows' own per-application choice (</w:t>
-      </w:r>
-      <w:r>
-        <w:rPr>
-          <w:rStyle w:val="VerbatimChar"/>
-        </w:rPr>
-        <w:t xml:space="preserve">HKCU\Software\Microsoft\DirectX\ UserGpuPreferences</w:t>
-      </w:r>
-      <w:r>
-        <w:t xml:space="preserve">, what Settings ▸ Display ▸ Graphics writes) for a laptop with two graphics</w:t>
-      </w:r>
-      <w:r>
-        <w:t xml:space="preserve"> </w:t>
-      </w:r>
-      <w:r>
-        <w:t xml:space="preserve">cards: a .NET program cannot export</w:t>
-      </w:r>
-      <w:r>
-        <w:t xml:space="preserve"> </w:t>
-      </w:r>
-      <w:r>
-        <w:rPr>
-          <w:rStyle w:val="VerbatimChar"/>
-        </w:rPr>
-        <w:t xml:space="preserve">NvOptimusEnablement</w:t>
-      </w:r>
-      <w:r>
-        <w:t xml:space="preserve">.</w:t>
-      </w:r>
-      <w:r>
-        <w:t xml:space="preserve"> </w:t>
-      </w:r>
-      <w:r>
-        <w:t xml:space="preserve">Test:</w:t>
-      </w:r>
-      <w:r>
-        <w:t xml:space="preserve"> </w:t>
-      </w:r>
-      <w:r>
-        <w:rPr>
-          <w:rStyle w:val="VerbatimChar"/>
-        </w:rPr>
-        <w:t xml:space="preserve">sh tools/tests/run_nemu_test.sh</w:t>
-      </w:r>
-      <w:r>
-        <w:t xml:space="preserve"> </w:t>
-      </w:r>
-      <w:r>
-        <w:t xml:space="preserve">(the C API on Linux: each core a few frames, a picture,</w:t>
-      </w:r>
-      <w:r>
-        <w:t xml:space="preserve"> </w:t>
-      </w:r>
-      <w:r>
-        <w:t xml:space="preserve">the library pictures;</w:t>
-      </w:r>
-      <w:r>
-        <w:t xml:space="preserve"> </w:t>
-      </w:r>
-      <w:r>
-        <w:rPr>
-          <w:rStyle w:val="VerbatimChar"/>
-        </w:rPr>
-        <w:t xml:space="preserve">NEMU_ROMS=&lt;folder&gt;</w:t>
-      </w:r>
-      <w:r>
-        <w:t xml:space="preserve"> </w:t>
-      </w:r>
-      <w:r>
-        <w:t xml:space="preserve">of ROMs).</w:t>
       </w:r>
     </w:p>
     <w:p>
@@ -67319,6 +67272,998 @@
           <w:b/>
           <w:bCs/>
         </w:rPr>
+        <w:t xml:space="preserve">NintendoEMU</w:t>
+      </w:r>
+      <w:r>
+        <w:t xml:space="preserve"> </w:t>
+      </w:r>
+      <w:r>
+        <w:t xml:space="preserve">(</w:t>
+      </w:r>
+      <w:r>
+        <w:rPr>
+          <w:rStyle w:val="VerbatimChar"/>
+        </w:rPr>
+        <w:t xml:space="preserve">pc/NintendoEMU</w:t>
+      </w:r>
+      <w:r>
+        <w:t xml:space="preserve">):</w:t>
+      </w:r>
+      <w:r>
+        <w:t xml:space="preserve"> </w:t>
+      </w:r>
+      <w:r>
+        <w:rPr>
+          <w:rStyle w:val="VerbatimChar"/>
+        </w:rPr>
+        <w:t xml:space="preserve">nemucore.dll</w:t>
+      </w:r>
+      <w:r>
+        <w:t xml:space="preserve"> </w:t>
+      </w:r>
+      <w:r>
+        <w:t xml:space="preserve">(</w:t>
+      </w:r>
+      <w:r>
+        <w:rPr>
+          <w:rStyle w:val="VerbatimChar"/>
+        </w:rPr>
+        <w:t xml:space="preserve">core/nemucore.cpp</w:t>
+      </w:r>
+      <w:r>
+        <w:t xml:space="preserve">, mingw-w64) builds the</w:t>
+      </w:r>
+      <w:r>
+        <w:t xml:space="preserve"> </w:t>
+      </w:r>
+      <w:r>
+        <w:t xml:space="preserve">emulator cores</w:t>
+      </w:r>
+      <w:r>
+        <w:t xml:space="preserve"> </w:t>
+      </w:r>
+      <w:r>
+        <w:rPr>
+          <w:b/>
+          <w:bCs/>
+        </w:rPr>
+        <w:t xml:space="preserve">unchanged</w:t>
+      </w:r>
+      <w:r>
+        <w:t xml:space="preserve"> </w:t>
+      </w:r>
+      <w:r>
+        <w:t xml:space="preserve">(</w:t>
+      </w:r>
+      <w:r>
+        <w:rPr>
+          <w:rStyle w:val="VerbatimChar"/>
+        </w:rPr>
+        <w:t xml:space="preserve">user/gb</w:t>
+      </w:r>
+      <w:r>
+        <w:t xml:space="preserve">,</w:t>
+      </w:r>
+      <w:r>
+        <w:t xml:space="preserve"> </w:t>
+      </w:r>
+      <w:r>
+        <w:rPr>
+          <w:rStyle w:val="VerbatimChar"/>
+        </w:rPr>
+        <w:t xml:space="preserve">gba</w:t>
+      </w:r>
+      <w:r>
+        <w:t xml:space="preserve">,</w:t>
+      </w:r>
+      <w:r>
+        <w:t xml:space="preserve"> </w:t>
+      </w:r>
+      <w:r>
+        <w:rPr>
+          <w:rStyle w:val="VerbatimChar"/>
+        </w:rPr>
+        <w:t xml:space="preserve">nes</w:t>
+      </w:r>
+      <w:r>
+        <w:t xml:space="preserve">,</w:t>
+      </w:r>
+      <w:r>
+        <w:t xml:space="preserve"> </w:t>
+      </w:r>
+      <w:r>
+        <w:rPr>
+          <w:rStyle w:val="VerbatimChar"/>
+        </w:rPr>
+        <w:t xml:space="preserve">snes</w:t>
+      </w:r>
+      <w:r>
+        <w:t xml:space="preserve">,</w:t>
+      </w:r>
+      <w:r>
+        <w:t xml:space="preserve"> </w:t>
+      </w:r>
+      <w:r>
+        <w:rPr>
+          <w:rStyle w:val="VerbatimChar"/>
+        </w:rPr>
+        <w:t xml:space="preserve">n64</w:t>
+      </w:r>
+      <w:r>
+        <w:t xml:space="preserve">,</w:t>
+      </w:r>
+      <w:r>
+        <w:t xml:space="preserve"> </w:t>
+      </w:r>
+      <w:r>
+        <w:rPr>
+          <w:rStyle w:val="VerbatimChar"/>
+        </w:rPr>
+        <w:t xml:space="preserve">gc</w:t>
+      </w:r>
+      <w:r>
+        <w:t xml:space="preserve">) behind a C API —</w:t>
+      </w:r>
+      <w:r>
+        <w:t xml:space="preserve"> </w:t>
+      </w:r>
+      <w:r>
+        <w:rPr>
+          <w:rStyle w:val="VerbatimChar"/>
+        </w:rPr>
+        <w:t xml:space="preserve">ne_open</w:t>
+      </w:r>
+      <w:r>
+        <w:t xml:space="preserve"> </w:t>
+      </w:r>
+      <w:r>
+        <w:t xml:space="preserve">(the system from the extension; a GameCube disc read on demand through</w:t>
+      </w:r>
+      <w:r>
+        <w:t xml:space="preserve"> </w:t>
+      </w:r>
+      <w:r>
+        <w:rPr>
+          <w:rStyle w:val="VerbatimChar"/>
+        </w:rPr>
+        <w:t xml:space="preserve">discRead</w:t>
+      </w:r>
+      <w:r>
+        <w:t xml:space="preserve">),</w:t>
+      </w:r>
+      <w:r>
+        <w:t xml:space="preserve"> </w:t>
+      </w:r>
+      <w:r>
+        <w:rPr>
+          <w:rStyle w:val="VerbatimChar"/>
+        </w:rPr>
+        <w:t xml:space="preserve">ne_set_keys</w:t>
+      </w:r>
+      <w:r>
+        <w:t xml:space="preserve"> </w:t>
+      </w:r>
+      <w:r>
+        <w:t xml:space="preserve">(the Windows key states) + XInput pad 0, mapped per system exactly as the Onyx</w:t>
+      </w:r>
+      <w:r>
+        <w:t xml:space="preserve"> </w:t>
+      </w:r>
+      <w:r>
+        <w:t xml:space="preserve">apps do,</w:t>
+      </w:r>
+      <w:r>
+        <w:t xml:space="preserve"> </w:t>
+      </w:r>
+      <w:r>
+        <w:rPr>
+          <w:rStyle w:val="VerbatimChar"/>
+        </w:rPr>
+        <w:t xml:space="preserve">ne_run_frame (h, draw)</w:t>
+      </w:r>
+      <w:r>
+        <w:t xml:space="preserve">,</w:t>
+      </w:r>
+      <w:r>
+        <w:t xml:space="preserve"> </w:t>
+      </w:r>
+      <w:r>
+        <w:rPr>
+          <w:rStyle w:val="VerbatimChar"/>
+        </w:rPr>
+        <w:t xml:space="preserve">ne_audio</w:t>
+      </w:r>
+      <w:r>
+        <w:t xml:space="preserve">,</w:t>
+      </w:r>
+      <w:r>
+        <w:t xml:space="preserve"> </w:t>
+      </w:r>
+      <w:r>
+        <w:rPr>
+          <w:rStyle w:val="VerbatimChar"/>
+        </w:rPr>
+        <w:t xml:space="preserve">ne_video</w:t>
+      </w:r>
+      <w:r>
+        <w:t xml:space="preserve"> </w:t>
+      </w:r>
+      <w:r>
+        <w:t xml:space="preserve">(the last picture, double-buffered</w:t>
+      </w:r>
+      <w:r>
+        <w:t xml:space="preserve"> </w:t>
+      </w:r>
+      <w:r>
+        <w:t xml:space="preserve">under a lock: the game runs on its own thread),</w:t>
+      </w:r>
+      <w:r>
+        <w:t xml:space="preserve"> </w:t>
+      </w:r>
+      <w:r>
+        <w:rPr>
+          <w:rStyle w:val="VerbatimChar"/>
+        </w:rPr>
+        <w:t xml:space="preserve">ne_thumb</w:t>
+      </w:r>
+      <w:r>
+        <w:t xml:space="preserve"> </w:t>
+      </w:r>
+      <w:r>
+        <w:t xml:space="preserve">(the library's picture),</w:t>
+      </w:r>
+      <w:r>
+        <w:t xml:space="preserve"> </w:t>
+      </w:r>
+      <w:r>
+        <w:rPr>
+          <w:rStyle w:val="VerbatimChar"/>
+        </w:rPr>
+        <w:t xml:space="preserve">ne_save</w:t>
+      </w:r>
+      <w:r>
+        <w:t xml:space="preserve"> </w:t>
+      </w:r>
+      <w:r>
+        <w:t xml:space="preserve">(</w:t>
+      </w:r>
+      <w:r>
+        <w:rPr>
+          <w:rStyle w:val="VerbatimChar"/>
+        </w:rPr>
+        <w:t xml:space="preserve">&lt;rom&gt;.sav</w:t>
+      </w:r>
+      <w:r>
+        <w:t xml:space="preserve">, as on Onyx; a GameCube's is its</w:t>
+      </w:r>
+      <w:r>
+        <w:t xml:space="preserve"> </w:t>
+      </w:r>
+      <w:r>
+        <w:rPr>
+          <w:b/>
+          <w:bCs/>
+        </w:rPr>
+        <w:t xml:space="preserve">memory card</w:t>
+      </w:r>
+      <w:r>
+        <w:t xml:space="preserve"> </w:t>
+      </w:r>
+      <w:r>
+        <w:t xml:space="preserve">in slot A, a 2 MB raw image —</w:t>
+      </w:r>
+      <w:r>
+        <w:t xml:space="preserve"> </w:t>
+      </w:r>
+      <w:r>
+        <w:t xml:space="preserve">Dolphin's</w:t>
+      </w:r>
+      <w:r>
+        <w:t xml:space="preserve"> </w:t>
+      </w:r>
+      <w:r>
+        <w:rPr>
+          <w:rStyle w:val="VerbatimChar"/>
+        </w:rPr>
+        <w:t xml:space="preserve">.raw</w:t>
+      </w:r>
+      <w:r>
+        <w:t xml:space="preserve"> </w:t>
+      </w:r>
+      <w:r>
+        <w:t xml:space="preserve">sizes accepted — inserted before the boot and written when</w:t>
+      </w:r>
+      <w:r>
+        <w:t xml:space="preserve"> </w:t>
+      </w:r>
+      <w:r>
+        <w:rPr>
+          <w:rStyle w:val="VerbatimChar"/>
+        </w:rPr>
+        <w:t xml:space="preserve">card[0].dirty</w:t>
+      </w:r>
+      <w:r>
+        <w:t xml:space="preserve">),</w:t>
+      </w:r>
+      <w:r>
+        <w:t xml:space="preserve"> </w:t>
+      </w:r>
+      <w:r>
+        <w:t xml:space="preserve">waveOut (</w:t>
+      </w:r>
+      <w:r>
+        <w:rPr>
+          <w:rStyle w:val="VerbatimChar"/>
+        </w:rPr>
+        <w:t xml:space="preserve">ne_audio_*</w:t>
+      </w:r>
+      <w:r>
+        <w:t xml:space="preserve">; the GameCube's sound through</w:t>
+      </w:r>
+      <w:r>
+        <w:t xml:space="preserve"> </w:t>
+      </w:r>
+      <w:r>
+        <w:rPr>
+          <w:rStyle w:val="VerbatimChar"/>
+        </w:rPr>
+        <w:t xml:space="preserve">Machine::audioRead</w:t>
+      </w:r>
+      <w:r>
+        <w:t xml:space="preserve">). The N64</w:t>
+      </w:r>
+      <w:r>
+        <w:t xml:space="preserve"> </w:t>
+      </w:r>
+      <w:r>
+        <w:rPr>
+          <w:rStyle w:val="VerbatimChar"/>
+        </w:rPr>
+        <w:t xml:space="preserve">GFrame</w:t>
+      </w:r>
+      <w:r>
+        <w:t xml:space="preserve">s go to</w:t>
+      </w:r>
+      <w:r>
+        <w:t xml:space="preserve"> </w:t>
+      </w:r>
+      <w:r>
+        <w:rPr>
+          <w:b/>
+          <w:bCs/>
+        </w:rPr>
+        <w:t xml:space="preserve">OpenGL</w:t>
+      </w:r>
+      <w:r>
+        <w:t xml:space="preserve"> </w:t>
+      </w:r>
+      <w:r>
+        <w:t xml:space="preserve">(</w:t>
+      </w:r>
+      <w:r>
+        <w:rPr>
+          <w:rStyle w:val="VerbatimChar"/>
+        </w:rPr>
+        <w:t xml:space="preserve">ne_gl_attach (h, hwnd)</w:t>
+      </w:r>
+      <w:r>
+        <w:t xml:space="preserve"> </w:t>
+      </w:r>
+      <w:r>
+        <w:t xml:space="preserve">from the game's thread: a WGL context on the picture</w:t>
+      </w:r>
+      <w:r>
+        <w:t xml:space="preserve"> </w:t>
+      </w:r>
+      <w:r>
+        <w:t xml:space="preserve">control, GLSL 1.20 — colour = texel × colour + colour2, alpha test, the batch's matrix, blending</w:t>
+      </w:r>
+      <w:r>
+        <w:t xml:space="preserve"> </w:t>
+      </w:r>
+      <w:r>
+        <w:t xml:space="preserve">/ depth / cull / wrap from the flags, as</w:t>
+      </w:r>
+      <w:r>
+        <w:t xml:space="preserve"> </w:t>
+      </w:r>
+      <w:r>
+        <w:rPr>
+          <w:rStyle w:val="VerbatimChar"/>
+        </w:rPr>
+        <w:t xml:space="preserve">kapi_gpu_render</w:t>
+      </w:r>
+      <w:r>
+        <w:t xml:space="preserve">; the machine's dirty textures uploaded;</w:t>
+      </w:r>
+      <w:r>
+        <w:t xml:space="preserve"> </w:t>
+      </w:r>
+      <w:r>
+        <w:t xml:space="preserve">a CPU-drawn framebuffer as a textured quad), else</w:t>
+      </w:r>
+      <w:r>
+        <w:t xml:space="preserve"> </w:t>
+      </w:r>
+      <w:r>
+        <w:rPr>
+          <w:rStyle w:val="VerbatimChar"/>
+        </w:rPr>
+        <w:t xml:space="preserve">bas::swTriangles</w:t>
+      </w:r>
+      <w:r>
+        <w:t xml:space="preserve"> </w:t>
+      </w:r>
+      <w:r>
+        <w:t xml:space="preserve">+</w:t>
+      </w:r>
+      <w:r>
+        <w:t xml:space="preserve"> </w:t>
+      </w:r>
+      <w:r>
+        <w:rPr>
+          <w:rStyle w:val="VerbatimChar"/>
+        </w:rPr>
+        <w:t xml:space="preserve">g3raster</w:t>
+      </w:r>
+      <w:r>
+        <w:t xml:space="preserve"> </w:t>
+      </w:r>
+      <w:r>
+        <w:t xml:space="preserve">in bands of 16</w:t>
+      </w:r>
+      <w:r>
+        <w:t xml:space="preserve"> </w:t>
+      </w:r>
+      <w:r>
+        <w:t xml:space="preserve">rows on every core (</w:t>
+      </w:r>
+      <w:r>
+        <w:rPr>
+          <w:rStyle w:val="VerbatimChar"/>
+        </w:rPr>
+        <w:t xml:space="preserve">user/basic/bas3d.h</w:t>
+      </w:r>
+      <w:r>
+        <w:t xml:space="preserve">) at</w:t>
+      </w:r>
+      <w:r>
+        <w:t xml:space="preserve"> </w:t>
+      </w:r>
+      <w:r>
+        <w:rPr>
+          <w:rStyle w:val="VerbatimChar"/>
+        </w:rPr>
+        <w:t xml:space="preserve">ne_set_scale</w:t>
+      </w:r>
+      <w:r>
+        <w:t xml:space="preserve"> </w:t>
+      </w:r>
+      <w:r>
+        <w:t xml:space="preserve">× their size. A GameCube game with</w:t>
+      </w:r>
+      <w:r>
+        <w:t xml:space="preserve"> </w:t>
+      </w:r>
+      <w:r>
+        <w:t xml:space="preserve">OpenGL 3.3 gets</w:t>
+      </w:r>
+      <w:r>
+        <w:t xml:space="preserve"> </w:t>
+      </w:r>
+      <w:r>
+        <w:rPr>
+          <w:rStyle w:val="VerbatimChar"/>
+          <w:b/>
+          <w:bCs/>
+        </w:rPr>
+        <w:t xml:space="preserve">core/gxgl.cpp</w:t>
+      </w:r>
+      <w:r>
+        <w:t xml:space="preserve"> </w:t>
+      </w:r>
+      <w:r>
+        <w:t xml:space="preserve">as its</w:t>
+      </w:r>
+      <w:r>
+        <w:t xml:space="preserve"> </w:t>
+      </w:r>
+      <w:r>
+        <w:rPr>
+          <w:rStyle w:val="VerbatimChar"/>
+        </w:rPr>
+        <w:t xml:space="preserve">Machine::gpu</w:t>
+      </w:r>
+      <w:r>
+        <w:t xml:space="preserve"> </w:t>
+      </w:r>
+      <w:r>
+        <w:t xml:space="preserve">(the GX's real pipeline on the GPU):</w:t>
+      </w:r>
+      <w:r>
+        <w:t xml:space="preserve"> </w:t>
+      </w:r>
+      <w:r>
+        <w:t xml:space="preserve">the EFB is a framebuffer (RGBA8 + depth 24,</w:t>
+      </w:r>
+      <w:r>
+        <w:t xml:space="preserve"> </w:t>
+      </w:r>
+      <w:r>
+        <w:rPr>
+          <w:rStyle w:val="VerbatimChar"/>
+        </w:rPr>
+        <w:t xml:space="preserve">ne_set_scale</w:t>
+      </w:r>
+      <w:r>
+        <w:t xml:space="preserve"> </w:t>
+      </w:r>
+      <w:r>
+        <w:t xml:space="preserve">× 640 × 528, its rows the EFB's); a</w:t>
+      </w:r>
+      <w:r>
+        <w:t xml:space="preserve"> </w:t>
+      </w:r>
+      <w:r>
+        <w:t xml:space="preserve">draw's vertices, the XF memory and the</w:t>
+      </w:r>
+      <w:r>
+        <w:t xml:space="preserve"> </w:t>
+      </w:r>
+      <w:r>
+        <w:rPr>
+          <w:rStyle w:val="VerbatimChar"/>
+        </w:rPr>
+        <w:t xml:space="preserve">GxState</w:t>
+      </w:r>
+      <w:r>
+        <w:t xml:space="preserve"> </w:t>
+      </w:r>
+      <w:r>
+        <w:t xml:space="preserve">go to three ring buffers (persistently mapped,</w:t>
+      </w:r>
+      <w:r>
+        <w:t xml:space="preserve"> </w:t>
+      </w:r>
+      <w:r>
+        <w:t xml:space="preserve">their quarters fenced; else unsynchronized maps) and two uniform blocks; the vertex shader</w:t>
+      </w:r>
+      <w:r>
+        <w:t xml:space="preserve"> </w:t>
+      </w:r>
+      <w:r>
+        <w:t xml:space="preserve">transforms, lights (the two channels, 8 lights: spot / specular attenuation, diffuse functions)</w:t>
+      </w:r>
+      <w:r>
+        <w:t xml:space="preserve"> </w:t>
+      </w:r>
+      <w:r>
+        <w:t xml:space="preserve">and makes the texture coordinates (texgens, dual texture); the fragment shader is the TEV in</w:t>
+      </w:r>
+      <w:r>
+        <w:t xml:space="preserve"> </w:t>
+      </w:r>
+      <w:r>
+        <w:t xml:space="preserve">integers as the hardware (the lerp with c + c &gt;&gt; 7, the scale inside it, compare modes, swap</w:t>
+      </w:r>
+      <w:r>
+        <w:t xml:space="preserve"> </w:t>
+      </w:r>
+      <w:r>
+        <w:t xml:space="preserve">tables, konst colours, the last stage into PREV, &amp; 255), indirect texturing (matrices, wraps,</w:t>
+      </w:r>
+      <w:r>
+        <w:t xml:space="preserve"> </w:t>
+      </w:r>
+      <w:r>
+        <w:t xml:space="preserve">bump alpha), the alpha test, the z texture, the fog (with its range adjustment), RGBA6 / RGB565</w:t>
+      </w:r>
+      <w:r>
+        <w:t xml:space="preserve"> </w:t>
+      </w:r>
+      <w:r>
+        <w:t xml:space="preserve">EFB formats, the destination alpha (dual-source blending); GX blending / logic ops / depth /</w:t>
+      </w:r>
+      <w:r>
+        <w:t xml:space="preserve"> </w:t>
+      </w:r>
+      <w:r>
+        <w:t xml:space="preserve">culling / scissor are GL state. Each TEV configuration gets a</w:t>
+      </w:r>
+      <w:r>
+        <w:t xml:space="preserve"> </w:t>
+      </w:r>
+      <w:r>
+        <w:rPr>
+          <w:b/>
+          <w:bCs/>
+        </w:rPr>
+        <w:t xml:space="preserve">specialized program</w:t>
+      </w:r>
+      <w:r>
+        <w:t xml:space="preserve"> </w:t>
+      </w:r>
+      <w:r>
+        <w:t xml:space="preserve">(the</w:t>
+      </w:r>
+      <w:r>
+        <w:t xml:space="preserve"> </w:t>
+      </w:r>
+      <w:r>
+        <w:t xml:space="preserve">ubershader's code with the stages unrolled and the state's choices as constants — ~1.6× faster</w:t>
+      </w:r>
+      <w:r>
+        <w:t xml:space="preserve"> </w:t>
+      </w:r>
+      <w:r>
+        <w:t xml:space="preserve">on an integrated GPU), compiled by the driver's threads when it has</w:t>
+      </w:r>
+      <w:r>
+        <w:t xml:space="preserve"> </w:t>
+      </w:r>
+      <w:r>
+        <w:rPr>
+          <w:rStyle w:val="VerbatimChar"/>
+        </w:rPr>
+        <w:t xml:space="preserve">KHR_parallel_shader_compile</w:t>
+      </w:r>
+      <w:r>
+        <w:t xml:space="preserve"> </w:t>
+      </w:r>
+      <w:r>
+        <w:t xml:space="preserve">(the ubershader meanwhile), else at once (the driver caches them on disk: a pause only the first</w:t>
+      </w:r>
+      <w:r>
+        <w:t xml:space="preserve"> </w:t>
+      </w:r>
+      <w:r>
+        <w:t xml:space="preserve">time a configuration is seen). Consecutive draws of one state are one draw call; textures are</w:t>
+      </w:r>
+      <w:r>
+        <w:t xml:space="preserve"> </w:t>
+      </w:r>
+      <w:r>
+        <w:t xml:space="preserve">uploaded with their mipmaps, sampled through cached sampler objects. An EFB copy to a texture</w:t>
+      </w:r>
+      <w:r>
+        <w:t xml:space="preserve"> </w:t>
+      </w:r>
+      <w:r>
+        <w:t xml:space="preserve">renders the rectangle into a texture of ours converted as the texture decoder would read it</w:t>
+      </w:r>
+      <w:r>
+        <w:t xml:space="preserve"> </w:t>
+      </w:r>
+      <w:r>
+        <w:t xml:space="preserve">(intensity Y = 0.257 R + 0.504 G + 0.098 B + 16, RGB565, RGB5A3, the depth's bytes for Z</w:t>
+      </w:r>
+      <w:r>
+        <w:t xml:space="preserve"> </w:t>
+      </w:r>
+      <w:r>
+        <w:t xml:space="preserve">formats), box-filtered when halved; a copy to the XFB is the picture, presented into the window</w:t>
+      </w:r>
+      <w:r>
+        <w:t xml:space="preserve"> </w:t>
+      </w:r>
+      <w:r>
+        <w:t xml:space="preserve">(</w:t>
+      </w:r>
+      <w:r>
+        <w:rPr>
+          <w:rStyle w:val="VerbatimChar"/>
+        </w:rPr>
+        <w:t xml:space="preserve">gxgl_present</w:t>
+      </w:r>
+      <w:r>
+        <w:t xml:space="preserve">).</w:t>
+      </w:r>
+      <w:r>
+        <w:t xml:space="preserve"> </w:t>
+      </w:r>
+      <w:r>
+        <w:rPr>
+          <w:rStyle w:val="VerbatimChar"/>
+        </w:rPr>
+        <w:t xml:space="preserve">NEMU_GX_UBER=1</w:t>
+      </w:r>
+      <w:r>
+        <w:t xml:space="preserve"> </w:t>
+      </w:r>
+      <w:r>
+        <w:t xml:space="preserve">forces the ubershader,</w:t>
+      </w:r>
+      <w:r>
+        <w:t xml:space="preserve"> </w:t>
+      </w:r>
+      <w:r>
+        <w:rPr>
+          <w:rStyle w:val="VerbatimChar"/>
+        </w:rPr>
+        <w:t xml:space="preserve">NEMU_GX_SYNC=1</w:t>
+      </w:r>
+      <w:r>
+        <w:t xml:space="preserve"> </w:t>
+      </w:r>
+      <w:r>
+        <w:t xml:space="preserve">compiles at once,</w:t>
+      </w:r>
+      <w:r>
+        <w:t xml:space="preserve"> </w:t>
+      </w:r>
+      <w:r>
+        <w:rPr>
+          <w:rStyle w:val="VerbatimChar"/>
+        </w:rPr>
+        <w:t xml:space="preserve">NEMU_GX_DUMP=&lt;prefix&gt;</w:t>
+      </w:r>
+      <w:r>
+        <w:t xml:space="preserve"> </w:t>
+      </w:r>
+      <w:r>
+        <w:t xml:space="preserve">writes the GPU's picture every 250 fields (+ what GL is). Pads: XInput, else</w:t>
+      </w:r>
+      <w:r>
+        <w:t xml:space="preserve"> </w:t>
+      </w:r>
+      <w:r>
+        <w:t xml:space="preserve">the first Windows joystick (winmm</w:t>
+      </w:r>
+      <w:r>
+        <w:t xml:space="preserve"> </w:t>
+      </w:r>
+      <w:r>
+        <w:rPr>
+          <w:rStyle w:val="VerbatimChar"/>
+        </w:rPr>
+        <w:t xml:space="preserve">joyGetPosEx</w:t>
+      </w:r>
+      <w:r>
+        <w:t xml:space="preserve">) through</w:t>
+      </w:r>
+      <w:r>
+        <w:t xml:space="preserve"> </w:t>
+      </w:r>
+      <w:r>
+        <w:rPr>
+          <w:rStyle w:val="VerbatimChar"/>
+        </w:rPr>
+        <w:t xml:space="preserve">ne_pad_map</w:t>
+      </w:r>
+      <w:r>
+        <w:t xml:space="preserve"> </w:t>
+      </w:r>
+      <w:r>
+        <w:t xml:space="preserve">(PAD_* bit → button / axis</w:t>
+      </w:r>
+      <w:r>
+        <w:t xml:space="preserve"> </w:t>
+      </w:r>
+      <w:r>
+        <w:t xml:space="preserve">end / hat direction;</w:t>
+      </w:r>
+      <w:r>
+        <w:t xml:space="preserve"> </w:t>
+      </w:r>
+      <w:r>
+        <w:rPr>
+          <w:rStyle w:val="VerbatimChar"/>
+        </w:rPr>
+        <w:t xml:space="preserve">PadDialog.cs</w:t>
+      </w:r>
+      <w:r>
+        <w:t xml:space="preserve">).</w:t>
+      </w:r>
+      <w:r>
+        <w:t xml:space="preserve"> </w:t>
+      </w:r>
+      <w:r>
+        <w:rPr>
+          <w:rStyle w:val="VerbatimChar"/>
+        </w:rPr>
+        <w:t xml:space="preserve">NintendoEMU.exe</w:t>
+      </w:r>
+      <w:r>
+        <w:t xml:space="preserve"> </w:t>
+      </w:r>
+      <w:r>
+        <w:t xml:space="preserve">(.NET</w:t>
+      </w:r>
+      <w:r>
+        <w:t xml:space="preserve"> </w:t>
+      </w:r>
+      <w:r>
+        <w:t xml:space="preserve">4.8 WinForms):</w:t>
+      </w:r>
+      <w:r>
+        <w:t xml:space="preserve"> </w:t>
+      </w:r>
+      <w:r>
+        <w:rPr>
+          <w:rStyle w:val="VerbatimChar"/>
+        </w:rPr>
+        <w:t xml:space="preserve">MainForm</w:t>
+      </w:r>
+      <w:r>
+        <w:t xml:space="preserve"> </w:t>
+      </w:r>
+      <w:r>
+        <w:t xml:space="preserve">(the library,</w:t>
+      </w:r>
+      <w:r>
+        <w:t xml:space="preserve"> </w:t>
+      </w:r>
+      <w:r>
+        <w:rPr>
+          <w:rStyle w:val="VerbatimChar"/>
+        </w:rPr>
+        <w:t xml:space="preserve">library.txt</w:t>
+      </w:r>
+      <w:r>
+        <w:t xml:space="preserve">, the pictures made by a worker thread),</w:t>
+      </w:r>
+      <w:r>
+        <w:t xml:space="preserve"> </w:t>
+      </w:r>
+      <w:r>
+        <w:rPr>
+          <w:rStyle w:val="VerbatimChar"/>
+        </w:rPr>
+        <w:t xml:space="preserve">GameForm</w:t>
+      </w:r>
+      <w:r>
+        <w:t xml:space="preserve"> </w:t>
+      </w:r>
+      <w:r>
+        <w:t xml:space="preserve">(the game thread: paced by the sound queue — ~70 ms — when the game makes sound,</w:t>
+      </w:r>
+      <w:r>
+        <w:t xml:space="preserve"> </w:t>
+      </w:r>
+      <w:r>
+        <w:t xml:space="preserve">else by the clock, a picture skipped to catch up; the window draws with</w:t>
+      </w:r>
+      <w:r>
+        <w:t xml:space="preserve"> </w:t>
+      </w:r>
+      <w:r>
+        <w:rPr>
+          <w:rStyle w:val="VerbatimChar"/>
+        </w:rPr>
+        <w:t xml:space="preserve">StretchDIBits</w:t>
+      </w:r>
+      <w:r>
+        <w:t xml:space="preserve">).</w:t>
+      </w:r>
+      <w:r>
+        <w:t xml:space="preserve"> </w:t>
+      </w:r>
+      <w:r>
+        <w:t xml:space="preserve">View ▸ 3D Renderer ▸</w:t>
+      </w:r>
+      <w:r>
+        <w:t xml:space="preserve"> </w:t>
+      </w:r>
+      <w:r>
+        <w:rPr>
+          <w:i/>
+          <w:iCs/>
+        </w:rPr>
+        <w:t xml:space="preserve">Use the High-Performance Graphics Card</w:t>
+      </w:r>
+      <w:r>
+        <w:t xml:space="preserve"> </w:t>
+      </w:r>
+      <w:r>
+        <w:t xml:space="preserve">(</w:t>
+      </w:r>
+      <w:r>
+        <w:rPr>
+          <w:rStyle w:val="VerbatimChar"/>
+        </w:rPr>
+        <w:t xml:space="preserve">GpuPreference</w:t>
+      </w:r>
+      <w:r>
+        <w:t xml:space="preserve"> </w:t>
+      </w:r>
+      <w:r>
+        <w:t xml:space="preserve">in</w:t>
+      </w:r>
+      <w:r>
+        <w:t xml:space="preserve"> </w:t>
+      </w:r>
+      <w:r>
+        <w:rPr>
+          <w:rStyle w:val="VerbatimChar"/>
+        </w:rPr>
+        <w:t xml:space="preserve">GameForm.cs</w:t>
+      </w:r>
+      <w:r>
+        <w:t xml:space="preserve">) writes Windows' own per-application choice (</w:t>
+      </w:r>
+      <w:r>
+        <w:rPr>
+          <w:rStyle w:val="VerbatimChar"/>
+        </w:rPr>
+        <w:t xml:space="preserve">HKCU\Software\Microsoft\DirectX\ UserGpuPreferences</w:t>
+      </w:r>
+      <w:r>
+        <w:t xml:space="preserve">, what Settings ▸ Display ▸ Graphics writes) for a laptop with two graphics</w:t>
+      </w:r>
+      <w:r>
+        <w:t xml:space="preserve"> </w:t>
+      </w:r>
+      <w:r>
+        <w:t xml:space="preserve">cards: a .NET program cannot export</w:t>
+      </w:r>
+      <w:r>
+        <w:t xml:space="preserve"> </w:t>
+      </w:r>
+      <w:r>
+        <w:rPr>
+          <w:rStyle w:val="VerbatimChar"/>
+        </w:rPr>
+        <w:t xml:space="preserve">NvOptimusEnablement</w:t>
+      </w:r>
+      <w:r>
+        <w:t xml:space="preserve">.</w:t>
+      </w:r>
+      <w:r>
+        <w:t xml:space="preserve"> </w:t>
+      </w:r>
+      <w:r>
+        <w:t xml:space="preserve">Test:</w:t>
+      </w:r>
+      <w:r>
+        <w:t xml:space="preserve"> </w:t>
+      </w:r>
+      <w:r>
+        <w:rPr>
+          <w:rStyle w:val="VerbatimChar"/>
+        </w:rPr>
+        <w:t xml:space="preserve">sh tools/tests/run_nemu_test.sh</w:t>
+      </w:r>
+      <w:r>
+        <w:t xml:space="preserve"> </w:t>
+      </w:r>
+      <w:r>
+        <w:t xml:space="preserve">(the C API on Linux: each core a few frames, a picture,</w:t>
+      </w:r>
+      <w:r>
+        <w:t xml:space="preserve"> </w:t>
+      </w:r>
+      <w:r>
+        <w:t xml:space="preserve">the library pictures;</w:t>
+      </w:r>
+      <w:r>
+        <w:t xml:space="preserve"> </w:t>
+      </w:r>
+      <w:r>
+        <w:rPr>
+          <w:rStyle w:val="VerbatimChar"/>
+        </w:rPr>
+        <w:t xml:space="preserve">NEMU_ROMS=&lt;folder&gt;</w:t>
+      </w:r>
+      <w:r>
+        <w:t xml:space="preserve"> </w:t>
+      </w:r>
+      <w:r>
+        <w:t xml:space="preserve">of ROMs).</w:t>
+      </w:r>
+    </w:p>
+    <w:p>
+      <w:pPr>
+        <w:pStyle w:val="Compact"/>
+        <w:numPr>
+          <w:ilvl w:val="0"/>
+          <w:numId w:val="1025"/>
+        </w:numPr>
+      </w:pPr>
+      <w:r>
+        <w:rPr>
+          <w:b/>
+          <w:bCs/>
+        </w:rPr>
         <w:t xml:space="preserve">Tests</w:t>
       </w:r>
       <w:r>
@@ -67403,9 +68348,9 @@
         <w:t xml:space="preserve">rewrites them).</w:t>
       </w:r>
     </w:p>
-    <w:bookmarkEnd w:id="87"/>
-    <w:bookmarkEnd w:id="88"/>
-    <w:bookmarkStart w:id="89" w:name="Xc2ec260aede7afe7fa831ade27ff6c6be860f38"/>
+    <w:bookmarkEnd w:id="89"/>
+    <w:bookmarkEnd w:id="90"/>
+    <w:bookmarkStart w:id="91" w:name="Xc2ec260aede7afe7fa831ade27ff6c6be860f38"/>
     <w:p>
       <w:pPr>
         <w:pStyle w:val="Heading2"/>
@@ -68132,8 +69077,8 @@
         <w:t xml:space="preserve">"must match").</w:t>
       </w:r>
     </w:p>
-    <w:bookmarkEnd w:id="89"/>
-    <w:bookmarkStart w:id="90" w:name="X57cc4a25254639a1e87307c03f7beba3c173828"/>
+    <w:bookmarkEnd w:id="91"/>
+    <w:bookmarkStart w:id="92" w:name="X57cc4a25254639a1e87307c03f7beba3c173828"/>
     <w:p>
       <w:pPr>
         <w:pStyle w:val="Heading2"/>
@@ -68509,8 +69454,8 @@
         <w:t xml:space="preserve">committed in this repo.)</w:t>
       </w:r>
     </w:p>
-    <w:bookmarkEnd w:id="90"/>
-    <w:bookmarkStart w:id="92" w:name="Xe2e8f17f312baf0f280f8a3dfcc5fa34b4105bf"/>
+    <w:bookmarkEnd w:id="92"/>
+    <w:bookmarkStart w:id="94" w:name="Xe2e8f17f312baf0f280f8a3dfcc5fa34b4105bf"/>
     <w:p>
       <w:pPr>
         <w:pStyle w:val="Heading2"/>
@@ -69561,7 +70506,7 @@
       <w:r>
         <w:t xml:space="preserve"> </w:t>
       </w:r>
-      <w:hyperlink r:id="rId91">
+      <w:hyperlink r:id="rId93">
         <w:r>
           <w:rPr>
             <w:rStyle w:val="Hyperlink"/>
@@ -69573,8 +70518,8 @@
         <w:t xml:space="preserve">).</w:t>
       </w:r>
     </w:p>
-    <w:bookmarkEnd w:id="92"/>
-    <w:bookmarkStart w:id="94" w:name="Xe9c7e4e932ad1908138a3909ff179a810da6d71"/>
+    <w:bookmarkEnd w:id="94"/>
+    <w:bookmarkStart w:id="96" w:name="Xe9c7e4e932ad1908138a3909ff179a810da6d71"/>
     <w:p>
       <w:pPr>
         <w:pStyle w:val="Heading2"/>
@@ -70661,7 +71606,7 @@
       <w:r>
         <w:t xml:space="preserve"> </w:t>
       </w:r>
-      <w:hyperlink r:id="rId93">
+      <w:hyperlink r:id="rId95">
         <w:r>
           <w:rPr>
             <w:rStyle w:val="Hyperlink"/>
@@ -71056,7 +72001,7 @@
         <w:t xml:space="preserve">, not another clone.</w:t>
       </w:r>
     </w:p>
-    <w:bookmarkEnd w:id="94"/>
+    <w:bookmarkEnd w:id="96"/>
     <w:sectPr>
       <w:footerReference r:id="rId9" w:type="default"/>
       <w:footnotePr>

</xml_diff>

<commit_message>
docs: the exports made again (docs/06 section 43 after the merge)
Co-Authored-By: Claude Opus 5.5 <noreply@anthropic.com>
Claude-Session: https://claude.ai/code/session_01UcY36na7Mp1DEYttKiw1pa
</commit_message>
<xml_diff>
--- a/docs/exports/03-DEVELOPER-GUIDE.docx
+++ b/docs/exports/03-DEVELOPER-GUIDE.docx
@@ -56072,7 +56072,28 @@
         <w:t xml:space="preserve"> </w:t>
       </w:r>
       <w:r>
-        <w:t xml:space="preserve">hand for newlib); the disk cache is</w:t>
+        <w:t xml:space="preserve">hand for newlib); expat (</w:t>
+      </w:r>
+      <w:r>
+        <w:rPr>
+          <w:rStyle w:val="VerbatimChar"/>
+        </w:rPr>
+        <w:t xml:space="preserve">third_party/expat-2.7.1</w:t>
+      </w:r>
+      <w:r>
+        <w:t xml:space="preserve">,</w:t>
+      </w:r>
+      <w:r>
+        <w:t xml:space="preserve"> </w:t>
+      </w:r>
+      <w:r>
+        <w:rPr>
+          <w:rStyle w:val="VerbatimChar"/>
+        </w:rPr>
+        <w:t xml:space="preserve">libexpat.a</w:t>
+      </w:r>
+      <w:r>
+        <w:t xml:space="preserve">: the XML documents, docs/06 §43); the disk cache is</w:t>
       </w:r>
       <w:r>
         <w:t xml:space="preserve"> </w:t>

</xml_diff>

<commit_message>
The packages' publishing: tools/pkg/publish.sh, the skill onyx-packages, CLAUDE.md's rule
- publish.sh: the onyx-packages clone updated, mkrepo --bump --db --lite,
  the index's signature checked with the cards' key, the host test,
  commit + push; the key from ONYX_PKG_KEY (PEM, \n escapes or base64),
  ONYX_PKG_KEY_FILE or ~/.onyx/pkg-key.pem -- none: nothing published
- mkrepo: no package changed -> the index and its signature kept
- .claude/skills/onyx-packages/SKILL.md: when (any change of the card),
  a new app's package (files, needs, user files, samples, an emulator's
  games =), publishing, what to commit, the nevers
- CLAUDE.md: the rule; docs/pkg/README.md, docs/03; exports

Co-Authored-By: Claude Opus 5.5 <noreply@anthropic.com>
Claude-Session: https://claude.ai/code/session_012k6pqyonBBqCtDQrtttmUW
</commit_message>
<xml_diff>
--- a/docs/exports/03-DEVELOPER-GUIDE.docx
+++ b/docs/exports/03-DEVELOPER-GUIDE.docx
@@ -41634,6 +41634,126 @@
             </w:r>
             <w:r>
               <w:t xml:space="preserve">: the card of the required packages only.</w:t>
+            </w:r>
+          </w:p>
+        </w:tc>
+      </w:tr>
+      <w:tr>
+        <w:tc>
+          <w:tcPr/>
+          <w:p>
+            <w:pPr>
+              <w:pStyle w:val="Compact"/>
+            </w:pPr>
+            <w:r>
+              <w:rPr>
+                <w:rStyle w:val="VerbatimChar"/>
+              </w:rPr>
+              <w:t xml:space="preserve">tools/pkg/publish.sh</w:t>
+            </w:r>
+          </w:p>
+        </w:tc>
+        <w:tc>
+          <w:tcPr/>
+          <w:p>
+            <w:pPr>
+              <w:pStyle w:val="Compact"/>
+            </w:pPr>
+            <w:r>
+              <w:t xml:space="preserve">The publishing, in one command (the skill</w:t>
+            </w:r>
+            <w:r>
+              <w:t xml:space="preserve"> </w:t>
+            </w:r>
+            <w:r>
+              <w:rPr>
+                <w:rStyle w:val="VerbatimChar"/>
+              </w:rPr>
+              <w:t xml:space="preserve">.claude/skills/onyx-packages</w:t>
+            </w:r>
+            <w:r>
+              <w:t xml:space="preserve">): the</w:t>
+            </w:r>
+            <w:r>
+              <w:t xml:space="preserve"> </w:t>
+            </w:r>
+            <w:r>
+              <w:rPr>
+                <w:rStyle w:val="VerbatimChar"/>
+              </w:rPr>
+              <w:t xml:space="preserve">onyx-packages</w:t>
+            </w:r>
+            <w:r>
+              <w:t xml:space="preserve"> </w:t>
+            </w:r>
+            <w:r>
+              <w:t xml:space="preserve">clone updated,</w:t>
+            </w:r>
+            <w:r>
+              <w:t xml:space="preserve"> </w:t>
+            </w:r>
+            <w:r>
+              <w:rPr>
+                <w:rStyle w:val="VerbatimChar"/>
+              </w:rPr>
+              <w:t xml:space="preserve">mkrepo.py --bump --db --lite</w:t>
+            </w:r>
+            <w:r>
+              <w:t xml:space="preserve">, the signature checked with</w:t>
+            </w:r>
+            <w:r>
+              <w:t xml:space="preserve"> </w:t>
+            </w:r>
+            <w:r>
+              <w:rPr>
+                <w:rStyle w:val="VerbatimChar"/>
+              </w:rPr>
+              <w:t xml:space="preserve">onyx.pub</w:t>
+            </w:r>
+            <w:r>
+              <w:t xml:space="preserve">, the host test, commit + push; the key from</w:t>
+            </w:r>
+            <w:r>
+              <w:t xml:space="preserve"> </w:t>
+            </w:r>
+            <w:r>
+              <w:rPr>
+                <w:rStyle w:val="VerbatimChar"/>
+              </w:rPr>
+              <w:t xml:space="preserve">ONYX_PKG_KEY</w:t>
+            </w:r>
+            <w:r>
+              <w:t xml:space="preserve"> </w:t>
+            </w:r>
+            <w:r>
+              <w:t xml:space="preserve">/</w:t>
+            </w:r>
+            <w:r>
+              <w:t xml:space="preserve"> </w:t>
+            </w:r>
+            <w:r>
+              <w:rPr>
+                <w:rStyle w:val="VerbatimChar"/>
+              </w:rPr>
+              <w:t xml:space="preserve">ONYX_PKG_KEY_FILE</w:t>
+            </w:r>
+            <w:r>
+              <w:t xml:space="preserve"> </w:t>
+            </w:r>
+            <w:r>
+              <w:t xml:space="preserve">/</w:t>
+            </w:r>
+            <w:r>
+              <w:t xml:space="preserve"> </w:t>
+            </w:r>
+            <w:r>
+              <w:rPr>
+                <w:rStyle w:val="VerbatimChar"/>
+              </w:rPr>
+              <w:t xml:space="preserve">~/.onyx/pkg-key.pem</w:t>
+            </w:r>
+            <w:r>
+              <w:t xml:space="preserve">.</w:t>
             </w:r>
           </w:p>
         </w:tc>

</xml_diff>

<commit_message>
Packages published: pkgman 1.0.0 (new), onyx 2026.10.4, jet 1.0.2, ledger 1.0.1
pkgman: bin/pkg, the Package Manager, pkgd in a package of their own (onyx needs
it); onyx: without them, with wtk's words (res/lang/) and no Wi-Fi settings;
Jet: its XML / XHTML / XSLT / SVG documents build; Ledger: in French.
versions.ini, the card's database and sdcard_lite made again; docs (pkg/README,
03, 04) and their exports.

Co-Authored-By: Claude Opus 5.5 <noreply@anthropic.com>
Claude-Session: https://claude.ai/code/session_018vcYqFmwcdMsmNMcVF62sL
</commit_message>
<xml_diff>
--- a/docs/exports/03-DEVELOPER-GUIDE.docx
+++ b/docs/exports/03-DEVELOPER-GUIDE.docx
@@ -42333,7 +42333,61 @@
               <w:t xml:space="preserve">.new</w:t>
             </w:r>
             <w:r>
-              <w:t xml:space="preserve">, the old version's other files removed), the staging of</w:t>
+              <w:t xml:space="preserve">, the old version's other files removed — unless another installed package has them,</w:t>
+            </w:r>
+            <w:r>
+              <w:t xml:space="preserve"> </w:t>
+            </w:r>
+            <w:r>
+              <w:rPr>
+                <w:rStyle w:val="VerbatimChar"/>
+              </w:rPr>
+              <w:t xml:space="preserve">owned_elsewhere</w:t>
+            </w:r>
+            <w:r>
+              <w:t xml:space="preserve">, as when</w:t>
+            </w:r>
+            <w:r>
+              <w:t xml:space="preserve"> </w:t>
+            </w:r>
+            <w:r>
+              <w:rPr>
+                <w:rStyle w:val="VerbatimChar"/>
+              </w:rPr>
+              <w:t xml:space="preserve">bin/pkg</w:t>
+            </w:r>
+            <w:r>
+              <w:t xml:space="preserve"> </w:t>
+            </w:r>
+            <w:r>
+              <w:t xml:space="preserve">moved from</w:t>
+            </w:r>
+            <w:r>
+              <w:t xml:space="preserve"> </w:t>
+            </w:r>
+            <w:r>
+              <w:rPr>
+                <w:rStyle w:val="VerbatimChar"/>
+              </w:rPr>
+              <w:t xml:space="preserve">onyx</w:t>
+            </w:r>
+            <w:r>
+              <w:t xml:space="preserve"> </w:t>
+            </w:r>
+            <w:r>
+              <w:t xml:space="preserve">into</w:t>
+            </w:r>
+            <w:r>
+              <w:t xml:space="preserve"> </w:t>
+            </w:r>
+            <w:r>
+              <w:rPr>
+                <w:rStyle w:val="VerbatimChar"/>
+              </w:rPr>
+              <w:t xml:space="preserve">pkgman</w:t>
+            </w:r>
+            <w:r>
+              <w:t xml:space="preserve">), the staging of</w:t>
             </w:r>
             <w:r>
               <w:t xml:space="preserve"> </w:t>

</xml_diff>

<commit_message>
Media Player: a MIDI file's notes scrolling as in the mock-up (the file's facts, the bars numbered, the playhead, the instruments), on now playing and its album's page; the kernel rebuilt from the merged sources; exports
Co-Authored-By: Claude Opus 5.5 <noreply@anthropic.com>
Claude-Session: https://claude.ai/code/session_01QvgzST61NjKyMDUFcBAzhM
</commit_message>
<xml_diff>
--- a/docs/exports/03-DEVELOPER-GUIDE.docx
+++ b/docs/exports/03-DEVELOPER-GUIDE.docx
@@ -8348,7 +8348,7 @@
     </w:p>
     <w:bookmarkEnd w:id="40"/>
     <w:bookmarkEnd w:id="41"/>
-    <w:bookmarkStart w:id="51" w:name="Xb2b57b3b718f4be25317d23f525cf8bb9daa0d0"/>
+    <w:bookmarkStart w:id="52" w:name="Xb2b57b3b718f4be25317d23f525cf8bb9daa0d0"/>
     <w:p>
       <w:pPr>
         <w:pStyle w:val="Heading2"/>
@@ -44155,19 +44155,19 @@
       </w:r>
     </w:p>
     <w:bookmarkEnd w:id="44"/>
-    <w:bookmarkStart w:id="45" w:name="X292acd1b77966009c7799e5ef4fd99b22efd18c"/>
+    <w:bookmarkStart w:id="45" w:name="X8095fc0ba22c78122c05dfa17d0fa32d422e8fd"/>
     <w:p>
       <w:pPr>
         <w:pStyle w:val="Heading3"/>
       </w:pPr>
       <w:r>
-        <w:t xml:space="preserve">A large app: Koton, the studio (</w:t>
-      </w:r>
-      <w:r>
-        <w:rPr>
-          <w:rStyle w:val="VerbatimChar"/>
-        </w:rPr>
-        <w:t xml:space="preserve">user/Apps/koton</w:t>
+        <w:t xml:space="preserve">Media Player, the music library (</w:t>
+      </w:r>
+      <w:r>
+        <w:rPr>
+          <w:rStyle w:val="VerbatimChar"/>
+        </w:rPr>
+        <w:t xml:space="preserve">user/Apps/media</w:t>
       </w:r>
       <w:r>
         <w:t xml:space="preserve">)</w:t>
@@ -44178,22 +44178,19 @@
         <w:pStyle w:val="FirstParagraph"/>
       </w:pPr>
       <w:r>
-        <w:t xml:space="preserve">Koton (the DAW:</w:t>
-      </w:r>
-      <w:r>
-        <w:t xml:space="preserve"> </w:t>
-      </w:r>
-      <w:r>
-        <w:rPr>
-          <w:rStyle w:val="VerbatimChar"/>
-        </w:rPr>
-        <w:t xml:space="preserve">docs/daw/README.md</w:t>
-      </w:r>
-      <w:r>
-        <w:t xml:space="preserve"> </w:t>
-      </w:r>
-      <w:r>
-        <w:t xml:space="preserve">has its plan and the user's decisions) is a</w:t>
+        <w:t xml:space="preserve">The music library (the mock-ups and the user's decisions:</w:t>
+      </w:r>
+      <w:r>
+        <w:t xml:space="preserve"> </w:t>
+      </w:r>
+      <w:r>
+        <w:rPr>
+          <w:rStyle w:val="VerbatimChar"/>
+        </w:rPr>
+        <w:t xml:space="preserve">docs/media/README.md</w:t>
+      </w:r>
+      <w:r>
+        <w:t xml:space="preserve">; its use: docs/04 §12) is a</w:t>
       </w:r>
       <w:r>
         <w:t xml:space="preserve"> </w:t>
@@ -44209,19 +44206,13 @@
         <w:t xml:space="preserve"> </w:t>
       </w:r>
       <w:r>
-        <w:t xml:space="preserve">wtk app</w:t>
-      </w:r>
-      <w:r>
-        <w:t xml:space="preserve"> </w:t>
-      </w:r>
-      <w:r>
-        <w:t xml:space="preserve">(</w:t>
-      </w:r>
-      <w:r>
-        <w:rPr>
-          <w:rStyle w:val="VerbatimChar"/>
-        </w:rPr>
-        <w:t xml:space="preserve">koton.elf</w:t>
+        <w:t xml:space="preserve">wtk app with FreeType text (</w:t>
+      </w:r>
+      <w:r>
+        <w:rPr>
+          <w:rStyle w:val="VerbatimChar"/>
+        </w:rPr>
+        <w:t xml:space="preserve">media.elf</w:t>
       </w:r>
       <w:r>
         <w:t xml:space="preserve"> </w:t>
@@ -44232,34 +44223,14 @@
       <w:r>
         <w:t xml:space="preserve"> </w:t>
       </w:r>
-      <w:hyperlink r:id="rId31">
-        <w:r>
-          <w:rPr>
-            <w:rStyle w:val="VerbatimChar"/>
-          </w:rPr>
-          <w:t xml:space="preserve">user/Makefile</w:t>
-        </w:r>
-      </w:hyperlink>
-      <w:r>
-        <w:t xml:space="preserve">: the engine, MeltySynth and the plugin host are</w:t>
-      </w:r>
-      <w:r>
-        <w:t xml:space="preserve"> </w:t>
-      </w:r>
-      <w:r>
-        <w:t xml:space="preserve">separate objects in</w:t>
-      </w:r>
-      <w:r>
-        <w:t xml:space="preserve"> </w:t>
-      </w:r>
-      <w:r>
-        <w:rPr>
-          <w:rStyle w:val="VerbatimChar"/>
-        </w:rPr>
-        <w:t xml:space="preserve">Apps/koton/obj/</w:t>
-      </w:r>
-      <w:r>
-        <w:t xml:space="preserve">, the UI is headers included by</w:t>
+      <w:r>
+        <w:rPr>
+          <w:rStyle w:val="VerbatimChar"/>
+        </w:rPr>
+        <w:t xml:space="preserve">user/Makefile</w:t>
+      </w:r>
+      <w:r>
+        <w:t xml:space="preserve">):</w:t>
       </w:r>
       <w:r>
         <w:t xml:space="preserve"> </w:t>
@@ -44271,37 +44242,10 @@
         <w:t xml:space="preserve">main.cpp</w:t>
       </w:r>
       <w:r>
-        <w:t xml:space="preserve">), with FreeType text</w:t>
-      </w:r>
-      <w:r>
-        <w:t xml:space="preserve"> </w:t>
-      </w:r>
-      <w:r>
-        <w:t xml:space="preserve">(</w:t>
-      </w:r>
-      <w:r>
-        <w:rPr>
-          <w:rStyle w:val="VerbatimChar"/>
-        </w:rPr>
-        <w:t xml:space="preserve">ft/wtkface.h</w:t>
-      </w:r>
-      <w:r>
-        <w:t xml:space="preserve">:</w:t>
-      </w:r>
-      <w:r>
-        <w:t xml:space="preserve"> </w:t>
-      </w:r>
-      <w:r>
-        <w:rPr>
-          <w:rStyle w:val="VerbatimChar"/>
-        </w:rPr>
-        <w:t xml:space="preserve">ft_wtk_install ("DejaVu Sans", 13)</w:t>
-      </w:r>
-      <w:r>
-        <w:t xml:space="preserve"> </w:t>
-      </w:r>
-      <w:r>
-        <w:t xml:space="preserve">before the Root). Its parts:</w:t>
+        <w:t xml:space="preserve"> </w:t>
+      </w:r>
+      <w:r>
+        <w:t xml:space="preserve">(the window) and headers.</w:t>
       </w:r>
     </w:p>
     <w:tbl>
@@ -44325,7 +44269,7 @@
               <w:pStyle w:val="Compact"/>
             </w:pPr>
             <w:r>
-              <w:t xml:space="preserve">Folder</w:t>
+              <w:t xml:space="preserve">File</w:t>
             </w:r>
           </w:p>
         </w:tc>
@@ -44352,13 +44296,10 @@
               <w:rPr>
                 <w:rStyle w:val="VerbatimChar"/>
               </w:rPr>
-              <w:t xml:space="preserve">engine/</w:t>
-            </w:r>
-            <w:r>
-              <w:t xml:space="preserve"> </w:t>
-            </w:r>
-            <w:r>
-              <w:t xml:space="preserve">(namespace</w:t>
+              <w:t xml:space="preserve">codecs.h</w:t>
+            </w:r>
+            <w:r>
+              <w:t xml:space="preserve">,</w:t>
             </w:r>
             <w:r>
               <w:t xml:space="preserve"> </w:t>
@@ -44367,10 +44308,19 @@
               <w:rPr>
                 <w:rStyle w:val="VerbatimChar"/>
               </w:rPr>
-              <w:t xml:space="preserve">kt</w:t>
-            </w:r>
-            <w:r>
-              <w:t xml:space="preserve">)</w:t>
+              <w:t xml:space="preserve">codecs.c</w:t>
+            </w:r>
+            <w:r>
+              <w:t xml:space="preserve">,</w:t>
+            </w:r>
+            <w:r>
+              <w:t xml:space="preserve"> </w:t>
+            </w:r>
+            <w:r>
+              <w:rPr>
+                <w:rStyle w:val="VerbatimChar"/>
+              </w:rPr>
+              <w:t xml:space="preserve">vorbis.c</w:t>
             </w:r>
           </w:p>
         </w:tc>
@@ -44381,31 +44331,73 @@
               <w:pStyle w:val="Compact"/>
             </w:pPr>
             <w:r>
+              <w:t xml:space="preserve">The decoders from</w:t>
+            </w:r>
+            <w:r>
+              <w:t xml:space="preserve"> </w:t>
+            </w:r>
+            <w:r>
               <w:rPr>
                 <w:rStyle w:val="VerbatimChar"/>
               </w:rPr>
-              <w:t xml:space="preserve">kbase.h</w:t>
+              <w:t xml:space="preserve">third_party</w:t>
+            </w:r>
+            <w:r>
+              <w:t xml:space="preserve">:</w:t>
             </w:r>
             <w:r>
               <w:t xml:space="preserve"> </w:t>
             </w:r>
             <w:r>
-              <w:t xml:space="preserve">(Vec, Str, .NET's seeded</w:t>
+              <w:rPr>
+                <w:b/>
+                <w:bCs/>
+              </w:rPr>
+              <w:t xml:space="preserve">minimp3</w:t>
             </w:r>
             <w:r>
               <w:t xml:space="preserve"> </w:t>
+            </w:r>
+            <w:r>
+              <w:t xml:space="preserve">(</w:t>
             </w:r>
             <w:r>
               <w:rPr>
                 <w:rStyle w:val="VerbatimChar"/>
               </w:rPr>
-              <w:t xml:space="preserve">Random</w:t>
+              <w:t xml:space="preserve">minimp3_ex.h</w:t>
+            </w:r>
+            <w:r>
+              <w:t xml:space="preserve">: an index for exact seeks),</w:t>
             </w:r>
             <w:r>
               <w:t xml:space="preserve"> </w:t>
             </w:r>
             <w:r>
-              <w:t xml:space="preserve">reproduced bit for bit, banker's rounding);</w:t>
+              <w:rPr>
+                <w:b/>
+                <w:bCs/>
+              </w:rPr>
+              <w:t xml:space="preserve">dr_flac</w:t>
+            </w:r>
+            <w:r>
+              <w:t xml:space="preserve">,</w:t>
+            </w:r>
+            <w:r>
+              <w:t xml:space="preserve"> </w:t>
+            </w:r>
+            <w:r>
+              <w:rPr>
+                <w:b/>
+                <w:bCs/>
+              </w:rPr>
+              <w:t xml:space="preserve">dr_wav</w:t>
+            </w:r>
+            <w:r>
+              <w:t xml:space="preserve"> </w:t>
+            </w:r>
+            <w:r>
+              <w:t xml:space="preserve">(in</w:t>
             </w:r>
             <w:r>
               <w:t xml:space="preserve"> </w:t>
@@ -44414,13 +44406,26 @@
               <w:rPr>
                 <w:rStyle w:val="VerbatimChar"/>
               </w:rPr>
-              <w:t xml:space="preserve">model.h/.cpp</w:t>
+              <w:t xml:space="preserve">codecs.c</w:t>
+            </w:r>
+            <w:r>
+              <w:t xml:space="preserve">),</w:t>
             </w:r>
             <w:r>
               <w:t xml:space="preserve"> </w:t>
             </w:r>
             <w:r>
-              <w:t xml:space="preserve">(the song: tracks of items — a module after a silence, positions relative —, the chord track pinned last;</w:t>
+              <w:rPr>
+                <w:b/>
+                <w:bCs/>
+              </w:rPr>
+              <w:t xml:space="preserve">stb_vorbis</w:t>
+            </w:r>
+            <w:r>
+              <w:t xml:space="preserve"> </w:t>
+            </w:r>
+            <w:r>
+              <w:t xml:space="preserve">(alone in</w:t>
             </w:r>
             <w:r>
               <w:t xml:space="preserve"> </w:t>
@@ -44429,13 +44434,10 @@
               <w:rPr>
                 <w:rStyle w:val="VerbatimChar"/>
               </w:rPr>
-              <w:t xml:space="preserve">.sq</w:t>
-            </w:r>
-            <w:r>
-              <w:t xml:space="preserve"> </w:t>
-            </w:r>
-            <w:r>
-              <w:t xml:space="preserve">/</w:t>
+              <w:t xml:space="preserve">vorbis.c</w:t>
+            </w:r>
+            <w:r>
+              <w:t xml:space="preserve">: its static names clash with minimp3's). C, built with the FPU into</w:t>
             </w:r>
             <w:r>
               <w:t xml:space="preserve"> </w:t>
@@ -44444,112 +44446,19 @@
               <w:rPr>
                 <w:rStyle w:val="VerbatimChar"/>
               </w:rPr>
-              <w:t xml:space="preserve">.kson</w:t>
-            </w:r>
-            <w:r>
-              <w:t xml:space="preserve"> </w:t>
-            </w:r>
-            <w:r>
-              <w:t xml:space="preserve">read and written with</w:t>
-            </w:r>
-            <w:r>
-              <w:t xml:space="preserve"> </w:t>
+              <w:t xml:space="preserve">Apps/media/obj/</w:t>
+            </w:r>
+            <w:r>
+              <w:t xml:space="preserve">; no stdio (</w:t>
             </w:r>
             <w:r>
               <w:rPr>
                 <w:rStyle w:val="VerbatimChar"/>
               </w:rPr>
-              <w:t xml:space="preserve">json.hpp</w:t>
-            </w:r>
-            <w:r>
-              <w:t xml:space="preserve">);</w:t>
-            </w:r>
-            <w:r>
-              <w:t xml:space="preserve"> </w:t>
-            </w:r>
-            <w:r>
-              <w:rPr>
-                <w:rStyle w:val="VerbatimChar"/>
-              </w:rPr>
-              <w:t xml:space="preserve">theory</w:t>
-            </w:r>
-            <w:r>
-              <w:t xml:space="preserve"> </w:t>
-            </w:r>
-            <w:r>
-              <w:t xml:space="preserve">(the modes, 35 qualities, degrees and colours, 30 cadences, voice leading, the next-chord suggestions, key changes);</w:t>
-            </w:r>
-            <w:r>
-              <w:t xml:space="preserve"> </w:t>
-            </w:r>
-            <w:r>
-              <w:rPr>
-                <w:rStyle w:val="VerbatimChar"/>
-              </w:rPr>
-              <w:t xml:space="preserve">gen_*.cpp</w:t>
-            </w:r>
-            <w:r>
-              <w:t xml:space="preserve"> </w:t>
-            </w:r>
-            <w:r>
-              <w:t xml:space="preserve">(every module rendered to notes: the chord styles and grids, the articulation, the drums, the euclidean rings, the melodic line engine);</w:t>
-            </w:r>
-            <w:r>
-              <w:t xml:space="preserve"> </w:t>
-            </w:r>
-            <w:r>
-              <w:rPr>
-                <w:rStyle w:val="VerbatimChar"/>
-              </w:rPr>
-              <w:t xml:space="preserve">compile</w:t>
-            </w:r>
-            <w:r>
-              <w:t xml:space="preserve"> </w:t>
-            </w:r>
-            <w:r>
-              <w:t xml:space="preserve">(the song flattened to events per track, the tempo map);</w:t>
-            </w:r>
-            <w:r>
-              <w:t xml:space="preserve"> </w:t>
-            </w:r>
-            <w:r>
-              <w:rPr>
-                <w:rStyle w:val="VerbatimChar"/>
-              </w:rPr>
-              <w:t xml:space="preserve">engine</w:t>
-            </w:r>
-            <w:r>
-              <w:t xml:space="preserve"> </w:t>
-            </w:r>
-            <w:r>
-              <w:t xml:space="preserve">(the audio engine: one MeltySynth per track, a lock-free command ring, the mix, the preview voice, the metronome — no allocation, no kapi call in</w:t>
-            </w:r>
-            <w:r>
-              <w:t xml:space="preserve"> </w:t>
-            </w:r>
-            <w:r>
-              <w:rPr>
-                <w:rStyle w:val="VerbatimChar"/>
-              </w:rPr>
-              <w:t xml:space="preserve">render</w:t>
-            </w:r>
-            <w:r>
-              <w:t xml:space="preserve">);</w:t>
-            </w:r>
-            <w:r>
-              <w:t xml:space="preserve"> </w:t>
-            </w:r>
-            <w:r>
-              <w:rPr>
-                <w:rStyle w:val="VerbatimChar"/>
-              </w:rPr>
-              <w:t xml:space="preserve">ai*</w:t>
-            </w:r>
-            <w:r>
-              <w:t xml:space="preserve"> </w:t>
-            </w:r>
-            <w:r>
-              <w:t xml:space="preserve">(Koton's AI: prompts, replies placed).</w:t>
+              <w:t xml:space="preserve">*_NO_STDIO</w:t>
+            </w:r>
+            <w:r>
+              <w:t xml:space="preserve">).</w:t>
             </w:r>
           </w:p>
         </w:tc>
@@ -44565,7 +44474,7 @@
               <w:rPr>
                 <w:rStyle w:val="VerbatimChar"/>
               </w:rPr>
-              <w:t xml:space="preserve">synth/</w:t>
+              <w:t xml:space="preserve">decode.h</w:t>
             </w:r>
           </w:p>
         </w:tc>
@@ -44576,7 +44485,130 @@
               <w:pStyle w:val="Compact"/>
             </w:pPr>
             <w:r>
-              <w:t xml:space="preserve">MeltySynth (C#) ported to C++: the SoundFont reader and the synthesizer, reverb and chorus.</w:t>
+              <w:rPr>
+                <w:rStyle w:val="VerbatimChar"/>
+              </w:rPr>
+              <w:t xml:space="preserve">Src</w:t>
+            </w:r>
+            <w:r>
+              <w:t xml:space="preserve"> </w:t>
+            </w:r>
+            <w:r>
+              <w:t xml:space="preserve">(a file through the kapi:</w:t>
+            </w:r>
+            <w:r>
+              <w:t xml:space="preserve"> </w:t>
+            </w:r>
+            <w:r>
+              <w:rPr>
+                <w:rStyle w:val="VerbatimChar"/>
+              </w:rPr>
+              <w:t xml:space="preserve">kapi_open</w:t>
+            </w:r>
+            <w:r>
+              <w:t xml:space="preserve"> </w:t>
+            </w:r>
+            <w:r>
+              <w:t xml:space="preserve">/</w:t>
+            </w:r>
+            <w:r>
+              <w:t xml:space="preserve"> </w:t>
+            </w:r>
+            <w:r>
+              <w:rPr>
+                <w:rStyle w:val="VerbatimChar"/>
+              </w:rPr>
+              <w:t xml:space="preserve">kapi_read</w:t>
+            </w:r>
+            <w:r>
+              <w:t xml:space="preserve"> </w:t>
+            </w:r>
+            <w:r>
+              <w:t xml:space="preserve">/</w:t>
+            </w:r>
+            <w:r>
+              <w:t xml:space="preserve"> </w:t>
+            </w:r>
+            <w:r>
+              <w:rPr>
+                <w:rStyle w:val="VerbatimChar"/>
+              </w:rPr>
+              <w:t xml:space="preserve">kapi_seek</w:t>
+            </w:r>
+            <w:r>
+              <w:t xml:space="preserve"> </w:t>
+            </w:r>
+            <w:r>
+              <w:t xml:space="preserve">/</w:t>
+            </w:r>
+            <w:r>
+              <w:t xml:space="preserve"> </w:t>
+            </w:r>
+            <w:r>
+              <w:rPr>
+                <w:rStyle w:val="VerbatimChar"/>
+              </w:rPr>
+              <w:t xml:space="preserve">kapi_fsize64</w:t>
+            </w:r>
+            <w:r>
+              <w:t xml:space="preserve">, any size),</w:t>
+            </w:r>
+            <w:r>
+              <w:t xml:space="preserve"> </w:t>
+            </w:r>
+            <w:r>
+              <w:rPr>
+                <w:rStyle w:val="VerbatimChar"/>
+              </w:rPr>
+              <w:t xml:space="preserve">Decoder</w:t>
+            </w:r>
+            <w:r>
+              <w:t xml:space="preserve"> </w:t>
+            </w:r>
+            <w:r>
+              <w:t xml:space="preserve">(s16 stereo frames at the file's rate; mono doubled, more than two channels: the first two), one per format (an Ogg file read whole: stb_vorbis decodes from memory),</w:t>
+            </w:r>
+            <w:r>
+              <w:t xml:space="preserve"> </w:t>
+            </w:r>
+            <w:r>
+              <w:rPr>
+                <w:rStyle w:val="VerbatimChar"/>
+              </w:rPr>
+              <w:t xml:space="preserve">Stream</w:t>
+            </w:r>
+            <w:r>
+              <w:t xml:space="preserve"> </w:t>
+            </w:r>
+            <w:r>
+              <w:t xml:space="preserve">(a linear resampler to</w:t>
+            </w:r>
+            <w:r>
+              <w:t xml:space="preserve"> </w:t>
+            </w:r>
+            <w:r>
+              <w:rPr>
+                <w:rStyle w:val="VerbatimChar"/>
+              </w:rPr>
+              <w:t xml:space="preserve">SOUND_RATE</w:t>
+            </w:r>
+            <w:r>
+              <w:t xml:space="preserve">),</w:t>
+            </w:r>
+            <w:r>
+              <w:t xml:space="preserve"> </w:t>
+            </w:r>
+            <w:r>
+              <w:rPr>
+                <w:rStyle w:val="VerbatimChar"/>
+              </w:rPr>
+              <w:t xml:space="preserve">decoder_open</w:t>
+            </w:r>
+            <w:r>
+              <w:t xml:space="preserve"> </w:t>
+            </w:r>
+            <w:r>
+              <w:t xml:space="preserve">(by extension, then the first bytes).</w:t>
             </w:r>
           </w:p>
         </w:tc>
@@ -44592,7 +44624,7 @@
               <w:rPr>
                 <w:rStyle w:val="VerbatimChar"/>
               </w:rPr>
-              <w:t xml:space="preserve">plug/</w:t>
+              <w:t xml:space="preserve">midi.h</w:t>
             </w:r>
           </w:p>
         </w:tc>
@@ -44603,28 +44635,64 @@
               <w:pStyle w:val="Compact"/>
             </w:pPr>
             <w:r>
-              <w:t xml:space="preserve">The plugin host: plugins as processes (</w:t>
-            </w:r>
-            <w:r>
               <w:rPr>
                 <w:rStyle w:val="VerbatimChar"/>
               </w:rPr>
-              <w:t xml:space="preserve">kplug_proto.h</w:t>
-            </w:r>
-            <w:r>
-              <w:t xml:space="preserve">,</w:t>
+              <w:t xml:space="preserve">MidiSong</w:t>
             </w:r>
             <w:r>
               <w:t xml:space="preserve"> </w:t>
+            </w:r>
+            <w:r>
+              <w:t xml:space="preserve">(a Standard MIDI File, formats 0 / 1, RMID too: the tempo map, running status, the events in time order in frames, the notes for the view, the channels' General MIDI instruments), the SoundFont loaded once (</w:t>
             </w:r>
             <w:r>
               <w:rPr>
                 <w:rStyle w:val="VerbatimChar"/>
               </w:rPr>
-              <w:t xml:space="preserve">kplug.h</w:t>
-            </w:r>
-            <w:r>
-              <w:t xml:space="preserve">), rendered ahead through shared rings, effects with their latency compensated, generators, editors shown as applets.</w:t>
+              <w:t xml:space="preserve">soundfont ()</w:t>
+            </w:r>
+            <w:r>
+              <w:t xml:space="preserve">),</w:t>
+            </w:r>
+            <w:r>
+              <w:t xml:space="preserve"> </w:t>
+            </w:r>
+            <w:r>
+              <w:rPr>
+                <w:rStyle w:val="VerbatimChar"/>
+              </w:rPr>
+              <w:t xml:space="preserve">MidiDecoder</w:t>
+            </w:r>
+            <w:r>
+              <w:t xml:space="preserve"> </w:t>
+            </w:r>
+            <w:r>
+              <w:t xml:space="preserve">(the events fired between</w:t>
+            </w:r>
+            <w:r>
+              <w:t xml:space="preserve"> </w:t>
+            </w:r>
+            <w:r>
+              <w:rPr>
+                <w:rStyle w:val="VerbatimChar"/>
+              </w:rPr>
+              <w:t xml:space="preserve">render</w:t>
+            </w:r>
+            <w:r>
+              <w:t xml:space="preserve">s of MeltySynth — Koton's</w:t>
+            </w:r>
+            <w:r>
+              <w:t xml:space="preserve"> </w:t>
+            </w:r>
+            <w:r>
+              <w:rPr>
+                <w:rStyle w:val="VerbatimChar"/>
+              </w:rPr>
+              <w:t xml:space="preserve">Apps/koton/synth</w:t>
+            </w:r>
+            <w:r>
+              <w:t xml:space="preserve">, linked from Koton's objects —; a seek replays the programs and controllers, no notes).</w:t>
             </w:r>
           </w:p>
         </w:tc>
@@ -44640,25 +44708,7 @@
               <w:rPr>
                 <w:rStyle w:val="VerbatimChar"/>
               </w:rPr>
-              <w:t xml:space="preserve">ui/</w:t>
-            </w:r>
-            <w:r>
-              <w:t xml:space="preserve"> </w:t>
-            </w:r>
-            <w:r>
-              <w:t xml:space="preserve">(namespace</w:t>
-            </w:r>
-            <w:r>
-              <w:t xml:space="preserve"> </w:t>
-            </w:r>
-            <w:r>
-              <w:rPr>
-                <w:rStyle w:val="VerbatimChar"/>
-              </w:rPr>
-              <w:t xml:space="preserve">kui</w:t>
-            </w:r>
-            <w:r>
-              <w:t xml:space="preserve">)</w:t>
+              <w:t xml:space="preserve">player.h</w:t>
             </w:r>
           </w:p>
         </w:tc>
@@ -44672,28 +44722,19 @@
               <w:rPr>
                 <w:rStyle w:val="VerbatimChar"/>
               </w:rPr>
-              <w:t xml:space="preserve">palette.h</w:t>
-            </w:r>
-            <w:r>
-              <w:t xml:space="preserve"> </w:t>
-            </w:r>
-            <w:r>
-              <w:t xml:space="preserve">(the studio's colours as a wtk theme, the drawing helpers);</w:t>
-            </w:r>
-            <w:r>
-              <w:t xml:space="preserve"> </w:t>
+              <w:t xml:space="preserve">Player</w:t>
+            </w:r>
+            <w:r>
+              <w:t xml:space="preserve">: a thread (</w:t>
             </w:r>
             <w:r>
               <w:rPr>
                 <w:rStyle w:val="VerbatimChar"/>
               </w:rPr>
-              <w:t xml:space="preserve">doc.h</w:t>
-            </w:r>
-            <w:r>
-              <w:t xml:space="preserve"> </w:t>
-            </w:r>
-            <w:r>
-              <w:t xml:space="preserve">(the song open, undo / redo as JSON snapshots, the timeline's edits);</w:t>
+              <w:t xml:space="preserve">kapi_thread_create</w:t>
+            </w:r>
+            <w:r>
+              <w:t xml:space="preserve">) that opens the song asked for, decodes ahead and feeds</w:t>
             </w:r>
             <w:r>
               <w:t xml:space="preserve"> </w:t>
@@ -44702,41 +44743,22 @@
               <w:rPr>
                 <w:rStyle w:val="VerbatimChar"/>
               </w:rPr>
-              <w:t xml:space="preserve">audio.h</w:t>
+              <w:t xml:space="preserve">kapi_sound_write</w:t>
             </w:r>
             <w:r>
               <w:t xml:space="preserve"> </w:t>
             </w:r>
             <w:r>
-              <w:t xml:space="preserve">(the SoundFont found and loaded, the engine started on an</w:t>
-            </w:r>
-            <w:r>
-              <w:t xml:space="preserve"> </w:t>
-            </w:r>
-            <w:r>
-              <w:rPr>
-                <w:b/>
-                <w:bCs/>
-              </w:rPr>
-              <w:t xml:space="preserve">app core</w:t>
-            </w:r>
-            <w:r>
-              <w:t xml:space="preserve">, else a real-time thread, else the UI's tick; the song compiled when the document's revision changes);</w:t>
-            </w:r>
-            <w:r>
-              <w:t xml:space="preserve"> </w:t>
+              <w:t xml:space="preserve">(</w:t>
             </w:r>
             <w:r>
               <w:rPr>
                 <w:rStyle w:val="VerbatimChar"/>
               </w:rPr>
-              <w:t xml:space="preserve">arrange.h</w:t>
-            </w:r>
-            <w:r>
-              <w:t xml:space="preserve"> </w:t>
-            </w:r>
-            <w:r>
-              <w:t xml:space="preserve">(the arrangement: ONE widget the size of the view, drawing only what shows);</w:t>
+              <w:t xml:space="preserve">kapi_sound_config (1024, 3)</w:t>
+            </w:r>
+            <w:r>
+              <w:t xml:space="preserve">: ~0.1 s queued, so a pause is heard at once), at the volume (a square law); the window asks (play, pause, resume, seek, stop) and reads</w:t>
             </w:r>
             <w:r>
               <w:t xml:space="preserve"> </w:t>
@@ -44745,13 +44767,10 @@
               <w:rPr>
                 <w:rStyle w:val="VerbatimChar"/>
               </w:rPr>
-              <w:t xml:space="preserve">grid.h</w:t>
-            </w:r>
-            <w:r>
-              <w:t xml:space="preserve"> </w:t>
-            </w:r>
-            <w:r>
-              <w:t xml:space="preserve">(NoteGrid: every editor's grid — voice rows, drum lanes, the piano roll);</w:t>
+              <w:t xml:space="preserve">state</w:t>
+            </w:r>
+            <w:r>
+              <w:t xml:space="preserve">,</w:t>
             </w:r>
             <w:r>
               <w:t xml:space="preserve"> </w:t>
@@ -44760,13 +44779,13 @@
               <w:rPr>
                 <w:rStyle w:val="VerbatimChar"/>
               </w:rPr>
-              <w:t xml:space="preserve">editor.h</w:t>
+              <w:t xml:space="preserve">posMs</w:t>
             </w:r>
             <w:r>
               <w:t xml:space="preserve"> </w:t>
             </w:r>
             <w:r>
-              <w:t xml:space="preserve">+</w:t>
+              <w:t xml:space="preserve">(what is heard: the frames sent less those queued),</w:t>
             </w:r>
             <w:r>
               <w:t xml:space="preserve"> </w:t>
@@ -44775,7 +44794,7 @@
               <w:rPr>
                 <w:rStyle w:val="VerbatimChar"/>
               </w:rPr>
-              <w:t xml:space="preserve">ed_chord.h</w:t>
+              <w:t xml:space="preserve">lenMs</w:t>
             </w:r>
             <w:r>
               <w:t xml:space="preserve">,</w:t>
@@ -44787,7 +44806,7 @@
               <w:rPr>
                 <w:rStyle w:val="VerbatimChar"/>
               </w:rPr>
-              <w:t xml:space="preserve">ed_rhythm.h</w:t>
+              <w:t xml:space="preserve">endedGen</w:t>
             </w:r>
             <w:r>
               <w:t xml:space="preserve">,</w:t>
@@ -44799,13 +44818,13 @@
               <w:rPr>
                 <w:rStyle w:val="VerbatimChar"/>
               </w:rPr>
-              <w:t xml:space="preserve">ed_riff.h</w:t>
+              <w:t xml:space="preserve">errGen</w:t>
             </w:r>
             <w:r>
               <w:t xml:space="preserve"> </w:t>
             </w:r>
             <w:r>
-              <w:t xml:space="preserve">(the block editors: a form of wtk controls in columns, a grid or a wheel on the right);</w:t>
+              <w:t xml:space="preserve">under a</w:t>
             </w:r>
             <w:r>
               <w:t xml:space="preserve"> </w:t>
@@ -44814,37 +44833,43 @@
               <w:rPr>
                 <w:rStyle w:val="VerbatimChar"/>
               </w:rPr>
-              <w:t xml:space="preserve">ops.h</w:t>
-            </w:r>
-            <w:r>
-              <w:t xml:space="preserve"> </w:t>
-            </w:r>
-            <w:r>
-              <w:t xml:space="preserve">(the editors' operations: the drum catalog, euclidean rhythms, the degree vocabulary, cadences, the next chord);</w:t>
-            </w:r>
-            <w:r>
-              <w:t xml:space="preserve"> </w:t>
-            </w:r>
+              <w:t xml:space="preserve">kapi_lock</w:t>
+            </w:r>
+            <w:r>
+              <w:t xml:space="preserve">. No output (the simulator): the song is decoded and timed silently.</w:t>
+            </w:r>
+          </w:p>
+        </w:tc>
+      </w:tr>
+      <w:tr>
+        <w:tc>
+          <w:tcPr/>
+          <w:p>
+            <w:pPr>
+              <w:pStyle w:val="Compact"/>
+            </w:pPr>
             <w:r>
               <w:rPr>
                 <w:rStyle w:val="VerbatimChar"/>
               </w:rPr>
-              <w:t xml:space="preserve">dialogs.h</w:t>
-            </w:r>
-            <w:r>
-              <w:t xml:space="preserve">,</w:t>
-            </w:r>
-            <w:r>
-              <w:t xml:space="preserve"> </w:t>
-            </w:r>
+              <w:t xml:space="preserve">tags.h</w:t>
+            </w:r>
+          </w:p>
+        </w:tc>
+        <w:tc>
+          <w:tcPr/>
+          <w:p>
+            <w:pPr>
+              <w:pStyle w:val="Compact"/>
+            </w:pPr>
             <w:r>
               <w:rPr>
                 <w:rStyle w:val="VerbatimChar"/>
               </w:rPr>
-              <w:t xml:space="preserve">ai_dialog.h</w:t>
-            </w:r>
-            <w:r>
-              <w:t xml:space="preserve">,</w:t>
+              <w:t xml:space="preserve">read_tags</w:t>
+            </w:r>
+            <w:r>
+              <w:t xml:space="preserve">: ID3v2.2–2.4 (Latin-1, UTF-16, UTF-8;</w:t>
             </w:r>
             <w:r>
               <w:t xml:space="preserve"> </w:t>
@@ -44853,13 +44878,10 @@
               <w:rPr>
                 <w:rStyle w:val="VerbatimChar"/>
               </w:rPr>
-              <w:t xml:space="preserve">chain.h</w:t>
-            </w:r>
-            <w:r>
-              <w:t xml:space="preserve"> </w:t>
-            </w:r>
-            <w:r>
-              <w:t xml:space="preserve">(a track's sound chain, a plugin's editor floating),</w:t>
+              <w:t xml:space="preserve">APIC</w:t>
+            </w:r>
+            <w:r>
+              <w:t xml:space="preserve">: the cover's offset and length in the file) then ID3v1, the MP3's length (the Xing / Info / VBRI header, else the bit rate), FLAC's</w:t>
             </w:r>
             <w:r>
               <w:t xml:space="preserve"> </w:t>
@@ -44868,13 +44890,511 @@
               <w:rPr>
                 <w:rStyle w:val="VerbatimChar"/>
               </w:rPr>
-              <w:t xml:space="preserve">chrome.h</w:t>
+              <w:t xml:space="preserve">STREAMINFO</w:t>
+            </w:r>
+            <w:r>
+              <w:t xml:space="preserve">,</w:t>
             </w:r>
             <w:r>
               <w:t xml:space="preserve"> </w:t>
             </w:r>
             <w:r>
-              <w:t xml:space="preserve">(the transport bar, the browser, the editor's host, the status bar).</w:t>
+              <w:rPr>
+                <w:rStyle w:val="VerbatimChar"/>
+              </w:rPr>
+              <w:t xml:space="preserve">VORBIS_COMMENT</w:t>
+            </w:r>
+            <w:r>
+              <w:t xml:space="preserve">,</w:t>
+            </w:r>
+            <w:r>
+              <w:t xml:space="preserve"> </w:t>
+            </w:r>
+            <w:r>
+              <w:rPr>
+                <w:rStyle w:val="VerbatimChar"/>
+              </w:rPr>
+              <w:t xml:space="preserve">PICTURE</w:t>
+            </w:r>
+            <w:r>
+              <w:t xml:space="preserve">, Ogg's comment header and the last page's granule, WAV's</w:t>
+            </w:r>
+            <w:r>
+              <w:t xml:space="preserve"> </w:t>
+            </w:r>
+            <w:r>
+              <w:rPr>
+                <w:rStyle w:val="VerbatimChar"/>
+              </w:rPr>
+              <w:t xml:space="preserve">fmt</w:t>
+            </w:r>
+            <w:r>
+              <w:t xml:space="preserve">,</w:t>
+            </w:r>
+            <w:r>
+              <w:t xml:space="preserve"> </w:t>
+            </w:r>
+            <w:r>
+              <w:rPr>
+                <w:rStyle w:val="VerbatimChar"/>
+              </w:rPr>
+              <w:t xml:space="preserve">data</w:t>
+            </w:r>
+            <w:r>
+              <w:t xml:space="preserve">,</w:t>
+            </w:r>
+            <w:r>
+              <w:t xml:space="preserve"> </w:t>
+            </w:r>
+            <w:r>
+              <w:rPr>
+                <w:rStyle w:val="VerbatimChar"/>
+              </w:rPr>
+              <w:t xml:space="preserve">LIST INFO</w:t>
+            </w:r>
+            <w:r>
+              <w:t xml:space="preserve">, MIDI's track name; the path fills the rest (</w:t>
+            </w:r>
+            <w:r>
+              <w:rPr>
+                <w:rStyle w:val="VerbatimChar"/>
+              </w:rPr>
+              <w:t xml:space="preserve">&lt;artist&gt;/&lt;album&gt;/&lt;nn&gt; - &lt;title&gt;</w:t>
+            </w:r>
+            <w:r>
+              <w:t xml:space="preserve">).</w:t>
+            </w:r>
+          </w:p>
+        </w:tc>
+      </w:tr>
+      <w:tr>
+        <w:tc>
+          <w:tcPr/>
+          <w:p>
+            <w:pPr>
+              <w:pStyle w:val="Compact"/>
+            </w:pPr>
+            <w:r>
+              <w:rPr>
+                <w:rStyle w:val="VerbatimChar"/>
+              </w:rPr>
+              <w:t xml:space="preserve">lib.h</w:t>
+            </w:r>
+          </w:p>
+        </w:tc>
+        <w:tc>
+          <w:tcPr/>
+          <w:p>
+            <w:pPr>
+              <w:pStyle w:val="Compact"/>
+            </w:pPr>
+            <w:r>
+              <w:rPr>
+                <w:rStyle w:val="VerbatimChar"/>
+              </w:rPr>
+              <w:t xml:space="preserve">Library</w:t>
+            </w:r>
+            <w:r>
+              <w:t xml:space="preserve">: the songs (strings</w:t>
+            </w:r>
+            <w:r>
+              <w:t xml:space="preserve"> </w:t>
+            </w:r>
+            <w:r>
+              <w:rPr>
+                <w:rStyle w:val="VerbatimChar"/>
+              </w:rPr>
+              <w:t xml:space="preserve">strdup</w:t>
+            </w:r>
+            <w:r>
+              <w:t xml:space="preserve">'d), grouped by</w:t>
+            </w:r>
+            <w:r>
+              <w:t xml:space="preserve"> </w:t>
+            </w:r>
+            <w:r>
+              <w:rPr>
+                <w:rStyle w:val="VerbatimChar"/>
+              </w:rPr>
+              <w:t xml:space="preserve">build ()</w:t>
+            </w:r>
+            <w:r>
+              <w:t xml:space="preserve"> </w:t>
+            </w:r>
+            <w:r>
+              <w:t xml:space="preserve">into albums (album artist — else artist — and album), artists, genres, folders;</w:t>
+            </w:r>
+            <w:r>
+              <w:t xml:space="preserve"> </w:t>
+            </w:r>
+            <w:r>
+              <w:rPr>
+                <w:rStyle w:val="VerbatimChar"/>
+              </w:rPr>
+              <w:t xml:space="preserve">sort_idx</w:t>
+            </w:r>
+            <w:r>
+              <w:t xml:space="preserve"> </w:t>
+            </w:r>
+            <w:r>
+              <w:t xml:space="preserve">(a merge sort with a context: the scan's thread sorts too);</w:t>
+            </w:r>
+            <w:r>
+              <w:t xml:space="preserve"> </w:t>
+            </w:r>
+            <w:r>
+              <w:rPr>
+                <w:rStyle w:val="VerbatimChar"/>
+              </w:rPr>
+              <w:t xml:space="preserve">library.tsv</w:t>
+            </w:r>
+            <w:r>
+              <w:t xml:space="preserve"> </w:t>
+            </w:r>
+            <w:r>
+              <w:t xml:space="preserve">/</w:t>
+            </w:r>
+            <w:r>
+              <w:t xml:space="preserve"> </w:t>
+            </w:r>
+            <w:r>
+              <w:rPr>
+                <w:rStyle w:val="VerbatimChar"/>
+              </w:rPr>
+              <w:t xml:space="preserve">stats.tsv</w:t>
+            </w:r>
+            <w:r>
+              <w:t xml:space="preserve">; the scan (</w:t>
+            </w:r>
+            <w:r>
+              <w:rPr>
+                <w:rStyle w:val="VerbatimChar"/>
+              </w:rPr>
+              <w:t xml:space="preserve">scan_dir</w:t>
+            </w:r>
+            <w:r>
+              <w:t xml:space="preserve">,</w:t>
+            </w:r>
+            <w:r>
+              <w:t xml:space="preserve"> </w:t>
+            </w:r>
+            <w:r>
+              <w:rPr>
+                <w:rStyle w:val="VerbatimChar"/>
+              </w:rPr>
+              <w:t xml:space="preserve">scan_thread</w:t>
+            </w:r>
+            <w:r>
+              <w:t xml:space="preserve">): the folders walked, a known file (same path, same size) copied, the others read; a folder's</w:t>
+            </w:r>
+            <w:r>
+              <w:t xml:space="preserve"> </w:t>
+            </w:r>
+            <w:r>
+              <w:rPr>
+                <w:rStyle w:val="VerbatimChar"/>
+              </w:rPr>
+              <w:t xml:space="preserve">cover.jpg</w:t>
+            </w:r>
+            <w:r>
+              <w:t xml:space="preserve"> </w:t>
+            </w:r>
+            <w:r>
+              <w:t xml:space="preserve">noted.</w:t>
+            </w:r>
+          </w:p>
+        </w:tc>
+      </w:tr>
+      <w:tr>
+        <w:tc>
+          <w:tcPr/>
+          <w:p>
+            <w:pPr>
+              <w:pStyle w:val="Compact"/>
+            </w:pPr>
+            <w:r>
+              <w:rPr>
+                <w:rStyle w:val="VerbatimChar"/>
+              </w:rPr>
+              <w:t xml:space="preserve">covers.h</w:t>
+            </w:r>
+          </w:p>
+        </w:tc>
+        <w:tc>
+          <w:tcPr/>
+          <w:p>
+            <w:pPr>
+              <w:pStyle w:val="Compact"/>
+            </w:pPr>
+            <w:r>
+              <w:rPr>
+                <w:rStyle w:val="VerbatimChar"/>
+              </w:rPr>
+              <w:t xml:space="preserve">Covers</w:t>
+            </w:r>
+            <w:r>
+              <w:t xml:space="preserve">: a thread decodes the pictures (</w:t>
+            </w:r>
+            <w:r>
+              <w:rPr>
+                <w:rStyle w:val="VerbatimChar"/>
+              </w:rPr>
+              <w:t xml:space="preserve">img_load_mem</w:t>
+            </w:r>
+            <w:r>
+              <w:t xml:space="preserve"> </w:t>
+            </w:r>
+            <w:r>
+              <w:t xml:space="preserve">/</w:t>
+            </w:r>
+            <w:r>
+              <w:t xml:space="preserve"> </w:t>
+            </w:r>
+            <w:r>
+              <w:rPr>
+                <w:rStyle w:val="VerbatimChar"/>
+              </w:rPr>
+              <w:t xml:space="preserve">img_load</w:t>
+            </w:r>
+            <w:r>
+              <w:t xml:space="preserve">), cropped square at 320 px; each size drawn is made once (box filter, bilinear up) and cached (the oldest dropped); an album without a picture gets one drawn from its name;</w:t>
+            </w:r>
+            <w:r>
+              <w:t xml:space="preserve"> </w:t>
+            </w:r>
+            <w:r>
+              <w:rPr>
+                <w:rStyle w:val="VerbatimChar"/>
+              </w:rPr>
+              <w:t xml:space="preserve">round_corners</w:t>
+            </w:r>
+            <w:r>
+              <w:t xml:space="preserve"> </w:t>
+            </w:r>
+            <w:r>
+              <w:t xml:space="preserve">(polygons over the corners);</w:t>
+            </w:r>
+            <w:r>
+              <w:t xml:space="preserve"> </w:t>
+            </w:r>
+            <w:r>
+              <w:rPr>
+                <w:rStyle w:val="VerbatimChar"/>
+              </w:rPr>
+              <w:t xml:space="preserve">tone ()</w:t>
+            </w:r>
+            <w:r>
+              <w:t xml:space="preserve"> </w:t>
+            </w:r>
+            <w:r>
+              <w:t xml:space="preserve">(a cover's colour: the bands, now playing).</w:t>
+            </w:r>
+          </w:p>
+        </w:tc>
+      </w:tr>
+      <w:tr>
+        <w:tc>
+          <w:tcPr/>
+          <w:p>
+            <w:pPr>
+              <w:pStyle w:val="Compact"/>
+            </w:pPr>
+            <w:r>
+              <w:rPr>
+                <w:rStyle w:val="VerbatimChar"/>
+              </w:rPr>
+              <w:t xml:space="preserve">ui.h</w:t>
+            </w:r>
+          </w:p>
+        </w:tc>
+        <w:tc>
+          <w:tcPr/>
+          <w:p>
+            <w:pPr>
+              <w:pStyle w:val="Compact"/>
+            </w:pPr>
+            <w:r>
+              <w:t xml:space="preserve">The faces (DejaVu Sans 11 … 27), text cut to fit, the times, the icons (</w:t>
+            </w:r>
+            <w:r>
+              <w:rPr>
+                <w:rStyle w:val="VerbatimChar"/>
+              </w:rPr>
+              <w:t xml:space="preserve">wtk/vpaint.h</w:t>
+            </w:r>
+            <w:r>
+              <w:t xml:space="preserve">),</w:t>
+            </w:r>
+            <w:r>
+              <w:t xml:space="preserve"> </w:t>
+            </w:r>
+            <w:r>
+              <w:rPr>
+                <w:rStyle w:val="VerbatimChar"/>
+              </w:rPr>
+              <w:t xml:space="preserve">IntList</w:t>
+            </w:r>
+            <w:r>
+              <w:t xml:space="preserve">.</w:t>
+            </w:r>
+          </w:p>
+        </w:tc>
+      </w:tr>
+      <w:tr>
+        <w:tc>
+          <w:tcPr/>
+          <w:p>
+            <w:pPr>
+              <w:pStyle w:val="Compact"/>
+            </w:pPr>
+            <w:r>
+              <w:rPr>
+                <w:rStyle w:val="VerbatimChar"/>
+              </w:rPr>
+              <w:t xml:space="preserve">main.cpp</w:t>
+            </w:r>
+          </w:p>
+        </w:tc>
+        <w:tc>
+          <w:tcPr/>
+          <w:p>
+            <w:pPr>
+              <w:pStyle w:val="Compact"/>
+            </w:pPr>
+            <w:r>
+              <w:t xml:space="preserve">The settings, the playlists (</w:t>
+            </w:r>
+            <w:r>
+              <w:rPr>
+                <w:rStyle w:val="VerbatimChar"/>
+              </w:rPr>
+              <w:t xml:space="preserve">.m3u</w:t>
+            </w:r>
+            <w:r>
+              <w:t xml:space="preserve">), the queue (its order, shuffled or not; ids &lt; 0: a file opened that is not in the library), the pages (</w:t>
+            </w:r>
+            <w:r>
+              <w:rPr>
+                <w:rStyle w:val="VerbatimChar"/>
+              </w:rPr>
+              <w:t xml:space="preserve">Page</w:t>
+            </w:r>
+            <w:r>
+              <w:t xml:space="preserve">, back / forward), the widgets —</w:t>
+            </w:r>
+            <w:r>
+              <w:t xml:space="preserve"> </w:t>
+            </w:r>
+            <w:r>
+              <w:rPr>
+                <w:rStyle w:val="VerbatimChar"/>
+              </w:rPr>
+              <w:t xml:space="preserve">Sidebar</w:t>
+            </w:r>
+            <w:r>
+              <w:t xml:space="preserve">,</w:t>
+            </w:r>
+            <w:r>
+              <w:t xml:space="preserve"> </w:t>
+            </w:r>
+            <w:r>
+              <w:rPr>
+                <w:rStyle w:val="VerbatimChar"/>
+              </w:rPr>
+              <w:t xml:space="preserve">TopBar</w:t>
+            </w:r>
+            <w:r>
+              <w:t xml:space="preserve"> </w:t>
+            </w:r>
+            <w:r>
+              <w:t xml:space="preserve">(</w:t>
+            </w:r>
+            <w:r>
+              <w:rPr>
+                <w:rStyle w:val="VerbatimChar"/>
+              </w:rPr>
+              <w:t xml:space="preserve">SearchBox</w:t>
+            </w:r>
+            <w:r>
+              <w:t xml:space="preserve">),</w:t>
+            </w:r>
+            <w:r>
+              <w:t xml:space="preserve"> </w:t>
+            </w:r>
+            <w:r>
+              <w:rPr>
+                <w:rStyle w:val="VerbatimChar"/>
+              </w:rPr>
+              <w:t xml:space="preserve">Content</w:t>
+            </w:r>
+            <w:r>
+              <w:t xml:space="preserve"> </w:t>
+            </w:r>
+            <w:r>
+              <w:t xml:space="preserve">(every page drawn in view coordinates, its hits listed for the clicks; the songs' table, its selection, its menu),</w:t>
+            </w:r>
+            <w:r>
+              <w:t xml:space="preserve"> </w:t>
+            </w:r>
+            <w:r>
+              <w:rPr>
+                <w:rStyle w:val="VerbatimChar"/>
+              </w:rPr>
+              <w:t xml:space="preserve">NowBar</w:t>
+            </w:r>
+            <w:r>
+              <w:t xml:space="preserve">,</w:t>
+            </w:r>
+            <w:r>
+              <w:t xml:space="preserve"> </w:t>
+            </w:r>
+            <w:r>
+              <w:rPr>
+                <w:rStyle w:val="VerbatimChar"/>
+              </w:rPr>
+              <w:t xml:space="preserve">MiniView</w:t>
+            </w:r>
+            <w:r>
+              <w:t xml:space="preserve"> </w:t>
+            </w:r>
+            <w:r>
+              <w:t xml:space="preserve">—, the mini player (</w:t>
+            </w:r>
+            <w:r>
+              <w:rPr>
+                <w:rStyle w:val="VerbatimChar"/>
+              </w:rPr>
+              <w:t xml:space="preserve">kapi_resize_window2</w:t>
+            </w:r>
+            <w:r>
+              <w:t xml:space="preserve"> </w:t>
+            </w:r>
+            <w:r>
+              <w:t xml:space="preserve">+</w:t>
+            </w:r>
+            <w:r>
+              <w:t xml:space="preserve"> </w:t>
+            </w:r>
+            <w:r>
+              <w:rPr>
+                <w:rStyle w:val="VerbatimChar"/>
+              </w:rPr>
+              <w:t xml:space="preserve">kapi_move_window</w:t>
+            </w:r>
+            <w:r>
+              <w:t xml:space="preserve"> </w:t>
+            </w:r>
+            <w:r>
+              <w:t xml:space="preserve">to the work area's bottom right), the scan's end (</w:t>
+            </w:r>
+            <w:r>
+              <w:rPr>
+                <w:rStyle w:val="VerbatimChar"/>
+              </w:rPr>
+              <w:t xml:space="preserve">scan_done</w:t>
+            </w:r>
+            <w:r>
+              <w:t xml:space="preserve">: the new library swapped in, the queue and the pages mapped by path / name).</w:t>
             </w:r>
           </w:p>
         </w:tc>
@@ -44885,239 +45405,72 @@
         <w:pStyle w:val="BodyText"/>
       </w:pPr>
       <w:r>
-        <w:t xml:space="preserve">Conventions worth keeping:</w:t>
-      </w:r>
-    </w:p>
-    <w:p>
-      <w:pPr>
-        <w:pStyle w:val="Compact"/>
-        <w:numPr>
-          <w:ilvl w:val="0"/>
-          <w:numId w:val="1016"/>
-        </w:numPr>
-      </w:pPr>
-      <w:r>
         <w:rPr>
           <w:b/>
           <w:bCs/>
         </w:rPr>
-        <w:t xml:space="preserve">The document's revision</w:t>
-      </w:r>
-      <w:r>
-        <w:t xml:space="preserve">: every edit is</w:t>
-      </w:r>
-      <w:r>
-        <w:t xml:space="preserve"> </w:t>
-      </w:r>
-      <w:r>
-        <w:rPr>
-          <w:rStyle w:val="VerbatimChar"/>
-        </w:rPr>
-        <w:t xml:space="preserve">g_doc.checkpoint ()</w:t>
-      </w:r>
-      <w:r>
-        <w:t xml:space="preserve"> </w:t>
-      </w:r>
-      <w:r>
-        <w:t xml:space="preserve">(the undo step), the change, then</w:t>
-      </w:r>
-      <w:r>
-        <w:t xml:space="preserve"> </w:t>
-      </w:r>
-      <w:r>
-        <w:rPr>
-          <w:rStyle w:val="VerbatimChar"/>
-        </w:rPr>
-        <w:t xml:space="preserve">g_doc.changed ()</w:t>
-      </w:r>
-      <w:r>
-        <w:t xml:space="preserve">; the views and the audio host follow</w:t>
-      </w:r>
-      <w:r>
-        <w:t xml:space="preserve"> </w:t>
-      </w:r>
-      <w:r>
-        <w:rPr>
-          <w:rStyle w:val="VerbatimChar"/>
-        </w:rPr>
-        <w:t xml:space="preserve">g_doc.revision</w:t>
-      </w:r>
-      <w:r>
-        <w:t xml:space="preserve"> </w:t>
-      </w:r>
-      <w:r>
-        <w:t xml:space="preserve">(the song is compiled</w:t>
-      </w:r>
-      <w:r>
-        <w:t xml:space="preserve"> </w:t>
-      </w:r>
-      <w:r>
-        <w:t xml:space="preserve">again once the edits pause — a drag recompiles a few times a second).</w:t>
-      </w:r>
-    </w:p>
-    <w:p>
-      <w:pPr>
-        <w:pStyle w:val="Compact"/>
-        <w:numPr>
-          <w:ilvl w:val="0"/>
-          <w:numId w:val="1016"/>
-        </w:numPr>
-      </w:pPr>
+        <w:t xml:space="preserve">Tests on the PC</w:t>
+      </w:r>
+      <w:r>
+        <w:t xml:space="preserve">:</w:t>
+      </w:r>
+      <w:r>
+        <w:t xml:space="preserve"> </w:t>
+      </w:r>
+      <w:r>
+        <w:rPr>
+          <w:rStyle w:val="VerbatimChar"/>
+        </w:rPr>
+        <w:t xml:space="preserve">sh tools/tests/run_media_test.sh</w:t>
+      </w:r>
+      <w:r>
+        <w:t xml:space="preserve"> </w:t>
+      </w:r>
+      <w:r>
+        <w:t xml:space="preserve">— sample files made by ffmpeg (MP3, Ogg, FLAC, WAV at</w:t>
+      </w:r>
+      <w:r>
+        <w:t xml:space="preserve"> </w:t>
+      </w:r>
+      <w:r>
+        <w:t xml:space="preserve">48 kHz, a 22 kHz mono WAV) and</w:t>
+      </w:r>
+      <w:r>
+        <w:t xml:space="preserve"> </w:t>
+      </w:r>
+      <w:r>
+        <w:rPr>
+          <w:rStyle w:val="VerbatimChar"/>
+        </w:rPr>
+        <w:t xml:space="preserve">tools/tests/media/make_midi.py</w:t>
+      </w:r>
+      <w:r>
+        <w:t xml:space="preserve">, decoded by</w:t>
+      </w:r>
+      <w:r>
+        <w:t xml:space="preserve"> </w:t>
+      </w:r>
+      <w:r>
+        <w:rPr>
+          <w:rStyle w:val="VerbatimChar"/>
+        </w:rPr>
+        <w:t xml:space="preserve">tools/tests/media/dectest.cpp</w:t>
+      </w:r>
+      <w:r>
+        <w:t xml:space="preserve"> </w:t>
+      </w:r>
+      <w:r>
+        <w:t xml:space="preserve">through the simulator's kapi: the length, the level, a seek, each.</w:t>
+      </w:r>
+      <w:r>
+        <w:t xml:space="preserve"> </w:t>
+      </w:r>
       <w:r>
         <w:rPr>
           <w:b/>
           <w:bCs/>
         </w:rPr>
-        <w:t xml:space="preserve">An editor never deletes itself</w:t>
-      </w:r>
-      <w:r>
-        <w:t xml:space="preserve">: a change that needs other controls sets</w:t>
-      </w:r>
-      <w:r>
-        <w:t xml:space="preserve"> </w:t>
-      </w:r>
-      <w:r>
-        <w:rPr>
-          <w:rStyle w:val="VerbatimChar"/>
-        </w:rPr>
-        <w:t xml:space="preserve">g_rebuildEditor</w:t>
-      </w:r>
-      <w:r>
-        <w:t xml:space="preserve">;</w:t>
-      </w:r>
-      <w:r>
-        <w:t xml:space="preserve"> </w:t>
-      </w:r>
-      <w:r>
-        <w:t xml:space="preserve">the Root's tick makes the editor again from the model (the same after an undo: the pointers into</w:t>
-      </w:r>
-      <w:r>
-        <w:t xml:space="preserve"> </w:t>
-      </w:r>
-      <w:r>
-        <w:t xml:space="preserve">the song are stale then).</w:t>
-      </w:r>
-    </w:p>
-    <w:p>
-      <w:pPr>
-        <w:pStyle w:val="Compact"/>
-        <w:numPr>
-          <w:ilvl w:val="0"/>
-          <w:numId w:val="1016"/>
-        </w:numPr>
-      </w:pPr>
-      <w:r>
-        <w:rPr>
-          <w:b/>
-          <w:bCs/>
-        </w:rPr>
-        <w:t xml:space="preserve">The audio thread / core</w:t>
-      </w:r>
-      <w:r>
-        <w:t xml:space="preserve"> </w:t>
-      </w:r>
-      <w:r>
-        <w:t xml:space="preserve">makes no kapi call and allocates nothing; the UI posts commands</w:t>
-      </w:r>
-      <w:r>
-        <w:t xml:space="preserve"> </w:t>
-      </w:r>
-      <w:r>
-        <w:t xml:space="preserve">(</w:t>
-      </w:r>
-      <w:r>
-        <w:rPr>
-          <w:rStyle w:val="VerbatimChar"/>
-        </w:rPr>
-        <w:t xml:space="preserve">Engine::post</w:t>
-      </w:r>
-      <w:r>
-        <w:t xml:space="preserve">) and frees the songs the engine hands back (</w:t>
-      </w:r>
-      <w:r>
-        <w:rPr>
-          <w:rStyle w:val="VerbatimChar"/>
-        </w:rPr>
-        <w:t xml:space="preserve">retired ()</w:t>
-      </w:r>
-      <w:r>
-        <w:t xml:space="preserve">).</w:t>
-      </w:r>
-    </w:p>
-    <w:p>
-      <w:pPr>
-        <w:pStyle w:val="Compact"/>
-        <w:numPr>
-          <w:ilvl w:val="0"/>
-          <w:numId w:val="1016"/>
-        </w:numPr>
-      </w:pPr>
-      <w:r>
-        <w:rPr>
-          <w:b/>
-          <w:bCs/>
-        </w:rPr>
-        <w:t xml:space="preserve">Memory</w:t>
-      </w:r>
-      <w:r>
-        <w:t xml:space="preserve">: JSON documents are arenas (</w:t>
-      </w:r>
-      <w:r>
-        <w:rPr>
-          <w:rStyle w:val="VerbatimChar"/>
-        </w:rPr>
-        <w:t xml:space="preserve">json.hpp</w:t>
-      </w:r>
-      <w:r>
-        <w:t xml:space="preserve">), freed as a whole; the song and its modules are</w:t>
-      </w:r>
-      <w:r>
-        <w:t xml:space="preserve"> </w:t>
-      </w:r>
-      <w:r>
-        <w:t xml:space="preserve">owned values (an</w:t>
-      </w:r>
-      <w:r>
-        <w:t xml:space="preserve"> </w:t>
-      </w:r>
-      <w:r>
-        <w:rPr>
-          <w:rStyle w:val="VerbatimChar"/>
-        </w:rPr>
-        <w:t xml:space="preserve">Item</w:t>
-      </w:r>
-      <w:r>
-        <w:t xml:space="preserve"> </w:t>
-      </w:r>
-      <w:r>
-        <w:t xml:space="preserve">owns its module, copies clone it). On the PC the app runs in the desktop</w:t>
-      </w:r>
-      <w:r>
-        <w:t xml:space="preserve"> </w:t>
-      </w:r>
-      <w:r>
-        <w:t xml:space="preserve">simulator (</w:t>
-      </w:r>
-      <w:r>
-        <w:rPr>
-          <w:rStyle w:val="VerbatimChar"/>
-        </w:rPr>
-        <w:t xml:space="preserve">sh tools/tests/desktop_sim/shots.sh koton</w:t>
-      </w:r>
-      <w:r>
-        <w:t xml:space="preserve">) and under valgrind with the host allocator</w:t>
-      </w:r>
-      <w:r>
-        <w:t xml:space="preserve"> </w:t>
-      </w:r>
-      <w:r>
-        <w:t xml:space="preserve">(</w:t>
-      </w:r>
-      <w:r>
-        <w:rPr>
-          <w:rStyle w:val="VerbatimChar"/>
-        </w:rPr>
-        <w:t xml:space="preserve">-DONYX_CPP_HPP -include new</w:t>
+        <w:t xml:space="preserve">The screenshots</w:t>
       </w:r>
       <w:r>
         <w:t xml:space="preserve">:</w:t>
@@ -45129,165 +45482,77 @@
         <w:rPr>
           <w:rStyle w:val="VerbatimChar"/>
         </w:rPr>
-        <w:t xml:space="preserve">onyxpp.hpp</w:t>
-      </w:r>
-      <w:r>
-        <w:t xml:space="preserve">'s allocator left out) — the engine's and the AI's own</w:t>
-      </w:r>
-      <w:r>
-        <w:t xml:space="preserve"> </w:t>
-      </w:r>
-      <w:r>
-        <w:t xml:space="preserve">tests run under ASan / UBSan / LSan (</w:t>
-      </w:r>
-      <w:r>
-        <w:rPr>
-          <w:rStyle w:val="VerbatimChar"/>
-        </w:rPr>
-        <w:t xml:space="preserve">sh tools/tests/koton/engine_run.sh</w:t>
-      </w:r>
-      <w:r>
-        <w:t xml:space="preserve">,</w:t>
-      </w:r>
-      <w:r>
-        <w:t xml:space="preserve"> </w:t>
-      </w:r>
-      <w:r>
-        <w:rPr>
-          <w:rStyle w:val="VerbatimChar"/>
-        </w:rPr>
-        <w:t xml:space="preserve">ai_run.sh</w:t>
-      </w:r>
-      <w:r>
-        <w:t xml:space="preserve">,</w:t>
-      </w:r>
-      <w:r>
-        <w:t xml:space="preserve"> </w:t>
-      </w:r>
-      <w:r>
-        <w:rPr>
-          <w:rStyle w:val="VerbatimChar"/>
-        </w:rPr>
-        <w:t xml:space="preserve">synth_run.sh</w:t>
-      </w:r>
-      <w:r>
-        <w:t xml:space="preserve">). (ASan cannot run the simulator itself: its shadow memory takes the kapi table's</w:t>
-      </w:r>
-      <w:r>
-        <w:t xml:space="preserve"> </w:t>
-      </w:r>
-      <w:r>
-        <w:t xml:space="preserve">fixed address.)</w:t>
-      </w:r>
-    </w:p>
-    <w:p>
-      <w:pPr>
-        <w:pStyle w:val="Compact"/>
-        <w:numPr>
-          <w:ilvl w:val="0"/>
-          <w:numId w:val="1016"/>
-        </w:numPr>
-      </w:pPr>
-      <w:r>
-        <w:rPr>
-          <w:b/>
-          <w:bCs/>
-        </w:rPr>
-        <w:t xml:space="preserve">Static objects</w:t>
-      </w:r>
-      <w:r>
-        <w:t xml:space="preserve"> </w:t>
-      </w:r>
-      <w:r>
-        <w:t xml:space="preserve">that allocate must not be made before</w:t>
-      </w:r>
-      <w:r>
-        <w:t xml:space="preserve"> </w:t>
-      </w:r>
-      <w:r>
-        <w:rPr>
-          <w:rStyle w:val="VerbatimChar"/>
-        </w:rPr>
-        <w:t xml:space="preserve">main</w:t>
-      </w:r>
-      <w:r>
-        <w:t xml:space="preserve"> </w:t>
-      </w:r>
-      <w:r>
-        <w:t xml:space="preserve">(the kapi table is not there yet</w:t>
-      </w:r>
-      <w:r>
-        <w:t xml:space="preserve"> </w:t>
-      </w:r>
-      <w:r>
-        <w:t xml:space="preserve">on Onyx): Koton makes its document in</w:t>
-      </w:r>
-      <w:r>
-        <w:t xml:space="preserve"> </w:t>
-      </w:r>
-      <w:r>
-        <w:rPr>
-          <w:rStyle w:val="VerbatimChar"/>
-        </w:rPr>
-        <w:t xml:space="preserve">main</w:t>
-      </w:r>
-      <w:r>
-        <w:t xml:space="preserve"> </w:t>
-      </w:r>
-      <w:r>
-        <w:t xml:space="preserve">(</w:t>
-      </w:r>
-      <w:r>
-        <w:rPr>
-          <w:rStyle w:val="VerbatimChar"/>
-        </w:rPr>
-        <w:t xml:space="preserve">g_doc</w:t>
-      </w:r>
-      <w:r>
-        <w:t xml:space="preserve"> </w:t>
-      </w:r>
-      <w:r>
-        <w:t xml:space="preserve">is a reference to storage constructed there).</w:t>
+        <w:t xml:space="preserve">sh tools/tests/desktop_sim/shots.sh media</w:t>
+      </w:r>
+      <w:r>
+        <w:t xml:space="preserve"> </w:t>
+      </w:r>
+      <w:r>
+        <w:t xml:space="preserve">over a sample library made by</w:t>
+      </w:r>
+      <w:r>
+        <w:t xml:space="preserve"> </w:t>
+      </w:r>
+      <w:r>
+        <w:rPr>
+          <w:rStyle w:val="VerbatimChar"/>
+        </w:rPr>
+        <w:t xml:space="preserve">tools/tests/media/make_library.py</w:t>
+      </w:r>
+      <w:r>
+        <w:t xml:space="preserve"> </w:t>
+      </w:r>
+      <w:r>
+        <w:t xml:space="preserve">(the mock-ups' albums and covers in every format, two MIDI albums, playlists, play counts; needs ffmpeg and</w:t>
+      </w:r>
+      <w:r>
+        <w:t xml:space="preserve"> </w:t>
+      </w:r>
+      <w:r>
+        <w:rPr>
+          <w:rStyle w:val="VerbatimChar"/>
+        </w:rPr>
+        <w:t xml:space="preserve">pip install mutagen</w:t>
+      </w:r>
+      <w:r>
+        <w:t xml:space="preserve">); the simulator got events (</w:t>
+      </w:r>
+      <w:r>
+        <w:rPr>
+          <w:rStyle w:val="VerbatimChar"/>
+        </w:rPr>
+        <w:t xml:space="preserve">event_create / set / reset / wait</w:t>
+      </w:r>
+      <w:r>
+        <w:t xml:space="preserve">, pthreads). The icon:</w:t>
+      </w:r>
+      <w:r>
+        <w:t xml:space="preserve"> </w:t>
+      </w:r>
+      <w:r>
+        <w:rPr>
+          <w:rStyle w:val="VerbatimChar"/>
+        </w:rPr>
+        <w:t xml:space="preserve">python3 tools/icons/media_icon.py</w:t>
+      </w:r>
+      <w:r>
+        <w:t xml:space="preserve">.</w:t>
       </w:r>
     </w:p>
     <w:bookmarkEnd w:id="45"/>
-    <w:bookmarkStart w:id="50" w:name="Xaed6078f9236dd71c6901d3b4b7c078cf403560"/>
+    <w:bookmarkStart w:id="46" w:name="X292acd1b77966009c7799e5ef4fd99b22efd18c"/>
     <w:p>
       <w:pPr>
         <w:pStyle w:val="Heading3"/>
       </w:pPr>
       <w:r>
-        <w:t xml:space="preserve">Koton's plugins: processes over IPC (</w:t>
-      </w:r>
-      <w:r>
-        <w:rPr>
-          <w:rStyle w:val="VerbatimChar"/>
-        </w:rPr>
-        <w:t xml:space="preserve">kplug.h</w:t>
-      </w:r>
-      <w:r>
-        <w:t xml:space="preserve">,</w:t>
-      </w:r>
-      <w:r>
-        <w:t xml:space="preserve"> </w:t>
-      </w:r>
-      <w:r>
-        <w:rPr>
-          <w:rStyle w:val="VerbatimChar"/>
-        </w:rPr>
-        <w:t xml:space="preserve">kplug_proto.h</w:t>
-      </w:r>
-      <w:r>
-        <w:t xml:space="preserve">,</w:t>
-      </w:r>
-      <w:r>
-        <w:t xml:space="preserve"> </w:t>
-      </w:r>
-      <w:r>
-        <w:rPr>
-          <w:rStyle w:val="VerbatimChar"/>
-        </w:rPr>
-        <w:t xml:space="preserve">Apps/koton/plug</w:t>
+        <w:t xml:space="preserve">A large app: Koton, the studio (</w:t>
+      </w:r>
+      <w:r>
+        <w:rPr>
+          <w:rStyle w:val="VerbatimChar"/>
+        </w:rPr>
+        <w:t xml:space="preserve">user/Apps/koton</w:t>
       </w:r>
       <w:r>
         <w:t xml:space="preserve">)</w:t>
@@ -45298,7 +45563,22 @@
         <w:pStyle w:val="FirstParagraph"/>
       </w:pPr>
       <w:r>
-        <w:t xml:space="preserve">Koton's instruments, effects and generators beyond the SoundFont are</w:t>
+        <w:t xml:space="preserve">Koton (the DAW:</w:t>
+      </w:r>
+      <w:r>
+        <w:t xml:space="preserve"> </w:t>
+      </w:r>
+      <w:r>
+        <w:rPr>
+          <w:rStyle w:val="VerbatimChar"/>
+        </w:rPr>
+        <w:t xml:space="preserve">docs/daw/README.md</w:t>
+      </w:r>
+      <w:r>
+        <w:t xml:space="preserve"> </w:t>
+      </w:r>
+      <w:r>
+        <w:t xml:space="preserve">has its plan and the user's decisions) is a</w:t>
       </w:r>
       <w:r>
         <w:t xml:space="preserve"> </w:t>
@@ -45308,16 +45588,105 @@
           <w:b/>
           <w:bCs/>
         </w:rPr>
-        <w:t xml:space="preserve">plugins</w:t>
-      </w:r>
-      <w:r>
-        <w:t xml:space="preserve">, each a process of</w:t>
-      </w:r>
-      <w:r>
-        <w:t xml:space="preserve"> </w:t>
-      </w:r>
-      <w:r>
-        <w:t xml:space="preserve">its own — the way the Control Panel hosts its applets: a crash in one never takes Koton down.</w:t>
+        <w:t xml:space="preserve">newlib</w:t>
+      </w:r>
+      <w:r>
+        <w:t xml:space="preserve"> </w:t>
+      </w:r>
+      <w:r>
+        <w:t xml:space="preserve">wtk app</w:t>
+      </w:r>
+      <w:r>
+        <w:t xml:space="preserve"> </w:t>
+      </w:r>
+      <w:r>
+        <w:t xml:space="preserve">(</w:t>
+      </w:r>
+      <w:r>
+        <w:rPr>
+          <w:rStyle w:val="VerbatimChar"/>
+        </w:rPr>
+        <w:t xml:space="preserve">koton.elf</w:t>
+      </w:r>
+      <w:r>
+        <w:t xml:space="preserve"> </w:t>
+      </w:r>
+      <w:r>
+        <w:t xml:space="preserve">in</w:t>
+      </w:r>
+      <w:r>
+        <w:t xml:space="preserve"> </w:t>
+      </w:r>
+      <w:hyperlink r:id="rId31">
+        <w:r>
+          <w:rPr>
+            <w:rStyle w:val="VerbatimChar"/>
+          </w:rPr>
+          <w:t xml:space="preserve">user/Makefile</w:t>
+        </w:r>
+      </w:hyperlink>
+      <w:r>
+        <w:t xml:space="preserve">: the engine, MeltySynth and the plugin host are</w:t>
+      </w:r>
+      <w:r>
+        <w:t xml:space="preserve"> </w:t>
+      </w:r>
+      <w:r>
+        <w:t xml:space="preserve">separate objects in</w:t>
+      </w:r>
+      <w:r>
+        <w:t xml:space="preserve"> </w:t>
+      </w:r>
+      <w:r>
+        <w:rPr>
+          <w:rStyle w:val="VerbatimChar"/>
+        </w:rPr>
+        <w:t xml:space="preserve">Apps/koton/obj/</w:t>
+      </w:r>
+      <w:r>
+        <w:t xml:space="preserve">, the UI is headers included by</w:t>
+      </w:r>
+      <w:r>
+        <w:t xml:space="preserve"> </w:t>
+      </w:r>
+      <w:r>
+        <w:rPr>
+          <w:rStyle w:val="VerbatimChar"/>
+        </w:rPr>
+        <w:t xml:space="preserve">main.cpp</w:t>
+      </w:r>
+      <w:r>
+        <w:t xml:space="preserve">), with FreeType text</w:t>
+      </w:r>
+      <w:r>
+        <w:t xml:space="preserve"> </w:t>
+      </w:r>
+      <w:r>
+        <w:t xml:space="preserve">(</w:t>
+      </w:r>
+      <w:r>
+        <w:rPr>
+          <w:rStyle w:val="VerbatimChar"/>
+        </w:rPr>
+        <w:t xml:space="preserve">ft/wtkface.h</w:t>
+      </w:r>
+      <w:r>
+        <w:t xml:space="preserve">:</w:t>
+      </w:r>
+      <w:r>
+        <w:t xml:space="preserve"> </w:t>
+      </w:r>
+      <w:r>
+        <w:rPr>
+          <w:rStyle w:val="VerbatimChar"/>
+        </w:rPr>
+        <w:t xml:space="preserve">ft_wtk_install ("DejaVu Sans", 13)</w:t>
+      </w:r>
+      <w:r>
+        <w:t xml:space="preserve"> </w:t>
+      </w:r>
+      <w:r>
+        <w:t xml:space="preserve">before the Root). Its parts:</w:t>
       </w:r>
     </w:p>
     <w:tbl>
@@ -45341,7 +45710,7 @@
               <w:pStyle w:val="Compact"/>
             </w:pPr>
             <w:r>
-              <w:t xml:space="preserve">File</w:t>
+              <w:t xml:space="preserve">Folder</w:t>
             </w:r>
           </w:p>
         </w:tc>
@@ -45364,7 +45733,1023 @@
             <w:pPr>
               <w:pStyle w:val="Compact"/>
             </w:pPr>
-            <w:hyperlink r:id="rId46">
+            <w:r>
+              <w:rPr>
+                <w:rStyle w:val="VerbatimChar"/>
+              </w:rPr>
+              <w:t xml:space="preserve">engine/</w:t>
+            </w:r>
+            <w:r>
+              <w:t xml:space="preserve"> </w:t>
+            </w:r>
+            <w:r>
+              <w:t xml:space="preserve">(namespace</w:t>
+            </w:r>
+            <w:r>
+              <w:t xml:space="preserve"> </w:t>
+            </w:r>
+            <w:r>
+              <w:rPr>
+                <w:rStyle w:val="VerbatimChar"/>
+              </w:rPr>
+              <w:t xml:space="preserve">kt</w:t>
+            </w:r>
+            <w:r>
+              <w:t xml:space="preserve">)</w:t>
+            </w:r>
+          </w:p>
+        </w:tc>
+        <w:tc>
+          <w:tcPr/>
+          <w:p>
+            <w:pPr>
+              <w:pStyle w:val="Compact"/>
+            </w:pPr>
+            <w:r>
+              <w:rPr>
+                <w:rStyle w:val="VerbatimChar"/>
+              </w:rPr>
+              <w:t xml:space="preserve">kbase.h</w:t>
+            </w:r>
+            <w:r>
+              <w:t xml:space="preserve"> </w:t>
+            </w:r>
+            <w:r>
+              <w:t xml:space="preserve">(Vec, Str, .NET's seeded</w:t>
+            </w:r>
+            <w:r>
+              <w:t xml:space="preserve"> </w:t>
+            </w:r>
+            <w:r>
+              <w:rPr>
+                <w:rStyle w:val="VerbatimChar"/>
+              </w:rPr>
+              <w:t xml:space="preserve">Random</w:t>
+            </w:r>
+            <w:r>
+              <w:t xml:space="preserve"> </w:t>
+            </w:r>
+            <w:r>
+              <w:t xml:space="preserve">reproduced bit for bit, banker's rounding);</w:t>
+            </w:r>
+            <w:r>
+              <w:t xml:space="preserve"> </w:t>
+            </w:r>
+            <w:r>
+              <w:rPr>
+                <w:rStyle w:val="VerbatimChar"/>
+              </w:rPr>
+              <w:t xml:space="preserve">model.h/.cpp</w:t>
+            </w:r>
+            <w:r>
+              <w:t xml:space="preserve"> </w:t>
+            </w:r>
+            <w:r>
+              <w:t xml:space="preserve">(the song: tracks of items — a module after a silence, positions relative —, the chord track pinned last;</w:t>
+            </w:r>
+            <w:r>
+              <w:t xml:space="preserve"> </w:t>
+            </w:r>
+            <w:r>
+              <w:rPr>
+                <w:rStyle w:val="VerbatimChar"/>
+              </w:rPr>
+              <w:t xml:space="preserve">.sq</w:t>
+            </w:r>
+            <w:r>
+              <w:t xml:space="preserve"> </w:t>
+            </w:r>
+            <w:r>
+              <w:t xml:space="preserve">/</w:t>
+            </w:r>
+            <w:r>
+              <w:t xml:space="preserve"> </w:t>
+            </w:r>
+            <w:r>
+              <w:rPr>
+                <w:rStyle w:val="VerbatimChar"/>
+              </w:rPr>
+              <w:t xml:space="preserve">.kson</w:t>
+            </w:r>
+            <w:r>
+              <w:t xml:space="preserve"> </w:t>
+            </w:r>
+            <w:r>
+              <w:t xml:space="preserve">read and written with</w:t>
+            </w:r>
+            <w:r>
+              <w:t xml:space="preserve"> </w:t>
+            </w:r>
+            <w:r>
+              <w:rPr>
+                <w:rStyle w:val="VerbatimChar"/>
+              </w:rPr>
+              <w:t xml:space="preserve">json.hpp</w:t>
+            </w:r>
+            <w:r>
+              <w:t xml:space="preserve">);</w:t>
+            </w:r>
+            <w:r>
+              <w:t xml:space="preserve"> </w:t>
+            </w:r>
+            <w:r>
+              <w:rPr>
+                <w:rStyle w:val="VerbatimChar"/>
+              </w:rPr>
+              <w:t xml:space="preserve">theory</w:t>
+            </w:r>
+            <w:r>
+              <w:t xml:space="preserve"> </w:t>
+            </w:r>
+            <w:r>
+              <w:t xml:space="preserve">(the modes, 35 qualities, degrees and colours, 30 cadences, voice leading, the next-chord suggestions, key changes);</w:t>
+            </w:r>
+            <w:r>
+              <w:t xml:space="preserve"> </w:t>
+            </w:r>
+            <w:r>
+              <w:rPr>
+                <w:rStyle w:val="VerbatimChar"/>
+              </w:rPr>
+              <w:t xml:space="preserve">gen_*.cpp</w:t>
+            </w:r>
+            <w:r>
+              <w:t xml:space="preserve"> </w:t>
+            </w:r>
+            <w:r>
+              <w:t xml:space="preserve">(every module rendered to notes: the chord styles and grids, the articulation, the drums, the euclidean rings, the melodic line engine);</w:t>
+            </w:r>
+            <w:r>
+              <w:t xml:space="preserve"> </w:t>
+            </w:r>
+            <w:r>
+              <w:rPr>
+                <w:rStyle w:val="VerbatimChar"/>
+              </w:rPr>
+              <w:t xml:space="preserve">compile</w:t>
+            </w:r>
+            <w:r>
+              <w:t xml:space="preserve"> </w:t>
+            </w:r>
+            <w:r>
+              <w:t xml:space="preserve">(the song flattened to events per track, the tempo map);</w:t>
+            </w:r>
+            <w:r>
+              <w:t xml:space="preserve"> </w:t>
+            </w:r>
+            <w:r>
+              <w:rPr>
+                <w:rStyle w:val="VerbatimChar"/>
+              </w:rPr>
+              <w:t xml:space="preserve">engine</w:t>
+            </w:r>
+            <w:r>
+              <w:t xml:space="preserve"> </w:t>
+            </w:r>
+            <w:r>
+              <w:t xml:space="preserve">(the audio engine: one MeltySynth per track, a lock-free command ring, the mix, the preview voice, the metronome — no allocation, no kapi call in</w:t>
+            </w:r>
+            <w:r>
+              <w:t xml:space="preserve"> </w:t>
+            </w:r>
+            <w:r>
+              <w:rPr>
+                <w:rStyle w:val="VerbatimChar"/>
+              </w:rPr>
+              <w:t xml:space="preserve">render</w:t>
+            </w:r>
+            <w:r>
+              <w:t xml:space="preserve">);</w:t>
+            </w:r>
+            <w:r>
+              <w:t xml:space="preserve"> </w:t>
+            </w:r>
+            <w:r>
+              <w:rPr>
+                <w:rStyle w:val="VerbatimChar"/>
+              </w:rPr>
+              <w:t xml:space="preserve">ai*</w:t>
+            </w:r>
+            <w:r>
+              <w:t xml:space="preserve"> </w:t>
+            </w:r>
+            <w:r>
+              <w:t xml:space="preserve">(Koton's AI: prompts, replies placed).</w:t>
+            </w:r>
+          </w:p>
+        </w:tc>
+      </w:tr>
+      <w:tr>
+        <w:tc>
+          <w:tcPr/>
+          <w:p>
+            <w:pPr>
+              <w:pStyle w:val="Compact"/>
+            </w:pPr>
+            <w:r>
+              <w:rPr>
+                <w:rStyle w:val="VerbatimChar"/>
+              </w:rPr>
+              <w:t xml:space="preserve">synth/</w:t>
+            </w:r>
+          </w:p>
+        </w:tc>
+        <w:tc>
+          <w:tcPr/>
+          <w:p>
+            <w:pPr>
+              <w:pStyle w:val="Compact"/>
+            </w:pPr>
+            <w:r>
+              <w:t xml:space="preserve">MeltySynth (C#) ported to C++: the SoundFont reader and the synthesizer, reverb and chorus.</w:t>
+            </w:r>
+          </w:p>
+        </w:tc>
+      </w:tr>
+      <w:tr>
+        <w:tc>
+          <w:tcPr/>
+          <w:p>
+            <w:pPr>
+              <w:pStyle w:val="Compact"/>
+            </w:pPr>
+            <w:r>
+              <w:rPr>
+                <w:rStyle w:val="VerbatimChar"/>
+              </w:rPr>
+              <w:t xml:space="preserve">plug/</w:t>
+            </w:r>
+          </w:p>
+        </w:tc>
+        <w:tc>
+          <w:tcPr/>
+          <w:p>
+            <w:pPr>
+              <w:pStyle w:val="Compact"/>
+            </w:pPr>
+            <w:r>
+              <w:t xml:space="preserve">The plugin host: plugins as processes (</w:t>
+            </w:r>
+            <w:r>
+              <w:rPr>
+                <w:rStyle w:val="VerbatimChar"/>
+              </w:rPr>
+              <w:t xml:space="preserve">kplug_proto.h</w:t>
+            </w:r>
+            <w:r>
+              <w:t xml:space="preserve">,</w:t>
+            </w:r>
+            <w:r>
+              <w:t xml:space="preserve"> </w:t>
+            </w:r>
+            <w:r>
+              <w:rPr>
+                <w:rStyle w:val="VerbatimChar"/>
+              </w:rPr>
+              <w:t xml:space="preserve">kplug.h</w:t>
+            </w:r>
+            <w:r>
+              <w:t xml:space="preserve">), rendered ahead through shared rings, effects with their latency compensated, generators, editors shown as applets.</w:t>
+            </w:r>
+          </w:p>
+        </w:tc>
+      </w:tr>
+      <w:tr>
+        <w:tc>
+          <w:tcPr/>
+          <w:p>
+            <w:pPr>
+              <w:pStyle w:val="Compact"/>
+            </w:pPr>
+            <w:r>
+              <w:rPr>
+                <w:rStyle w:val="VerbatimChar"/>
+              </w:rPr>
+              <w:t xml:space="preserve">ui/</w:t>
+            </w:r>
+            <w:r>
+              <w:t xml:space="preserve"> </w:t>
+            </w:r>
+            <w:r>
+              <w:t xml:space="preserve">(namespace</w:t>
+            </w:r>
+            <w:r>
+              <w:t xml:space="preserve"> </w:t>
+            </w:r>
+            <w:r>
+              <w:rPr>
+                <w:rStyle w:val="VerbatimChar"/>
+              </w:rPr>
+              <w:t xml:space="preserve">kui</w:t>
+            </w:r>
+            <w:r>
+              <w:t xml:space="preserve">)</w:t>
+            </w:r>
+          </w:p>
+        </w:tc>
+        <w:tc>
+          <w:tcPr/>
+          <w:p>
+            <w:pPr>
+              <w:pStyle w:val="Compact"/>
+            </w:pPr>
+            <w:r>
+              <w:rPr>
+                <w:rStyle w:val="VerbatimChar"/>
+              </w:rPr>
+              <w:t xml:space="preserve">palette.h</w:t>
+            </w:r>
+            <w:r>
+              <w:t xml:space="preserve"> </w:t>
+            </w:r>
+            <w:r>
+              <w:t xml:space="preserve">(the studio's colours as a wtk theme, the drawing helpers);</w:t>
+            </w:r>
+            <w:r>
+              <w:t xml:space="preserve"> </w:t>
+            </w:r>
+            <w:r>
+              <w:rPr>
+                <w:rStyle w:val="VerbatimChar"/>
+              </w:rPr>
+              <w:t xml:space="preserve">doc.h</w:t>
+            </w:r>
+            <w:r>
+              <w:t xml:space="preserve"> </w:t>
+            </w:r>
+            <w:r>
+              <w:t xml:space="preserve">(the song open, undo / redo as JSON snapshots, the timeline's edits);</w:t>
+            </w:r>
+            <w:r>
+              <w:t xml:space="preserve"> </w:t>
+            </w:r>
+            <w:r>
+              <w:rPr>
+                <w:rStyle w:val="VerbatimChar"/>
+              </w:rPr>
+              <w:t xml:space="preserve">audio.h</w:t>
+            </w:r>
+            <w:r>
+              <w:t xml:space="preserve"> </w:t>
+            </w:r>
+            <w:r>
+              <w:t xml:space="preserve">(the SoundFont found and loaded, the engine started on an</w:t>
+            </w:r>
+            <w:r>
+              <w:t xml:space="preserve"> </w:t>
+            </w:r>
+            <w:r>
+              <w:rPr>
+                <w:b/>
+                <w:bCs/>
+              </w:rPr>
+              <w:t xml:space="preserve">app core</w:t>
+            </w:r>
+            <w:r>
+              <w:t xml:space="preserve">, else a real-time thread, else the UI's tick; the song compiled when the document's revision changes);</w:t>
+            </w:r>
+            <w:r>
+              <w:t xml:space="preserve"> </w:t>
+            </w:r>
+            <w:r>
+              <w:rPr>
+                <w:rStyle w:val="VerbatimChar"/>
+              </w:rPr>
+              <w:t xml:space="preserve">arrange.h</w:t>
+            </w:r>
+            <w:r>
+              <w:t xml:space="preserve"> </w:t>
+            </w:r>
+            <w:r>
+              <w:t xml:space="preserve">(the arrangement: ONE widget the size of the view, drawing only what shows);</w:t>
+            </w:r>
+            <w:r>
+              <w:t xml:space="preserve"> </w:t>
+            </w:r>
+            <w:r>
+              <w:rPr>
+                <w:rStyle w:val="VerbatimChar"/>
+              </w:rPr>
+              <w:t xml:space="preserve">grid.h</w:t>
+            </w:r>
+            <w:r>
+              <w:t xml:space="preserve"> </w:t>
+            </w:r>
+            <w:r>
+              <w:t xml:space="preserve">(NoteGrid: every editor's grid — voice rows, drum lanes, the piano roll);</w:t>
+            </w:r>
+            <w:r>
+              <w:t xml:space="preserve"> </w:t>
+            </w:r>
+            <w:r>
+              <w:rPr>
+                <w:rStyle w:val="VerbatimChar"/>
+              </w:rPr>
+              <w:t xml:space="preserve">editor.h</w:t>
+            </w:r>
+            <w:r>
+              <w:t xml:space="preserve"> </w:t>
+            </w:r>
+            <w:r>
+              <w:t xml:space="preserve">+</w:t>
+            </w:r>
+            <w:r>
+              <w:t xml:space="preserve"> </w:t>
+            </w:r>
+            <w:r>
+              <w:rPr>
+                <w:rStyle w:val="VerbatimChar"/>
+              </w:rPr>
+              <w:t xml:space="preserve">ed_chord.h</w:t>
+            </w:r>
+            <w:r>
+              <w:t xml:space="preserve">,</w:t>
+            </w:r>
+            <w:r>
+              <w:t xml:space="preserve"> </w:t>
+            </w:r>
+            <w:r>
+              <w:rPr>
+                <w:rStyle w:val="VerbatimChar"/>
+              </w:rPr>
+              <w:t xml:space="preserve">ed_rhythm.h</w:t>
+            </w:r>
+            <w:r>
+              <w:t xml:space="preserve">,</w:t>
+            </w:r>
+            <w:r>
+              <w:t xml:space="preserve"> </w:t>
+            </w:r>
+            <w:r>
+              <w:rPr>
+                <w:rStyle w:val="VerbatimChar"/>
+              </w:rPr>
+              <w:t xml:space="preserve">ed_riff.h</w:t>
+            </w:r>
+            <w:r>
+              <w:t xml:space="preserve"> </w:t>
+            </w:r>
+            <w:r>
+              <w:t xml:space="preserve">(the block editors: a form of wtk controls in columns, a grid or a wheel on the right);</w:t>
+            </w:r>
+            <w:r>
+              <w:t xml:space="preserve"> </w:t>
+            </w:r>
+            <w:r>
+              <w:rPr>
+                <w:rStyle w:val="VerbatimChar"/>
+              </w:rPr>
+              <w:t xml:space="preserve">ops.h</w:t>
+            </w:r>
+            <w:r>
+              <w:t xml:space="preserve"> </w:t>
+            </w:r>
+            <w:r>
+              <w:t xml:space="preserve">(the editors' operations: the drum catalog, euclidean rhythms, the degree vocabulary, cadences, the next chord);</w:t>
+            </w:r>
+            <w:r>
+              <w:t xml:space="preserve"> </w:t>
+            </w:r>
+            <w:r>
+              <w:rPr>
+                <w:rStyle w:val="VerbatimChar"/>
+              </w:rPr>
+              <w:t xml:space="preserve">dialogs.h</w:t>
+            </w:r>
+            <w:r>
+              <w:t xml:space="preserve">,</w:t>
+            </w:r>
+            <w:r>
+              <w:t xml:space="preserve"> </w:t>
+            </w:r>
+            <w:r>
+              <w:rPr>
+                <w:rStyle w:val="VerbatimChar"/>
+              </w:rPr>
+              <w:t xml:space="preserve">ai_dialog.h</w:t>
+            </w:r>
+            <w:r>
+              <w:t xml:space="preserve">,</w:t>
+            </w:r>
+            <w:r>
+              <w:t xml:space="preserve"> </w:t>
+            </w:r>
+            <w:r>
+              <w:rPr>
+                <w:rStyle w:val="VerbatimChar"/>
+              </w:rPr>
+              <w:t xml:space="preserve">chain.h</w:t>
+            </w:r>
+            <w:r>
+              <w:t xml:space="preserve"> </w:t>
+            </w:r>
+            <w:r>
+              <w:t xml:space="preserve">(a track's sound chain, a plugin's editor floating),</w:t>
+            </w:r>
+            <w:r>
+              <w:t xml:space="preserve"> </w:t>
+            </w:r>
+            <w:r>
+              <w:rPr>
+                <w:rStyle w:val="VerbatimChar"/>
+              </w:rPr>
+              <w:t xml:space="preserve">chrome.h</w:t>
+            </w:r>
+            <w:r>
+              <w:t xml:space="preserve"> </w:t>
+            </w:r>
+            <w:r>
+              <w:t xml:space="preserve">(the transport bar, the browser, the editor's host, the status bar).</w:t>
+            </w:r>
+          </w:p>
+        </w:tc>
+      </w:tr>
+    </w:tbl>
+    <w:p>
+      <w:pPr>
+        <w:pStyle w:val="BodyText"/>
+      </w:pPr>
+      <w:r>
+        <w:t xml:space="preserve">Conventions worth keeping:</w:t>
+      </w:r>
+    </w:p>
+    <w:p>
+      <w:pPr>
+        <w:pStyle w:val="Compact"/>
+        <w:numPr>
+          <w:ilvl w:val="0"/>
+          <w:numId w:val="1016"/>
+        </w:numPr>
+      </w:pPr>
+      <w:r>
+        <w:rPr>
+          <w:b/>
+          <w:bCs/>
+        </w:rPr>
+        <w:t xml:space="preserve">The document's revision</w:t>
+      </w:r>
+      <w:r>
+        <w:t xml:space="preserve">: every edit is</w:t>
+      </w:r>
+      <w:r>
+        <w:t xml:space="preserve"> </w:t>
+      </w:r>
+      <w:r>
+        <w:rPr>
+          <w:rStyle w:val="VerbatimChar"/>
+        </w:rPr>
+        <w:t xml:space="preserve">g_doc.checkpoint ()</w:t>
+      </w:r>
+      <w:r>
+        <w:t xml:space="preserve"> </w:t>
+      </w:r>
+      <w:r>
+        <w:t xml:space="preserve">(the undo step), the change, then</w:t>
+      </w:r>
+      <w:r>
+        <w:t xml:space="preserve"> </w:t>
+      </w:r>
+      <w:r>
+        <w:rPr>
+          <w:rStyle w:val="VerbatimChar"/>
+        </w:rPr>
+        <w:t xml:space="preserve">g_doc.changed ()</w:t>
+      </w:r>
+      <w:r>
+        <w:t xml:space="preserve">; the views and the audio host follow</w:t>
+      </w:r>
+      <w:r>
+        <w:t xml:space="preserve"> </w:t>
+      </w:r>
+      <w:r>
+        <w:rPr>
+          <w:rStyle w:val="VerbatimChar"/>
+        </w:rPr>
+        <w:t xml:space="preserve">g_doc.revision</w:t>
+      </w:r>
+      <w:r>
+        <w:t xml:space="preserve"> </w:t>
+      </w:r>
+      <w:r>
+        <w:t xml:space="preserve">(the song is compiled</w:t>
+      </w:r>
+      <w:r>
+        <w:t xml:space="preserve"> </w:t>
+      </w:r>
+      <w:r>
+        <w:t xml:space="preserve">again once the edits pause — a drag recompiles a few times a second).</w:t>
+      </w:r>
+    </w:p>
+    <w:p>
+      <w:pPr>
+        <w:pStyle w:val="Compact"/>
+        <w:numPr>
+          <w:ilvl w:val="0"/>
+          <w:numId w:val="1016"/>
+        </w:numPr>
+      </w:pPr>
+      <w:r>
+        <w:rPr>
+          <w:b/>
+          <w:bCs/>
+        </w:rPr>
+        <w:t xml:space="preserve">An editor never deletes itself</w:t>
+      </w:r>
+      <w:r>
+        <w:t xml:space="preserve">: a change that needs other controls sets</w:t>
+      </w:r>
+      <w:r>
+        <w:t xml:space="preserve"> </w:t>
+      </w:r>
+      <w:r>
+        <w:rPr>
+          <w:rStyle w:val="VerbatimChar"/>
+        </w:rPr>
+        <w:t xml:space="preserve">g_rebuildEditor</w:t>
+      </w:r>
+      <w:r>
+        <w:t xml:space="preserve">;</w:t>
+      </w:r>
+      <w:r>
+        <w:t xml:space="preserve"> </w:t>
+      </w:r>
+      <w:r>
+        <w:t xml:space="preserve">the Root's tick makes the editor again from the model (the same after an undo: the pointers into</w:t>
+      </w:r>
+      <w:r>
+        <w:t xml:space="preserve"> </w:t>
+      </w:r>
+      <w:r>
+        <w:t xml:space="preserve">the song are stale then).</w:t>
+      </w:r>
+    </w:p>
+    <w:p>
+      <w:pPr>
+        <w:pStyle w:val="Compact"/>
+        <w:numPr>
+          <w:ilvl w:val="0"/>
+          <w:numId w:val="1016"/>
+        </w:numPr>
+      </w:pPr>
+      <w:r>
+        <w:rPr>
+          <w:b/>
+          <w:bCs/>
+        </w:rPr>
+        <w:t xml:space="preserve">The audio thread / core</w:t>
+      </w:r>
+      <w:r>
+        <w:t xml:space="preserve"> </w:t>
+      </w:r>
+      <w:r>
+        <w:t xml:space="preserve">makes no kapi call and allocates nothing; the UI posts commands</w:t>
+      </w:r>
+      <w:r>
+        <w:t xml:space="preserve"> </w:t>
+      </w:r>
+      <w:r>
+        <w:t xml:space="preserve">(</w:t>
+      </w:r>
+      <w:r>
+        <w:rPr>
+          <w:rStyle w:val="VerbatimChar"/>
+        </w:rPr>
+        <w:t xml:space="preserve">Engine::post</w:t>
+      </w:r>
+      <w:r>
+        <w:t xml:space="preserve">) and frees the songs the engine hands back (</w:t>
+      </w:r>
+      <w:r>
+        <w:rPr>
+          <w:rStyle w:val="VerbatimChar"/>
+        </w:rPr>
+        <w:t xml:space="preserve">retired ()</w:t>
+      </w:r>
+      <w:r>
+        <w:t xml:space="preserve">).</w:t>
+      </w:r>
+    </w:p>
+    <w:p>
+      <w:pPr>
+        <w:pStyle w:val="Compact"/>
+        <w:numPr>
+          <w:ilvl w:val="0"/>
+          <w:numId w:val="1016"/>
+        </w:numPr>
+      </w:pPr>
+      <w:r>
+        <w:rPr>
+          <w:b/>
+          <w:bCs/>
+        </w:rPr>
+        <w:t xml:space="preserve">Memory</w:t>
+      </w:r>
+      <w:r>
+        <w:t xml:space="preserve">: JSON documents are arenas (</w:t>
+      </w:r>
+      <w:r>
+        <w:rPr>
+          <w:rStyle w:val="VerbatimChar"/>
+        </w:rPr>
+        <w:t xml:space="preserve">json.hpp</w:t>
+      </w:r>
+      <w:r>
+        <w:t xml:space="preserve">), freed as a whole; the song and its modules are</w:t>
+      </w:r>
+      <w:r>
+        <w:t xml:space="preserve"> </w:t>
+      </w:r>
+      <w:r>
+        <w:t xml:space="preserve">owned values (an</w:t>
+      </w:r>
+      <w:r>
+        <w:t xml:space="preserve"> </w:t>
+      </w:r>
+      <w:r>
+        <w:rPr>
+          <w:rStyle w:val="VerbatimChar"/>
+        </w:rPr>
+        <w:t xml:space="preserve">Item</w:t>
+      </w:r>
+      <w:r>
+        <w:t xml:space="preserve"> </w:t>
+      </w:r>
+      <w:r>
+        <w:t xml:space="preserve">owns its module, copies clone it). On the PC the app runs in the desktop</w:t>
+      </w:r>
+      <w:r>
+        <w:t xml:space="preserve"> </w:t>
+      </w:r>
+      <w:r>
+        <w:t xml:space="preserve">simulator (</w:t>
+      </w:r>
+      <w:r>
+        <w:rPr>
+          <w:rStyle w:val="VerbatimChar"/>
+        </w:rPr>
+        <w:t xml:space="preserve">sh tools/tests/desktop_sim/shots.sh koton</w:t>
+      </w:r>
+      <w:r>
+        <w:t xml:space="preserve">) and under valgrind with the host allocator</w:t>
+      </w:r>
+      <w:r>
+        <w:t xml:space="preserve"> </w:t>
+      </w:r>
+      <w:r>
+        <w:t xml:space="preserve">(</w:t>
+      </w:r>
+      <w:r>
+        <w:rPr>
+          <w:rStyle w:val="VerbatimChar"/>
+        </w:rPr>
+        <w:t xml:space="preserve">-DONYX_CPP_HPP -include new</w:t>
+      </w:r>
+      <w:r>
+        <w:t xml:space="preserve">:</w:t>
+      </w:r>
+      <w:r>
+        <w:t xml:space="preserve"> </w:t>
+      </w:r>
+      <w:r>
+        <w:rPr>
+          <w:rStyle w:val="VerbatimChar"/>
+        </w:rPr>
+        <w:t xml:space="preserve">onyxpp.hpp</w:t>
+      </w:r>
+      <w:r>
+        <w:t xml:space="preserve">'s allocator left out) — the engine's and the AI's own</w:t>
+      </w:r>
+      <w:r>
+        <w:t xml:space="preserve"> </w:t>
+      </w:r>
+      <w:r>
+        <w:t xml:space="preserve">tests run under ASan / UBSan / LSan (</w:t>
+      </w:r>
+      <w:r>
+        <w:rPr>
+          <w:rStyle w:val="VerbatimChar"/>
+        </w:rPr>
+        <w:t xml:space="preserve">sh tools/tests/koton/engine_run.sh</w:t>
+      </w:r>
+      <w:r>
+        <w:t xml:space="preserve">,</w:t>
+      </w:r>
+      <w:r>
+        <w:t xml:space="preserve"> </w:t>
+      </w:r>
+      <w:r>
+        <w:rPr>
+          <w:rStyle w:val="VerbatimChar"/>
+        </w:rPr>
+        <w:t xml:space="preserve">ai_run.sh</w:t>
+      </w:r>
+      <w:r>
+        <w:t xml:space="preserve">,</w:t>
+      </w:r>
+      <w:r>
+        <w:t xml:space="preserve"> </w:t>
+      </w:r>
+      <w:r>
+        <w:rPr>
+          <w:rStyle w:val="VerbatimChar"/>
+        </w:rPr>
+        <w:t xml:space="preserve">synth_run.sh</w:t>
+      </w:r>
+      <w:r>
+        <w:t xml:space="preserve">). (ASan cannot run the simulator itself: its shadow memory takes the kapi table's</w:t>
+      </w:r>
+      <w:r>
+        <w:t xml:space="preserve"> </w:t>
+      </w:r>
+      <w:r>
+        <w:t xml:space="preserve">fixed address.)</w:t>
+      </w:r>
+    </w:p>
+    <w:p>
+      <w:pPr>
+        <w:pStyle w:val="Compact"/>
+        <w:numPr>
+          <w:ilvl w:val="0"/>
+          <w:numId w:val="1016"/>
+        </w:numPr>
+      </w:pPr>
+      <w:r>
+        <w:rPr>
+          <w:b/>
+          <w:bCs/>
+        </w:rPr>
+        <w:t xml:space="preserve">Static objects</w:t>
+      </w:r>
+      <w:r>
+        <w:t xml:space="preserve"> </w:t>
+      </w:r>
+      <w:r>
+        <w:t xml:space="preserve">that allocate must not be made before</w:t>
+      </w:r>
+      <w:r>
+        <w:t xml:space="preserve"> </w:t>
+      </w:r>
+      <w:r>
+        <w:rPr>
+          <w:rStyle w:val="VerbatimChar"/>
+        </w:rPr>
+        <w:t xml:space="preserve">main</w:t>
+      </w:r>
+      <w:r>
+        <w:t xml:space="preserve"> </w:t>
+      </w:r>
+      <w:r>
+        <w:t xml:space="preserve">(the kapi table is not there yet</w:t>
+      </w:r>
+      <w:r>
+        <w:t xml:space="preserve"> </w:t>
+      </w:r>
+      <w:r>
+        <w:t xml:space="preserve">on Onyx): Koton makes its document in</w:t>
+      </w:r>
+      <w:r>
+        <w:t xml:space="preserve"> </w:t>
+      </w:r>
+      <w:r>
+        <w:rPr>
+          <w:rStyle w:val="VerbatimChar"/>
+        </w:rPr>
+        <w:t xml:space="preserve">main</w:t>
+      </w:r>
+      <w:r>
+        <w:t xml:space="preserve"> </w:t>
+      </w:r>
+      <w:r>
+        <w:t xml:space="preserve">(</w:t>
+      </w:r>
+      <w:r>
+        <w:rPr>
+          <w:rStyle w:val="VerbatimChar"/>
+        </w:rPr>
+        <w:t xml:space="preserve">g_doc</w:t>
+      </w:r>
+      <w:r>
+        <w:t xml:space="preserve"> </w:t>
+      </w:r>
+      <w:r>
+        <w:t xml:space="preserve">is a reference to storage constructed there).</w:t>
+      </w:r>
+    </w:p>
+    <w:bookmarkEnd w:id="46"/>
+    <w:bookmarkStart w:id="51" w:name="Xaed6078f9236dd71c6901d3b4b7c078cf403560"/>
+    <w:p>
+      <w:pPr>
+        <w:pStyle w:val="Heading3"/>
+      </w:pPr>
+      <w:r>
+        <w:t xml:space="preserve">Koton's plugins: processes over IPC (</w:t>
+      </w:r>
+      <w:r>
+        <w:rPr>
+          <w:rStyle w:val="VerbatimChar"/>
+        </w:rPr>
+        <w:t xml:space="preserve">kplug.h</w:t>
+      </w:r>
+      <w:r>
+        <w:t xml:space="preserve">,</w:t>
+      </w:r>
+      <w:r>
+        <w:t xml:space="preserve"> </w:t>
+      </w:r>
+      <w:r>
+        <w:rPr>
+          <w:rStyle w:val="VerbatimChar"/>
+        </w:rPr>
+        <w:t xml:space="preserve">kplug_proto.h</w:t>
+      </w:r>
+      <w:r>
+        <w:t xml:space="preserve">,</w:t>
+      </w:r>
+      <w:r>
+        <w:t xml:space="preserve"> </w:t>
+      </w:r>
+      <w:r>
+        <w:rPr>
+          <w:rStyle w:val="VerbatimChar"/>
+        </w:rPr>
+        <w:t xml:space="preserve">Apps/koton/plug</w:t>
+      </w:r>
+      <w:r>
+        <w:t xml:space="preserve">)</w:t>
+      </w:r>
+    </w:p>
+    <w:p>
+      <w:pPr>
+        <w:pStyle w:val="FirstParagraph"/>
+      </w:pPr>
+      <w:r>
+        <w:t xml:space="preserve">Koton's instruments, effects and generators beyond the SoundFont are</w:t>
+      </w:r>
+      <w:r>
+        <w:t xml:space="preserve"> </w:t>
+      </w:r>
+      <w:r>
+        <w:rPr>
+          <w:b/>
+          <w:bCs/>
+        </w:rPr>
+        <w:t xml:space="preserve">plugins</w:t>
+      </w:r>
+      <w:r>
+        <w:t xml:space="preserve">, each a process of</w:t>
+      </w:r>
+      <w:r>
+        <w:t xml:space="preserve"> </w:t>
+      </w:r>
+      <w:r>
+        <w:t xml:space="preserve">its own — the way the Control Panel hosts its applets: a crash in one never takes Koton down.</w:t>
+      </w:r>
+    </w:p>
+    <w:tbl>
+      <w:tblPr>
+        <w:tblStyle w:val="Table"/>
+        <w:tblW w:type="auto" w:w="0"/>
+        <w:tblLook w:firstRow="1" w:lastRow="0" w:firstColumn="0" w:lastColumn="0" w:noHBand="0" w:noVBand="0" w:val="0020"/>
+      </w:tblPr>
+      <w:tblGrid>
+        <w:gridCol w:w="3960"/>
+        <w:gridCol w:w="3960"/>
+      </w:tblGrid>
+      <w:tr>
+        <w:trPr>
+          <w:tblHeader w:val="on"/>
+        </w:trPr>
+        <w:tc>
+          <w:tcPr/>
+          <w:p>
+            <w:pPr>
+              <w:pStyle w:val="Compact"/>
+            </w:pPr>
+            <w:r>
+              <w:t xml:space="preserve">File</w:t>
+            </w:r>
+          </w:p>
+        </w:tc>
+        <w:tc>
+          <w:tcPr/>
+          <w:p>
+            <w:pPr>
+              <w:pStyle w:val="Compact"/>
+            </w:pPr>
+            <w:r>
+              <w:t xml:space="preserve">What</w:t>
+            </w:r>
+          </w:p>
+        </w:tc>
+      </w:tr>
+      <w:tr>
+        <w:tc>
+          <w:tcPr/>
+          <w:p>
+            <w:pPr>
+              <w:pStyle w:val="Compact"/>
+            </w:pPr>
+            <w:hyperlink r:id="rId47">
               <w:r>
                 <w:rPr>
                   <w:rStyle w:val="VerbatimChar"/>
@@ -45433,7 +46818,7 @@
             <w:pPr>
               <w:pStyle w:val="Compact"/>
             </w:pPr>
-            <w:hyperlink r:id="rId47">
+            <w:hyperlink r:id="rId48">
               <w:r>
                 <w:rPr>
                   <w:rStyle w:val="VerbatimChar"/>
@@ -45639,7 +47024,7 @@
             <w:pPr>
               <w:pStyle w:val="Compact"/>
             </w:pPr>
-            <w:hyperlink r:id="rId48">
+            <w:hyperlink r:id="rId49">
               <w:r>
                 <w:rPr>
                   <w:rStyle w:val="VerbatimChar"/>
@@ -46773,7 +48158,7 @@
       <w:r>
         <w:t xml:space="preserve">(</w:t>
       </w:r>
-      <w:hyperlink r:id="rId49">
+      <w:hyperlink r:id="rId50">
         <w:r>
           <w:rPr>
             <w:rStyle w:val="VerbatimChar"/>
@@ -52255,9 +53640,9 @@
         <w:t xml:space="preserve">writes the editors' pictures).</w:t>
       </w:r>
     </w:p>
-    <w:bookmarkEnd w:id="50"/>
     <w:bookmarkEnd w:id="51"/>
-    <w:bookmarkStart w:id="54" w:name="Xeac8a7f07d054ec4a738e7316cecd6b2667878f"/>
+    <w:bookmarkEnd w:id="52"/>
+    <w:bookmarkStart w:id="55" w:name="Xeac8a7f07d054ec4a738e7316cecd6b2667878f"/>
     <w:p>
       <w:pPr>
         <w:pStyle w:val="Heading2"/>
@@ -53531,7 +54916,7 @@
         <w:t xml:space="preserve">).</w:t>
       </w:r>
     </w:p>
-    <w:bookmarkStart w:id="52" w:name="memset--memcpy-in-freestanding-apps"/>
+    <w:bookmarkStart w:id="53" w:name="memset--memcpy-in-freestanding-apps"/>
     <w:p>
       <w:pPr>
         <w:pStyle w:val="Heading3"/>
@@ -53773,8 +55158,8 @@
         <w:t xml:space="preserve">; newlib programs must not (they keep newlib's versions).</w:t>
       </w:r>
     </w:p>
-    <w:bookmarkEnd w:id="52"/>
-    <w:bookmarkStart w:id="53" w:name="Xcf0dbbf20be0cc782816b5e8ce7c8fb7d3dde7b"/>
+    <w:bookmarkEnd w:id="53"/>
+    <w:bookmarkStart w:id="54" w:name="Xcf0dbbf20be0cc782816b5e8ce7c8fb7d3dde7b"/>
     <w:p>
       <w:pPr>
         <w:pStyle w:val="Heading3"/>
@@ -56020,9 +57405,9 @@
         <w:t xml:space="preserve">.</w:t>
       </w:r>
     </w:p>
-    <w:bookmarkEnd w:id="53"/>
     <w:bookmarkEnd w:id="54"/>
-    <w:bookmarkStart w:id="76" w:name="Xf0254b5b66af42bca7d25138d14efff7271fb9a"/>
+    <w:bookmarkEnd w:id="55"/>
+    <w:bookmarkStart w:id="77" w:name="Xf0254b5b66af42bca7d25138d14efff7271fb9a"/>
     <w:p>
       <w:pPr>
         <w:pStyle w:val="Heading2"/>
@@ -56050,7 +57435,7 @@
       <w:pPr>
         <w:pStyle w:val="FirstParagraph"/>
       </w:pPr>
-      <w:hyperlink r:id="rId55">
+      <w:hyperlink r:id="rId56">
         <w:r>
           <w:rPr>
             <w:rStyle w:val="VerbatimChar"/>
@@ -56530,7 +57915,7 @@
       <w:r>
         <w:t xml:space="preserve"> </w:t>
       </w:r>
-      <w:hyperlink r:id="rId56">
+      <w:hyperlink r:id="rId57">
         <w:r>
           <w:rPr>
             <w:rStyle w:val="VerbatimChar"/>
@@ -56669,7 +58054,7 @@
       <w:r>
         <w:t xml:space="preserve"> </w:t>
       </w:r>
-      <w:hyperlink r:id="rId57">
+      <w:hyperlink r:id="rId58">
         <w:r>
           <w:rPr>
             <w:rStyle w:val="VerbatimChar"/>
@@ -56953,7 +58338,7 @@
       <w:r>
         <w:t xml:space="preserve"> </w:t>
       </w:r>
-      <w:hyperlink r:id="rId58">
+      <w:hyperlink r:id="rId59">
         <w:r>
           <w:rPr>
             <w:rStyle w:val="VerbatimChar"/>
@@ -57166,7 +58551,7 @@
       <w:r>
         <w:t xml:space="preserve"> </w:t>
       </w:r>
-      <w:hyperlink r:id="rId59">
+      <w:hyperlink r:id="rId60">
         <w:r>
           <w:rPr>
             <w:rStyle w:val="VerbatimChar"/>
@@ -57283,7 +58668,7 @@
       <w:r>
         <w:t xml:space="preserve">(</w:t>
       </w:r>
-      <w:hyperlink r:id="rId60">
+      <w:hyperlink r:id="rId61">
         <w:r>
           <w:rPr>
             <w:rStyle w:val="VerbatimChar"/>
@@ -57752,7 +59137,7 @@
       <w:r>
         <w:t xml:space="preserve"> </w:t>
       </w:r>
-      <w:hyperlink r:id="rId61">
+      <w:hyperlink r:id="rId62">
         <w:r>
           <w:rPr>
             <w:rStyle w:val="VerbatimChar"/>
@@ -57859,7 +59244,7 @@
       <w:r>
         <w:t xml:space="preserve"> </w:t>
       </w:r>
-      <w:hyperlink r:id="rId62">
+      <w:hyperlink r:id="rId63">
         <w:r>
           <w:rPr>
             <w:rStyle w:val="VerbatimChar"/>
@@ -57970,7 +59355,7 @@
       <w:r>
         <w:t xml:space="preserve"> </w:t>
       </w:r>
-      <w:hyperlink r:id="rId63">
+      <w:hyperlink r:id="rId64">
         <w:r>
           <w:rPr>
             <w:rStyle w:val="VerbatimChar"/>
@@ -58042,7 +59427,7 @@
       <w:r>
         <w:t xml:space="preserve"> </w:t>
       </w:r>
-      <w:hyperlink r:id="rId64">
+      <w:hyperlink r:id="rId65">
         <w:r>
           <w:rPr>
             <w:rStyle w:val="VerbatimChar"/>
@@ -58344,7 +59729,7 @@
       <w:r>
         <w:t xml:space="preserve"> </w:t>
       </w:r>
-      <w:hyperlink r:id="rId65">
+      <w:hyperlink r:id="rId66">
         <w:r>
           <w:rPr>
             <w:rStyle w:val="VerbatimChar"/>
@@ -58496,7 +59881,7 @@
       <w:r>
         <w:t xml:space="preserve"> </w:t>
       </w:r>
-      <w:hyperlink r:id="rId66">
+      <w:hyperlink r:id="rId67">
         <w:r>
           <w:rPr>
             <w:rStyle w:val="VerbatimChar"/>
@@ -58700,7 +60085,7 @@
       <w:r>
         <w:t xml:space="preserve">(</w:t>
       </w:r>
-      <w:hyperlink r:id="rId67">
+      <w:hyperlink r:id="rId68">
         <w:r>
           <w:rPr>
             <w:rStyle w:val="VerbatimChar"/>
@@ -58727,7 +60112,7 @@
       <w:r>
         <w:t xml:space="preserve">(</w:t>
       </w:r>
-      <w:hyperlink r:id="rId68">
+      <w:hyperlink r:id="rId69">
         <w:r>
           <w:rPr>
             <w:rStyle w:val="VerbatimChar"/>
@@ -58975,7 +60360,7 @@
       <w:r>
         <w:t xml:space="preserve"> </w:t>
       </w:r>
-      <w:hyperlink r:id="rId66">
+      <w:hyperlink r:id="rId67">
         <w:r>
           <w:rPr>
             <w:rStyle w:val="VerbatimChar"/>
@@ -59001,7 +60386,7 @@
       <w:r>
         <w:t xml:space="preserve"> </w:t>
       </w:r>
-      <w:hyperlink r:id="rId69">
+      <w:hyperlink r:id="rId70">
         <w:r>
           <w:rPr>
             <w:rStyle w:val="VerbatimChar"/>
@@ -59060,7 +60445,7 @@
       <w:r>
         <w:t xml:space="preserve"> </w:t>
       </w:r>
-      <w:hyperlink r:id="rId70">
+      <w:hyperlink r:id="rId71">
         <w:r>
           <w:rPr>
             <w:rStyle w:val="VerbatimChar"/>
@@ -59944,7 +61329,7 @@
       <w:r>
         <w:t xml:space="preserve"> </w:t>
       </w:r>
-      <w:hyperlink r:id="rId71">
+      <w:hyperlink r:id="rId72">
         <w:r>
           <w:rPr>
             <w:rStyle w:val="VerbatimChar"/>
@@ -60348,7 +61733,7 @@
         <w:t xml:space="preserve">…, §earlier) still work and coexist; apps choose one model per window.</w:t>
       </w:r>
     </w:p>
-    <w:bookmarkStart w:id="75" w:name="dynamic-memory--c-apps"/>
+    <w:bookmarkStart w:id="76" w:name="dynamic-memory--c-apps"/>
     <w:p>
       <w:pPr>
         <w:pStyle w:val="Heading3"/>
@@ -60418,7 +61803,7 @@
       <w:r>
         <w:t xml:space="preserve"> </w:t>
       </w:r>
-      <w:hyperlink r:id="rId72">
+      <w:hyperlink r:id="rId73">
         <w:r>
           <w:rPr>
             <w:rStyle w:val="VerbatimChar"/>
@@ -60714,7 +62099,7 @@
       <w:r>
         <w:t xml:space="preserve"> </w:t>
       </w:r>
-      <w:hyperlink r:id="rId73">
+      <w:hyperlink r:id="rId74">
         <w:r>
           <w:rPr>
             <w:rStyle w:val="VerbatimChar"/>
@@ -60948,7 +62333,7 @@
       <w:r>
         <w:t xml:space="preserve"> </w:t>
       </w:r>
-      <w:hyperlink r:id="rId74">
+      <w:hyperlink r:id="rId75">
         <w:r>
           <w:rPr>
             <w:rStyle w:val="VerbatimChar"/>
@@ -60963,9 +62348,9 @@
         <w:t xml:space="preserve">for a working example.</w:t>
       </w:r>
     </w:p>
-    <w:bookmarkEnd w:id="75"/>
     <w:bookmarkEnd w:id="76"/>
-    <w:bookmarkStart w:id="92" w:name="X636230dba256ccd30a2e68f8101290712b3f4c4"/>
+    <w:bookmarkEnd w:id="77"/>
+    <w:bookmarkStart w:id="93" w:name="X636230dba256ccd30a2e68f8101290712b3f4c4"/>
     <w:p>
       <w:pPr>
         <w:pStyle w:val="Heading2"/>
@@ -62239,7 +63624,7 @@
       <w:r>
         <w:t xml:space="preserve"> </w:t>
       </w:r>
-      <w:hyperlink r:id="rId77">
+      <w:hyperlink r:id="rId78">
         <w:r>
           <w:rPr>
             <w:rStyle w:val="VerbatimChar"/>
@@ -62320,7 +63705,7 @@
       <w:r>
         <w:t xml:space="preserve"> </w:t>
       </w:r>
-      <w:hyperlink r:id="rId78">
+      <w:hyperlink r:id="rId79">
         <w:r>
           <w:rPr>
             <w:rStyle w:val="VerbatimChar"/>
@@ -62584,7 +63969,7 @@
         <w:t xml:space="preserve">40</w:t>
       </w:r>
     </w:p>
-    <w:bookmarkStart w:id="86" w:name="screenshots-and-documentation"/>
+    <w:bookmarkStart w:id="87" w:name="screenshots-and-documentation"/>
     <w:p>
       <w:pPr>
         <w:pStyle w:val="Heading3"/>
@@ -62614,7 +63999,7 @@
       <w:r>
         <w:t xml:space="preserve"> </w:t>
       </w:r>
-      <w:hyperlink r:id="rId79">
+      <w:hyperlink r:id="rId80">
         <w:r>
           <w:rPr>
             <w:rStyle w:val="VerbatimChar"/>
@@ -63609,7 +64994,7 @@
       <w:r>
         <w:t xml:space="preserve"> </w:t>
       </w:r>
-      <w:hyperlink r:id="rId80">
+      <w:hyperlink r:id="rId81">
         <w:r>
           <w:rPr>
             <w:rStyle w:val="VerbatimChar"/>
@@ -63750,7 +65135,7 @@
       <w:r>
         <w:t xml:space="preserve"> </w:t>
       </w:r>
-      <w:hyperlink r:id="rId81">
+      <w:hyperlink r:id="rId82">
         <w:r>
           <w:rPr>
             <w:rStyle w:val="VerbatimChar"/>
@@ -63773,7 +65158,7 @@
       <w:r>
         <w:t xml:space="preserve"> </w:t>
       </w:r>
-      <w:hyperlink r:id="rId82">
+      <w:hyperlink r:id="rId83">
         <w:r>
           <w:rPr>
             <w:rStyle w:val="VerbatimChar"/>
@@ -63808,7 +65193,7 @@
       <w:r>
         <w:t xml:space="preserve"> </w:t>
       </w:r>
-      <w:hyperlink r:id="rId83">
+      <w:hyperlink r:id="rId84">
         <w:r>
           <w:rPr>
             <w:rStyle w:val="VerbatimChar"/>
@@ -64014,7 +65399,7 @@
       <w:r>
         <w:t xml:space="preserve"> </w:t>
       </w:r>
-      <w:hyperlink r:id="rId84">
+      <w:hyperlink r:id="rId85">
         <w:r>
           <w:rPr>
             <w:rStyle w:val="VerbatimChar"/>
@@ -64077,7 +65462,7 @@
       <w:r>
         <w:t xml:space="preserve"> </w:t>
       </w:r>
-      <w:hyperlink r:id="rId85">
+      <w:hyperlink r:id="rId86">
         <w:r>
           <w:rPr>
             <w:rStyle w:val="VerbatimChar"/>
@@ -64301,8 +65686,8 @@
         <w:t xml:space="preserve">screenshot if the visual changes, then regenerates the exports.</w:t>
       </w:r>
     </w:p>
-    <w:bookmarkEnd w:id="86"/>
-    <w:bookmarkStart w:id="91" w:name="onyx-basic-the-interpreter"/>
+    <w:bookmarkEnd w:id="87"/>
+    <w:bookmarkStart w:id="92" w:name="onyx-basic-the-interpreter"/>
     <w:p>
       <w:pPr>
         <w:pStyle w:val="Heading3"/>
@@ -67330,7 +68715,7 @@
       <w:r>
         <w:t xml:space="preserve"> </w:t>
       </w:r>
-      <w:hyperlink r:id="rId87">
+      <w:hyperlink r:id="rId88">
         <w:r>
           <w:rPr>
             <w:rStyle w:val="VerbatimChar"/>
@@ -68140,7 +69525,7 @@
       <w:r>
         <w:t xml:space="preserve"> </w:t>
       </w:r>
-      <w:hyperlink r:id="rId88">
+      <w:hyperlink r:id="rId89">
         <w:r>
           <w:rPr>
             <w:rStyle w:val="VerbatimChar"/>
@@ -68547,7 +69932,7 @@
       <w:r>
         <w:t xml:space="preserve"> </w:t>
       </w:r>
-      <w:hyperlink r:id="rId89">
+      <w:hyperlink r:id="rId90">
         <w:r>
           <w:rPr>
             <w:rStyle w:val="VerbatimChar"/>
@@ -68618,7 +70003,7 @@
       <w:r>
         <w:t xml:space="preserve"> </w:t>
       </w:r>
-      <w:hyperlink r:id="rId90">
+      <w:hyperlink r:id="rId91">
         <w:r>
           <w:rPr>
             <w:rStyle w:val="VerbatimChar"/>
@@ -70625,9 +72010,9 @@
         <w:t xml:space="preserve">rewrites them).</w:t>
       </w:r>
     </w:p>
-    <w:bookmarkEnd w:id="91"/>
     <w:bookmarkEnd w:id="92"/>
-    <w:bookmarkStart w:id="93" w:name="Xc2ec260aede7afe7fa831ade27ff6c6be860f38"/>
+    <w:bookmarkEnd w:id="93"/>
+    <w:bookmarkStart w:id="94" w:name="Xc2ec260aede7afe7fa831ade27ff6c6be860f38"/>
     <w:p>
       <w:pPr>
         <w:pStyle w:val="Heading2"/>
@@ -71354,8 +72739,8 @@
         <w:t xml:space="preserve">"must match").</w:t>
       </w:r>
     </w:p>
-    <w:bookmarkEnd w:id="93"/>
-    <w:bookmarkStart w:id="94" w:name="X57cc4a25254639a1e87307c03f7beba3c173828"/>
+    <w:bookmarkEnd w:id="94"/>
+    <w:bookmarkStart w:id="95" w:name="X57cc4a25254639a1e87307c03f7beba3c173828"/>
     <w:p>
       <w:pPr>
         <w:pStyle w:val="Heading2"/>
@@ -71731,8 +73116,8 @@
         <w:t xml:space="preserve">committed in this repo.)</w:t>
       </w:r>
     </w:p>
-    <w:bookmarkEnd w:id="94"/>
-    <w:bookmarkStart w:id="96" w:name="Xe2e8f17f312baf0f280f8a3dfcc5fa34b4105bf"/>
+    <w:bookmarkEnd w:id="95"/>
+    <w:bookmarkStart w:id="97" w:name="Xe2e8f17f312baf0f280f8a3dfcc5fa34b4105bf"/>
     <w:p>
       <w:pPr>
         <w:pStyle w:val="Heading2"/>
@@ -72783,7 +74168,7 @@
       <w:r>
         <w:t xml:space="preserve"> </w:t>
       </w:r>
-      <w:hyperlink r:id="rId95">
+      <w:hyperlink r:id="rId96">
         <w:r>
           <w:rPr>
             <w:rStyle w:val="Hyperlink"/>
@@ -72795,8 +74180,8 @@
         <w:t xml:space="preserve">).</w:t>
       </w:r>
     </w:p>
-    <w:bookmarkEnd w:id="96"/>
-    <w:bookmarkStart w:id="98" w:name="Xe9c7e4e932ad1908138a3909ff179a810da6d71"/>
+    <w:bookmarkEnd w:id="97"/>
+    <w:bookmarkStart w:id="99" w:name="Xe9c7e4e932ad1908138a3909ff179a810da6d71"/>
     <w:p>
       <w:pPr>
         <w:pStyle w:val="Heading2"/>
@@ -73883,7 +75268,7 @@
       <w:r>
         <w:t xml:space="preserve"> </w:t>
       </w:r>
-      <w:hyperlink r:id="rId97">
+      <w:hyperlink r:id="rId98">
         <w:r>
           <w:rPr>
             <w:rStyle w:val="Hyperlink"/>
@@ -74278,7 +75663,7 @@
         <w:t xml:space="preserve">, not another clone.</w:t>
       </w:r>
     </w:p>
-    <w:bookmarkEnd w:id="98"/>
+    <w:bookmarkEnd w:id="99"/>
     <w:sectPr>
       <w:footerReference r:id="rId9" w:type="default"/>
       <w:footnotePr>

</xml_diff>

<commit_message>
docs: the exports regenerated after the merge
Co-Authored-By: Claude Opus 5.5 <noreply@anthropic.com>
Claude-Session: https://claude.ai/code/session_01QvgzST61NjKyMDUFcBAzhM
</commit_message>
<xml_diff>
--- a/docs/exports/03-DEVELOPER-GUIDE.docx
+++ b/docs/exports/03-DEVELOPER-GUIDE.docx
@@ -42333,7 +42333,61 @@
               <w:t xml:space="preserve">.new</w:t>
             </w:r>
             <w:r>
-              <w:t xml:space="preserve">, the old version's other files removed), the staging of</w:t>
+              <w:t xml:space="preserve">, the old version's other files removed — unless another installed package has them,</w:t>
+            </w:r>
+            <w:r>
+              <w:t xml:space="preserve"> </w:t>
+            </w:r>
+            <w:r>
+              <w:rPr>
+                <w:rStyle w:val="VerbatimChar"/>
+              </w:rPr>
+              <w:t xml:space="preserve">owned_elsewhere</w:t>
+            </w:r>
+            <w:r>
+              <w:t xml:space="preserve">, as when</w:t>
+            </w:r>
+            <w:r>
+              <w:t xml:space="preserve"> </w:t>
+            </w:r>
+            <w:r>
+              <w:rPr>
+                <w:rStyle w:val="VerbatimChar"/>
+              </w:rPr>
+              <w:t xml:space="preserve">bin/pkg</w:t>
+            </w:r>
+            <w:r>
+              <w:t xml:space="preserve"> </w:t>
+            </w:r>
+            <w:r>
+              <w:t xml:space="preserve">moved from</w:t>
+            </w:r>
+            <w:r>
+              <w:t xml:space="preserve"> </w:t>
+            </w:r>
+            <w:r>
+              <w:rPr>
+                <w:rStyle w:val="VerbatimChar"/>
+              </w:rPr>
+              <w:t xml:space="preserve">onyx</w:t>
+            </w:r>
+            <w:r>
+              <w:t xml:space="preserve"> </w:t>
+            </w:r>
+            <w:r>
+              <w:t xml:space="preserve">into</w:t>
+            </w:r>
+            <w:r>
+              <w:t xml:space="preserve"> </w:t>
+            </w:r>
+            <w:r>
+              <w:rPr>
+                <w:rStyle w:val="VerbatimChar"/>
+              </w:rPr>
+              <w:t xml:space="preserve">pkgman</w:t>
+            </w:r>
+            <w:r>
+              <w:t xml:space="preserve">), the staging of</w:t>
             </w:r>
             <w:r>
               <w:t xml:space="preserve"> </w:t>

</xml_diff>